<commit_message>
Refresh corrected Word research paper
Co-authored-by: rohit michael <rohitmichael-alt@users.noreply.github.com>
</commit_message>
<xml_diff>
--- a/docs/PROJECT_RESEARCH_AND_EVIDENCE.docx
+++ b/docs/PROJECT_RESEARCH_AND_EVIDENCE.docx
@@ -785,19 +785,19 @@
               <w:jc w:val="left"/>
             </w:pPr>
             <w:r>
-              <w:t xml:space="preserve">CCH metropolitan rerouting, congestion, recheck periods, and improvement thresholds</w:t>
-            </w:r>
-          </w:p>
-        </w:tc>
-        <w:tc>
-          <w:tcPr/>
-          <w:p>
-            <w:pPr>
-              <w:pStyle w:val="Compact"/>
-              <w:jc w:val="left"/>
-            </w:pPr>
-            <w:r>
-              <w:t xml:space="preserve">No flood evidence or query-level stale-metric certificate</w:t>
+              <w:t xml:space="preserve">CCH customization/query costs, recheck periods, improvement thresholds, compliance/penetration, and congestion redistribution</w:t>
+            </w:r>
+          </w:p>
+        </w:tc>
+        <w:tc>
+          <w:tcPr/>
+          <w:p>
+            <w:pPr>
+              <w:pStyle w:val="Compact"/>
+              <w:jc w:val="left"/>
+            </w:pPr>
+            <w:r>
+              <w:t xml:space="preserve">No flood evidence or deterministic monotone per-query stale-metric certificate</w:t>
             </w:r>
           </w:p>
         </w:tc>
@@ -828,7 +828,7 @@
               <w:jc w:val="left"/>
             </w:pPr>
             <w:r>
-              <w:t xml:space="preserve">Certificate-gated route planning under drifting costs and stale CH/oracle concepts</w:t>
+              <w:t xml:space="preserve">Implemented proof-gated CH/oracle routing under drifting costs</w:t>
             </w:r>
           </w:p>
         </w:tc>
@@ -1160,7 +1160,7 @@
           <w:rPr>
             <w:rStyle w:val="Hyperlink"/>
           </w:rPr>
-          <w:t xml:space="preserve">Chowdhury and Chakraborty, 2023</w:t>
+          <w:t xml:space="preserve">Gore, Arkatkar, Joshi, and Antoniou, 2023</w:t>
         </w:r>
       </w:hyperlink>
       <w:r>
@@ -2110,6 +2110,83 @@
         <w:t xml:space="preserve">where adjacency denotes multiplication. For software and CCH, seconds are quantized to non-negative integer milliseconds. Flow and capacity use the same interval and units. Discharged throughput is retained as an outcome, not substituted for assigned entering demand.</w:t>
       </w:r>
     </w:p>
+    <w:p>
+      <w:pPr>
+        <w:pStyle w:val="BodyText"/>
+      </w:pPr>
+      <w:r>
+        <w:t xml:space="preserve">When</w:t>
+      </w:r>
+      <w:r>
+        <w:t xml:space="preserve"> </w:t>
+      </w:r>
+      <m:oMath>
+        <m:sSubSup>
+          <m:e>
+            <m:r>
+              <m:t>c</m:t>
+            </m:r>
+          </m:e>
+          <m:sub>
+            <m:r>
+              <m:t>e</m:t>
+            </m:r>
+            <m:r>
+              <m:rPr>
+                <m:sty m:val="p"/>
+              </m:rPr>
+              <m:t>,</m:t>
+            </m:r>
+            <m:r>
+              <m:t>t</m:t>
+            </m:r>
+          </m:sub>
+          <m:sup>
+            <m:r>
+              <m:t>e</m:t>
+            </m:r>
+            <m:r>
+              <m:t>f</m:t>
+            </m:r>
+            <m:r>
+              <m:t>f</m:t>
+            </m:r>
+          </m:sup>
+        </m:sSubSup>
+        <m:r>
+          <m:rPr>
+            <m:sty m:val="p"/>
+          </m:rPr>
+          <m:t>=</m:t>
+        </m:r>
+        <m:r>
+          <m:t>0</m:t>
+        </m:r>
+      </m:oMath>
+      <w:r>
+        <w:t xml:space="preserve">, the edge is excluded and its routing cost is</w:t>
+      </w:r>
+      <w:r>
+        <w:t xml:space="preserve"> </w:t>
+      </w:r>
+      <m:oMath>
+        <m:r>
+          <m:rPr>
+            <m:sty m:val="p"/>
+          </m:rPr>
+          <m:t>+</m:t>
+        </m:r>
+        <m:r>
+          <m:rPr>
+            <m:sty m:val="p"/>
+          </m:rPr>
+          <m:t>∞</m:t>
+        </m:r>
+      </m:oMath>
+      <w:r>
+        <w:t xml:space="preserve">; the finite BPR expression is not evaluated. The native CCH experiment currently rejects closures until a finite sentinel and overflow bound are validated.</w:t>
+      </w:r>
+    </w:p>
     <w:bookmarkEnd w:id="44"/>
     <w:bookmarkStart w:id="45" w:name="which-algorithm-finds-the-path"/>
     <w:p>
@@ -3956,7 +4033,7 @@
     </w:p>
     <w:bookmarkEnd w:id="51"/>
     <w:bookmarkEnd w:id="52"/>
-    <w:bookmarkStart w:id="79" w:name="dataset-and-data-access"/>
+    <w:bookmarkStart w:id="80" w:name="dataset-and-data-access"/>
     <w:p>
       <w:pPr>
         <w:pStyle w:val="Heading2"/>
@@ -4159,7 +4236,7 @@
       </w:hyperlink>
     </w:p>
     <w:bookmarkEnd w:id="57"/>
-    <w:bookmarkStart w:id="61" w:name="opencity-chennai-flood-data"/>
+    <w:bookmarkStart w:id="62" w:name="opencity-chennai-flood-data"/>
     <w:p>
       <w:pPr>
         <w:pStyle w:val="Heading3"/>
@@ -4199,7 +4276,7 @@
         <w:t xml:space="preserve"> </w:t>
       </w:r>
       <w:r>
-        <w:t xml:space="preserve">2015 hotspots/stagnation points, inundation points/depth, zones, and return-period hazards.</w:t>
+        <w:t xml:space="preserve">The 2015 dataset has hotspots/stagnation points and a 2015 inundation zone; the separate Chennai Flooding Data collection has inundation points/depth and return-period hazards.</w:t>
       </w:r>
       <w:r>
         <w:br/>
@@ -4289,6 +4366,20 @@
         </w:r>
       </w:hyperlink>
       <w:r>
+        <w:t xml:space="preserve">,</w:t>
+      </w:r>
+      <w:r>
+        <w:t xml:space="preserve"> </w:t>
+      </w:r>
+      <w:hyperlink r:id="rId59">
+        <w:r>
+          <w:rPr>
+            <w:rStyle w:val="Hyperlink"/>
+          </w:rPr>
+          <w:t xml:space="preserve">Chennai Flooding Data</w:t>
+        </w:r>
+      </w:hyperlink>
+      <w:r>
         <w:br/>
       </w:r>
       <w:r>
@@ -4301,7 +4392,7 @@
       <w:r>
         <w:t xml:space="preserve"> </w:t>
       </w:r>
-      <w:hyperlink r:id="rId59">
+      <w:hyperlink r:id="rId60">
         <w:r>
           <w:rPr>
             <w:rStyle w:val="Hyperlink"/>
@@ -4322,7 +4413,7 @@
       <w:r>
         <w:t xml:space="preserve"> </w:t>
       </w:r>
-      <w:hyperlink r:id="rId60">
+      <w:hyperlink r:id="rId61">
         <w:r>
           <w:rPr>
             <w:rStyle w:val="VerbatimChar"/>
@@ -4347,8 +4438,8 @@
         <w:t xml:space="preserve">Resource previews on the OpenCity page.</w:t>
       </w:r>
     </w:p>
-    <w:bookmarkEnd w:id="61"/>
-    <w:bookmarkStart w:id="65" w:name="nasa-gpm-imerg"/>
+    <w:bookmarkEnd w:id="62"/>
+    <w:bookmarkStart w:id="66" w:name="nasa-gpm-imerg"/>
     <w:p>
       <w:pPr>
         <w:pStyle w:val="Heading3"/>
@@ -4469,7 +4560,7 @@
       <w:r>
         <w:t xml:space="preserve"> </w:t>
       </w:r>
-      <w:hyperlink r:id="rId62">
+      <w:hyperlink r:id="rId63">
         <w:r>
           <w:rPr>
             <w:rStyle w:val="Hyperlink"/>
@@ -4490,7 +4581,7 @@
       <w:r>
         <w:t xml:space="preserve"> </w:t>
       </w:r>
-      <w:hyperlink r:id="rId63">
+      <w:hyperlink r:id="rId64">
         <w:r>
           <w:rPr>
             <w:rStyle w:val="Hyperlink"/>
@@ -4536,7 +4627,7 @@
       <w:r>
         <w:t xml:space="preserve"> </w:t>
       </w:r>
-      <w:hyperlink r:id="rId64">
+      <w:hyperlink r:id="rId65">
         <w:r>
           <w:rPr>
             <w:rStyle w:val="Hyperlink"/>
@@ -4545,8 +4636,8 @@
         </w:r>
       </w:hyperlink>
     </w:p>
-    <w:bookmarkEnd w:id="65"/>
-    <w:bookmarkStart w:id="69" w:name="nasa-srtmnasadem-and-chennai-hydrology"/>
+    <w:bookmarkEnd w:id="66"/>
+    <w:bookmarkStart w:id="70" w:name="nasa-srtmnasadem-and-chennai-hydrology"/>
     <w:p>
       <w:pPr>
         <w:pStyle w:val="Heading3"/>
@@ -4667,7 +4758,7 @@
       <w:r>
         <w:t xml:space="preserve"> </w:t>
       </w:r>
-      <w:hyperlink r:id="rId66">
+      <w:hyperlink r:id="rId67">
         <w:r>
           <w:rPr>
             <w:rStyle w:val="Hyperlink"/>
@@ -4688,7 +4779,7 @@
       <w:r>
         <w:t xml:space="preserve"> </w:t>
       </w:r>
-      <w:hyperlink r:id="rId67">
+      <w:hyperlink r:id="rId68">
         <w:r>
           <w:rPr>
             <w:rStyle w:val="Hyperlink"/>
@@ -4740,7 +4831,7 @@
       <w:r>
         <w:t xml:space="preserve"> </w:t>
       </w:r>
-      <w:hyperlink r:id="rId68">
+      <w:hyperlink r:id="rId69">
         <w:r>
           <w:rPr>
             <w:rStyle w:val="Hyperlink"/>
@@ -4749,8 +4840,8 @@
         </w:r>
       </w:hyperlink>
     </w:p>
-    <w:bookmarkEnd w:id="69"/>
-    <w:bookmarkStart w:id="73" w:name="eclipse-sumo"/>
+    <w:bookmarkEnd w:id="70"/>
+    <w:bookmarkStart w:id="74" w:name="eclipse-sumo"/>
     <w:p>
       <w:pPr>
         <w:pStyle w:val="Heading3"/>
@@ -4871,7 +4962,7 @@
       <w:r>
         <w:t xml:space="preserve"> </w:t>
       </w:r>
-      <w:hyperlink r:id="rId70">
+      <w:hyperlink r:id="rId71">
         <w:r>
           <w:rPr>
             <w:rStyle w:val="Hyperlink"/>
@@ -4892,7 +4983,7 @@
       <w:r>
         <w:t xml:space="preserve"> </w:t>
       </w:r>
-      <w:hyperlink r:id="rId71">
+      <w:hyperlink r:id="rId72">
         <w:r>
           <w:rPr>
             <w:rStyle w:val="Hyperlink"/>
@@ -4913,7 +5004,7 @@
       <w:r>
         <w:t xml:space="preserve"> </w:t>
       </w:r>
-      <w:hyperlink r:id="rId72">
+      <w:hyperlink r:id="rId73">
         <w:r>
           <w:rPr>
             <w:rStyle w:val="Hyperlink"/>
@@ -4938,8 +5029,8 @@
         <w:t xml:space="preserve">SUMO-GUI, not a web data viewer.</w:t>
       </w:r>
     </w:p>
-    <w:bookmarkEnd w:id="73"/>
-    <w:bookmarkStart w:id="78" w:name="critical-facilities-and-population"/>
+    <w:bookmarkEnd w:id="74"/>
+    <w:bookmarkStart w:id="79" w:name="critical-facilities-and-population"/>
     <w:p>
       <w:pPr>
         <w:pStyle w:val="Heading3"/>
@@ -5060,7 +5151,7 @@
       <w:r>
         <w:t xml:space="preserve"> </w:t>
       </w:r>
-      <w:hyperlink r:id="rId74">
+      <w:hyperlink r:id="rId75">
         <w:r>
           <w:rPr>
             <w:rStyle w:val="Hyperlink"/>
@@ -5074,7 +5165,7 @@
       <w:r>
         <w:t xml:space="preserve"> </w:t>
       </w:r>
-      <w:hyperlink r:id="rId75">
+      <w:hyperlink r:id="rId76">
         <w:r>
           <w:rPr>
             <w:rStyle w:val="Hyperlink"/>
@@ -5088,7 +5179,7 @@
       <w:r>
         <w:t xml:space="preserve"> </w:t>
       </w:r>
-      <w:hyperlink r:id="rId76">
+      <w:hyperlink r:id="rId77">
         <w:r>
           <w:rPr>
             <w:rStyle w:val="Hyperlink"/>
@@ -5109,7 +5200,7 @@
       <w:r>
         <w:t xml:space="preserve"> </w:t>
       </w:r>
-      <w:hyperlink r:id="rId77">
+      <w:hyperlink r:id="rId78">
         <w:r>
           <w:rPr>
             <w:rStyle w:val="Hyperlink"/>
@@ -5153,9 +5244,9 @@
         <w:t xml:space="preserve">OpenCity resource previews where provided.</w:t>
       </w:r>
     </w:p>
-    <w:bookmarkEnd w:id="78"/>
     <w:bookmarkEnd w:id="79"/>
-    <w:bookmarkStart w:id="80" w:name="data-classification-and-temporal-meaning"/>
+    <w:bookmarkEnd w:id="80"/>
+    <w:bookmarkStart w:id="81" w:name="data-classification-and-temporal-meaning"/>
     <w:p>
       <w:pPr>
         <w:pStyle w:val="Heading2"/>
@@ -5568,8 +5659,8 @@
         <w:t xml:space="preserve">Optional OpenWeather/Open-Meteo forecasts may support demonstrations, but the core does not depend on paid APIs. No verified public live Chennai road-speed, accident, signal, or closure API is assumed.</w:t>
       </w:r>
     </w:p>
-    <w:bookmarkEnd w:id="80"/>
-    <w:bookmarkStart w:id="81" w:name="data-to-routing-mapping"/>
+    <w:bookmarkEnd w:id="81"/>
+    <w:bookmarkStart w:id="82" w:name="data-to-routing-mapping"/>
     <w:p>
       <w:pPr>
         <w:pStyle w:val="Heading2"/>
@@ -6012,8 +6103,8 @@
         </w:tc>
       </w:tr>
     </w:tbl>
-    <w:bookmarkEnd w:id="81"/>
-    <w:bookmarkStart w:id="85" w:name="architecture"/>
+    <w:bookmarkEnd w:id="82"/>
+    <w:bookmarkStart w:id="86" w:name="architecture"/>
     <w:p>
       <w:pPr>
         <w:pStyle w:val="Heading2"/>
@@ -6031,18 +6122,18 @@
           <wp:inline>
             <wp:extent cx="5334000" cy="6956293"/>
             <wp:effectExtent b="0" l="0" r="0" t="0"/>
-            <wp:docPr descr="Certificate-gated routing architecture" title="System Architecture" id="83" name="Picture"/>
+            <wp:docPr descr="Certificate-gated routing architecture" title="System Architecture" id="84" name="Picture"/>
             <a:graphic>
               <a:graphicData uri="http://schemas.openxmlformats.org/drawingml/2006/picture">
                 <pic:pic>
                   <pic:nvPicPr>
-                    <pic:cNvPr descr="docs/.docx-architecture.png" id="84" name="Picture"/>
+                    <pic:cNvPr descr="docs/.docx-architecture.png" id="85" name="Picture"/>
                     <pic:cNvPicPr>
                       <a:picLocks noChangeArrowheads="1" noChangeAspect="1"/>
                     </pic:cNvPicPr>
                   </pic:nvPicPr>
                   <pic:blipFill>
-                    <a:blip r:embed="rId82"/>
+                    <a:blip r:embed="rId83"/>
                     <a:stretch>
                       <a:fillRect/>
                     </a:stretch>
@@ -6069,8 +6160,8 @@
         </w:drawing>
       </w:r>
     </w:p>
-    <w:bookmarkEnd w:id="85"/>
-    <w:bookmarkStart w:id="96" w:name="implementation-status-and-revised-stages"/>
+    <w:bookmarkEnd w:id="86"/>
+    <w:bookmarkStart w:id="97" w:name="implementation-status-and-revised-stages"/>
     <w:p>
       <w:pPr>
         <w:pStyle w:val="Heading2"/>
@@ -6079,7 +6170,7 @@
         <w:t xml:space="preserve">10. Implementation Status and Revised Stages</w:t>
       </w:r>
     </w:p>
-    <w:bookmarkStart w:id="86" w:name="X91a5b516961134ace8296606c3e58ad87e2ed6a"/>
+    <w:bookmarkStart w:id="87" w:name="X91a5b516961134ace8296606c3e58ad87e2ed6a"/>
     <w:p>
       <w:pPr>
         <w:pStyle w:val="Heading3"/>
@@ -6112,8 +6203,8 @@
         <w:t xml:space="preserve">OSM and OpenCity historical hotspots are joined to roads; one real mapped edge is controlled as blocked; BPR weights and two Dijkstra snapshots demonstrate closure avoidance. Finite congestion response is not validated.</w:t>
       </w:r>
     </w:p>
-    <w:bookmarkEnd w:id="86"/>
-    <w:bookmarkStart w:id="87" w:name="Xccb8caa86ccf46b10144f4fa77c6463d872ef9a"/>
+    <w:bookmarkEnd w:id="87"/>
+    <w:bookmarkStart w:id="88" w:name="Xccb8caa86ccf46b10144f4fa77c6463d872ef9a"/>
     <w:p>
       <w:pPr>
         <w:pStyle w:val="Heading3"/>
@@ -6272,11 +6363,11 @@
         <w:pStyle w:val="Compact"/>
       </w:pPr>
       <w:r>
-        <w:t xml:space="preserve">28 passing tests.</w:t>
-      </w:r>
-    </w:p>
-    <w:bookmarkEnd w:id="87"/>
-    <w:bookmarkStart w:id="88" w:name="stage-3-reproducible-chennai-graph"/>
+        <w:t xml:space="preserve">37 passing tests.</w:t>
+      </w:r>
+    </w:p>
+    <w:bookmarkEnd w:id="88"/>
+    <w:bookmarkStart w:id="89" w:name="stage-3-reproducible-chennai-graph"/>
     <w:p>
       <w:pPr>
         <w:pStyle w:val="Heading3"/>
@@ -6309,8 +6400,8 @@
         <w:t xml:space="preserve">Dated OSM extract, stable arc IDs, validated directions/turns/parallel arcs, free-flow times, and documented capacity assumptions.</w:t>
       </w:r>
     </w:p>
-    <w:bookmarkEnd w:id="88"/>
-    <w:bookmarkStart w:id="89" w:name="stage-4-flood-and-road-state-evidence"/>
+    <w:bookmarkEnd w:id="89"/>
+    <w:bookmarkStart w:id="90" w:name="stage-4-flood-and-road-state-evidence"/>
     <w:p>
       <w:pPr>
         <w:pStyle w:val="Heading3"/>
@@ -6358,8 +6449,8 @@
         <w:t xml:space="preserve">states.</w:t>
       </w:r>
     </w:p>
-    <w:bookmarkEnd w:id="89"/>
-    <w:bookmarkStart w:id="90" w:name="Xb77ec8f9bac440bfe6e8fbaadfd160ccd3243f6"/>
+    <w:bookmarkEnd w:id="90"/>
+    <w:bookmarkStart w:id="91" w:name="Xb77ec8f9bac440bfe6e8fbaadfd160ccd3243f6"/>
     <w:p>
       <w:pPr>
         <w:pStyle w:val="Heading3"/>
@@ -6392,8 +6483,8 @@
         <w:t xml:space="preserve">Heterogeneous demand, entering PCE flow, incidents, queues, BPR calibration/sensitivity, and no double counting of SUMO delay.</w:t>
       </w:r>
     </w:p>
-    <w:bookmarkEnd w:id="90"/>
-    <w:bookmarkStart w:id="91" w:name="stage-6-chennai-cch-integration"/>
+    <w:bookmarkEnd w:id="91"/>
+    <w:bookmarkStart w:id="92" w:name="stage-6-chennai-cch-integration"/>
     <w:p>
       <w:pPr>
         <w:pStyle w:val="Heading3"/>
@@ -6426,8 +6517,8 @@
         <w:t xml:space="preserve">Geometry-aware ordering, turn-expanded topology, finite closure sentinel, integer quantization, full/partial customization, and Dijkstra differential validation.</w:t>
       </w:r>
     </w:p>
-    <w:bookmarkEnd w:id="91"/>
-    <w:bookmarkStart w:id="92" w:name="stage-7-stable-projected-load-rerouting"/>
+    <w:bookmarkEnd w:id="92"/>
+    <w:bookmarkStart w:id="93" w:name="stage-7-stable-projected-load-rerouting"/>
     <w:p>
       <w:pPr>
         <w:pStyle w:val="Heading3"/>
@@ -6460,8 +6551,8 @@
         <w:t xml:space="preserve">Threshold, minimum gain, cooldown, time-indexed route reservations, and compliance sensitivity.</w:t>
       </w:r>
     </w:p>
-    <w:bookmarkEnd w:id="92"/>
-    <w:bookmarkStart w:id="93" w:name="Xb095f145158f7c623f7559c37a2b0c933a8bd73"/>
+    <w:bookmarkEnd w:id="93"/>
+    <w:bookmarkStart w:id="94" w:name="Xb095f145158f7c623f7559c37a2b0c933a8bd73"/>
     <w:p>
       <w:pPr>
         <w:pStyle w:val="Heading3"/>
@@ -6494,8 +6585,8 @@
         <w:t xml:space="preserve">Hospitals, fire stations, relief centres, disconnection, p90 access, and population-weighted loss.</w:t>
       </w:r>
     </w:p>
-    <w:bookmarkEnd w:id="93"/>
-    <w:bookmarkStart w:id="94" w:name="stage-9-emergency-scenario"/>
+    <w:bookmarkEnd w:id="94"/>
+    <w:bookmarkStart w:id="95" w:name="stage-9-emergency-scenario"/>
     <w:p>
       <w:pPr>
         <w:pStyle w:val="Heading3"/>
@@ -6528,8 +6619,8 @@
         <w:t xml:space="preserve">Response time, deadline success, safety exposure, and ordinary-user external delay.</w:t>
       </w:r>
     </w:p>
-    <w:bookmarkEnd w:id="94"/>
-    <w:bookmarkStart w:id="95" w:name="stage-10-full-evaluation-and-paper"/>
+    <w:bookmarkEnd w:id="95"/>
+    <w:bookmarkStart w:id="96" w:name="stage-10-full-evaluation-and-paper"/>
     <w:p>
       <w:pPr>
         <w:pStyle w:val="Heading3"/>
@@ -6562,9 +6653,9 @@
         <w:t xml:space="preserve">Paired scenarios, baselines, ablations, uncertainty, statistical reporting, reproducibility package, and final manuscript.</w:t>
       </w:r>
     </w:p>
-    <w:bookmarkEnd w:id="95"/>
     <w:bookmarkEnd w:id="96"/>
-    <w:bookmarkStart w:id="101" w:name="preliminary-certificate-experiment"/>
+    <w:bookmarkEnd w:id="97"/>
+    <w:bookmarkStart w:id="102" w:name="preliminary-certificate-experiment"/>
     <w:p>
       <w:pPr>
         <w:pStyle w:val="Heading2"/>
@@ -6573,7 +6664,7 @@
         <w:t xml:space="preserve">11. Preliminary Certificate Experiment</w:t>
       </w:r>
     </w:p>
-    <w:bookmarkStart w:id="97" w:name="setup"/>
+    <w:bookmarkStart w:id="98" w:name="setup"/>
     <w:p>
       <w:pPr>
         <w:pStyle w:val="Heading3"/>
@@ -6693,8 +6784,8 @@
         <w:t xml:space="preserve">0.1.4.</w:t>
       </w:r>
     </w:p>
-    <w:bookmarkEnd w:id="97"/>
-    <w:bookmarkStart w:id="98" w:name="main-results"/>
+    <w:bookmarkEnd w:id="98"/>
+    <w:bookmarkStart w:id="99" w:name="main-results"/>
     <w:p>
       <w:pPr>
         <w:pStyle w:val="Heading3"/>
@@ -6927,7 +7018,7 @@
               <w:jc w:val="right"/>
             </w:pPr>
             <w:r>
-              <w:t xml:space="preserve">538 ms</w:t>
+              <w:t xml:space="preserve">587 ms</w:t>
             </w:r>
           </w:p>
         </w:tc>
@@ -6939,7 +7030,7 @@
               <w:jc w:val="right"/>
             </w:pPr>
             <w:r>
-              <w:t xml:space="preserve">702 ms</w:t>
+              <w:t xml:space="preserve">705 ms</w:t>
             </w:r>
           </w:p>
         </w:tc>
@@ -7037,7 +7128,7 @@
               <w:jc w:val="right"/>
             </w:pPr>
             <w:r>
-              <w:t xml:space="preserve">656 ms</w:t>
+              <w:t xml:space="preserve">707 ms</w:t>
             </w:r>
           </w:p>
         </w:tc>
@@ -7049,7 +7140,7 @@
               <w:jc w:val="right"/>
             </w:pPr>
             <w:r>
-              <w:t xml:space="preserve">708 ms</w:t>
+              <w:t xml:space="preserve">736 ms</w:t>
             </w:r>
           </w:p>
         </w:tc>
@@ -7147,7 +7238,7 @@
               <w:jc w:val="right"/>
             </w:pPr>
             <w:r>
-              <w:t xml:space="preserve">77 ms</w:t>
+              <w:t xml:space="preserve">120 ms</w:t>
             </w:r>
           </w:p>
         </w:tc>
@@ -7159,7 +7250,7 @@
               <w:jc w:val="right"/>
             </w:pPr>
             <w:r>
-              <w:t xml:space="preserve">199 ms</w:t>
+              <w:t xml:space="preserve">203 ms</w:t>
             </w:r>
           </w:p>
         </w:tc>
@@ -7257,7 +7348,7 @@
               <w:jc w:val="right"/>
             </w:pPr>
             <w:r>
-              <w:t xml:space="preserve">170 ms</w:t>
+              <w:t xml:space="preserve">209 ms</w:t>
             </w:r>
           </w:p>
         </w:tc>
@@ -7269,7 +7360,7 @@
               <w:jc w:val="right"/>
             </w:pPr>
             <w:r>
-              <w:t xml:space="preserve">199 ms</w:t>
+              <w:t xml:space="preserve">202 ms</w:t>
             </w:r>
           </w:p>
         </w:tc>
@@ -7280,7 +7371,7 @@
         <w:pStyle w:val="BodyText"/>
       </w:pPr>
       <w:r>
-        <w:t xml:space="preserve">There were zero certificate violations and zero exact post-refresh mismatches. The monotone workload produced the largest reduction because the lower bound remained valid. Mixed decreases correctly forced frequent refreshes.</w:t>
+        <w:t xml:space="preserve">There were zero certificate violations, zero exact post-refresh mismatches, and zero CCH-versus-independent-Dijkstra oracle mismatches. The monotone workload produced the largest reduction because the lower bound remained valid. Mixed decreases correctly forced frequent refreshes; in this single run, certificate overhead made mixed CCH slightly slower than eager CCH.</w:t>
       </w:r>
     </w:p>
     <w:p>
@@ -7288,11 +7379,29 @@
         <w:pStyle w:val="BodyText"/>
       </w:pPr>
       <w:r>
-        <w:t xml:space="preserve">These are one-machine synthetic measurements with degree ordering. They validate implementation behavior, not Chennai travel outcomes or general performance.</w:t>
-      </w:r>
-    </w:p>
-    <w:bookmarkEnd w:id="98"/>
-    <w:bookmarkStart w:id="100" w:name="epsilon-sensitivity"/>
+        <w:t xml:space="preserve">These are one-machine, single-run synthetic measurements with degree ordering.</w:t>
+      </w:r>
+      <w:r>
+        <w:t xml:space="preserve"> </w:t>
+      </w:r>
+      <w:r>
+        <w:t xml:space="preserve">“</w:t>
+      </w:r>
+      <w:r>
+        <w:t xml:space="preserve">Total</w:t>
+      </w:r>
+      <w:r>
+        <w:t xml:space="preserve">”</w:t>
+      </w:r>
+      <w:r>
+        <w:t xml:space="preserve"> </w:t>
+      </w:r>
+      <w:r>
+        <w:t xml:space="preserve">uses symmetric wall-clock boundaries for all post-initialization updates and route requests; engine construction and initial synchronization are reported separately in the JSON. The values validate implementation behavior, not Chennai travel outcomes or general performance.</w:t>
+      </w:r>
+    </w:p>
+    <w:bookmarkEnd w:id="99"/>
+    <w:bookmarkStart w:id="101" w:name="epsilon-sensitivity"/>
     <w:p>
       <w:pPr>
         <w:pStyle w:val="Heading3"/>
@@ -7319,7 +7428,7 @@
       <w:r>
         <w:t xml:space="preserve"> </w:t>
       </w:r>
-      <w:hyperlink r:id="rId99">
+      <w:hyperlink r:id="rId100">
         <w:r>
           <w:rPr>
             <w:rStyle w:val="VerbatimChar"/>
@@ -7331,9 +7440,9 @@
         <w:t xml:space="preserve">.</w:t>
       </w:r>
     </w:p>
-    <w:bookmarkEnd w:id="100"/>
     <w:bookmarkEnd w:id="101"/>
-    <w:bookmarkStart w:id="105" w:name="evaluation-plan"/>
+    <w:bookmarkEnd w:id="102"/>
+    <w:bookmarkStart w:id="106" w:name="evaluation-plan"/>
     <w:p>
       <w:pPr>
         <w:pStyle w:val="Heading2"/>
@@ -7342,7 +7451,7 @@
         <w:t xml:space="preserve">12. Evaluation Plan</w:t>
       </w:r>
     </w:p>
-    <w:bookmarkStart w:id="102" w:name="baselines"/>
+    <w:bookmarkStart w:id="103" w:name="baselines"/>
     <w:p>
       <w:pPr>
         <w:pStyle w:val="Heading3"/>
@@ -7435,8 +7544,8 @@
         <w:t xml:space="preserve">independent versus projected-load-aware assignments.</w:t>
       </w:r>
     </w:p>
-    <w:bookmarkEnd w:id="102"/>
-    <w:bookmarkStart w:id="103" w:name="ablations"/>
+    <w:bookmarkEnd w:id="103"/>
+    <w:bookmarkStart w:id="104" w:name="ablations"/>
     <w:p>
       <w:pPr>
         <w:pStyle w:val="Heading3"/>
@@ -7529,8 +7638,8 @@
         <w:t xml:space="preserve">compliance levels 0–100%.</w:t>
       </w:r>
     </w:p>
-    <w:bookmarkEnd w:id="103"/>
-    <w:bookmarkStart w:id="104" w:name="metrics"/>
+    <w:bookmarkEnd w:id="104"/>
+    <w:bookmarkStart w:id="105" w:name="metrics"/>
     <w:p>
       <w:pPr>
         <w:pStyle w:val="Heading3"/>
@@ -7863,9 +7972,9 @@
         </w:tc>
       </w:tr>
     </w:tbl>
-    <w:bookmarkEnd w:id="104"/>
     <w:bookmarkEnd w:id="105"/>
-    <w:bookmarkStart w:id="106" w:name="reproducibility"/>
+    <w:bookmarkEnd w:id="106"/>
+    <w:bookmarkStart w:id="107" w:name="reproducibility"/>
     <w:p>
       <w:pPr>
         <w:pStyle w:val="Heading2"/>
@@ -8206,8 +8315,8 @@
         <w:t xml:space="preserve">Remote OSM/OpenCity inputs remain mutable until dated snapshots and checksums are committed. Synthetic experiment results are deterministic apart from timing.</w:t>
       </w:r>
     </w:p>
-    <w:bookmarkEnd w:id="106"/>
-    <w:bookmarkStart w:id="107" w:name="feasibility-and-remaining-uncertainty"/>
+    <w:bookmarkEnd w:id="107"/>
+    <w:bookmarkStart w:id="108" w:name="feasibility-and-remaining-uncertainty"/>
     <w:p>
       <w:pPr>
         <w:pStyle w:val="Heading2"/>
@@ -8260,8 +8369,8 @@
         <w:t xml:space="preserve">The core remains feasible using historical replay and labelled simulation without paid APIs.</w:t>
       </w:r>
     </w:p>
-    <w:bookmarkEnd w:id="107"/>
-    <w:bookmarkStart w:id="108" w:name="limitations"/>
+    <w:bookmarkEnd w:id="108"/>
+    <w:bookmarkStart w:id="109" w:name="limitations"/>
     <w:p>
       <w:pPr>
         <w:pStyle w:val="Heading2"/>
@@ -8462,8 +8571,8 @@
         <w:t xml:space="preserve">A literature audit cannot prove universal novelty.</w:t>
       </w:r>
     </w:p>
-    <w:bookmarkEnd w:id="108"/>
-    <w:bookmarkStart w:id="109" w:name="final-project-summary"/>
+    <w:bookmarkEnd w:id="109"/>
+    <w:bookmarkStart w:id="110" w:name="final-project-summary"/>
     <w:p>
       <w:pPr>
         <w:pStyle w:val="Heading2"/>
@@ -8799,7 +8908,7 @@
         </w:tc>
       </w:tr>
     </w:tbl>
-    <w:bookmarkEnd w:id="109"/>
+    <w:bookmarkEnd w:id="110"/>
     <w:bookmarkStart w:id="113" w:name="master-resource-table"/>
     <w:p>
       <w:pPr>
@@ -8883,7 +8992,7 @@
               <w:pStyle w:val="Compact"/>
               <w:jc w:val="left"/>
             </w:pPr>
-            <w:hyperlink r:id="rId110">
+            <w:hyperlink r:id="rId111">
               <w:r>
                 <w:rPr>
                   <w:rStyle w:val="Hyperlink"/>
@@ -8993,7 +9102,7 @@
               <w:pStyle w:val="Compact"/>
               <w:jc w:val="left"/>
             </w:pPr>
-            <w:hyperlink r:id="rId111">
+            <w:hyperlink r:id="rId59">
               <w:r>
                 <w:rPr>
                   <w:rStyle w:val="Hyperlink"/>
@@ -9048,7 +9157,7 @@
               <w:pStyle w:val="Compact"/>
               <w:jc w:val="left"/>
             </w:pPr>
-            <w:hyperlink r:id="rId62">
+            <w:hyperlink r:id="rId63">
               <w:r>
                 <w:rPr>
                   <w:rStyle w:val="Hyperlink"/>
@@ -9103,7 +9212,7 @@
               <w:pStyle w:val="Compact"/>
               <w:jc w:val="left"/>
             </w:pPr>
-            <w:hyperlink r:id="rId66">
+            <w:hyperlink r:id="rId67">
               <w:r>
                 <w:rPr>
                   <w:rStyle w:val="Hyperlink"/>
@@ -9158,7 +9267,7 @@
               <w:pStyle w:val="Compact"/>
               <w:jc w:val="left"/>
             </w:pPr>
-            <w:hyperlink r:id="rId67">
+            <w:hyperlink r:id="rId68">
               <w:r>
                 <w:rPr>
                   <w:rStyle w:val="Hyperlink"/>
@@ -9213,7 +9322,7 @@
               <w:pStyle w:val="Compact"/>
               <w:jc w:val="left"/>
             </w:pPr>
-            <w:hyperlink r:id="rId70">
+            <w:hyperlink r:id="rId71">
               <w:r>
                 <w:rPr>
                   <w:rStyle w:val="Hyperlink"/>
@@ -9323,7 +9432,7 @@
               <w:pStyle w:val="Compact"/>
               <w:jc w:val="left"/>
             </w:pPr>
-            <w:hyperlink r:id="rId74">
+            <w:hyperlink r:id="rId75">
               <w:r>
                 <w:rPr>
                   <w:rStyle w:val="Hyperlink"/>
@@ -9378,7 +9487,7 @@
               <w:pStyle w:val="Compact"/>
               <w:jc w:val="left"/>
             </w:pPr>
-            <w:hyperlink r:id="rId77">
+            <w:hyperlink r:id="rId78">
               <w:r>
                 <w:rPr>
                   <w:rStyle w:val="Hyperlink"/>

</xml_diff>

<commit_message>
Regenerate streamlined Word paper
Co-authored-by: rohit michael <rohitmichael-alt@users.noreply.github.com>
</commit_message>
<xml_diff>
--- a/docs/PROJECT_RESEARCH_AND_EVIDENCE.docx
+++ b/docs/PROJECT_RESEARCH_AND_EVIDENCE.docx
@@ -28,7 +28,7 @@
         </w:p>
       </w:sdtContent>
     </w:sdt>
-    <w:bookmarkStart w:id="115" w:name="Xd3382af488ce2996da400d0130c7cadeb69cdc7"/>
+    <w:bookmarkStart w:id="112" w:name="Xd3382af488ce2996da400d0130c7cadeb69cdc7"/>
     <w:p>
       <w:pPr>
         <w:pStyle w:val="Heading1"/>
@@ -509,7 +509,7 @@
         <w:pStyle w:val="BlockText"/>
       </w:pPr>
       <w:r>
-        <w:t xml:space="preserve">A reproducible Chennai-oriented compound-disruption framework that applies an established monotone lower/upper-bound certificate as a query-level CCH refresh gate, and experimentally separates routing-index performance from the traffic effects of stable, projected-load-aware route adoption.</w:t>
+        <w:t xml:space="preserve">A reproducible Chennai-oriented compound-disruption framework that applies an established monotone lower/upper-bound certificate as a query-level CCH refresh gate, and is designed to experimentally separate routing-index performance from the traffic effects of stable, projected-load-aware route adoption.</w:t>
       </w:r>
     </w:p>
     <w:p>
@@ -7371,7 +7371,7 @@
         <w:pStyle w:val="BodyText"/>
       </w:pPr>
       <w:r>
-        <w:t xml:space="preserve">There were zero certificate violations, zero exact post-refresh mismatches, and zero CCH-versus-independent-Dijkstra oracle mismatches. The monotone workload produced the largest reduction because the lower bound remained valid. Mixed decreases correctly forced frequent refreshes; in this single run, certificate overhead made mixed CCH slightly slower than eager CCH.</w:t>
+        <w:t xml:space="preserve">There were zero certificate violations, zero exact post-refresh mismatches, and zero CCH-versus-independent-Dijkstra oracle mismatches. The monotone workload produced the largest reduction because the lower bound remained valid. Mixed decreases correctly forced frequent refreshes; in this single run, lazy CCH was slightly slower than eager CCH.</w:t>
       </w:r>
     </w:p>
     <w:p>
@@ -7397,7 +7397,25 @@
         <w:t xml:space="preserve"> </w:t>
       </w:r>
       <w:r>
-        <w:t xml:space="preserve">uses symmetric wall-clock boundaries for all post-initialization updates and route requests; engine construction and initial synchronization are reported separately in the JSON. The values validate implementation behavior, not Chennai travel outcomes or general performance.</w:t>
+        <w:t xml:space="preserve">uses symmetric wall-clock boundaries for all post-initialization updates and route requests. Engine construction is reported separately; synchronization diagnostics combine initial and later synchronizations and should not be added to</w:t>
+      </w:r>
+      <w:r>
+        <w:t xml:space="preserve"> </w:t>
+      </w:r>
+      <w:r>
+        <w:t xml:space="preserve">“</w:t>
+      </w:r>
+      <w:r>
+        <w:t xml:space="preserve">Total.</w:t>
+      </w:r>
+      <w:r>
+        <w:t xml:space="preserve">”</w:t>
+      </w:r>
+      <w:r>
+        <w:t xml:space="preserve"> </w:t>
+      </w:r>
+      <w:r>
+        <w:t xml:space="preserve">The values validate implementation behavior, not Chennai travel outcomes or general performance.</w:t>
       </w:r>
     </w:p>
     <w:bookmarkEnd w:id="99"/>
@@ -8909,1025 +8927,13 @@
       </w:tr>
     </w:tbl>
     <w:bookmarkEnd w:id="110"/>
-    <w:bookmarkStart w:id="113" w:name="master-resource-table"/>
+    <w:bookmarkStart w:id="111" w:name="research-claim-boundary"/>
     <w:p>
       <w:pPr>
         <w:pStyle w:val="Heading2"/>
       </w:pPr>
       <w:r>
-        <w:t xml:space="preserve">17. Master Resource Table</w:t>
-      </w:r>
-    </w:p>
-    <w:tbl>
-      <w:tblPr>
-        <w:tblStyle w:val="Table"/>
-        <w:tblW w:type="pct" w:w="5000"/>
-        <w:tblLook w:firstRow="1" w:lastRow="0" w:firstColumn="0" w:lastColumn="0" w:noHBand="0" w:noVBand="0" w:val="0020"/>
-        <w:jc w:val="start"/>
-      </w:tblPr>
-      <w:tblGrid>
-        <w:gridCol w:w="1980"/>
-        <w:gridCol w:w="1980"/>
-        <w:gridCol w:w="1980"/>
-        <w:gridCol w:w="1980"/>
-      </w:tblGrid>
-      <w:tr>
-        <w:trPr>
-          <w:tblHeader w:val="true"/>
-        </w:trPr>
-        <w:tc>
-          <w:tcPr/>
-          <w:p>
-            <w:pPr>
-              <w:pStyle w:val="Compact"/>
-              <w:jc w:val="left"/>
-            </w:pPr>
-            <w:r>
-              <w:t xml:space="preserve">Resource</w:t>
-            </w:r>
-          </w:p>
-        </w:tc>
-        <w:tc>
-          <w:tcPr/>
-          <w:p>
-            <w:pPr>
-              <w:pStyle w:val="Compact"/>
-              <w:jc w:val="left"/>
-            </w:pPr>
-            <w:r>
-              <w:t xml:space="preserve">Purpose</w:t>
-            </w:r>
-          </w:p>
-        </w:tc>
-        <w:tc>
-          <w:tcPr/>
-          <w:p>
-            <w:pPr>
-              <w:pStyle w:val="Compact"/>
-              <w:jc w:val="left"/>
-            </w:pPr>
-            <w:r>
-              <w:t xml:space="preserve">Access</w:t>
-            </w:r>
-          </w:p>
-        </w:tc>
-        <w:tc>
-          <w:tcPr/>
-          <w:p>
-            <w:pPr>
-              <w:pStyle w:val="Compact"/>
-              <w:jc w:val="left"/>
-            </w:pPr>
-            <w:r>
-              <w:t xml:space="preserve">Status</w:t>
-            </w:r>
-          </w:p>
-        </w:tc>
-      </w:tr>
-      <w:tr>
-        <w:tc>
-          <w:tcPr/>
-          <w:p>
-            <w:pPr>
-              <w:pStyle w:val="Compact"/>
-              <w:jc w:val="left"/>
-            </w:pPr>
-            <w:hyperlink r:id="rId111">
-              <w:r>
-                <w:rPr>
-                  <w:rStyle w:val="Hyperlink"/>
-                </w:rPr>
-                <w:t xml:space="preserve">OpenStreetMap</w:t>
-              </w:r>
-            </w:hyperlink>
-          </w:p>
-        </w:tc>
-        <w:tc>
-          <w:tcPr/>
-          <w:p>
-            <w:pPr>
-              <w:pStyle w:val="Compact"/>
-              <w:jc w:val="left"/>
-            </w:pPr>
-            <w:r>
-              <w:t xml:space="preserve">Road topology</w:t>
-            </w:r>
-          </w:p>
-        </w:tc>
-        <w:tc>
-          <w:tcPr/>
-          <w:p>
-            <w:pPr>
-              <w:pStyle w:val="Compact"/>
-              <w:jc w:val="left"/>
-            </w:pPr>
-            <w:r>
-              <w:t xml:space="preserve">Open/ODbL</w:t>
-            </w:r>
-          </w:p>
-        </w:tc>
-        <w:tc>
-          <w:tcPr/>
-          <w:p>
-            <w:pPr>
-              <w:pStyle w:val="Compact"/>
-              <w:jc w:val="left"/>
-            </w:pPr>
-            <w:r>
-              <w:t xml:space="preserve">Stage 1/core</w:t>
-            </w:r>
-          </w:p>
-        </w:tc>
-      </w:tr>
-      <w:tr>
-        <w:tc>
-          <w:tcPr/>
-          <w:p>
-            <w:pPr>
-              <w:pStyle w:val="Compact"/>
-              <w:jc w:val="left"/>
-            </w:pPr>
-            <w:hyperlink r:id="rId58">
-              <w:r>
-                <w:rPr>
-                  <w:rStyle w:val="Hyperlink"/>
-                </w:rPr>
-                <w:t xml:space="preserve">OpenCity Floods 2015</w:t>
-              </w:r>
-            </w:hyperlink>
-          </w:p>
-        </w:tc>
-        <w:tc>
-          <w:tcPr/>
-          <w:p>
-            <w:pPr>
-              <w:pStyle w:val="Compact"/>
-              <w:jc w:val="left"/>
-            </w:pPr>
-            <w:r>
-              <w:t xml:space="preserve">Historical flood evidence</w:t>
-            </w:r>
-          </w:p>
-        </w:tc>
-        <w:tc>
-          <w:tcPr/>
-          <w:p>
-            <w:pPr>
-              <w:pStyle w:val="Compact"/>
-              <w:jc w:val="left"/>
-            </w:pPr>
-            <w:r>
-              <w:t xml:space="preserve">Public KML</w:t>
-            </w:r>
-          </w:p>
-        </w:tc>
-        <w:tc>
-          <w:tcPr/>
-          <w:p>
-            <w:pPr>
-              <w:pStyle w:val="Compact"/>
-              <w:jc w:val="left"/>
-            </w:pPr>
-            <w:r>
-              <w:t xml:space="preserve">Stage 1/core</w:t>
-            </w:r>
-          </w:p>
-        </w:tc>
-      </w:tr>
-      <w:tr>
-        <w:tc>
-          <w:tcPr/>
-          <w:p>
-            <w:pPr>
-              <w:pStyle w:val="Compact"/>
-              <w:jc w:val="left"/>
-            </w:pPr>
-            <w:hyperlink r:id="rId59">
-              <w:r>
-                <w:rPr>
-                  <w:rStyle w:val="Hyperlink"/>
-                </w:rPr>
-                <w:t xml:space="preserve">OpenCity flooding</w:t>
-              </w:r>
-            </w:hyperlink>
-          </w:p>
-        </w:tc>
-        <w:tc>
-          <w:tcPr/>
-          <w:p>
-            <w:pPr>
-              <w:pStyle w:val="Compact"/>
-              <w:jc w:val="left"/>
-            </w:pPr>
-            <w:r>
-              <w:t xml:space="preserve">Depth/hazard evidence</w:t>
-            </w:r>
-          </w:p>
-        </w:tc>
-        <w:tc>
-          <w:tcPr/>
-          <w:p>
-            <w:pPr>
-              <w:pStyle w:val="Compact"/>
-              <w:jc w:val="left"/>
-            </w:pPr>
-            <w:r>
-              <w:t xml:space="preserve">Public KML</w:t>
-            </w:r>
-          </w:p>
-        </w:tc>
-        <w:tc>
-          <w:tcPr/>
-          <w:p>
-            <w:pPr>
-              <w:pStyle w:val="Compact"/>
-              <w:jc w:val="left"/>
-            </w:pPr>
-            <w:r>
-              <w:t xml:space="preserve">Planned</w:t>
-            </w:r>
-          </w:p>
-        </w:tc>
-      </w:tr>
-      <w:tr>
-        <w:tc>
-          <w:tcPr/>
-          <w:p>
-            <w:pPr>
-              <w:pStyle w:val="Compact"/>
-              <w:jc w:val="left"/>
-            </w:pPr>
-            <w:hyperlink r:id="rId63">
-              <w:r>
-                <w:rPr>
-                  <w:rStyle w:val="Hyperlink"/>
-                </w:rPr>
-                <w:t xml:space="preserve">GPM IMERG</w:t>
-              </w:r>
-            </w:hyperlink>
-          </w:p>
-        </w:tc>
-        <w:tc>
-          <w:tcPr/>
-          <w:p>
-            <w:pPr>
-              <w:pStyle w:val="Compact"/>
-              <w:jc w:val="left"/>
-            </w:pPr>
-            <w:r>
-              <w:t xml:space="preserve">Rainfall</w:t>
-            </w:r>
-          </w:p>
-        </w:tc>
-        <w:tc>
-          <w:tcPr/>
-          <w:p>
-            <w:pPr>
-              <w:pStyle w:val="Compact"/>
-              <w:jc w:val="left"/>
-            </w:pPr>
-            <w:r>
-              <w:t xml:space="preserve">Free Earthdata account</w:t>
-            </w:r>
-          </w:p>
-        </w:tc>
-        <w:tc>
-          <w:tcPr/>
-          <w:p>
-            <w:pPr>
-              <w:pStyle w:val="Compact"/>
-              <w:jc w:val="left"/>
-            </w:pPr>
-            <w:r>
-              <w:t xml:space="preserve">Planned</w:t>
-            </w:r>
-          </w:p>
-        </w:tc>
-      </w:tr>
-      <w:tr>
-        <w:tc>
-          <w:tcPr/>
-          <w:p>
-            <w:pPr>
-              <w:pStyle w:val="Compact"/>
-              <w:jc w:val="left"/>
-            </w:pPr>
-            <w:hyperlink r:id="rId67">
-              <w:r>
-                <w:rPr>
-                  <w:rStyle w:val="Hyperlink"/>
-                </w:rPr>
-                <w:t xml:space="preserve">SRTMGL1</w:t>
-              </w:r>
-            </w:hyperlink>
-          </w:p>
-        </w:tc>
-        <w:tc>
-          <w:tcPr/>
-          <w:p>
-            <w:pPr>
-              <w:pStyle w:val="Compact"/>
-              <w:jc w:val="left"/>
-            </w:pPr>
-            <w:r>
-              <w:t xml:space="preserve">Terrain</w:t>
-            </w:r>
-          </w:p>
-        </w:tc>
-        <w:tc>
-          <w:tcPr/>
-          <w:p>
-            <w:pPr>
-              <w:pStyle w:val="Compact"/>
-              <w:jc w:val="left"/>
-            </w:pPr>
-            <w:r>
-              <w:t xml:space="preserve">Free Earthdata account</w:t>
-            </w:r>
-          </w:p>
-        </w:tc>
-        <w:tc>
-          <w:tcPr/>
-          <w:p>
-            <w:pPr>
-              <w:pStyle w:val="Compact"/>
-              <w:jc w:val="left"/>
-            </w:pPr>
-            <w:r>
-              <w:t xml:space="preserve">Supporting</w:t>
-            </w:r>
-          </w:p>
-        </w:tc>
-      </w:tr>
-      <w:tr>
-        <w:tc>
-          <w:tcPr/>
-          <w:p>
-            <w:pPr>
-              <w:pStyle w:val="Compact"/>
-              <w:jc w:val="left"/>
-            </w:pPr>
-            <w:hyperlink r:id="rId68">
-              <w:r>
-                <w:rPr>
-                  <w:rStyle w:val="Hyperlink"/>
-                </w:rPr>
-                <w:t xml:space="preserve">Chennai drains</w:t>
-              </w:r>
-            </w:hyperlink>
-          </w:p>
-        </w:tc>
-        <w:tc>
-          <w:tcPr/>
-          <w:p>
-            <w:pPr>
-              <w:pStyle w:val="Compact"/>
-              <w:jc w:val="left"/>
-            </w:pPr>
-            <w:r>
-              <w:t xml:space="preserve">Hydrological context</w:t>
-            </w:r>
-          </w:p>
-        </w:tc>
-        <w:tc>
-          <w:tcPr/>
-          <w:p>
-            <w:pPr>
-              <w:pStyle w:val="Compact"/>
-              <w:jc w:val="left"/>
-            </w:pPr>
-            <w:r>
-              <w:t xml:space="preserve">Public</w:t>
-            </w:r>
-          </w:p>
-        </w:tc>
-        <w:tc>
-          <w:tcPr/>
-          <w:p>
-            <w:pPr>
-              <w:pStyle w:val="Compact"/>
-              <w:jc w:val="left"/>
-            </w:pPr>
-            <w:r>
-              <w:t xml:space="preserve">Supporting</w:t>
-            </w:r>
-          </w:p>
-        </w:tc>
-      </w:tr>
-      <w:tr>
-        <w:tc>
-          <w:tcPr/>
-          <w:p>
-            <w:pPr>
-              <w:pStyle w:val="Compact"/>
-              <w:jc w:val="left"/>
-            </w:pPr>
-            <w:hyperlink r:id="rId71">
-              <w:r>
-                <w:rPr>
-                  <w:rStyle w:val="Hyperlink"/>
-                </w:rPr>
-                <w:t xml:space="preserve">SUMO</w:t>
-              </w:r>
-            </w:hyperlink>
-          </w:p>
-        </w:tc>
-        <w:tc>
-          <w:tcPr/>
-          <w:p>
-            <w:pPr>
-              <w:pStyle w:val="Compact"/>
-              <w:jc w:val="left"/>
-            </w:pPr>
-            <w:r>
-              <w:t xml:space="preserve">Traffic simulation</w:t>
-            </w:r>
-          </w:p>
-        </w:tc>
-        <w:tc>
-          <w:tcPr/>
-          <w:p>
-            <w:pPr>
-              <w:pStyle w:val="Compact"/>
-              <w:jc w:val="left"/>
-            </w:pPr>
-            <w:r>
-              <w:t xml:space="preserve">Open source</w:t>
-            </w:r>
-          </w:p>
-        </w:tc>
-        <w:tc>
-          <w:tcPr/>
-          <w:p>
-            <w:pPr>
-              <w:pStyle w:val="Compact"/>
-              <w:jc w:val="left"/>
-            </w:pPr>
-            <w:r>
-              <w:t xml:space="preserve">Planned</w:t>
-            </w:r>
-          </w:p>
-        </w:tc>
-      </w:tr>
-      <w:tr>
-        <w:tc>
-          <w:tcPr/>
-          <w:p>
-            <w:pPr>
-              <w:pStyle w:val="Compact"/>
-              <w:jc w:val="left"/>
-            </w:pPr>
-            <w:hyperlink r:id="rId112">
-              <w:r>
-                <w:rPr>
-                  <w:rStyle w:val="Hyperlink"/>
-                </w:rPr>
-                <w:t xml:space="preserve">RoutingKit CCH binding</w:t>
-              </w:r>
-            </w:hyperlink>
-          </w:p>
-        </w:tc>
-        <w:tc>
-          <w:tcPr/>
-          <w:p>
-            <w:pPr>
-              <w:pStyle w:val="Compact"/>
-              <w:jc w:val="left"/>
-            </w:pPr>
-            <w:r>
-              <w:t xml:space="preserve">CCH path engine</w:t>
-            </w:r>
-          </w:p>
-        </w:tc>
-        <w:tc>
-          <w:tcPr/>
-          <w:p>
-            <w:pPr>
-              <w:pStyle w:val="Compact"/>
-              <w:jc w:val="left"/>
-            </w:pPr>
-            <w:r>
-              <w:t xml:space="preserve">Open package</w:t>
-            </w:r>
-          </w:p>
-        </w:tc>
-        <w:tc>
-          <w:tcPr/>
-          <w:p>
-            <w:pPr>
-              <w:pStyle w:val="Compact"/>
-              <w:jc w:val="left"/>
-            </w:pPr>
-            <w:r>
-              <w:t xml:space="preserve">Implemented experiment</w:t>
-            </w:r>
-          </w:p>
-        </w:tc>
-      </w:tr>
-      <w:tr>
-        <w:tc>
-          <w:tcPr/>
-          <w:p>
-            <w:pPr>
-              <w:pStyle w:val="Compact"/>
-              <w:jc w:val="left"/>
-            </w:pPr>
-            <w:hyperlink r:id="rId75">
-              <w:r>
-                <w:rPr>
-                  <w:rStyle w:val="Hyperlink"/>
-                </w:rPr>
-                <w:t xml:space="preserve">Facility datasets</w:t>
-              </w:r>
-            </w:hyperlink>
-          </w:p>
-        </w:tc>
-        <w:tc>
-          <w:tcPr/>
-          <w:p>
-            <w:pPr>
-              <w:pStyle w:val="Compact"/>
-              <w:jc w:val="left"/>
-            </w:pPr>
-            <w:r>
-              <w:t xml:space="preserve">Accessibility evaluation</w:t>
-            </w:r>
-          </w:p>
-        </w:tc>
-        <w:tc>
-          <w:tcPr/>
-          <w:p>
-            <w:pPr>
-              <w:pStyle w:val="Compact"/>
-              <w:jc w:val="left"/>
-            </w:pPr>
-            <w:r>
-              <w:t xml:space="preserve">Public</w:t>
-            </w:r>
-          </w:p>
-        </w:tc>
-        <w:tc>
-          <w:tcPr/>
-          <w:p>
-            <w:pPr>
-              <w:pStyle w:val="Compact"/>
-              <w:jc w:val="left"/>
-            </w:pPr>
-            <w:r>
-              <w:t xml:space="preserve">Planned</w:t>
-            </w:r>
-          </w:p>
-        </w:tc>
-      </w:tr>
-      <w:tr>
-        <w:tc>
-          <w:tcPr/>
-          <w:p>
-            <w:pPr>
-              <w:pStyle w:val="Compact"/>
-              <w:jc w:val="left"/>
-            </w:pPr>
-            <w:hyperlink r:id="rId78">
-              <w:r>
-                <w:rPr>
-                  <w:rStyle w:val="Hyperlink"/>
-                </w:rPr>
-                <w:t xml:space="preserve">WorldPop India</w:t>
-              </w:r>
-            </w:hyperlink>
-          </w:p>
-        </w:tc>
-        <w:tc>
-          <w:tcPr/>
-          <w:p>
-            <w:pPr>
-              <w:pStyle w:val="Compact"/>
-              <w:jc w:val="left"/>
-            </w:pPr>
-            <w:r>
-              <w:t xml:space="preserve">Population weighting</w:t>
-            </w:r>
-          </w:p>
-        </w:tc>
-        <w:tc>
-          <w:tcPr/>
-          <w:p>
-            <w:pPr>
-              <w:pStyle w:val="Compact"/>
-              <w:jc w:val="left"/>
-            </w:pPr>
-            <w:r>
-              <w:t xml:space="preserve">Public</w:t>
-            </w:r>
-          </w:p>
-        </w:tc>
-        <w:tc>
-          <w:tcPr/>
-          <w:p>
-            <w:pPr>
-              <w:pStyle w:val="Compact"/>
-              <w:jc w:val="left"/>
-            </w:pPr>
-            <w:r>
-              <w:t xml:space="preserve">Planned</w:t>
-            </w:r>
-          </w:p>
-        </w:tc>
-      </w:tr>
-      <w:tr>
-        <w:tc>
-          <w:tcPr/>
-          <w:p>
-            <w:pPr>
-              <w:pStyle w:val="Compact"/>
-              <w:jc w:val="left"/>
-            </w:pPr>
-            <w:hyperlink r:id="rId24">
-              <w:r>
-                <w:rPr>
-                  <w:rStyle w:val="Hyperlink"/>
-                </w:rPr>
-                <w:t xml:space="preserve">CPD-Search</w:t>
-              </w:r>
-            </w:hyperlink>
-          </w:p>
-        </w:tc>
-        <w:tc>
-          <w:tcPr/>
-          <w:p>
-            <w:pPr>
-              <w:pStyle w:val="Compact"/>
-              <w:jc w:val="left"/>
-            </w:pPr>
-            <w:r>
-              <w:t xml:space="preserve">Closest certificate prior art</w:t>
-            </w:r>
-          </w:p>
-        </w:tc>
-        <w:tc>
-          <w:tcPr/>
-          <w:p>
-            <w:pPr>
-              <w:pStyle w:val="Compact"/>
-              <w:jc w:val="left"/>
-            </w:pPr>
-            <w:r>
-              <w:t xml:space="preserve">DOI/paper</w:t>
-            </w:r>
-          </w:p>
-        </w:tc>
-        <w:tc>
-          <w:tcPr/>
-          <w:p>
-            <w:pPr>
-              <w:pStyle w:val="Compact"/>
-              <w:jc w:val="left"/>
-            </w:pPr>
-            <w:r>
-              <w:t xml:space="preserve">Required citation</w:t>
-            </w:r>
-          </w:p>
-        </w:tc>
-      </w:tr>
-      <w:tr>
-        <w:tc>
-          <w:tcPr/>
-          <w:p>
-            <w:pPr>
-              <w:pStyle w:val="Compact"/>
-              <w:jc w:val="left"/>
-            </w:pPr>
-            <w:hyperlink r:id="rId26">
-              <w:r>
-                <w:rPr>
-                  <w:rStyle w:val="Hyperlink"/>
-                </w:rPr>
-                <w:t xml:space="preserve">CCH</w:t>
-              </w:r>
-            </w:hyperlink>
-          </w:p>
-        </w:tc>
-        <w:tc>
-          <w:tcPr/>
-          <w:p>
-            <w:pPr>
-              <w:pStyle w:val="Compact"/>
-              <w:jc w:val="left"/>
-            </w:pPr>
-            <w:r>
-              <w:t xml:space="preserve">Routing algorithm</w:t>
-            </w:r>
-          </w:p>
-        </w:tc>
-        <w:tc>
-          <w:tcPr/>
-          <w:p>
-            <w:pPr>
-              <w:pStyle w:val="Compact"/>
-              <w:jc w:val="left"/>
-            </w:pPr>
-            <w:r>
-              <w:t xml:space="preserve">DOI/paper</w:t>
-            </w:r>
-          </w:p>
-        </w:tc>
-        <w:tc>
-          <w:tcPr/>
-          <w:p>
-            <w:pPr>
-              <w:pStyle w:val="Compact"/>
-              <w:jc w:val="left"/>
-            </w:pPr>
-            <w:r>
-              <w:t xml:space="preserve">Required citation</w:t>
-            </w:r>
-          </w:p>
-        </w:tc>
-      </w:tr>
-      <w:tr>
-        <w:tc>
-          <w:tcPr/>
-          <w:p>
-            <w:pPr>
-              <w:pStyle w:val="Compact"/>
-              <w:jc w:val="left"/>
-            </w:pPr>
-            <w:hyperlink r:id="rId27">
-              <w:r>
-                <w:rPr>
-                  <w:rStyle w:val="Hyperlink"/>
-                </w:rPr>
-                <w:t xml:space="preserve">Engineered CCH</w:t>
-              </w:r>
-            </w:hyperlink>
-          </w:p>
-        </w:tc>
-        <w:tc>
-          <w:tcPr/>
-          <w:p>
-            <w:pPr>
-              <w:pStyle w:val="Compact"/>
-              <w:jc w:val="left"/>
-            </w:pPr>
-            <w:r>
-              <w:t xml:space="preserve">BPR traffic assignment</w:t>
-            </w:r>
-          </w:p>
-        </w:tc>
-        <w:tc>
-          <w:tcPr/>
-          <w:p>
-            <w:pPr>
-              <w:pStyle w:val="Compact"/>
-              <w:jc w:val="left"/>
-            </w:pPr>
-            <w:r>
-              <w:t xml:space="preserve">DOI/paper</w:t>
-            </w:r>
-          </w:p>
-        </w:tc>
-        <w:tc>
-          <w:tcPr/>
-          <w:p>
-            <w:pPr>
-              <w:pStyle w:val="Compact"/>
-              <w:jc w:val="left"/>
-            </w:pPr>
-            <w:r>
-              <w:t xml:space="preserve">Required citation</w:t>
-            </w:r>
-          </w:p>
-        </w:tc>
-      </w:tr>
-      <w:tr>
-        <w:tc>
-          <w:tcPr/>
-          <w:p>
-            <w:pPr>
-              <w:pStyle w:val="Compact"/>
-              <w:jc w:val="left"/>
-            </w:pPr>
-            <w:hyperlink r:id="rId28">
-              <w:r>
-                <w:rPr>
-                  <w:rStyle w:val="Hyperlink"/>
-                </w:rPr>
-                <w:t xml:space="preserve">Dynamic CCH rerouting</w:t>
-              </w:r>
-            </w:hyperlink>
-          </w:p>
-        </w:tc>
-        <w:tc>
-          <w:tcPr/>
-          <w:p>
-            <w:pPr>
-              <w:pStyle w:val="Compact"/>
-              <w:jc w:val="left"/>
-            </w:pPr>
-            <w:r>
-              <w:t xml:space="preserve">Closest routing-system overlap</w:t>
-            </w:r>
-          </w:p>
-        </w:tc>
-        <w:tc>
-          <w:tcPr/>
-          <w:p>
-            <w:pPr>
-              <w:pStyle w:val="Compact"/>
-              <w:jc w:val="left"/>
-            </w:pPr>
-            <w:r>
-              <w:t xml:space="preserve">DOI/paper</w:t>
-            </w:r>
-          </w:p>
-        </w:tc>
-        <w:tc>
-          <w:tcPr/>
-          <w:p>
-            <w:pPr>
-              <w:pStyle w:val="Compact"/>
-              <w:jc w:val="left"/>
-            </w:pPr>
-            <w:r>
-              <w:t xml:space="preserve">Required citation</w:t>
-            </w:r>
-          </w:p>
-        </w:tc>
-      </w:tr>
-      <w:tr>
-        <w:tc>
-          <w:tcPr/>
-          <w:p>
-            <w:pPr>
-              <w:pStyle w:val="Compact"/>
-              <w:jc w:val="left"/>
-            </w:pPr>
-            <w:hyperlink r:id="rId29">
-              <w:r>
-                <w:rPr>
-                  <w:rStyle w:val="Hyperlink"/>
-                </w:rPr>
-                <w:t xml:space="preserve">CERT-FLOW</w:t>
-              </w:r>
-            </w:hyperlink>
-          </w:p>
-        </w:tc>
-        <w:tc>
-          <w:tcPr/>
-          <w:p>
-            <w:pPr>
-              <w:pStyle w:val="Compact"/>
-              <w:jc w:val="left"/>
-            </w:pPr>
-            <w:r>
-              <w:t xml:space="preserve">Certificate-gated stale routing</w:t>
-            </w:r>
-          </w:p>
-        </w:tc>
-        <w:tc>
-          <w:tcPr/>
-          <w:p>
-            <w:pPr>
-              <w:pStyle w:val="Compact"/>
-              <w:jc w:val="left"/>
-            </w:pPr>
-            <w:r>
-              <w:t xml:space="preserve">Preprint</w:t>
-            </w:r>
-          </w:p>
-        </w:tc>
-        <w:tc>
-          <w:tcPr/>
-          <w:p>
-            <w:pPr>
-              <w:pStyle w:val="Compact"/>
-              <w:jc w:val="left"/>
-            </w:pPr>
-            <w:r>
-              <w:t xml:space="preserve">Required caution</w:t>
-            </w:r>
-          </w:p>
-        </w:tc>
-      </w:tr>
-      <w:tr>
-        <w:tc>
-          <w:tcPr/>
-          <w:p>
-            <w:pPr>
-              <w:pStyle w:val="Compact"/>
-              <w:jc w:val="left"/>
-            </w:pPr>
-            <w:hyperlink r:id="rId34">
-              <w:r>
-                <w:rPr>
-                  <w:rStyle w:val="Hyperlink"/>
-                </w:rPr>
-                <w:t xml:space="preserve">Chennai relief routing</w:t>
-              </w:r>
-            </w:hyperlink>
-          </w:p>
-        </w:tc>
-        <w:tc>
-          <w:tcPr/>
-          <w:p>
-            <w:pPr>
-              <w:pStyle w:val="Compact"/>
-              <w:jc w:val="left"/>
-            </w:pPr>
-            <w:r>
-              <w:t xml:space="preserve">Local flood-routing prior art</w:t>
-            </w:r>
-          </w:p>
-        </w:tc>
-        <w:tc>
-          <w:tcPr/>
-          <w:p>
-            <w:pPr>
-              <w:pStyle w:val="Compact"/>
-              <w:jc w:val="left"/>
-            </w:pPr>
-            <w:r>
-              <w:t xml:space="preserve">DOI/paper</w:t>
-            </w:r>
-          </w:p>
-        </w:tc>
-        <w:tc>
-          <w:tcPr/>
-          <w:p>
-            <w:pPr>
-              <w:pStyle w:val="Compact"/>
-              <w:jc w:val="left"/>
-            </w:pPr>
-            <w:r>
-              <w:t xml:space="preserve">Required citation</w:t>
-            </w:r>
-          </w:p>
-        </w:tc>
-      </w:tr>
-      <w:tr>
-        <w:tc>
-          <w:tcPr/>
-          <w:p>
-            <w:pPr>
-              <w:pStyle w:val="Compact"/>
-              <w:jc w:val="left"/>
-            </w:pPr>
-            <w:hyperlink r:id="rId35">
-              <w:r>
-                <w:rPr>
-                  <w:rStyle w:val="Hyperlink"/>
-                </w:rPr>
-                <w:t xml:space="preserve">Chennai time-dependent routing</w:t>
-              </w:r>
-            </w:hyperlink>
-          </w:p>
-        </w:tc>
-        <w:tc>
-          <w:tcPr/>
-          <w:p>
-            <w:pPr>
-              <w:pStyle w:val="Compact"/>
-              <w:jc w:val="left"/>
-            </w:pPr>
-            <w:r>
-              <w:t xml:space="preserve">Local Dijkstra/A*/ALT prior art</w:t>
-            </w:r>
-          </w:p>
-        </w:tc>
-        <w:tc>
-          <w:tcPr/>
-          <w:p>
-            <w:pPr>
-              <w:pStyle w:val="Compact"/>
-              <w:jc w:val="left"/>
-            </w:pPr>
-            <w:r>
-              <w:t xml:space="preserve">DOI/paper</w:t>
-            </w:r>
-          </w:p>
-        </w:tc>
-        <w:tc>
-          <w:tcPr/>
-          <w:p>
-            <w:pPr>
-              <w:pStyle w:val="Compact"/>
-              <w:jc w:val="left"/>
-            </w:pPr>
-            <w:r>
-              <w:t xml:space="preserve">Required citation</w:t>
-            </w:r>
-          </w:p>
-        </w:tc>
-      </w:tr>
-    </w:tbl>
-    <w:bookmarkEnd w:id="113"/>
-    <w:bookmarkStart w:id="114" w:name="research-claim-boundary"/>
-    <w:p>
-      <w:pPr>
-        <w:pStyle w:val="Heading2"/>
-      </w:pPr>
-      <w:r>
-        <w:t xml:space="preserve">18. Research Claim Boundary</w:t>
+        <w:t xml:space="preserve">17. Research Claim Boundary</w:t>
       </w:r>
     </w:p>
     <w:p>
@@ -10050,8 +9056,8 @@
         <w:t xml:space="preserve">Those claims require completion of Stages 3–10.</w:t>
       </w:r>
     </w:p>
-    <w:bookmarkEnd w:id="114"/>
-    <w:bookmarkEnd w:id="115"/>
+    <w:bookmarkEnd w:id="111"/>
+    <w:bookmarkEnd w:id="112"/>
     <w:sectPr/>
   </w:body>
 </w:document>

</xml_diff>

<commit_message>
Regenerate professor document with historical strategy
Co-authored-by: rohit michael <rohitmichael-alt@users.noreply.github.com>
</commit_message>
<xml_diff>
--- a/docs/PROJECT_RESEARCH_AND_EVIDENCE.docx
+++ b/docs/PROJECT_RESEARCH_AND_EVIDENCE.docx
@@ -28,7 +28,7 @@
         </w:p>
       </w:sdtContent>
     </w:sdt>
-    <w:bookmarkStart w:id="112" w:name="Xd3382af488ce2996da400d0130c7cadeb69cdc7"/>
+    <w:bookmarkStart w:id="114" w:name="Xd3382af488ce2996da400d0130c7cadeb69cdc7"/>
     <w:p>
       <w:pPr>
         <w:pStyle w:val="Heading1"/>
@@ -352,7 +352,7 @@
       </w:r>
     </w:p>
     <w:bookmarkEnd w:id="22"/>
-    <w:bookmarkStart w:id="43" w:name="research-gap-and-contribution"/>
+    <w:bookmarkStart w:id="44" w:name="research-gap-and-contribution"/>
     <w:p>
       <w:pPr>
         <w:pStyle w:val="Heading2"/>
@@ -1302,8 +1302,152 @@
       </w:r>
     </w:p>
     <w:bookmarkEnd w:id="42"/>
+    <w:bookmarkStart w:id="43" w:name="historical-data-and-publication-validity"/>
+    <w:p>
+      <w:pPr>
+        <w:pStyle w:val="Heading3"/>
+      </w:pPr>
+      <w:r>
+        <w:t xml:space="preserve">4.5 Historical Data and Publication Validity</w:t>
+      </w:r>
+    </w:p>
+    <w:p>
+      <w:pPr>
+        <w:pStyle w:val="FirstParagraph"/>
+      </w:pPr>
+      <w:r>
+        <w:t xml:space="preserve">The absence of a public live Chennai traffic/closure feed does not prevent publication. The study must be framed as a</w:t>
+      </w:r>
+      <w:r>
+        <w:t xml:space="preserve"> </w:t>
+      </w:r>
+      <w:r>
+        <w:rPr>
+          <w:bCs/>
+          <w:b/>
+        </w:rPr>
+        <w:t xml:space="preserve">retrospective historical-event replay with simulated traffic</w:t>
+      </w:r>
+      <w:r>
+        <w:t xml:space="preserve">, not an operational live deployment.</w:t>
+      </w:r>
+    </w:p>
+    <w:p>
+      <w:pPr>
+        <w:pStyle w:val="BodyText"/>
+      </w:pPr>
+      <w:r>
+        <w:t xml:space="preserve">Historical evidence can strengthen reproducibility because every method is evaluated against the same dated event. The evaluation will:</w:t>
+      </w:r>
+    </w:p>
+    <w:p>
+      <w:pPr>
+        <w:numPr>
+          <w:ilvl w:val="0"/>
+          <w:numId w:val="1006"/>
+        </w:numPr>
+        <w:pStyle w:val="Compact"/>
+      </w:pPr>
+      <w:r>
+        <w:t xml:space="preserve">replay documented Chennai flood conditions and rainfall for declared dates;</w:t>
+      </w:r>
+    </w:p>
+    <w:p>
+      <w:pPr>
+        <w:numPr>
+          <w:ilvl w:val="0"/>
+          <w:numId w:val="1006"/>
+        </w:numPr>
+        <w:pStyle w:val="Compact"/>
+      </w:pPr>
+      <w:r>
+        <w:t xml:space="preserve">preserve source versions, retrieval dates, checksums, and spatial resolution;</w:t>
+      </w:r>
+    </w:p>
+    <w:p>
+      <w:pPr>
+        <w:numPr>
+          <w:ilvl w:val="0"/>
+          <w:numId w:val="1006"/>
+        </w:numPr>
+        <w:pStyle w:val="Compact"/>
+      </w:pPr>
+      <w:r>
+        <w:t xml:space="preserve">separate model calibration/sensitivity from held-out scenario evaluation;</w:t>
+      </w:r>
+    </w:p>
+    <w:p>
+      <w:pPr>
+        <w:numPr>
+          <w:ilvl w:val="0"/>
+          <w:numId w:val="1006"/>
+        </w:numPr>
+        <w:pStyle w:val="Compact"/>
+      </w:pPr>
+      <w:r>
+        <w:t xml:space="preserve">inject controlled 0/30/60/120-minute evidence lags and false-positive/false-negative road states;</w:t>
+      </w:r>
+    </w:p>
+    <w:p>
+      <w:pPr>
+        <w:numPr>
+          <w:ilvl w:val="0"/>
+          <w:numId w:val="1006"/>
+        </w:numPr>
+        <w:pStyle w:val="Compact"/>
+      </w:pPr>
+      <w:r>
+        <w:t xml:space="preserve">use repeated SUMO seeds and report confidence intervals;</w:t>
+      </w:r>
+    </w:p>
+    <w:p>
+      <w:pPr>
+        <w:numPr>
+          <w:ilvl w:val="0"/>
+          <w:numId w:val="1006"/>
+        </w:numPr>
+        <w:pStyle w:val="Compact"/>
+      </w:pPr>
+      <w:r>
+        <w:t xml:space="preserve">compare historical-evidence routing with perfect-information and no-flood baselines; and</w:t>
+      </w:r>
+    </w:p>
+    <w:p>
+      <w:pPr>
+        <w:numPr>
+          <w:ilvl w:val="0"/>
+          <w:numId w:val="1006"/>
+        </w:numPr>
+        <w:pStyle w:val="Compact"/>
+      </w:pPr>
+      <w:r>
+        <w:t xml:space="preserve">describe the architecture as</w:t>
+      </w:r>
+      <w:r>
+        <w:t xml:space="preserve"> </w:t>
+      </w:r>
+      <w:r>
+        <w:rPr>
+          <w:bCs/>
+          <w:b/>
+        </w:rPr>
+        <w:t xml:space="preserve">near-real-time capable</w:t>
+      </w:r>
+      <w:r>
+        <w:t xml:space="preserve">, not as a live Chennai service.</w:t>
+      </w:r>
+    </w:p>
+    <w:p>
+      <w:pPr>
+        <w:pStyle w:val="FirstParagraph"/>
+      </w:pPr>
+      <w:r>
+        <w:t xml:space="preserve">The limitation is reduced operational external validity: the study cannot prove present-day live accuracy or deployment readiness. That limitation is acceptable for an applied methods/case-study paper when stated explicitly.</w:t>
+      </w:r>
+    </w:p>
     <w:bookmarkEnd w:id="43"/>
-    <w:bookmarkStart w:id="52" w:name="proposed-method"/>
+    <w:bookmarkEnd w:id="44"/>
+    <w:bookmarkStart w:id="53" w:name="proposed-method"/>
     <w:p>
       <w:pPr>
         <w:pStyle w:val="Heading2"/>
@@ -1312,7 +1456,7 @@
         <w:t xml:space="preserve">5. Proposed Method</w:t>
       </w:r>
     </w:p>
-    <w:bookmarkStart w:id="44" w:name="network-and-cost-model"/>
+    <w:bookmarkStart w:id="45" w:name="network-and-cost-model"/>
     <w:p>
       <w:pPr>
         <w:pStyle w:val="Heading3"/>
@@ -1375,7 +1519,7 @@
       <w:pPr>
         <w:numPr>
           <w:ilvl w:val="0"/>
-          <w:numId w:val="1006"/>
+          <w:numId w:val="1007"/>
         </w:numPr>
         <w:pStyle w:val="Compact"/>
       </w:pPr>
@@ -1412,7 +1556,7 @@
       <w:pPr>
         <w:numPr>
           <w:ilvl w:val="0"/>
-          <w:numId w:val="1006"/>
+          <w:numId w:val="1007"/>
         </w:numPr>
         <w:pStyle w:val="Compact"/>
       </w:pPr>
@@ -1449,7 +1593,7 @@
       <w:pPr>
         <w:numPr>
           <w:ilvl w:val="0"/>
-          <w:numId w:val="1006"/>
+          <w:numId w:val="1007"/>
         </w:numPr>
         <w:pStyle w:val="Compact"/>
       </w:pPr>
@@ -1490,7 +1634,7 @@
       <w:pPr>
         <w:numPr>
           <w:ilvl w:val="0"/>
-          <w:numId w:val="1006"/>
+          <w:numId w:val="1007"/>
         </w:numPr>
         <w:pStyle w:val="Compact"/>
       </w:pPr>
@@ -1548,7 +1692,7 @@
       <w:pPr>
         <w:numPr>
           <w:ilvl w:val="0"/>
-          <w:numId w:val="1006"/>
+          <w:numId w:val="1007"/>
         </w:numPr>
         <w:pStyle w:val="Compact"/>
       </w:pPr>
@@ -1615,7 +1759,7 @@
       <w:pPr>
         <w:numPr>
           <w:ilvl w:val="0"/>
-          <w:numId w:val="1006"/>
+          <w:numId w:val="1007"/>
         </w:numPr>
         <w:pStyle w:val="Compact"/>
       </w:pPr>
@@ -2187,8 +2331,8 @@
         <w:t xml:space="preserve">; the finite BPR expression is not evaluated. The native CCH experiment currently rejects closures until a finite sentinel and overflow bound are validated.</w:t>
       </w:r>
     </w:p>
-    <w:bookmarkEnd w:id="44"/>
-    <w:bookmarkStart w:id="45" w:name="which-algorithm-finds-the-path"/>
+    <w:bookmarkEnd w:id="45"/>
+    <w:bookmarkStart w:id="46" w:name="which-algorithm-finds-the-path"/>
     <w:p>
       <w:pPr>
         <w:pStyle w:val="Heading3"/>
@@ -2219,7 +2363,7 @@
       <w:pPr>
         <w:numPr>
           <w:ilvl w:val="0"/>
-          <w:numId w:val="1007"/>
+          <w:numId w:val="1008"/>
         </w:numPr>
         <w:pStyle w:val="Compact"/>
       </w:pPr>
@@ -2241,7 +2385,7 @@
       <w:pPr>
         <w:numPr>
           <w:ilvl w:val="0"/>
-          <w:numId w:val="1007"/>
+          <w:numId w:val="1008"/>
         </w:numPr>
         <w:pStyle w:val="Compact"/>
       </w:pPr>
@@ -2263,7 +2407,7 @@
       <w:pPr>
         <w:numPr>
           <w:ilvl w:val="0"/>
-          <w:numId w:val="1007"/>
+          <w:numId w:val="1008"/>
         </w:numPr>
         <w:pStyle w:val="Compact"/>
       </w:pPr>
@@ -2293,7 +2437,7 @@
       <w:pPr>
         <w:numPr>
           <w:ilvl w:val="0"/>
-          <w:numId w:val="1008"/>
+          <w:numId w:val="1009"/>
         </w:numPr>
         <w:pStyle w:val="Compact"/>
       </w:pPr>
@@ -2311,7 +2455,7 @@
       <w:pPr>
         <w:numPr>
           <w:ilvl w:val="0"/>
-          <w:numId w:val="1008"/>
+          <w:numId w:val="1009"/>
         </w:numPr>
         <w:pStyle w:val="Compact"/>
       </w:pPr>
@@ -2329,7 +2473,7 @@
       <w:pPr>
         <w:numPr>
           <w:ilvl w:val="0"/>
-          <w:numId w:val="1008"/>
+          <w:numId w:val="1009"/>
         </w:numPr>
         <w:pStyle w:val="Compact"/>
       </w:pPr>
@@ -2347,7 +2491,7 @@
       <w:pPr>
         <w:numPr>
           <w:ilvl w:val="0"/>
-          <w:numId w:val="1008"/>
+          <w:numId w:val="1009"/>
         </w:numPr>
         <w:pStyle w:val="Compact"/>
       </w:pPr>
@@ -2361,8 +2505,8 @@
         <w:t xml:space="preserve">: repeated-refresh baseline.</w:t>
       </w:r>
     </w:p>
-    <w:bookmarkEnd w:id="45"/>
-    <w:bookmarkStart w:id="47" w:name="certified-lazy-synchronization"/>
+    <w:bookmarkEnd w:id="46"/>
+    <w:bookmarkStart w:id="48" w:name="certified-lazy-synchronization"/>
     <w:p>
       <w:pPr>
         <w:pStyle w:val="Heading3"/>
@@ -2383,7 +2527,7 @@
       <w:pPr>
         <w:numPr>
           <w:ilvl w:val="0"/>
-          <w:numId w:val="1009"/>
+          <w:numId w:val="1010"/>
         </w:numPr>
         <w:pStyle w:val="Compact"/>
       </w:pPr>
@@ -2407,7 +2551,7 @@
       <w:pPr>
         <w:numPr>
           <w:ilvl w:val="0"/>
-          <w:numId w:val="1009"/>
+          <w:numId w:val="1010"/>
         </w:numPr>
         <w:pStyle w:val="Compact"/>
       </w:pPr>
@@ -2424,7 +2568,7 @@
       <w:pPr>
         <w:numPr>
           <w:ilvl w:val="0"/>
-          <w:numId w:val="1009"/>
+          <w:numId w:val="1010"/>
         </w:numPr>
         <w:pStyle w:val="Compact"/>
       </w:pPr>
@@ -2468,7 +2612,7 @@
       <w:pPr>
         <w:numPr>
           <w:ilvl w:val="0"/>
-          <w:numId w:val="1009"/>
+          <w:numId w:val="1010"/>
         </w:numPr>
         <w:pStyle w:val="Compact"/>
       </w:pPr>
@@ -2532,7 +2676,7 @@
       <w:pPr>
         <w:numPr>
           <w:ilvl w:val="0"/>
-          <w:numId w:val="1009"/>
+          <w:numId w:val="1010"/>
         </w:numPr>
         <w:pStyle w:val="Compact"/>
       </w:pPr>
@@ -2589,7 +2733,7 @@
       <w:pPr>
         <w:numPr>
           <w:ilvl w:val="0"/>
-          <w:numId w:val="1009"/>
+          <w:numId w:val="1010"/>
         </w:numPr>
         <w:pStyle w:val="Compact"/>
       </w:pPr>
@@ -2745,7 +2889,7 @@
         <w:t xml:space="preserve">Otherwise, the controller customizes CCH with the complete current metric and queries again.</w:t>
       </w:r>
     </w:p>
-    <w:bookmarkStart w:id="46" w:name="three-road-example"/>
+    <w:bookmarkStart w:id="47" w:name="three-road-example"/>
     <w:p>
       <w:pPr>
         <w:pStyle w:val="Heading4"/>
@@ -2947,7 +3091,7 @@
       <w:pPr>
         <w:numPr>
           <w:ilvl w:val="0"/>
-          <w:numId w:val="1010"/>
+          <w:numId w:val="1011"/>
         </w:numPr>
         <w:pStyle w:val="Compact"/>
       </w:pPr>
@@ -2959,7 +3103,7 @@
       <w:pPr>
         <w:numPr>
           <w:ilvl w:val="0"/>
-          <w:numId w:val="1010"/>
+          <w:numId w:val="1011"/>
         </w:numPr>
         <w:pStyle w:val="Compact"/>
       </w:pPr>
@@ -3000,7 +3144,7 @@
       <w:pPr>
         <w:numPr>
           <w:ilvl w:val="0"/>
-          <w:numId w:val="1010"/>
+          <w:numId w:val="1011"/>
         </w:numPr>
         <w:pStyle w:val="Compact"/>
       </w:pPr>
@@ -3034,7 +3178,7 @@
       <w:pPr>
         <w:numPr>
           <w:ilvl w:val="0"/>
-          <w:numId w:val="1011"/>
+          <w:numId w:val="1012"/>
         </w:numPr>
         <w:pStyle w:val="Compact"/>
       </w:pPr>
@@ -3060,7 +3204,7 @@
       <w:pPr>
         <w:numPr>
           <w:ilvl w:val="0"/>
-          <w:numId w:val="1011"/>
+          <w:numId w:val="1012"/>
         </w:numPr>
         <w:pStyle w:val="Compact"/>
       </w:pPr>
@@ -3072,7 +3216,7 @@
       <w:pPr>
         <w:numPr>
           <w:ilvl w:val="0"/>
-          <w:numId w:val="1011"/>
+          <w:numId w:val="1012"/>
         </w:numPr>
         <w:pStyle w:val="Compact"/>
       </w:pPr>
@@ -3088,9 +3232,9 @@
         <w:t xml:space="preserve">If A rises to 7.0 min, refreshed CCH selects B at 6.0 min.</w:t>
       </w:r>
     </w:p>
-    <w:bookmarkEnd w:id="46"/>
     <w:bookmarkEnd w:id="47"/>
-    <w:bookmarkStart w:id="48" w:name="formal-guarantee"/>
+    <w:bookmarkEnd w:id="48"/>
+    <w:bookmarkStart w:id="49" w:name="formal-guarantee"/>
     <w:p>
       <w:pPr>
         <w:pStyle w:val="Heading3"/>
@@ -3650,8 +3794,8 @@
         <w:t xml:space="preserve">This is an application of an established upper/lower-bound certificate, not a new theorem.</w:t>
       </w:r>
     </w:p>
-    <w:bookmarkEnd w:id="48"/>
-    <w:bookmarkStart w:id="49" w:name="mandatory-refresh-conditions"/>
+    <w:bookmarkEnd w:id="49"/>
+    <w:bookmarkStart w:id="50" w:name="mandatory-refresh-conditions"/>
     <w:p>
       <w:pPr>
         <w:pStyle w:val="Heading3"/>
@@ -3672,7 +3816,7 @@
       <w:pPr>
         <w:numPr>
           <w:ilvl w:val="0"/>
-          <w:numId w:val="1012"/>
+          <w:numId w:val="1013"/>
         </w:numPr>
         <w:pStyle w:val="Compact"/>
       </w:pPr>
@@ -3684,7 +3828,7 @@
       <w:pPr>
         <w:numPr>
           <w:ilvl w:val="0"/>
-          <w:numId w:val="1012"/>
+          <w:numId w:val="1013"/>
         </w:numPr>
         <w:pStyle w:val="Compact"/>
       </w:pPr>
@@ -3696,7 +3840,7 @@
       <w:pPr>
         <w:numPr>
           <w:ilvl w:val="0"/>
-          <w:numId w:val="1012"/>
+          <w:numId w:val="1013"/>
         </w:numPr>
         <w:pStyle w:val="Compact"/>
       </w:pPr>
@@ -3708,7 +3852,7 @@
       <w:pPr>
         <w:numPr>
           <w:ilvl w:val="0"/>
-          <w:numId w:val="1012"/>
+          <w:numId w:val="1013"/>
         </w:numPr>
         <w:pStyle w:val="Compact"/>
       </w:pPr>
@@ -3724,8 +3868,8 @@
         <w:t xml:space="preserve">A closure represented as an increase is safe for the lower-bound direction, but a candidate containing the closed edge fails the upper-bound test. Native CCH currently accepts finite integer weights only; closure-sentinel behavior still requires a dedicated validation stage.</w:t>
       </w:r>
     </w:p>
-    <w:bookmarkEnd w:id="49"/>
-    <w:bookmarkStart w:id="50" w:name="route-adoption-and-projected-load"/>
+    <w:bookmarkEnd w:id="50"/>
+    <w:bookmarkStart w:id="51" w:name="route-adoption-and-projected-load"/>
     <w:p>
       <w:pPr>
         <w:pStyle w:val="Heading3"/>
@@ -3772,7 +3916,7 @@
       <w:pPr>
         <w:numPr>
           <w:ilvl w:val="0"/>
-          <w:numId w:val="1013"/>
+          <w:numId w:val="1014"/>
         </w:numPr>
         <w:pStyle w:val="Compact"/>
       </w:pPr>
@@ -3810,7 +3954,7 @@
       <w:pPr>
         <w:numPr>
           <w:ilvl w:val="0"/>
-          <w:numId w:val="1013"/>
+          <w:numId w:val="1014"/>
         </w:numPr>
         <w:pStyle w:val="Compact"/>
       </w:pPr>
@@ -3851,7 +3995,7 @@
       <w:pPr>
         <w:numPr>
           <w:ilvl w:val="0"/>
-          <w:numId w:val="1013"/>
+          <w:numId w:val="1014"/>
         </w:numPr>
         <w:pStyle w:val="Compact"/>
       </w:pPr>
@@ -3863,7 +4007,7 @@
       <w:pPr>
         <w:numPr>
           <w:ilvl w:val="0"/>
-          <w:numId w:val="1013"/>
+          <w:numId w:val="1014"/>
         </w:numPr>
         <w:pStyle w:val="Compact"/>
       </w:pPr>
@@ -3875,7 +4019,7 @@
       <w:pPr>
         <w:numPr>
           <w:ilvl w:val="0"/>
-          <w:numId w:val="1013"/>
+          <w:numId w:val="1014"/>
         </w:numPr>
         <w:pStyle w:val="Compact"/>
       </w:pPr>
@@ -3891,8 +4035,8 @@
         <w:t xml:space="preserve">This greedy policy is not claimed to achieve traffic equilibrium.</w:t>
       </w:r>
     </w:p>
-    <w:bookmarkEnd w:id="50"/>
-    <w:bookmarkStart w:id="51" w:name="emergency-and-public-service-evaluation"/>
+    <w:bookmarkEnd w:id="51"/>
+    <w:bookmarkStart w:id="52" w:name="emergency-and-public-service-evaluation"/>
     <w:p>
       <w:pPr>
         <w:pStyle w:val="Heading3"/>
@@ -3913,7 +4057,7 @@
       <w:pPr>
         <w:numPr>
           <w:ilvl w:val="0"/>
-          <w:numId w:val="1014"/>
+          <w:numId w:val="1015"/>
         </w:numPr>
         <w:pStyle w:val="Compact"/>
       </w:pPr>
@@ -3925,7 +4069,7 @@
       <w:pPr>
         <w:numPr>
           <w:ilvl w:val="0"/>
-          <w:numId w:val="1014"/>
+          <w:numId w:val="1015"/>
         </w:numPr>
         <w:pStyle w:val="Compact"/>
       </w:pPr>
@@ -3937,7 +4081,7 @@
       <w:pPr>
         <w:numPr>
           <w:ilvl w:val="0"/>
-          <w:numId w:val="1014"/>
+          <w:numId w:val="1015"/>
         </w:numPr>
         <w:pStyle w:val="Compact"/>
       </w:pPr>
@@ -3949,7 +4093,7 @@
       <w:pPr>
         <w:numPr>
           <w:ilvl w:val="0"/>
-          <w:numId w:val="1014"/>
+          <w:numId w:val="1015"/>
         </w:numPr>
         <w:pStyle w:val="Compact"/>
       </w:pPr>
@@ -3962,14 +4106,14 @@
         <w:pStyle w:val="FirstParagraph"/>
       </w:pPr>
       <w:r>
-        <w:t xml:space="preserve">Three low-scope evaluation additions strengthen impact without becoming route weights:</w:t>
-      </w:r>
-    </w:p>
-    <w:p>
-      <w:pPr>
-        <w:numPr>
-          <w:ilvl w:val="0"/>
-          <w:numId w:val="1015"/>
+        <w:t xml:space="preserve">Five committed evaluation studies strengthen impact without becoming route weights:</w:t>
+      </w:r>
+    </w:p>
+    <w:p>
+      <w:pPr>
+        <w:numPr>
+          <w:ilvl w:val="0"/>
+          <w:numId w:val="1016"/>
         </w:numPr>
         <w:pStyle w:val="Compact"/>
       </w:pPr>
@@ -3978,20 +4122,20 @@
           <w:bCs/>
           <w:b/>
         </w:rPr>
-        <w:t xml:space="preserve">Critical-facility accessibility:</w:t>
-      </w:r>
-      <w:r>
-        <w:t xml:space="preserve"> </w:t>
-      </w:r>
-      <w:r>
-        <w:t xml:space="preserve">travel time/disconnection to hospitals, fire stations, and relief centres.</w:t>
-      </w:r>
-    </w:p>
-    <w:p>
-      <w:pPr>
-        <w:numPr>
-          <w:ilvl w:val="0"/>
-          <w:numId w:val="1015"/>
+        <w:t xml:space="preserve">Evidence freshness and uncertainty:</w:t>
+      </w:r>
+      <w:r>
+        <w:t xml:space="preserve"> </w:t>
+      </w:r>
+      <w:r>
+        <w:t xml:space="preserve">controlled lag and classification-error traces.</w:t>
+      </w:r>
+    </w:p>
+    <w:p>
+      <w:pPr>
+        <w:numPr>
+          <w:ilvl w:val="0"/>
+          <w:numId w:val="1016"/>
         </w:numPr>
         <w:pStyle w:val="Compact"/>
       </w:pPr>
@@ -4000,20 +4144,20 @@
           <w:bCs/>
           <w:b/>
         </w:rPr>
-        <w:t xml:space="preserve">Population-weighted access loss:</w:t>
-      </w:r>
-      <w:r>
-        <w:t xml:space="preserve"> </w:t>
-      </w:r>
-      <w:r>
-        <w:t xml:space="preserve">distribution of access impact using WorldPop/ward weights; this is not socioeconomic equity.</w:t>
-      </w:r>
-    </w:p>
-    <w:p>
-      <w:pPr>
-        <w:numPr>
-          <w:ilvl w:val="0"/>
-          <w:numId w:val="1015"/>
+        <w:t xml:space="preserve">Critical-facility accessibility:</w:t>
+      </w:r>
+      <w:r>
+        <w:t xml:space="preserve"> </w:t>
+      </w:r>
+      <w:r>
+        <w:t xml:space="preserve">travel time/disconnection to hospitals, fire stations, and relief centres.</w:t>
+      </w:r>
+    </w:p>
+    <w:p>
+      <w:pPr>
+        <w:numPr>
+          <w:ilvl w:val="0"/>
+          <w:numId w:val="1016"/>
         </w:numPr>
         <w:pStyle w:val="Compact"/>
       </w:pPr>
@@ -4022,83 +4166,130 @@
           <w:bCs/>
           <w:b/>
         </w:rPr>
-        <w:t xml:space="preserve">Partial compliance:</w:t>
-      </w:r>
-      <w:r>
-        <w:t xml:space="preserve"> </w:t>
-      </w:r>
-      <w:r>
-        <w:t xml:space="preserve">0%, 25%, 50%, 75%, and 100% of vehicles follow guidance.</w:t>
-      </w:r>
-    </w:p>
-    <w:bookmarkEnd w:id="51"/>
-    <w:bookmarkEnd w:id="52"/>
-    <w:bookmarkStart w:id="80" w:name="dataset-and-data-access"/>
-    <w:p>
-      <w:pPr>
-        <w:pStyle w:val="Heading2"/>
-      </w:pPr>
-      <w:r>
-        <w:t xml:space="preserve">6. Dataset and Data Access</w:t>
-      </w:r>
-    </w:p>
-    <w:bookmarkStart w:id="57" w:name="openstreetmap"/>
-    <w:p>
-      <w:pPr>
-        <w:pStyle w:val="Heading3"/>
-      </w:pPr>
-      <w:r>
-        <w:t xml:space="preserve">6.1 OpenStreetMap</w:t>
-      </w:r>
-    </w:p>
-    <w:p>
-      <w:pPr>
-        <w:pStyle w:val="FirstParagraph"/>
+        <w:t xml:space="preserve">Population-weighted access loss:</w:t>
+      </w:r>
+      <w:r>
+        <w:t xml:space="preserve"> </w:t>
+      </w:r>
+      <w:r>
+        <w:t xml:space="preserve">distribution of access impact using WorldPop/ward weights; this is not socioeconomic equity.</w:t>
+      </w:r>
+    </w:p>
+    <w:p>
+      <w:pPr>
+        <w:numPr>
+          <w:ilvl w:val="0"/>
+          <w:numId w:val="1016"/>
+        </w:numPr>
+        <w:pStyle w:val="Compact"/>
       </w:pPr>
       <w:r>
         <w:rPr>
           <w:bCs/>
           <w:b/>
         </w:rPr>
-        <w:t xml:space="preserve">Purpose:</w:t>
-      </w:r>
-      <w:r>
-        <w:t xml:space="preserve"> </w:t>
-      </w:r>
-      <w:r>
-        <w:t xml:space="preserve">Directed Chennai road topology and road attributes.</w:t>
-      </w:r>
-      <w:r>
-        <w:br/>
-      </w:r>
+        <w:t xml:space="preserve">Partial compliance:</w:t>
+      </w:r>
+      <w:r>
+        <w:t xml:space="preserve"> </w:t>
+      </w:r>
+      <w:r>
+        <w:t xml:space="preserve">0%, 25%, 50%, 75%, and 100% of vehicles follow guidance.</w:t>
+      </w:r>
+    </w:p>
+    <w:p>
+      <w:pPr>
+        <w:numPr>
+          <w:ilvl w:val="0"/>
+          <w:numId w:val="1016"/>
+        </w:numPr>
+        <w:pStyle w:val="Compact"/>
+      </w:pPr>
       <w:r>
         <w:rPr>
           <w:bCs/>
           <w:b/>
         </w:rPr>
-        <w:t xml:space="preserve">Contains:</w:t>
-      </w:r>
-      <w:r>
-        <w:t xml:space="preserve"> </w:t>
-      </w:r>
-      <w:r>
-        <w:t xml:space="preserve">Nodes, ways, geometry, road class, direction, and incomplete lanes/speeds/turn data.</w:t>
-      </w:r>
-      <w:r>
-        <w:br/>
-      </w:r>
+        <w:t xml:space="preserve">Facility-oriented road criticality:</w:t>
+      </w:r>
+      <w:r>
+        <w:t xml:space="preserve"> </w:t>
+      </w:r>
+      <w:r>
+        <w:t xml:space="preserve">rank candidate roads by newly disconnected population and population-weighted added facility travel time.</w:t>
+      </w:r>
+    </w:p>
+    <w:p>
+      <w:pPr>
+        <w:pStyle w:val="FirstParagraph"/>
+      </w:pPr>
+      <w:r>
+        <w:t xml:space="preserve">Generic deterministic implementations for all five are present in</w:t>
+      </w:r>
+      <w:r>
+        <w:t xml:space="preserve"> </w:t>
+      </w:r>
+      <w:r>
+        <w:rPr>
+          <w:rStyle w:val="VerbatimChar"/>
+        </w:rPr>
+        <w:t xml:space="preserve">evaluation/metrics.py</w:t>
+      </w:r>
+      <w:r>
+        <w:t xml:space="preserve"> </w:t>
+      </w:r>
+      <w:r>
+        <w:t xml:space="preserve">and</w:t>
+      </w:r>
+      <w:r>
+        <w:t xml:space="preserve"> </w:t>
+      </w:r>
+      <w:r>
+        <w:rPr>
+          <w:rStyle w:val="VerbatimChar"/>
+        </w:rPr>
+        <w:t xml:space="preserve">evaluation/robustness.py</w:t>
+      </w:r>
+      <w:r>
+        <w:t xml:space="preserve">; Chennai data integration remains a later stage.</w:t>
+      </w:r>
+    </w:p>
+    <w:bookmarkEnd w:id="52"/>
+    <w:bookmarkEnd w:id="53"/>
+    <w:bookmarkStart w:id="82" w:name="dataset-and-data-access"/>
+    <w:p>
+      <w:pPr>
+        <w:pStyle w:val="Heading2"/>
+      </w:pPr>
+      <w:r>
+        <w:t xml:space="preserve">6. Dataset and Data Access</w:t>
+      </w:r>
+    </w:p>
+    <w:bookmarkStart w:id="58" w:name="openstreetmap"/>
+    <w:p>
+      <w:pPr>
+        <w:pStyle w:val="Heading3"/>
+      </w:pPr>
+      <w:r>
+        <w:t xml:space="preserve">6.1 OpenStreetMap</w:t>
+      </w:r>
+    </w:p>
+    <w:p>
+      <w:pPr>
+        <w:pStyle w:val="FirstParagraph"/>
+      </w:pPr>
       <w:r>
         <w:rPr>
           <w:bCs/>
           <w:b/>
         </w:rPr>
-        <w:t xml:space="preserve">Chennai coverage:</w:t>
-      </w:r>
-      <w:r>
-        <w:t xml:space="preserve"> </w:t>
-      </w:r>
-      <w:r>
-        <w:t xml:space="preserve">Yes; completeness must be audited.</w:t>
+        <w:t xml:space="preserve">Purpose:</w:t>
+      </w:r>
+      <w:r>
+        <w:t xml:space="preserve"> </w:t>
+      </w:r>
+      <w:r>
+        <w:t xml:space="preserve">Directed Chennai road topology and road attributes.</w:t>
       </w:r>
       <w:r>
         <w:br/>
@@ -4108,13 +4299,13 @@
           <w:bCs/>
           <w:b/>
         </w:rPr>
-        <w:t xml:space="preserve">Global coverage:</w:t>
-      </w:r>
-      <w:r>
-        <w:t xml:space="preserve"> </w:t>
-      </w:r>
-      <w:r>
-        <w:t xml:space="preserve">Yes.</w:t>
+        <w:t xml:space="preserve">Contains:</w:t>
+      </w:r>
+      <w:r>
+        <w:t xml:space="preserve"> </w:t>
+      </w:r>
+      <w:r>
+        <w:t xml:space="preserve">Nodes, ways, geometry, road class, direction, and incomplete lanes/speeds/turn data.</w:t>
       </w:r>
       <w:r>
         <w:br/>
@@ -4124,31 +4315,29 @@
           <w:bCs/>
           <w:b/>
         </w:rPr>
-        <w:t xml:space="preserve">Access:</w:t>
-      </w:r>
-      <w:r>
-        <w:t xml:space="preserve"> </w:t>
-      </w:r>
-      <w:r>
-        <w:t xml:space="preserve">OSMnx/Overpass or dated Geofabrik extract.</w:t>
-      </w:r>
-    </w:p>
-    <w:p>
-      <w:pPr>
-        <w:pStyle w:val="BodyText"/>
-      </w:pPr>
+        <w:t xml:space="preserve">Chennai coverage:</w:t>
+      </w:r>
+      <w:r>
+        <w:t xml:space="preserve"> </w:t>
+      </w:r>
+      <w:r>
+        <w:t xml:space="preserve">Yes; completeness must be audited.</w:t>
+      </w:r>
+      <w:r>
+        <w:br/>
+      </w:r>
       <w:r>
         <w:rPr>
           <w:bCs/>
           <w:b/>
         </w:rPr>
-        <w:t xml:space="preserve">Limitations:</w:t>
-      </w:r>
-      <w:r>
-        <w:t xml:space="preserve"> </w:t>
-      </w:r>
-      <w:r>
-        <w:t xml:space="preserve">Mutable community data; missing attributes and turn restrictions.</w:t>
+        <w:t xml:space="preserve">Global coverage:</w:t>
+      </w:r>
+      <w:r>
+        <w:t xml:space="preserve"> </w:t>
+      </w:r>
+      <w:r>
+        <w:t xml:space="preserve">Yes.</w:t>
       </w:r>
       <w:r>
         <w:br/>
@@ -4158,12 +4347,46 @@
           <w:bCs/>
           <w:b/>
         </w:rPr>
+        <w:t xml:space="preserve">Access:</w:t>
+      </w:r>
+      <w:r>
+        <w:t xml:space="preserve"> </w:t>
+      </w:r>
+      <w:r>
+        <w:t xml:space="preserve">OSMnx/Overpass or dated Geofabrik extract.</w:t>
+      </w:r>
+    </w:p>
+    <w:p>
+      <w:pPr>
+        <w:pStyle w:val="BodyText"/>
+      </w:pPr>
+      <w:r>
+        <w:rPr>
+          <w:bCs/>
+          <w:b/>
+        </w:rPr>
+        <w:t xml:space="preserve">Limitations:</w:t>
+      </w:r>
+      <w:r>
+        <w:t xml:space="preserve"> </w:t>
+      </w:r>
+      <w:r>
+        <w:t xml:space="preserve">Mutable community data; missing attributes and turn restrictions.</w:t>
+      </w:r>
+      <w:r>
+        <w:br/>
+      </w:r>
+      <w:r>
+        <w:rPr>
+          <w:bCs/>
+          <w:b/>
+        </w:rPr>
         <w:t xml:space="preserve">Direct access:</w:t>
       </w:r>
       <w:r>
         <w:t xml:space="preserve"> </w:t>
       </w:r>
-      <w:hyperlink r:id="rId53">
+      <w:hyperlink r:id="rId54">
         <w:r>
           <w:rPr>
             <w:rStyle w:val="Hyperlink"/>
@@ -4184,7 +4407,7 @@
       <w:r>
         <w:t xml:space="preserve"> </w:t>
       </w:r>
-      <w:hyperlink r:id="rId54">
+      <w:hyperlink r:id="rId55">
         <w:r>
           <w:rPr>
             <w:rStyle w:val="Hyperlink"/>
@@ -4205,7 +4428,7 @@
       <w:r>
         <w:t xml:space="preserve"> </w:t>
       </w:r>
-      <w:hyperlink r:id="rId55">
+      <w:hyperlink r:id="rId56">
         <w:r>
           <w:rPr>
             <w:rStyle w:val="Hyperlink"/>
@@ -4226,7 +4449,7 @@
       <w:r>
         <w:t xml:space="preserve"> </w:t>
       </w:r>
-      <w:hyperlink r:id="rId56">
+      <w:hyperlink r:id="rId57">
         <w:r>
           <w:rPr>
             <w:rStyle w:val="Hyperlink"/>
@@ -4235,8 +4458,8 @@
         </w:r>
       </w:hyperlink>
     </w:p>
-    <w:bookmarkEnd w:id="57"/>
-    <w:bookmarkStart w:id="62" w:name="opencity-chennai-flood-data"/>
+    <w:bookmarkEnd w:id="58"/>
+    <w:bookmarkStart w:id="63" w:name="opencity-chennai-flood-data"/>
     <w:p>
       <w:pPr>
         <w:pStyle w:val="Heading3"/>
@@ -4357,7 +4580,7 @@
       <w:r>
         <w:t xml:space="preserve"> </w:t>
       </w:r>
-      <w:hyperlink r:id="rId58">
+      <w:hyperlink r:id="rId59">
         <w:r>
           <w:rPr>
             <w:rStyle w:val="Hyperlink"/>
@@ -4371,7 +4594,7 @@
       <w:r>
         <w:t xml:space="preserve"> </w:t>
       </w:r>
-      <w:hyperlink r:id="rId59">
+      <w:hyperlink r:id="rId60">
         <w:r>
           <w:rPr>
             <w:rStyle w:val="Hyperlink"/>
@@ -4392,7 +4615,7 @@
       <w:r>
         <w:t xml:space="preserve"> </w:t>
       </w:r>
-      <w:hyperlink r:id="rId60">
+      <w:hyperlink r:id="rId61">
         <w:r>
           <w:rPr>
             <w:rStyle w:val="Hyperlink"/>
@@ -4413,7 +4636,7 @@
       <w:r>
         <w:t xml:space="preserve"> </w:t>
       </w:r>
-      <w:hyperlink r:id="rId61">
+      <w:hyperlink r:id="rId62">
         <w:r>
           <w:rPr>
             <w:rStyle w:val="VerbatimChar"/>
@@ -4438,8 +4661,8 @@
         <w:t xml:space="preserve">Resource previews on the OpenCity page.</w:t>
       </w:r>
     </w:p>
-    <w:bookmarkEnd w:id="62"/>
-    <w:bookmarkStart w:id="66" w:name="nasa-gpm-imerg"/>
+    <w:bookmarkEnd w:id="63"/>
+    <w:bookmarkStart w:id="68" w:name="nasa-gpm-imerg"/>
     <w:p>
       <w:pPr>
         <w:pStyle w:val="Heading3"/>
@@ -4560,7 +4783,7 @@
       <w:r>
         <w:t xml:space="preserve"> </w:t>
       </w:r>
-      <w:hyperlink r:id="rId63">
+      <w:hyperlink r:id="rId64">
         <w:r>
           <w:rPr>
             <w:rStyle w:val="Hyperlink"/>
@@ -4581,7 +4804,7 @@
       <w:r>
         <w:t xml:space="preserve"> </w:t>
       </w:r>
-      <w:hyperlink r:id="rId64">
+      <w:hyperlink r:id="rId65">
         <w:r>
           <w:rPr>
             <w:rStyle w:val="Hyperlink"/>
@@ -4627,7 +4850,7 @@
       <w:r>
         <w:t xml:space="preserve"> </w:t>
       </w:r>
-      <w:hyperlink r:id="rId65">
+      <w:hyperlink r:id="rId66">
         <w:r>
           <w:rPr>
             <w:rStyle w:val="Hyperlink"/>
@@ -4636,8 +4859,33 @@
         </w:r>
       </w:hyperlink>
     </w:p>
-    <w:bookmarkEnd w:id="66"/>
-    <w:bookmarkStart w:id="70" w:name="nasa-srtmnasadem-and-chennai-hydrology"/>
+    <w:p>
+      <w:pPr>
+        <w:pStyle w:val="BodyText"/>
+      </w:pPr>
+      <w:r>
+        <w:t xml:space="preserve">If no Earthdata credentials are available, the no-key</w:t>
+      </w:r>
+      <w:r>
+        <w:t xml:space="preserve"> </w:t>
+      </w:r>
+      <w:hyperlink r:id="rId67">
+        <w:r>
+          <w:rPr>
+            <w:rStyle w:val="Hyperlink"/>
+          </w:rPr>
+          <w:t xml:space="preserve">Open-Meteo Historical Weather API</w:t>
+        </w:r>
+      </w:hyperlink>
+      <w:r>
+        <w:t xml:space="preserve"> </w:t>
+      </w:r>
+      <w:r>
+        <w:t xml:space="preserve">provides an ERA5/ERA5-Land-derived rainfall fallback. It must be labelled reanalysis and must not be presented as road-level observation.</w:t>
+      </w:r>
+    </w:p>
+    <w:bookmarkEnd w:id="68"/>
+    <w:bookmarkStart w:id="72" w:name="nasa-srtmnasadem-and-chennai-hydrology"/>
     <w:p>
       <w:pPr>
         <w:pStyle w:val="Heading3"/>
@@ -4758,7 +5006,7 @@
       <w:r>
         <w:t xml:space="preserve"> </w:t>
       </w:r>
-      <w:hyperlink r:id="rId67">
+      <w:hyperlink r:id="rId69">
         <w:r>
           <w:rPr>
             <w:rStyle w:val="Hyperlink"/>
@@ -4779,7 +5027,7 @@
       <w:r>
         <w:t xml:space="preserve"> </w:t>
       </w:r>
-      <w:hyperlink r:id="rId68">
+      <w:hyperlink r:id="rId70">
         <w:r>
           <w:rPr>
             <w:rStyle w:val="Hyperlink"/>
@@ -4831,7 +5079,7 @@
       <w:r>
         <w:t xml:space="preserve"> </w:t>
       </w:r>
-      <w:hyperlink r:id="rId69">
+      <w:hyperlink r:id="rId71">
         <w:r>
           <w:rPr>
             <w:rStyle w:val="Hyperlink"/>
@@ -4840,8 +5088,8 @@
         </w:r>
       </w:hyperlink>
     </w:p>
-    <w:bookmarkEnd w:id="70"/>
-    <w:bookmarkStart w:id="74" w:name="eclipse-sumo"/>
+    <w:bookmarkEnd w:id="72"/>
+    <w:bookmarkStart w:id="76" w:name="eclipse-sumo"/>
     <w:p>
       <w:pPr>
         <w:pStyle w:val="Heading3"/>
@@ -4962,7 +5210,7 @@
       <w:r>
         <w:t xml:space="preserve"> </w:t>
       </w:r>
-      <w:hyperlink r:id="rId71">
+      <w:hyperlink r:id="rId73">
         <w:r>
           <w:rPr>
             <w:rStyle w:val="Hyperlink"/>
@@ -4983,7 +5231,7 @@
       <w:r>
         <w:t xml:space="preserve"> </w:t>
       </w:r>
-      <w:hyperlink r:id="rId72">
+      <w:hyperlink r:id="rId74">
         <w:r>
           <w:rPr>
             <w:rStyle w:val="Hyperlink"/>
@@ -5004,7 +5252,7 @@
       <w:r>
         <w:t xml:space="preserve"> </w:t>
       </w:r>
-      <w:hyperlink r:id="rId73">
+      <w:hyperlink r:id="rId75">
         <w:r>
           <w:rPr>
             <w:rStyle w:val="Hyperlink"/>
@@ -5029,8 +5277,8 @@
         <w:t xml:space="preserve">SUMO-GUI, not a web data viewer.</w:t>
       </w:r>
     </w:p>
-    <w:bookmarkEnd w:id="74"/>
-    <w:bookmarkStart w:id="79" w:name="critical-facilities-and-population"/>
+    <w:bookmarkEnd w:id="76"/>
+    <w:bookmarkStart w:id="81" w:name="critical-facilities-and-population"/>
     <w:p>
       <w:pPr>
         <w:pStyle w:val="Heading3"/>
@@ -5151,7 +5399,7 @@
       <w:r>
         <w:t xml:space="preserve"> </w:t>
       </w:r>
-      <w:hyperlink r:id="rId75">
+      <w:hyperlink r:id="rId77">
         <w:r>
           <w:rPr>
             <w:rStyle w:val="Hyperlink"/>
@@ -5165,7 +5413,7 @@
       <w:r>
         <w:t xml:space="preserve"> </w:t>
       </w:r>
-      <w:hyperlink r:id="rId76">
+      <w:hyperlink r:id="rId78">
         <w:r>
           <w:rPr>
             <w:rStyle w:val="Hyperlink"/>
@@ -5179,7 +5427,7 @@
       <w:r>
         <w:t xml:space="preserve"> </w:t>
       </w:r>
-      <w:hyperlink r:id="rId77">
+      <w:hyperlink r:id="rId79">
         <w:r>
           <w:rPr>
             <w:rStyle w:val="Hyperlink"/>
@@ -5200,7 +5448,7 @@
       <w:r>
         <w:t xml:space="preserve"> </w:t>
       </w:r>
-      <w:hyperlink r:id="rId78">
+      <w:hyperlink r:id="rId80">
         <w:r>
           <w:rPr>
             <w:rStyle w:val="Hyperlink"/>
@@ -5244,9 +5492,9 @@
         <w:t xml:space="preserve">OpenCity resource previews where provided.</w:t>
       </w:r>
     </w:p>
-    <w:bookmarkEnd w:id="79"/>
-    <w:bookmarkEnd w:id="80"/>
-    <w:bookmarkStart w:id="81" w:name="data-classification-and-temporal-meaning"/>
+    <w:bookmarkEnd w:id="81"/>
+    <w:bookmarkEnd w:id="82"/>
+    <w:bookmarkStart w:id="83" w:name="data-classification-and-temporal-meaning"/>
     <w:p>
       <w:pPr>
         <w:pStyle w:val="Heading2"/>
@@ -5659,8 +5907,8 @@
         <w:t xml:space="preserve">Optional OpenWeather/Open-Meteo forecasts may support demonstrations, but the core does not depend on paid APIs. No verified public live Chennai road-speed, accident, signal, or closure API is assumed.</w:t>
       </w:r>
     </w:p>
-    <w:bookmarkEnd w:id="81"/>
-    <w:bookmarkStart w:id="82" w:name="data-to-routing-mapping"/>
+    <w:bookmarkEnd w:id="83"/>
+    <w:bookmarkStart w:id="84" w:name="data-to-routing-mapping"/>
     <w:p>
       <w:pPr>
         <w:pStyle w:val="Heading2"/>
@@ -6103,8 +6351,8 @@
         </w:tc>
       </w:tr>
     </w:tbl>
-    <w:bookmarkEnd w:id="82"/>
-    <w:bookmarkStart w:id="86" w:name="architecture"/>
+    <w:bookmarkEnd w:id="84"/>
+    <w:bookmarkStart w:id="88" w:name="architecture"/>
     <w:p>
       <w:pPr>
         <w:pStyle w:val="Heading2"/>
@@ -6122,18 +6370,18 @@
           <wp:inline>
             <wp:extent cx="5334000" cy="6956293"/>
             <wp:effectExtent b="0" l="0" r="0" t="0"/>
-            <wp:docPr descr="Certificate-gated routing architecture" title="System Architecture" id="84" name="Picture"/>
+            <wp:docPr descr="Certificate-gated routing architecture" title="System Architecture" id="86" name="Picture"/>
             <a:graphic>
               <a:graphicData uri="http://schemas.openxmlformats.org/drawingml/2006/picture">
                 <pic:pic>
                   <pic:nvPicPr>
-                    <pic:cNvPr descr="docs/.docx-architecture.png" id="85" name="Picture"/>
+                    <pic:cNvPr descr="docs/.docx-architecture.png" id="87" name="Picture"/>
                     <pic:cNvPicPr>
                       <a:picLocks noChangeArrowheads="1" noChangeAspect="1"/>
                     </pic:cNvPicPr>
                   </pic:nvPicPr>
                   <pic:blipFill>
-                    <a:blip r:embed="rId83"/>
+                    <a:blip r:embed="rId85"/>
                     <a:stretch>
                       <a:fillRect/>
                     </a:stretch>
@@ -6160,8 +6408,8 @@
         </w:drawing>
       </w:r>
     </w:p>
-    <w:bookmarkEnd w:id="86"/>
-    <w:bookmarkStart w:id="97" w:name="implementation-status-and-revised-stages"/>
+    <w:bookmarkEnd w:id="88"/>
+    <w:bookmarkStart w:id="99" w:name="implementation-status-and-revised-stages"/>
     <w:p>
       <w:pPr>
         <w:pStyle w:val="Heading2"/>
@@ -6170,7 +6418,7 @@
         <w:t xml:space="preserve">10. Implementation Status and Revised Stages</w:t>
       </w:r>
     </w:p>
-    <w:bookmarkStart w:id="87" w:name="X91a5b516961134ace8296606c3e58ad87e2ed6a"/>
+    <w:bookmarkStart w:id="89" w:name="X91a5b516961134ace8296606c3e58ad87e2ed6a"/>
     <w:p>
       <w:pPr>
         <w:pStyle w:val="Heading3"/>
@@ -6203,8 +6451,8 @@
         <w:t xml:space="preserve">OSM and OpenCity historical hotspots are joined to roads; one real mapped edge is controlled as blocked; BPR weights and two Dijkstra snapshots demonstrate closure avoidance. Finite congestion response is not validated.</w:t>
       </w:r>
     </w:p>
-    <w:bookmarkEnd w:id="87"/>
-    <w:bookmarkStart w:id="88" w:name="Xccb8caa86ccf46b10144f4fa77c6463d872ef9a"/>
+    <w:bookmarkEnd w:id="89"/>
+    <w:bookmarkStart w:id="90" w:name="Xccb8caa86ccf46b10144f4fa77c6463d872ef9a"/>
     <w:p>
       <w:pPr>
         <w:pStyle w:val="Heading3"/>
@@ -6235,7 +6483,7 @@
       <w:pPr>
         <w:numPr>
           <w:ilvl w:val="0"/>
-          <w:numId w:val="1016"/>
+          <w:numId w:val="1017"/>
         </w:numPr>
         <w:pStyle w:val="Compact"/>
       </w:pPr>
@@ -6247,7 +6495,7 @@
       <w:pPr>
         <w:numPr>
           <w:ilvl w:val="0"/>
-          <w:numId w:val="1016"/>
+          <w:numId w:val="1017"/>
         </w:numPr>
         <w:pStyle w:val="Compact"/>
       </w:pPr>
@@ -6259,7 +6507,7 @@
       <w:pPr>
         <w:numPr>
           <w:ilvl w:val="0"/>
-          <w:numId w:val="1016"/>
+          <w:numId w:val="1017"/>
         </w:numPr>
         <w:pStyle w:val="Compact"/>
       </w:pPr>
@@ -6286,7 +6534,7 @@
       <w:pPr>
         <w:numPr>
           <w:ilvl w:val="0"/>
-          <w:numId w:val="1016"/>
+          <w:numId w:val="1017"/>
         </w:numPr>
         <w:pStyle w:val="Compact"/>
       </w:pPr>
@@ -6298,7 +6546,7 @@
       <w:pPr>
         <w:numPr>
           <w:ilvl w:val="0"/>
-          <w:numId w:val="1016"/>
+          <w:numId w:val="1017"/>
         </w:numPr>
         <w:pStyle w:val="Compact"/>
       </w:pPr>
@@ -6310,7 +6558,7 @@
       <w:pPr>
         <w:numPr>
           <w:ilvl w:val="0"/>
-          <w:numId w:val="1016"/>
+          <w:numId w:val="1017"/>
         </w:numPr>
         <w:pStyle w:val="Compact"/>
       </w:pPr>
@@ -6322,7 +6570,7 @@
       <w:pPr>
         <w:numPr>
           <w:ilvl w:val="0"/>
-          <w:numId w:val="1016"/>
+          <w:numId w:val="1017"/>
         </w:numPr>
         <w:pStyle w:val="Compact"/>
       </w:pPr>
@@ -6334,7 +6582,7 @@
       <w:pPr>
         <w:numPr>
           <w:ilvl w:val="0"/>
-          <w:numId w:val="1016"/>
+          <w:numId w:val="1017"/>
         </w:numPr>
         <w:pStyle w:val="Compact"/>
       </w:pPr>
@@ -6346,7 +6594,7 @@
       <w:pPr>
         <w:numPr>
           <w:ilvl w:val="0"/>
-          <w:numId w:val="1016"/>
+          <w:numId w:val="1017"/>
         </w:numPr>
         <w:pStyle w:val="Compact"/>
       </w:pPr>
@@ -6358,16 +6606,28 @@
       <w:pPr>
         <w:numPr>
           <w:ilvl w:val="0"/>
-          <w:numId w:val="1016"/>
-        </w:numPr>
-        <w:pStyle w:val="Compact"/>
-      </w:pPr>
-      <w:r>
-        <w:t xml:space="preserve">37 passing tests.</w:t>
-      </w:r>
-    </w:p>
-    <w:bookmarkEnd w:id="88"/>
-    <w:bookmarkStart w:id="89" w:name="stage-3-reproducible-chennai-graph"/>
+          <w:numId w:val="1017"/>
+        </w:numPr>
+        <w:pStyle w:val="Compact"/>
+      </w:pPr>
+      <w:r>
+        <w:t xml:space="preserve">uncertainty and facility-road-criticality utilities;</w:t>
+      </w:r>
+    </w:p>
+    <w:p>
+      <w:pPr>
+        <w:numPr>
+          <w:ilvl w:val="0"/>
+          <w:numId w:val="1017"/>
+        </w:numPr>
+        <w:pStyle w:val="Compact"/>
+      </w:pPr>
+      <w:r>
+        <w:t xml:space="preserve">41 passing tests.</w:t>
+      </w:r>
+    </w:p>
+    <w:bookmarkEnd w:id="90"/>
+    <w:bookmarkStart w:id="91" w:name="stage-3-reproducible-chennai-graph"/>
     <w:p>
       <w:pPr>
         <w:pStyle w:val="Heading3"/>
@@ -6400,8 +6660,8 @@
         <w:t xml:space="preserve">Dated OSM extract, stable arc IDs, validated directions/turns/parallel arcs, free-flow times, and documented capacity assumptions.</w:t>
       </w:r>
     </w:p>
-    <w:bookmarkEnd w:id="89"/>
-    <w:bookmarkStart w:id="90" w:name="stage-4-flood-and-road-state-evidence"/>
+    <w:bookmarkEnd w:id="91"/>
+    <w:bookmarkStart w:id="92" w:name="stage-4-flood-and-road-state-evidence"/>
     <w:p>
       <w:pPr>
         <w:pStyle w:val="Heading3"/>
@@ -6425,13 +6685,13 @@
         <w:t xml:space="preserve"> </w:t>
       </w:r>
       <w:r>
-        <w:t xml:space="preserve">Planned.</w:t>
+        <w:t xml:space="preserve">Generic lag/error perturbation implemented; Chennai evidence integration planned.</w:t>
       </w:r>
       <w:r>
         <w:br/>
       </w:r>
       <w:r>
-        <w:t xml:space="preserve">Historical susceptibility, IMERG rolling rainfall, optional current evidence, source freshness, confidence, and explained</w:t>
+        <w:t xml:space="preserve">Historical susceptibility, IMERG or no-key reanalysis rainfall, optional current evidence, source freshness, confidence, and explained</w:t>
       </w:r>
       <w:r>
         <w:t xml:space="preserve"> </w:t>
@@ -6449,8 +6709,8 @@
         <w:t xml:space="preserve">states.</w:t>
       </w:r>
     </w:p>
-    <w:bookmarkEnd w:id="90"/>
-    <w:bookmarkStart w:id="91" w:name="Xb77ec8f9bac440bfe6e8fbaadfd160ccd3243f6"/>
+    <w:bookmarkEnd w:id="92"/>
+    <w:bookmarkStart w:id="93" w:name="Xb77ec8f9bac440bfe6e8fbaadfd160ccd3243f6"/>
     <w:p>
       <w:pPr>
         <w:pStyle w:val="Heading3"/>
@@ -6483,8 +6743,8 @@
         <w:t xml:space="preserve">Heterogeneous demand, entering PCE flow, incidents, queues, BPR calibration/sensitivity, and no double counting of SUMO delay.</w:t>
       </w:r>
     </w:p>
-    <w:bookmarkEnd w:id="91"/>
-    <w:bookmarkStart w:id="92" w:name="stage-6-chennai-cch-integration"/>
+    <w:bookmarkEnd w:id="93"/>
+    <w:bookmarkStart w:id="94" w:name="stage-6-chennai-cch-integration"/>
     <w:p>
       <w:pPr>
         <w:pStyle w:val="Heading3"/>
@@ -6517,8 +6777,8 @@
         <w:t xml:space="preserve">Geometry-aware ordering, turn-expanded topology, finite closure sentinel, integer quantization, full/partial customization, and Dijkstra differential validation.</w:t>
       </w:r>
     </w:p>
-    <w:bookmarkEnd w:id="92"/>
-    <w:bookmarkStart w:id="93" w:name="stage-7-stable-projected-load-rerouting"/>
+    <w:bookmarkEnd w:id="94"/>
+    <w:bookmarkStart w:id="95" w:name="stage-7-stable-projected-load-rerouting"/>
     <w:p>
       <w:pPr>
         <w:pStyle w:val="Heading3"/>
@@ -6551,14 +6811,14 @@
         <w:t xml:space="preserve">Threshold, minimum gain, cooldown, time-indexed route reservations, and compliance sensitivity.</w:t>
       </w:r>
     </w:p>
-    <w:bookmarkEnd w:id="93"/>
-    <w:bookmarkStart w:id="94" w:name="Xb095f145158f7c623f7559c37a2b0c933a8bd73"/>
+    <w:bookmarkEnd w:id="95"/>
+    <w:bookmarkStart w:id="96" w:name="Xccf3cb31944b30e91fefa8a2921cf08ca5a74ca"/>
     <w:p>
       <w:pPr>
         <w:pStyle w:val="Heading3"/>
       </w:pPr>
       <w:r>
-        <w:t xml:space="preserve">Stage 8 — Accessibility and Population Evaluation</w:t>
+        <w:t xml:space="preserve">Stage 8 — Accessibility, Population, Compliance, and Road Criticality</w:t>
       </w:r>
     </w:p>
     <w:p>
@@ -6576,17 +6836,17 @@
         <w:t xml:space="preserve"> </w:t>
       </w:r>
       <w:r>
-        <w:t xml:space="preserve">Planned data integration; generic metrics implemented.</w:t>
+        <w:t xml:space="preserve">Generic metrics implemented; Chennai data integration planned.</w:t>
       </w:r>
       <w:r>
         <w:br/>
       </w:r>
       <w:r>
-        <w:t xml:space="preserve">Hospitals, fire stations, relief centres, disconnection, p90 access, and population-weighted loss.</w:t>
-      </w:r>
-    </w:p>
-    <w:bookmarkEnd w:id="94"/>
-    <w:bookmarkStart w:id="95" w:name="stage-9-emergency-scenario"/>
+        <w:t xml:space="preserve">Hospitals, fire stations, relief centres, disconnection, p90 access, population-weighted loss, partial compliance, and facility-oriented road criticality.</w:t>
+      </w:r>
+    </w:p>
+    <w:bookmarkEnd w:id="96"/>
+    <w:bookmarkStart w:id="97" w:name="stage-9-emergency-scenario"/>
     <w:p>
       <w:pPr>
         <w:pStyle w:val="Heading3"/>
@@ -6619,8 +6879,8 @@
         <w:t xml:space="preserve">Response time, deadline success, safety exposure, and ordinary-user external delay.</w:t>
       </w:r>
     </w:p>
-    <w:bookmarkEnd w:id="95"/>
-    <w:bookmarkStart w:id="96" w:name="stage-10-full-evaluation-and-paper"/>
+    <w:bookmarkEnd w:id="97"/>
+    <w:bookmarkStart w:id="98" w:name="stage-10-full-evaluation-and-paper"/>
     <w:p>
       <w:pPr>
         <w:pStyle w:val="Heading3"/>
@@ -6653,9 +6913,9 @@
         <w:t xml:space="preserve">Paired scenarios, baselines, ablations, uncertainty, statistical reporting, reproducibility package, and final manuscript.</w:t>
       </w:r>
     </w:p>
-    <w:bookmarkEnd w:id="96"/>
-    <w:bookmarkEnd w:id="97"/>
-    <w:bookmarkStart w:id="102" w:name="preliminary-certificate-experiment"/>
+    <w:bookmarkEnd w:id="98"/>
+    <w:bookmarkEnd w:id="99"/>
+    <w:bookmarkStart w:id="104" w:name="preliminary-certificate-experiment"/>
     <w:p>
       <w:pPr>
         <w:pStyle w:val="Heading2"/>
@@ -6664,7 +6924,7 @@
         <w:t xml:space="preserve">11. Preliminary Certificate Experiment</w:t>
       </w:r>
     </w:p>
-    <w:bookmarkStart w:id="98" w:name="setup"/>
+    <w:bookmarkStart w:id="100" w:name="setup"/>
     <w:p>
       <w:pPr>
         <w:pStyle w:val="Heading3"/>
@@ -6677,7 +6937,7 @@
       <w:pPr>
         <w:numPr>
           <w:ilvl w:val="0"/>
-          <w:numId w:val="1017"/>
+          <w:numId w:val="1018"/>
         </w:numPr>
         <w:pStyle w:val="Compact"/>
       </w:pPr>
@@ -6689,7 +6949,7 @@
       <w:pPr>
         <w:numPr>
           <w:ilvl w:val="0"/>
-          <w:numId w:val="1017"/>
+          <w:numId w:val="1018"/>
         </w:numPr>
         <w:pStyle w:val="Compact"/>
       </w:pPr>
@@ -6701,7 +6961,7 @@
       <w:pPr>
         <w:numPr>
           <w:ilvl w:val="0"/>
-          <w:numId w:val="1017"/>
+          <w:numId w:val="1018"/>
         </w:numPr>
         <w:pStyle w:val="Compact"/>
       </w:pPr>
@@ -6713,7 +6973,7 @@
       <w:pPr>
         <w:numPr>
           <w:ilvl w:val="0"/>
-          <w:numId w:val="1017"/>
+          <w:numId w:val="1018"/>
         </w:numPr>
         <w:pStyle w:val="Compact"/>
       </w:pPr>
@@ -6725,7 +6985,7 @@
       <w:pPr>
         <w:numPr>
           <w:ilvl w:val="0"/>
-          <w:numId w:val="1017"/>
+          <w:numId w:val="1018"/>
         </w:numPr>
         <w:pStyle w:val="Compact"/>
       </w:pPr>
@@ -6737,7 +6997,7 @@
       <w:pPr>
         <w:numPr>
           <w:ilvl w:val="0"/>
-          <w:numId w:val="1017"/>
+          <w:numId w:val="1018"/>
         </w:numPr>
         <w:pStyle w:val="Compact"/>
       </w:pPr>
@@ -6749,7 +7009,7 @@
       <w:pPr>
         <w:numPr>
           <w:ilvl w:val="0"/>
-          <w:numId w:val="1017"/>
+          <w:numId w:val="1018"/>
         </w:numPr>
         <w:pStyle w:val="Compact"/>
       </w:pPr>
@@ -6761,7 +7021,7 @@
       <w:pPr>
         <w:numPr>
           <w:ilvl w:val="0"/>
-          <w:numId w:val="1017"/>
+          <w:numId w:val="1018"/>
         </w:numPr>
         <w:pStyle w:val="Compact"/>
       </w:pPr>
@@ -6784,8 +7044,8 @@
         <w:t xml:space="preserve">0.1.4.</w:t>
       </w:r>
     </w:p>
-    <w:bookmarkEnd w:id="98"/>
-    <w:bookmarkStart w:id="99" w:name="main-results"/>
+    <w:bookmarkEnd w:id="100"/>
+    <w:bookmarkStart w:id="101" w:name="main-results"/>
     <w:p>
       <w:pPr>
         <w:pStyle w:val="Heading3"/>
@@ -7418,8 +7678,8 @@
         <w:t xml:space="preserve">The values validate implementation behavior, not Chennai travel outcomes or general performance.</w:t>
       </w:r>
     </w:p>
-    <w:bookmarkEnd w:id="99"/>
-    <w:bookmarkStart w:id="101" w:name="epsilon-sensitivity"/>
+    <w:bookmarkEnd w:id="101"/>
+    <w:bookmarkStart w:id="103" w:name="epsilon-sensitivity"/>
     <w:p>
       <w:pPr>
         <w:pStyle w:val="Heading3"/>
@@ -7446,7 +7706,7 @@
       <w:r>
         <w:t xml:space="preserve"> </w:t>
       </w:r>
-      <w:hyperlink r:id="rId100">
+      <w:hyperlink r:id="rId102">
         <w:r>
           <w:rPr>
             <w:rStyle w:val="VerbatimChar"/>
@@ -7458,9 +7718,9 @@
         <w:t xml:space="preserve">.</w:t>
       </w:r>
     </w:p>
-    <w:bookmarkEnd w:id="101"/>
-    <w:bookmarkEnd w:id="102"/>
-    <w:bookmarkStart w:id="106" w:name="evaluation-plan"/>
+    <w:bookmarkEnd w:id="103"/>
+    <w:bookmarkEnd w:id="104"/>
+    <w:bookmarkStart w:id="108" w:name="evaluation-plan"/>
     <w:p>
       <w:pPr>
         <w:pStyle w:val="Heading2"/>
@@ -7469,7 +7729,7 @@
         <w:t xml:space="preserve">12. Evaluation Plan</w:t>
       </w:r>
     </w:p>
-    <w:bookmarkStart w:id="103" w:name="baselines"/>
+    <w:bookmarkStart w:id="105" w:name="baselines"/>
     <w:p>
       <w:pPr>
         <w:pStyle w:val="Heading3"/>
@@ -7482,7 +7742,7 @@
       <w:pPr>
         <w:numPr>
           <w:ilvl w:val="0"/>
-          <w:numId w:val="1018"/>
+          <w:numId w:val="1019"/>
         </w:numPr>
         <w:pStyle w:val="Compact"/>
       </w:pPr>
@@ -7494,7 +7754,7 @@
       <w:pPr>
         <w:numPr>
           <w:ilvl w:val="0"/>
-          <w:numId w:val="1018"/>
+          <w:numId w:val="1019"/>
         </w:numPr>
         <w:pStyle w:val="Compact"/>
       </w:pPr>
@@ -7506,7 +7766,7 @@
       <w:pPr>
         <w:numPr>
           <w:ilvl w:val="0"/>
-          <w:numId w:val="1018"/>
+          <w:numId w:val="1019"/>
         </w:numPr>
         <w:pStyle w:val="Compact"/>
       </w:pPr>
@@ -7518,7 +7778,7 @@
       <w:pPr>
         <w:numPr>
           <w:ilvl w:val="0"/>
-          <w:numId w:val="1018"/>
+          <w:numId w:val="1019"/>
         </w:numPr>
         <w:pStyle w:val="Compact"/>
       </w:pPr>
@@ -7530,7 +7790,7 @@
       <w:pPr>
         <w:numPr>
           <w:ilvl w:val="0"/>
-          <w:numId w:val="1018"/>
+          <w:numId w:val="1019"/>
         </w:numPr>
         <w:pStyle w:val="Compact"/>
       </w:pPr>
@@ -7542,7 +7802,7 @@
       <w:pPr>
         <w:numPr>
           <w:ilvl w:val="0"/>
-          <w:numId w:val="1018"/>
+          <w:numId w:val="1019"/>
         </w:numPr>
         <w:pStyle w:val="Compact"/>
       </w:pPr>
@@ -7554,7 +7814,7 @@
       <w:pPr>
         <w:numPr>
           <w:ilvl w:val="0"/>
-          <w:numId w:val="1018"/>
+          <w:numId w:val="1019"/>
         </w:numPr>
         <w:pStyle w:val="Compact"/>
       </w:pPr>
@@ -7562,8 +7822,8 @@
         <w:t xml:space="preserve">independent versus projected-load-aware assignments.</w:t>
       </w:r>
     </w:p>
-    <w:bookmarkEnd w:id="103"/>
-    <w:bookmarkStart w:id="104" w:name="ablations"/>
+    <w:bookmarkEnd w:id="105"/>
+    <w:bookmarkStart w:id="106" w:name="ablations"/>
     <w:p>
       <w:pPr>
         <w:pStyle w:val="Heading3"/>
@@ -7576,7 +7836,7 @@
       <w:pPr>
         <w:numPr>
           <w:ilvl w:val="0"/>
-          <w:numId w:val="1019"/>
+          <w:numId w:val="1020"/>
         </w:numPr>
         <w:pStyle w:val="Compact"/>
       </w:pPr>
@@ -7588,7 +7848,7 @@
       <w:pPr>
         <w:numPr>
           <w:ilvl w:val="0"/>
-          <w:numId w:val="1019"/>
+          <w:numId w:val="1020"/>
         </w:numPr>
         <w:pStyle w:val="Compact"/>
       </w:pPr>
@@ -7600,7 +7860,7 @@
       <w:pPr>
         <w:numPr>
           <w:ilvl w:val="0"/>
-          <w:numId w:val="1019"/>
+          <w:numId w:val="1020"/>
         </w:numPr>
         <w:pStyle w:val="Compact"/>
       </w:pPr>
@@ -7612,7 +7872,7 @@
       <w:pPr>
         <w:numPr>
           <w:ilvl w:val="0"/>
-          <w:numId w:val="1019"/>
+          <w:numId w:val="1020"/>
         </w:numPr>
         <w:pStyle w:val="Compact"/>
       </w:pPr>
@@ -7624,7 +7884,7 @@
       <w:pPr>
         <w:numPr>
           <w:ilvl w:val="0"/>
-          <w:numId w:val="1019"/>
+          <w:numId w:val="1020"/>
         </w:numPr>
         <w:pStyle w:val="Compact"/>
       </w:pPr>
@@ -7636,7 +7896,7 @@
       <w:pPr>
         <w:numPr>
           <w:ilvl w:val="0"/>
-          <w:numId w:val="1019"/>
+          <w:numId w:val="1020"/>
         </w:numPr>
         <w:pStyle w:val="Compact"/>
       </w:pPr>
@@ -7648,7 +7908,7 @@
       <w:pPr>
         <w:numPr>
           <w:ilvl w:val="0"/>
-          <w:numId w:val="1019"/>
+          <w:numId w:val="1020"/>
         </w:numPr>
         <w:pStyle w:val="Compact"/>
       </w:pPr>
@@ -7656,8 +7916,8 @@
         <w:t xml:space="preserve">compliance levels 0–100%.</w:t>
       </w:r>
     </w:p>
-    <w:bookmarkEnd w:id="104"/>
-    <w:bookmarkStart w:id="105" w:name="metrics"/>
+    <w:bookmarkEnd w:id="106"/>
+    <w:bookmarkStart w:id="107" w:name="metrics"/>
     <w:p>
       <w:pPr>
         <w:pStyle w:val="Heading3"/>
@@ -7990,9 +8250,9 @@
         </w:tc>
       </w:tr>
     </w:tbl>
-    <w:bookmarkEnd w:id="105"/>
-    <w:bookmarkEnd w:id="106"/>
-    <w:bookmarkStart w:id="107" w:name="reproducibility"/>
+    <w:bookmarkEnd w:id="107"/>
+    <w:bookmarkEnd w:id="108"/>
+    <w:bookmarkStart w:id="109" w:name="reproducibility"/>
     <w:p>
       <w:pPr>
         <w:pStyle w:val="Heading2"/>
@@ -8333,8 +8593,8 @@
         <w:t xml:space="preserve">Remote OSM/OpenCity inputs remain mutable until dated snapshots and checksums are committed. Synthetic experiment results are deterministic apart from timing.</w:t>
       </w:r>
     </w:p>
-    <w:bookmarkEnd w:id="107"/>
-    <w:bookmarkStart w:id="108" w:name="feasibility-and-remaining-uncertainty"/>
+    <w:bookmarkEnd w:id="109"/>
+    <w:bookmarkStart w:id="110" w:name="feasibility-and-remaining-uncertainty"/>
     <w:p>
       <w:pPr>
         <w:pStyle w:val="Heading2"/>
@@ -8387,8 +8647,8 @@
         <w:t xml:space="preserve">The core remains feasible using historical replay and labelled simulation without paid APIs.</w:t>
       </w:r>
     </w:p>
-    <w:bookmarkEnd w:id="108"/>
-    <w:bookmarkStart w:id="109" w:name="limitations"/>
+    <w:bookmarkEnd w:id="110"/>
+    <w:bookmarkStart w:id="111" w:name="limitations"/>
     <w:p>
       <w:pPr>
         <w:pStyle w:val="Heading2"/>
@@ -8401,7 +8661,7 @@
       <w:pPr>
         <w:numPr>
           <w:ilvl w:val="0"/>
-          <w:numId w:val="1020"/>
+          <w:numId w:val="1021"/>
         </w:numPr>
         <w:pStyle w:val="Compact"/>
       </w:pPr>
@@ -8413,7 +8673,7 @@
       <w:pPr>
         <w:numPr>
           <w:ilvl w:val="0"/>
-          <w:numId w:val="1020"/>
+          <w:numId w:val="1021"/>
         </w:numPr>
         <w:pStyle w:val="Compact"/>
       </w:pPr>
@@ -8425,7 +8685,7 @@
       <w:pPr>
         <w:numPr>
           <w:ilvl w:val="0"/>
-          <w:numId w:val="1020"/>
+          <w:numId w:val="1021"/>
         </w:numPr>
         <w:pStyle w:val="Compact"/>
       </w:pPr>
@@ -8437,7 +8697,7 @@
       <w:pPr>
         <w:numPr>
           <w:ilvl w:val="0"/>
-          <w:numId w:val="1020"/>
+          <w:numId w:val="1021"/>
         </w:numPr>
         <w:pStyle w:val="Compact"/>
       </w:pPr>
@@ -8449,7 +8709,7 @@
       <w:pPr>
         <w:numPr>
           <w:ilvl w:val="0"/>
-          <w:numId w:val="1020"/>
+          <w:numId w:val="1021"/>
         </w:numPr>
         <w:pStyle w:val="Compact"/>
       </w:pPr>
@@ -8461,7 +8721,7 @@
       <w:pPr>
         <w:numPr>
           <w:ilvl w:val="0"/>
-          <w:numId w:val="1020"/>
+          <w:numId w:val="1021"/>
         </w:numPr>
         <w:pStyle w:val="Compact"/>
       </w:pPr>
@@ -8473,7 +8733,7 @@
       <w:pPr>
         <w:numPr>
           <w:ilvl w:val="0"/>
-          <w:numId w:val="1020"/>
+          <w:numId w:val="1021"/>
         </w:numPr>
         <w:pStyle w:val="Compact"/>
       </w:pPr>
@@ -8485,7 +8745,7 @@
       <w:pPr>
         <w:numPr>
           <w:ilvl w:val="0"/>
-          <w:numId w:val="1020"/>
+          <w:numId w:val="1021"/>
         </w:numPr>
         <w:pStyle w:val="Compact"/>
       </w:pPr>
@@ -8497,7 +8757,7 @@
       <w:pPr>
         <w:numPr>
           <w:ilvl w:val="0"/>
-          <w:numId w:val="1020"/>
+          <w:numId w:val="1021"/>
         </w:numPr>
         <w:pStyle w:val="Compact"/>
       </w:pPr>
@@ -8509,7 +8769,7 @@
       <w:pPr>
         <w:numPr>
           <w:ilvl w:val="0"/>
-          <w:numId w:val="1020"/>
+          <w:numId w:val="1021"/>
         </w:numPr>
         <w:pStyle w:val="Compact"/>
       </w:pPr>
@@ -8521,7 +8781,7 @@
       <w:pPr>
         <w:numPr>
           <w:ilvl w:val="0"/>
-          <w:numId w:val="1020"/>
+          <w:numId w:val="1021"/>
         </w:numPr>
         <w:pStyle w:val="Compact"/>
       </w:pPr>
@@ -8533,7 +8793,7 @@
       <w:pPr>
         <w:numPr>
           <w:ilvl w:val="0"/>
-          <w:numId w:val="1020"/>
+          <w:numId w:val="1021"/>
         </w:numPr>
         <w:pStyle w:val="Compact"/>
       </w:pPr>
@@ -8545,7 +8805,7 @@
       <w:pPr>
         <w:numPr>
           <w:ilvl w:val="0"/>
-          <w:numId w:val="1020"/>
+          <w:numId w:val="1021"/>
         </w:numPr>
         <w:pStyle w:val="Compact"/>
       </w:pPr>
@@ -8557,7 +8817,7 @@
       <w:pPr>
         <w:numPr>
           <w:ilvl w:val="0"/>
-          <w:numId w:val="1020"/>
+          <w:numId w:val="1021"/>
         </w:numPr>
         <w:pStyle w:val="Compact"/>
       </w:pPr>
@@ -8569,7 +8829,7 @@
       <w:pPr>
         <w:numPr>
           <w:ilvl w:val="0"/>
-          <w:numId w:val="1020"/>
+          <w:numId w:val="1021"/>
         </w:numPr>
         <w:pStyle w:val="Compact"/>
       </w:pPr>
@@ -8581,7 +8841,7 @@
       <w:pPr>
         <w:numPr>
           <w:ilvl w:val="0"/>
-          <w:numId w:val="1020"/>
+          <w:numId w:val="1021"/>
         </w:numPr>
         <w:pStyle w:val="Compact"/>
       </w:pPr>
@@ -8589,8 +8849,8 @@
         <w:t xml:space="preserve">A literature audit cannot prove universal novelty.</w:t>
       </w:r>
     </w:p>
-    <w:bookmarkEnd w:id="109"/>
-    <w:bookmarkStart w:id="110" w:name="final-project-summary"/>
+    <w:bookmarkEnd w:id="111"/>
+    <w:bookmarkStart w:id="112" w:name="final-project-summary"/>
     <w:p>
       <w:pPr>
         <w:pStyle w:val="Heading2"/>
@@ -8842,7 +9102,7 @@
               <w:jc w:val="left"/>
             </w:pPr>
             <w:r>
-              <w:t xml:space="preserve">Facility access, population-weighted loss, partial compliance</w:t>
+              <w:t xml:space="preserve">Uncertainty, facility access, population-weighted loss, partial compliance, road criticality</w:t>
             </w:r>
           </w:p>
         </w:tc>
@@ -8926,8 +9186,8 @@
         </w:tc>
       </w:tr>
     </w:tbl>
-    <w:bookmarkEnd w:id="110"/>
-    <w:bookmarkStart w:id="111" w:name="research-claim-boundary"/>
+    <w:bookmarkEnd w:id="112"/>
+    <w:bookmarkStart w:id="113" w:name="research-claim-boundary"/>
     <w:p>
       <w:pPr>
         <w:pStyle w:val="Heading2"/>
@@ -8980,7 +9240,7 @@
       <w:pPr>
         <w:numPr>
           <w:ilvl w:val="0"/>
-          <w:numId w:val="1021"/>
+          <w:numId w:val="1022"/>
         </w:numPr>
         <w:pStyle w:val="Compact"/>
       </w:pPr>
@@ -8992,7 +9252,7 @@
       <w:pPr>
         <w:numPr>
           <w:ilvl w:val="0"/>
-          <w:numId w:val="1021"/>
+          <w:numId w:val="1022"/>
         </w:numPr>
         <w:pStyle w:val="Compact"/>
       </w:pPr>
@@ -9004,7 +9264,7 @@
       <w:pPr>
         <w:numPr>
           <w:ilvl w:val="0"/>
-          <w:numId w:val="1021"/>
+          <w:numId w:val="1022"/>
         </w:numPr>
         <w:pStyle w:val="Compact"/>
       </w:pPr>
@@ -9016,7 +9276,7 @@
       <w:pPr>
         <w:numPr>
           <w:ilvl w:val="0"/>
-          <w:numId w:val="1021"/>
+          <w:numId w:val="1022"/>
         </w:numPr>
         <w:pStyle w:val="Compact"/>
       </w:pPr>
@@ -9028,7 +9288,7 @@
       <w:pPr>
         <w:numPr>
           <w:ilvl w:val="0"/>
-          <w:numId w:val="1021"/>
+          <w:numId w:val="1022"/>
         </w:numPr>
         <w:pStyle w:val="Compact"/>
       </w:pPr>
@@ -9040,7 +9300,7 @@
       <w:pPr>
         <w:numPr>
           <w:ilvl w:val="0"/>
-          <w:numId w:val="1021"/>
+          <w:numId w:val="1022"/>
         </w:numPr>
         <w:pStyle w:val="Compact"/>
       </w:pPr>
@@ -9056,8 +9316,8 @@
         <w:t xml:space="preserve">Those claims require completion of Stages 3–10.</w:t>
       </w:r>
     </w:p>
-    <w:bookmarkEnd w:id="111"/>
-    <w:bookmarkEnd w:id="112"/>
+    <w:bookmarkEnd w:id="113"/>
+    <w:bookmarkEnd w:id="114"/>
     <w:sectPr/>
   </w:body>
 </w:document>
@@ -9371,27 +9631,6 @@
     <w:abstractNumId w:val="991"/>
   </w:num>
   <w:num w:numId="1006">
-    <w:abstractNumId w:val="991"/>
-  </w:num>
-  <w:num w:numId="1007">
-    <w:abstractNumId w:val="991"/>
-  </w:num>
-  <w:num w:numId="1008">
-    <w:abstractNumId w:val="991"/>
-  </w:num>
-  <w:num w:numId="1009">
-    <w:abstractNumId w:val="991"/>
-  </w:num>
-  <w:num w:numId="1010">
-    <w:abstractNumId w:val="991"/>
-  </w:num>
-  <w:num w:numId="1011">
-    <w:abstractNumId w:val="991"/>
-  </w:num>
-  <w:num w:numId="1012">
-    <w:abstractNumId w:val="991"/>
-  </w:num>
-  <w:num w:numId="1013">
     <w:abstractNumId w:val="99411"/>
     <w:lvlOverride w:ilvl="0">
       <w:startOverride w:val="1"/>
@@ -9421,10 +9660,28 @@
       <w:startOverride w:val="1"/>
     </w:lvlOverride>
   </w:num>
-  <w:num w:numId="1014">
+  <w:num w:numId="1007">
     <w:abstractNumId w:val="991"/>
   </w:num>
-  <w:num w:numId="1015">
+  <w:num w:numId="1008">
+    <w:abstractNumId w:val="991"/>
+  </w:num>
+  <w:num w:numId="1009">
+    <w:abstractNumId w:val="991"/>
+  </w:num>
+  <w:num w:numId="1010">
+    <w:abstractNumId w:val="991"/>
+  </w:num>
+  <w:num w:numId="1011">
+    <w:abstractNumId w:val="991"/>
+  </w:num>
+  <w:num w:numId="1012">
+    <w:abstractNumId w:val="991"/>
+  </w:num>
+  <w:num w:numId="1013">
+    <w:abstractNumId w:val="991"/>
+  </w:num>
+  <w:num w:numId="1014">
     <w:abstractNumId w:val="99411"/>
     <w:lvlOverride w:ilvl="0">
       <w:startOverride w:val="1"/>
@@ -9454,13 +9711,10 @@
       <w:startOverride w:val="1"/>
     </w:lvlOverride>
   </w:num>
-  <w:num w:numId="1016">
+  <w:num w:numId="1015">
     <w:abstractNumId w:val="991"/>
   </w:num>
-  <w:num w:numId="1017">
-    <w:abstractNumId w:val="991"/>
-  </w:num>
-  <w:num w:numId="1018">
+  <w:num w:numId="1016">
     <w:abstractNumId w:val="99411"/>
     <w:lvlOverride w:ilvl="0">
       <w:startOverride w:val="1"/>
@@ -9490,10 +9744,13 @@
       <w:startOverride w:val="1"/>
     </w:lvlOverride>
   </w:num>
-  <w:num w:numId="1019">
+  <w:num w:numId="1017">
     <w:abstractNumId w:val="991"/>
   </w:num>
-  <w:num w:numId="1020">
+  <w:num w:numId="1018">
+    <w:abstractNumId w:val="991"/>
+  </w:num>
+  <w:num w:numId="1019">
     <w:abstractNumId w:val="99411"/>
     <w:lvlOverride w:ilvl="0">
       <w:startOverride w:val="1"/>
@@ -9523,7 +9780,40 @@
       <w:startOverride w:val="1"/>
     </w:lvlOverride>
   </w:num>
+  <w:num w:numId="1020">
+    <w:abstractNumId w:val="991"/>
+  </w:num>
   <w:num w:numId="1021">
+    <w:abstractNumId w:val="99411"/>
+    <w:lvlOverride w:ilvl="0">
+      <w:startOverride w:val="1"/>
+    </w:lvlOverride>
+    <w:lvlOverride w:ilvl="1">
+      <w:startOverride w:val="1"/>
+    </w:lvlOverride>
+    <w:lvlOverride w:ilvl="2">
+      <w:startOverride w:val="1"/>
+    </w:lvlOverride>
+    <w:lvlOverride w:ilvl="3">
+      <w:startOverride w:val="1"/>
+    </w:lvlOverride>
+    <w:lvlOverride w:ilvl="4">
+      <w:startOverride w:val="1"/>
+    </w:lvlOverride>
+    <w:lvlOverride w:ilvl="5">
+      <w:startOverride w:val="1"/>
+    </w:lvlOverride>
+    <w:lvlOverride w:ilvl="6">
+      <w:startOverride w:val="1"/>
+    </w:lvlOverride>
+    <w:lvlOverride w:ilvl="7">
+      <w:startOverride w:val="1"/>
+    </w:lvlOverride>
+    <w:lvlOverride w:ilvl="8">
+      <w:startOverride w:val="1"/>
+    </w:lvlOverride>
+  </w:num>
+  <w:num w:numId="1022">
     <w:abstractNumId w:val="991"/>
   </w:num>
 </w:numbering>

</xml_diff>

<commit_message>
Refresh final professor Word document
Co-authored-by: rohit michael <rohitmichael-alt@users.noreply.github.com>
</commit_message>
<xml_diff>
--- a/docs/PROJECT_RESEARCH_AND_EVIDENCE.docx
+++ b/docs/PROJECT_RESEARCH_AND_EVIDENCE.docx
@@ -1431,10 +1431,10 @@
           <w:bCs/>
           <w:b/>
         </w:rPr>
-        <w:t xml:space="preserve">near-real-time capable</w:t>
-      </w:r>
-      <w:r>
-        <w:t xml:space="preserve">, not as a live Chennai service.</w:t>
+        <w:t xml:space="preserve">designed for near-real-time operation</w:t>
+      </w:r>
+      <w:r>
+        <w:t xml:space="preserve">, not as a validated near-real-time or live Chennai service.</w:t>
       </w:r>
     </w:p>
     <w:p>
@@ -4194,7 +4194,7 @@
         <w:t xml:space="preserve"> </w:t>
       </w:r>
       <w:r>
-        <w:t xml:space="preserve">0%, 25%, 50%, 75%, and 100% of vehicles follow guidance.</w:t>
+        <w:t xml:space="preserve">exact seeded cohorts of 0%, 25%, 50%, 75%, and 100% of vehicles follow guidance.</w:t>
       </w:r>
     </w:p>
     <w:p>
@@ -4210,13 +4210,13 @@
           <w:bCs/>
           <w:b/>
         </w:rPr>
-        <w:t xml:space="preserve">Facility-oriented road criticality:</w:t>
-      </w:r>
-      <w:r>
-        <w:t xml:space="preserve"> </w:t>
-      </w:r>
-      <w:r>
-        <w:t xml:space="preserve">rank candidate roads by newly disconnected population and population-weighted added facility travel time.</w:t>
+        <w:t xml:space="preserve">Facility-oriented criticality:</w:t>
+      </w:r>
+      <w:r>
+        <w:t xml:space="preserve"> </w:t>
+      </w:r>
+      <w:r>
+        <w:t xml:space="preserve">rank directed keyed arcs by newly disconnected population and population-weighted added facility travel time; group both directions/parallel arcs by OSM way ID before physical-road reporting.</w:t>
       </w:r>
     </w:p>
     <w:p>
@@ -6623,7 +6623,7 @@
         <w:pStyle w:val="Compact"/>
       </w:pPr>
       <w:r>
-        <w:t xml:space="preserve">41 passing tests.</w:t>
+        <w:t xml:space="preserve">45 passing tests.</w:t>
       </w:r>
     </w:p>
     <w:bookmarkEnd w:id="90"/>

</xml_diff>

<commit_message>
Generate final audited professor Word document
Co-authored-by: rohit michael <rohitmichael-alt@users.noreply.github.com>
</commit_message>
<xml_diff>
--- a/docs/PROJECT_RESEARCH_AND_EVIDENCE.docx
+++ b/docs/PROJECT_RESEARCH_AND_EVIDENCE.docx
@@ -28,7 +28,7 @@
         </w:p>
       </w:sdtContent>
     </w:sdt>
-    <w:bookmarkStart w:id="114" w:name="Xd3382af488ce2996da400d0130c7cadeb69cdc7"/>
+    <w:bookmarkStart w:id="138" w:name="Xd3382af488ce2996da400d0130c7cadeb69cdc7"/>
     <w:p>
       <w:pPr>
         <w:pStyle w:val="Heading1"/>
@@ -352,7 +352,7 @@
       </w:r>
     </w:p>
     <w:bookmarkEnd w:id="22"/>
-    <w:bookmarkStart w:id="44" w:name="research-gap-and-contribution"/>
+    <w:bookmarkStart w:id="45" w:name="research-gap-and-contribution"/>
     <w:p>
       <w:pPr>
         <w:pStyle w:val="Heading2"/>
@@ -521,11 +521,17 @@
           <w:bCs/>
           <w:b/>
         </w:rPr>
-        <w:t xml:space="preserve">Novelty confidence: Medium for integration/evaluation; Low for algorithmic novelty.</w:t>
+        <w:t xml:space="preserve">Provisional novelty assessment:</w:t>
+      </w:r>
+      <w:r>
+        <w:t xml:space="preserve"> </w:t>
+      </w:r>
+      <w:r>
+        <w:t xml:space="preserve">Medium for the proposed integration/evaluation and Low for algorithmic novelty, pending a systematic database search and completed Chennai experiments.</w:t>
       </w:r>
     </w:p>
     <w:bookmarkEnd w:id="23"/>
-    <w:bookmarkStart w:id="32" w:name="closest-prior-art"/>
+    <w:bookmarkStart w:id="33" w:name="closest-prior-art"/>
     <w:p>
       <w:pPr>
         <w:pStyle w:val="Heading3"/>
@@ -988,8 +994,130 @@
         <w:t xml:space="preserve">claim is supportable.</w:t>
       </w:r>
     </w:p>
+    <w:bookmarkStart w:id="32" w:name="search-protocol-and-limit"/>
+    <w:p>
+      <w:pPr>
+        <w:pStyle w:val="Heading4"/>
+      </w:pPr>
+      <w:r>
+        <w:t xml:space="preserve">Search Protocol and Limit</w:t>
+      </w:r>
+    </w:p>
+    <w:p>
+      <w:pPr>
+        <w:pStyle w:val="FirstParagraph"/>
+      </w:pPr>
+      <w:r>
+        <w:t xml:space="preserve">The audit used targeted English-language searches through 6 September 2026 across scholarly web indexes, DOI/publisher records, surveys, reference chains, and Google Patents. Search concepts included</w:t>
+      </w:r>
+      <w:r>
+        <w:t xml:space="preserve"> </w:t>
+      </w:r>
+      <w:r>
+        <w:rPr>
+          <w:rStyle w:val="VerbatimChar"/>
+        </w:rPr>
+        <w:t xml:space="preserve">CCH dynamic rerouting</w:t>
+      </w:r>
+      <w:r>
+        <w:t xml:space="preserve">,</w:t>
+      </w:r>
+      <w:r>
+        <w:t xml:space="preserve"> </w:t>
+      </w:r>
+      <w:r>
+        <w:rPr>
+          <w:rStyle w:val="VerbatimChar"/>
+        </w:rPr>
+        <w:t xml:space="preserve">lazy/partial customization</w:t>
+      </w:r>
+      <w:r>
+        <w:t xml:space="preserve">,</w:t>
+      </w:r>
+      <w:r>
+        <w:t xml:space="preserve"> </w:t>
+      </w:r>
+      <w:r>
+        <w:rPr>
+          <w:rStyle w:val="VerbatimChar"/>
+        </w:rPr>
+        <w:t xml:space="preserve">stale metric shortest path certificate</w:t>
+      </w:r>
+      <w:r>
+        <w:t xml:space="preserve">,</w:t>
+      </w:r>
+      <w:r>
+        <w:t xml:space="preserve"> </w:t>
+      </w:r>
+      <w:r>
+        <w:rPr>
+          <w:rStyle w:val="VerbatimChar"/>
+        </w:rPr>
+        <w:t xml:space="preserve">monotone edge-weight increase</w:t>
+      </w:r>
+      <w:r>
+        <w:t xml:space="preserve">,</w:t>
+      </w:r>
+      <w:r>
+        <w:t xml:space="preserve"> </w:t>
+      </w:r>
+      <w:r>
+        <w:rPr>
+          <w:rStyle w:val="VerbatimChar"/>
+        </w:rPr>
+        <w:t xml:space="preserve">bounded suboptimal replanning</w:t>
+      </w:r>
+      <w:r>
+        <w:t xml:space="preserve">,</w:t>
+      </w:r>
+      <w:r>
+        <w:t xml:space="preserve"> </w:t>
+      </w:r>
+      <w:r>
+        <w:rPr>
+          <w:rStyle w:val="VerbatimChar"/>
+        </w:rPr>
+        <w:t xml:space="preserve">BPR route reservation</w:t>
+      </w:r>
+      <w:r>
+        <w:t xml:space="preserve">,</w:t>
+      </w:r>
+      <w:r>
+        <w:t xml:space="preserve"> </w:t>
+      </w:r>
+      <w:r>
+        <w:rPr>
+          <w:rStyle w:val="VerbatimChar"/>
+        </w:rPr>
+        <w:t xml:space="preserve">flood SUMO routing</w:t>
+      </w:r>
+      <w:r>
+        <w:t xml:space="preserve">, and</w:t>
+      </w:r>
+      <w:r>
+        <w:t xml:space="preserve"> </w:t>
+      </w:r>
+      <w:r>
+        <w:rPr>
+          <w:rStyle w:val="VerbatimChar"/>
+        </w:rPr>
+        <w:t xml:space="preserve">Chennai flood routing</w:t>
+      </w:r>
+      <w:r>
+        <w:t xml:space="preserve">. Candidate work was screened for certificate logic, routing index, traffic assignment, flood evidence, stability, and emergency/accessibility evaluation.</w:t>
+      </w:r>
+    </w:p>
+    <w:p>
+      <w:pPr>
+        <w:pStyle w:val="BodyText"/>
+      </w:pPr>
+      <w:r>
+        <w:t xml:space="preserve">This was a focused prior-art audit, not a registered systematic review. The claimed gap is therefore provisional and must be rechecked using venue-specific databases and documented inclusion/exclusion counts before submission.</w:t>
+      </w:r>
+    </w:p>
     <w:bookmarkEnd w:id="32"/>
-    <w:bookmarkStart w:id="41" w:name="chennai-specific-gap"/>
+    <w:bookmarkEnd w:id="33"/>
+    <w:bookmarkStart w:id="42" w:name="chennai-specific-gap"/>
     <w:p>
       <w:pPr>
         <w:pStyle w:val="Heading3"/>
@@ -1017,7 +1145,7 @@
       <w:r>
         <w:t xml:space="preserve">crowdsourced flooded-street mapping (</w:t>
       </w:r>
-      <w:hyperlink r:id="rId33">
+      <w:hyperlink r:id="rId34">
         <w:r>
           <w:rPr>
             <w:rStyle w:val="Hyperlink"/>
@@ -1040,7 +1168,7 @@
       <w:r>
         <w:t xml:space="preserve">flood-relief vehicle routing (</w:t>
       </w:r>
-      <w:hyperlink r:id="rId34">
+      <w:hyperlink r:id="rId35">
         <w:r>
           <w:rPr>
             <w:rStyle w:val="Hyperlink"/>
@@ -1063,7 +1191,7 @@
       <w:r>
         <w:t xml:space="preserve">city-level Dijkstra/A*/ALT routing (</w:t>
       </w:r>
-      <w:hyperlink r:id="rId35">
+      <w:hyperlink r:id="rId36">
         <w:r>
           <w:rPr>
             <w:rStyle w:val="Hyperlink"/>
@@ -1086,7 +1214,7 @@
       <w:r>
         <w:t xml:space="preserve">flood forecasting through C-FLOWS (</w:t>
       </w:r>
-      <w:hyperlink r:id="rId36">
+      <w:hyperlink r:id="rId37">
         <w:r>
           <w:rPr>
             <w:rStyle w:val="Hyperlink"/>
@@ -1109,7 +1237,7 @@
       <w:r>
         <w:t xml:space="preserve">flood susceptibility mapping (</w:t>
       </w:r>
-      <w:hyperlink r:id="rId37">
+      <w:hyperlink r:id="rId38">
         <w:r>
           <w:rPr>
             <w:rStyle w:val="Hyperlink"/>
@@ -1132,7 +1260,7 @@
       <w:r>
         <w:t xml:space="preserve">SUMO calibration for heterogeneous Chennai traffic (</w:t>
       </w:r>
-      <w:hyperlink r:id="rId38">
+      <w:hyperlink r:id="rId39">
         <w:r>
           <w:rPr>
             <w:rStyle w:val="Hyperlink"/>
@@ -1155,7 +1283,7 @@
       <w:r>
         <w:t xml:space="preserve">Chennai BPR-family calibration (</w:t>
       </w:r>
-      <w:hyperlink r:id="rId39">
+      <w:hyperlink r:id="rId40">
         <w:r>
           <w:rPr>
             <w:rStyle w:val="Hyperlink"/>
@@ -1178,7 +1306,7 @@
       <w:r>
         <w:t xml:space="preserve">a recent flood/traffic/safety navigation concept (</w:t>
       </w:r>
-      <w:hyperlink r:id="rId40">
+      <w:hyperlink r:id="rId41">
         <w:r>
           <w:rPr>
             <w:rStyle w:val="Hyperlink"/>
@@ -1198,8 +1326,8 @@
         <w:t xml:space="preserve">No verified Chennai study was found that jointly evaluates flood-dependent effective capacity, CCH refresh behavior, projected route load, route stability, partial compliance, and population-weighted critical-facility access. This is an evidence-based search result, not proof of universal absence.</w:t>
       </w:r>
     </w:p>
-    <w:bookmarkEnd w:id="41"/>
-    <w:bookmarkStart w:id="42" w:name="publication-positioning"/>
+    <w:bookmarkEnd w:id="42"/>
+    <w:bookmarkStart w:id="43" w:name="publication-positioning"/>
     <w:p>
       <w:pPr>
         <w:pStyle w:val="Heading3"/>
@@ -1301,8 +1429,8 @@
         <w:t xml:space="preserve">public experiment configurations and negative results.</w:t>
       </w:r>
     </w:p>
-    <w:bookmarkEnd w:id="42"/>
-    <w:bookmarkStart w:id="43" w:name="historical-data-and-publication-validity"/>
+    <w:bookmarkEnd w:id="43"/>
+    <w:bookmarkStart w:id="44" w:name="historical-data-and-publication-validity"/>
     <w:p>
       <w:pPr>
         <w:pStyle w:val="Heading3"/>
@@ -1316,7 +1444,7 @@
         <w:pStyle w:val="FirstParagraph"/>
       </w:pPr>
       <w:r>
-        <w:t xml:space="preserve">The absence of a public live Chennai traffic/closure feed does not prevent publication. The study must be framed as a</w:t>
+        <w:t xml:space="preserve">The absence of a public live Chennai traffic/closure feed does not by itself preclude a retrospective methods submission; suitability depends on validation quality and venue. The study must be framed as a</w:t>
       </w:r>
       <w:r>
         <w:t xml:space="preserve"> </w:t>
@@ -1326,10 +1454,10 @@
           <w:bCs/>
           <w:b/>
         </w:rPr>
-        <w:t xml:space="preserve">retrospective historical-event replay with simulated traffic</w:t>
-      </w:r>
-      <w:r>
-        <w:t xml:space="preserve">, not an operational live deployment.</w:t>
+        <w:t xml:space="preserve">retrospective historical-evidence-conditioned simulation/scenario reconstruction</w:t>
+      </w:r>
+      <w:r>
+        <w:t xml:space="preserve">, not an observed road-state replay or operational live deployment.</w:t>
       </w:r>
     </w:p>
     <w:p>
@@ -1349,7 +1477,7 @@
         <w:pStyle w:val="Compact"/>
       </w:pPr>
       <w:r>
-        <w:t xml:space="preserve">replay documented Chennai flood conditions and rainfall for declared dates;</w:t>
+        <w:t xml:space="preserve">condition scenarios on documented Chennai flood evidence and rainfall for declared dates;</w:t>
       </w:r>
     </w:p>
     <w:p>
@@ -1385,7 +1513,7 @@
         <w:pStyle w:val="Compact"/>
       </w:pPr>
       <w:r>
-        <w:t xml:space="preserve">inject controlled 0/30/60/120-minute evidence lags and false-positive/false-negative road states;</w:t>
+        <w:t xml:space="preserve">inject controlled 0/30/60/120-minute lags and false-positive/false-negative states into derived/simulated road-state traces;</w:t>
       </w:r>
     </w:p>
     <w:p>
@@ -1442,12 +1570,12 @@
         <w:pStyle w:val="FirstParagraph"/>
       </w:pPr>
       <w:r>
-        <w:t xml:space="preserve">The limitation is reduced operational external validity: the study cannot prove present-day live accuracy or deployment readiness. That limitation is acceptable for an applied methods/case-study paper when stated explicitly.</w:t>
-      </w:r>
-    </w:p>
-    <w:bookmarkEnd w:id="43"/>
+        <w:t xml:space="preserve">OpenCity hotspot/hazard layers do not provide authoritative timestamped road-state trajectories. Until such observations are obtained, lag/error tests measure robustness to controlled assumptions rather than empirical sensing accuracy. The study cannot prove present-day live accuracy or deployment readiness.</w:t>
+      </w:r>
+    </w:p>
     <w:bookmarkEnd w:id="44"/>
-    <w:bookmarkStart w:id="53" w:name="proposed-method"/>
+    <w:bookmarkEnd w:id="45"/>
+    <w:bookmarkStart w:id="54" w:name="proposed-method"/>
     <w:p>
       <w:pPr>
         <w:pStyle w:val="Heading2"/>
@@ -1456,7 +1584,7 @@
         <w:t xml:space="preserve">5. Proposed Method</w:t>
       </w:r>
     </w:p>
-    <w:bookmarkStart w:id="45" w:name="network-and-cost-model"/>
+    <w:bookmarkStart w:id="46" w:name="network-and-cost-model"/>
     <w:p>
       <w:pPr>
         <w:pStyle w:val="Heading3"/>
@@ -2331,8 +2459,8 @@
         <w:t xml:space="preserve">; the finite BPR expression is not evaluated. The native CCH experiment currently rejects closures until a finite sentinel and overflow bound are validated.</w:t>
       </w:r>
     </w:p>
-    <w:bookmarkEnd w:id="45"/>
-    <w:bookmarkStart w:id="46" w:name="which-algorithm-finds-the-path"/>
+    <w:bookmarkEnd w:id="46"/>
+    <w:bookmarkStart w:id="47" w:name="which-algorithm-finds-the-path"/>
     <w:p>
       <w:pPr>
         <w:pStyle w:val="Heading3"/>
@@ -2344,19 +2472,31 @@
     <w:p>
       <w:pPr>
         <w:pStyle w:val="FirstParagraph"/>
+      </w:pPr>
+      <w:r>
+        <w:t xml:space="preserve">Stage 1 uses Dijkstra. Stage 2 can select Dijkstra or the native CCH adapter on synthetic graphs. The planned Chennai implementation will use CCH only after Stage 6 validates topology conversion, turns, closures, quantization, ordering, and path equality.</w:t>
+      </w:r>
+    </w:p>
+    <w:p>
+      <w:pPr>
+        <w:numPr>
+          <w:ilvl w:val="0"/>
+          <w:numId w:val="1008"/>
+        </w:numPr>
+        <w:pStyle w:val="Compact"/>
       </w:pPr>
       <w:r>
         <w:rPr>
           <w:bCs/>
           <w:b/>
         </w:rPr>
-        <w:t xml:space="preserve">CCH finds the proposed path.</w:t>
-      </w:r>
-      <w:r>
-        <w:t xml:space="preserve"> </w:t>
-      </w:r>
-      <w:r>
-        <w:t xml:space="preserve">It preprocesses fixed topology once, customizes integer edge weights when the metric changes, and then answers exact shortest-path queries for that represented metric.</w:t>
+        <w:t xml:space="preserve">Dijkstra:</w:t>
+      </w:r>
+      <w:r>
+        <w:t xml:space="preserve"> </w:t>
+      </w:r>
+      <w:r>
+        <w:t xml:space="preserve">implemented correctness oracle and Stage 1 baseline.</w:t>
       </w:r>
     </w:p>
     <w:p>
@@ -2372,13 +2512,13 @@
           <w:bCs/>
           <w:b/>
         </w:rPr>
-        <w:t xml:space="preserve">Dijkstra:</w:t>
-      </w:r>
-      <w:r>
-        <w:t xml:space="preserve"> </w:t>
-      </w:r>
-      <w:r>
-        <w:t xml:space="preserve">correctness oracle and baseline.</w:t>
+        <w:t xml:space="preserve">CCH:</w:t>
+      </w:r>
+      <w:r>
+        <w:t xml:space="preserve"> </w:t>
+      </w:r>
+      <w:r>
+        <w:t xml:space="preserve">implemented prototype adapter; planned final Chennai path engine after validation.</w:t>
       </w:r>
     </w:p>
     <w:p>
@@ -2400,7 +2540,7 @@
         <w:t xml:space="preserve"> </w:t>
       </w:r>
       <w:r>
-        <w:t xml:space="preserve">lightweight backup/comparator.</w:t>
+        <w:t xml:space="preserve">unimplemented planned comparator/backup.</w:t>
       </w:r>
     </w:p>
     <w:p>
@@ -2505,8 +2645,8 @@
         <w:t xml:space="preserve">: repeated-refresh baseline.</w:t>
       </w:r>
     </w:p>
-    <w:bookmarkEnd w:id="46"/>
-    <w:bookmarkStart w:id="48" w:name="certified-lazy-synchronization"/>
+    <w:bookmarkEnd w:id="47"/>
+    <w:bookmarkStart w:id="49" w:name="certified-lazy-synchronization"/>
     <w:p>
       <w:pPr>
         <w:pStyle w:val="Heading3"/>
@@ -2889,7 +3029,7 @@
         <w:t xml:space="preserve">Otherwise, the controller customizes CCH with the complete current metric and queries again.</w:t>
       </w:r>
     </w:p>
-    <w:bookmarkStart w:id="47" w:name="three-road-example"/>
+    <w:bookmarkStart w:id="48" w:name="three-road-example"/>
     <w:p>
       <w:pPr>
         <w:pStyle w:val="Heading4"/>
@@ -3232,9 +3372,9 @@
         <w:t xml:space="preserve">If A rises to 7.0 min, refreshed CCH selects B at 6.0 min.</w:t>
       </w:r>
     </w:p>
-    <w:bookmarkEnd w:id="47"/>
     <w:bookmarkEnd w:id="48"/>
-    <w:bookmarkStart w:id="49" w:name="formal-guarantee"/>
+    <w:bookmarkEnd w:id="49"/>
+    <w:bookmarkStart w:id="50" w:name="formal-guarantee"/>
     <w:p>
       <w:pPr>
         <w:pStyle w:val="Heading3"/>
@@ -3794,8 +3934,8 @@
         <w:t xml:space="preserve">This is an application of an established upper/lower-bound certificate, not a new theorem.</w:t>
       </w:r>
     </w:p>
-    <w:bookmarkEnd w:id="49"/>
-    <w:bookmarkStart w:id="50" w:name="mandatory-refresh-conditions"/>
+    <w:bookmarkEnd w:id="50"/>
+    <w:bookmarkStart w:id="51" w:name="mandatory-refresh-conditions"/>
     <w:p>
       <w:pPr>
         <w:pStyle w:val="Heading3"/>
@@ -3868,8 +4008,8 @@
         <w:t xml:space="preserve">A closure represented as an increase is safe for the lower-bound direction, but a candidate containing the closed edge fails the upper-bound test. Native CCH currently accepts finite integer weights only; closure-sentinel behavior still requires a dedicated validation stage.</w:t>
       </w:r>
     </w:p>
-    <w:bookmarkEnd w:id="50"/>
-    <w:bookmarkStart w:id="51" w:name="route-adoption-and-projected-load"/>
+    <w:bookmarkEnd w:id="51"/>
+    <w:bookmarkStart w:id="52" w:name="route-adoption-and-projected-load"/>
     <w:p>
       <w:pPr>
         <w:pStyle w:val="Heading3"/>
@@ -4035,8 +4175,8 @@
         <w:t xml:space="preserve">This greedy policy is not claimed to achieve traffic equilibrium.</w:t>
       </w:r>
     </w:p>
-    <w:bookmarkEnd w:id="51"/>
-    <w:bookmarkStart w:id="52" w:name="emergency-and-public-service-evaluation"/>
+    <w:bookmarkEnd w:id="52"/>
+    <w:bookmarkStart w:id="53" w:name="emergency-and-public-service-evaluation"/>
     <w:p>
       <w:pPr>
         <w:pStyle w:val="Heading3"/>
@@ -4194,7 +4334,7 @@
         <w:t xml:space="preserve"> </w:t>
       </w:r>
       <w:r>
-        <w:t xml:space="preserve">exact seeded cohorts of 0%, 25%, 50%, 75%, and 100% of vehicles follow guidance.</w:t>
+        <w:t xml:space="preserve">nearest-integer seeded cohorts target 0%, 25%, 50%, 75%, and 100%; exact percentages require a compatible fleet size.</w:t>
       </w:r>
     </w:p>
     <w:p>
@@ -4216,7 +4356,7 @@
         <w:t xml:space="preserve"> </w:t>
       </w:r>
       <w:r>
-        <w:t xml:space="preserve">rank directed keyed arcs by newly disconnected population and population-weighted added facility travel time; group both directions/parallel arcs by OSM way ID before physical-road reporting.</w:t>
+        <w:t xml:space="preserve">rank directed keyed arcs by newly disconnected population and unnormalised person-time added to facility access; group both directions/parallel arcs by OSM way ID before physical-road reporting.</w:t>
       </w:r>
     </w:p>
     <w:p>
@@ -4224,7 +4364,7 @@
         <w:pStyle w:val="FirstParagraph"/>
       </w:pPr>
       <w:r>
-        <w:t xml:space="preserve">Generic deterministic implementations for all five are present in</w:t>
+        <w:t xml:space="preserve">Generic utility functions exist for portions of all five factors in</w:t>
       </w:r>
       <w:r>
         <w:t xml:space="preserve"> </w:t>
@@ -4251,12 +4391,12 @@
         <w:t xml:space="preserve">evaluation/robustness.py</w:t>
       </w:r>
       <w:r>
-        <w:t xml:space="preserve">; Chennai data integration remains a later stage.</w:t>
-      </w:r>
-    </w:p>
-    <w:bookmarkEnd w:id="52"/>
+        <w:t xml:space="preserve">. None of the five has yet been integrated with Chennai inputs or executed as a factor-level experiment.</w:t>
+      </w:r>
+    </w:p>
     <w:bookmarkEnd w:id="53"/>
-    <w:bookmarkStart w:id="82" w:name="dataset-and-data-access"/>
+    <w:bookmarkEnd w:id="54"/>
+    <w:bookmarkStart w:id="106" w:name="dataset-and-data-access"/>
     <w:p>
       <w:pPr>
         <w:pStyle w:val="Heading2"/>
@@ -4265,47 +4405,1664 @@
         <w:t xml:space="preserve">6. Dataset and Data Access</w:t>
       </w:r>
     </w:p>
-    <w:bookmarkStart w:id="58" w:name="openstreetmap"/>
+    <w:bookmarkStart w:id="65" w:name="X6a0b311eb7f577d5968c7f63e860014ce690bd2"/>
     <w:p>
       <w:pPr>
         <w:pStyle w:val="Heading3"/>
       </w:pPr>
       <w:r>
-        <w:t xml:space="preserve">6.1 OpenStreetMap</w:t>
-      </w:r>
-    </w:p>
-    <w:p>
-      <w:pPr>
-        <w:pStyle w:val="FirstParagraph"/>
+        <w:t xml:space="preserve">6.1 Factor-to-Data, Credential, and Implementation Matrix</w:t>
+      </w:r>
+    </w:p>
+    <w:tbl>
+      <w:tblPr>
+        <w:tblStyle w:val="Table"/>
+        <w:tblW w:type="pct" w:w="5000"/>
+        <w:tblLook w:firstRow="1" w:lastRow="0" w:firstColumn="0" w:lastColumn="0" w:noHBand="0" w:noVBand="0" w:val="0020"/>
+        <w:jc w:val="start"/>
+      </w:tblPr>
+      <w:tblGrid>
+        <w:gridCol w:w="990"/>
+        <w:gridCol w:w="990"/>
+        <w:gridCol w:w="990"/>
+        <w:gridCol w:w="990"/>
+        <w:gridCol w:w="990"/>
+        <w:gridCol w:w="990"/>
+        <w:gridCol w:w="990"/>
+        <w:gridCol w:w="990"/>
+      </w:tblGrid>
+      <w:tr>
+        <w:trPr>
+          <w:tblHeader w:val="true"/>
+        </w:trPr>
+        <w:tc>
+          <w:tcPr/>
+          <w:p>
+            <w:pPr>
+              <w:pStyle w:val="Compact"/>
+              <w:jc w:val="left"/>
+            </w:pPr>
+            <w:r>
+              <w:t xml:space="preserve">Factor</w:t>
+            </w:r>
+          </w:p>
+        </w:tc>
+        <w:tc>
+          <w:tcPr/>
+          <w:p>
+            <w:pPr>
+              <w:pStyle w:val="Compact"/>
+              <w:jc w:val="left"/>
+            </w:pPr>
+            <w:r>
+              <w:t xml:space="preserve">Required data</w:t>
+            </w:r>
+          </w:p>
+        </w:tc>
+        <w:tc>
+          <w:tcPr/>
+          <w:p>
+            <w:pPr>
+              <w:pStyle w:val="Compact"/>
+              <w:jc w:val="left"/>
+            </w:pPr>
+            <w:r>
+              <w:t xml:space="preserve">Chennai source</w:t>
+            </w:r>
+          </w:p>
+        </w:tc>
+        <w:tc>
+          <w:tcPr/>
+          <w:p>
+            <w:pPr>
+              <w:pStyle w:val="Compact"/>
+              <w:jc w:val="left"/>
+            </w:pPr>
+            <w:r>
+              <w:t xml:space="preserve">Access method</w:t>
+            </w:r>
+          </w:p>
+        </w:tc>
+        <w:tc>
+          <w:tcPr/>
+          <w:p>
+            <w:pPr>
+              <w:pStyle w:val="Compact"/>
+              <w:jc w:val="left"/>
+            </w:pPr>
+            <w:r>
+              <w:t xml:space="preserve">API key/account</w:t>
+            </w:r>
+          </w:p>
+        </w:tc>
+        <w:tc>
+          <w:tcPr/>
+          <w:p>
+            <w:pPr>
+              <w:pStyle w:val="Compact"/>
+              <w:jc w:val="left"/>
+            </w:pPr>
+            <w:r>
+              <w:t xml:space="preserve">No-credential path</w:t>
+            </w:r>
+          </w:p>
+        </w:tc>
+        <w:tc>
+          <w:tcPr/>
+          <w:p>
+            <w:pPr>
+              <w:pStyle w:val="Compact"/>
+              <w:jc w:val="left"/>
+            </w:pPr>
+            <w:r>
+              <w:t xml:space="preserve">Implemented now</w:t>
+            </w:r>
+          </w:p>
+        </w:tc>
+        <w:tc>
+          <w:tcPr/>
+          <w:p>
+            <w:pPr>
+              <w:pStyle w:val="Compact"/>
+              <w:jc w:val="left"/>
+            </w:pPr>
+            <w:r>
+              <w:t xml:space="preserve">Remaining experiment work</w:t>
+            </w:r>
+          </w:p>
+        </w:tc>
+      </w:tr>
+      <w:tr>
+        <w:tc>
+          <w:tcPr/>
+          <w:p>
+            <w:pPr>
+              <w:pStyle w:val="Compact"/>
+              <w:jc w:val="left"/>
+            </w:pPr>
+            <w:r>
+              <w:t xml:space="preserve">Evidence freshness and uncertainty</w:t>
+            </w:r>
+          </w:p>
+        </w:tc>
+        <w:tc>
+          <w:tcPr/>
+          <w:p>
+            <w:pPr>
+              <w:pStyle w:val="Compact"/>
+              <w:jc w:val="left"/>
+            </w:pPr>
+            <w:r>
+              <w:t xml:space="preserve">A derived/simulated binary road-state truth trace plus rainfall/flood evidence</w:t>
+            </w:r>
+          </w:p>
+        </w:tc>
+        <w:tc>
+          <w:tcPr/>
+          <w:p>
+            <w:pPr>
+              <w:pStyle w:val="Compact"/>
+              <w:jc w:val="left"/>
+            </w:pPr>
+            <w:hyperlink r:id="rId55">
+              <w:r>
+                <w:rPr>
+                  <w:rStyle w:val="Hyperlink"/>
+                </w:rPr>
+                <w:t xml:space="preserve">OpenCity flood records</w:t>
+              </w:r>
+            </w:hyperlink>
+            <w:r>
+              <w:t xml:space="preserve">;</w:t>
+            </w:r>
+            <w:r>
+              <w:t xml:space="preserve"> </w:t>
+            </w:r>
+            <w:hyperlink r:id="rId56">
+              <w:r>
+                <w:rPr>
+                  <w:rStyle w:val="Hyperlink"/>
+                </w:rPr>
+                <w:t xml:space="preserve">Open-Meteo reanalysis</w:t>
+              </w:r>
+            </w:hyperlink>
+            <w:r>
+              <w:t xml:space="preserve">; optional</w:t>
+            </w:r>
+            <w:r>
+              <w:t xml:space="preserve"> </w:t>
+            </w:r>
+            <w:hyperlink r:id="rId57">
+              <w:r>
+                <w:rPr>
+                  <w:rStyle w:val="Hyperlink"/>
+                </w:rPr>
+                <w:t xml:space="preserve">IMERG Final V07</w:t>
+              </w:r>
+            </w:hyperlink>
+          </w:p>
+        </w:tc>
+        <w:tc>
+          <w:tcPr/>
+          <w:p>
+            <w:pPr>
+              <w:pStyle w:val="Compact"/>
+              <w:jc w:val="left"/>
+            </w:pPr>
+            <w:r>
+              <w:t xml:space="preserve">CKAN download, HTTPS JSON, or credentialed GES DISC download</w:t>
+            </w:r>
+          </w:p>
+        </w:tc>
+        <w:tc>
+          <w:tcPr/>
+          <w:p>
+            <w:pPr>
+              <w:pStyle w:val="Compact"/>
+              <w:jc w:val="left"/>
+            </w:pPr>
+            <w:r>
+              <w:rPr>
+                <w:bCs/>
+                <w:b/>
+              </w:rPr>
+              <w:t xml:space="preserve">No key</w:t>
+            </w:r>
+            <w:r>
+              <w:t xml:space="preserve"> </w:t>
+            </w:r>
+            <w:r>
+              <w:t xml:space="preserve">for OpenCity/Open-Meteo; Earthdata account authorization plus credentials/token for optional IMERG</w:t>
+            </w:r>
+          </w:p>
+        </w:tc>
+        <w:tc>
+          <w:tcPr/>
+          <w:p>
+            <w:pPr>
+              <w:pStyle w:val="Compact"/>
+              <w:jc w:val="left"/>
+            </w:pPr>
+            <w:r>
+              <w:t xml:space="preserve">OpenCity + Open-Meteo</w:t>
+            </w:r>
+          </w:p>
+        </w:tc>
+        <w:tc>
+          <w:tcPr/>
+          <w:p>
+            <w:pPr>
+              <w:pStyle w:val="Compact"/>
+              <w:jc w:val="left"/>
+            </w:pPr>
+            <w:r>
+              <w:t xml:space="preserve">Synthetic binary step-lag and false-positive/false-negative utility only</w:t>
+            </w:r>
+          </w:p>
+        </w:tc>
+        <w:tc>
+          <w:tcPr/>
+          <w:p>
+            <w:pPr>
+              <w:pStyle w:val="Compact"/>
+              <w:jc w:val="left"/>
+            </w:pPr>
+            <w:r>
+              <w:t xml:space="preserve">Create and justify road-state truth, timestamp alignment, multiclass/confidence mapping, then run scenarios</w:t>
+            </w:r>
+          </w:p>
+        </w:tc>
+      </w:tr>
+      <w:tr>
+        <w:tc>
+          <w:tcPr/>
+          <w:p>
+            <w:pPr>
+              <w:pStyle w:val="Compact"/>
+              <w:jc w:val="left"/>
+            </w:pPr>
+            <w:r>
+              <w:t xml:space="preserve">Critical-facility accessibility</w:t>
+            </w:r>
+          </w:p>
+        </w:tc>
+        <w:tc>
+          <w:tcPr/>
+          <w:p>
+            <w:pPr>
+              <w:pStyle w:val="Compact"/>
+              <w:jc w:val="left"/>
+            </w:pPr>
+            <w:r>
+              <w:t xml:space="preserve">Geolocated health, fire, and relief facilities</w:t>
+            </w:r>
+          </w:p>
+        </w:tc>
+        <w:tc>
+          <w:tcPr/>
+          <w:p>
+            <w:pPr>
+              <w:pStyle w:val="Compact"/>
+              <w:jc w:val="left"/>
+            </w:pPr>
+            <w:r>
+              <w:t xml:space="preserve">OpenCity</w:t>
+            </w:r>
+            <w:r>
+              <w:t xml:space="preserve"> </w:t>
+            </w:r>
+            <w:hyperlink r:id="rId58">
+              <w:r>
+                <w:rPr>
+                  <w:rStyle w:val="Hyperlink"/>
+                </w:rPr>
+                <w:t xml:space="preserve">health</w:t>
+              </w:r>
+            </w:hyperlink>
+            <w:r>
+              <w:t xml:space="preserve">,</w:t>
+            </w:r>
+            <w:r>
+              <w:t xml:space="preserve"> </w:t>
+            </w:r>
+            <w:hyperlink r:id="rId59">
+              <w:r>
+                <w:rPr>
+                  <w:rStyle w:val="Hyperlink"/>
+                </w:rPr>
+                <w:t xml:space="preserve">fire</w:t>
+              </w:r>
+            </w:hyperlink>
+            <w:r>
+              <w:t xml:space="preserve">, and</w:t>
+            </w:r>
+            <w:r>
+              <w:t xml:space="preserve"> </w:t>
+            </w:r>
+            <w:hyperlink r:id="rId60">
+              <w:r>
+                <w:rPr>
+                  <w:rStyle w:val="Hyperlink"/>
+                </w:rPr>
+                <w:t xml:space="preserve">relief</w:t>
+              </w:r>
+            </w:hyperlink>
+            <w:r>
+              <w:t xml:space="preserve">;</w:t>
+            </w:r>
+            <w:r>
+              <w:t xml:space="preserve"> </w:t>
+            </w:r>
+            <w:hyperlink r:id="rId61">
+              <w:r>
+                <w:rPr>
+                  <w:rStyle w:val="Hyperlink"/>
+                </w:rPr>
+                <w:t xml:space="preserve">OSM POIs</w:t>
+              </w:r>
+            </w:hyperlink>
+          </w:p>
+        </w:tc>
+        <w:tc>
+          <w:tcPr/>
+          <w:p>
+            <w:pPr>
+              <w:pStyle w:val="Compact"/>
+              <w:jc w:val="left"/>
+            </w:pPr>
+            <w:r>
+              <w:t xml:space="preserve">Health CSV/selected KML, fire CSV/KML, relief-centre PDF, and cached Overpass response</w:t>
+            </w:r>
+          </w:p>
+        </w:tc>
+        <w:tc>
+          <w:tcPr/>
+          <w:p>
+            <w:pPr>
+              <w:pStyle w:val="Compact"/>
+              <w:jc w:val="left"/>
+            </w:pPr>
+            <w:r>
+              <w:rPr>
+                <w:bCs/>
+                <w:b/>
+              </w:rPr>
+              <w:t xml:space="preserve">No key or account</w:t>
+            </w:r>
+            <w:r>
+              <w:t xml:space="preserve"> </w:t>
+            </w:r>
+            <w:r>
+              <w:t xml:space="preserve">for the listed sources</w:t>
+            </w:r>
+          </w:p>
+        </w:tc>
+        <w:tc>
+          <w:tcPr/>
+          <w:p>
+            <w:pPr>
+              <w:pStyle w:val="Compact"/>
+              <w:jc w:val="left"/>
+            </w:pPr>
+            <w:r>
+              <w:t xml:space="preserve">Use coordinate-bearing KML/OSM; geocode relief addresses sequentially through no-key Nominatim, then cache and manually verify</w:t>
+            </w:r>
+          </w:p>
+        </w:tc>
+        <w:tc>
+          <w:tcPr/>
+          <w:p>
+            <w:pPr>
+              <w:pStyle w:val="Compact"/>
+              <w:jc w:val="left"/>
+            </w:pPr>
+            <w:r>
+              <w:t xml:space="preserve">Summaries from precomputed travel-time arrays only</w:t>
+            </w:r>
+          </w:p>
+        </w:tc>
+        <w:tc>
+          <w:tcPr/>
+          <w:p>
+            <w:pPr>
+              <w:pStyle w:val="Compact"/>
+              <w:jc w:val="left"/>
+            </w:pPr>
+            <w:r>
+              <w:t xml:space="preserve">Acquire/cache, verify type and emergency capability, geocode relief addresses, snap facilities, compute routes</w:t>
+            </w:r>
+          </w:p>
+        </w:tc>
+      </w:tr>
+      <w:tr>
+        <w:tc>
+          <w:tcPr/>
+          <w:p>
+            <w:pPr>
+              <w:pStyle w:val="Compact"/>
+              <w:jc w:val="left"/>
+            </w:pPr>
+            <w:r>
+              <w:t xml:space="preserve">Population impact</w:t>
+            </w:r>
+          </w:p>
+        </w:tc>
+        <w:tc>
+          <w:tcPr/>
+          <w:p>
+            <w:pPr>
+              <w:pStyle w:val="Compact"/>
+              <w:jc w:val="left"/>
+            </w:pPr>
+            <w:r>
+              <w:t xml:space="preserve">Population count raster</w:t>
+            </w:r>
+          </w:p>
+        </w:tc>
+        <w:tc>
+          <w:tcPr/>
+          <w:p>
+            <w:pPr>
+              <w:pStyle w:val="Compact"/>
+              <w:jc w:val="left"/>
+            </w:pPr>
+            <w:r>
+              <w:t xml:space="preserve">Exact</w:t>
+            </w:r>
+            <w:r>
+              <w:t xml:space="preserve"> </w:t>
+            </w:r>
+            <w:hyperlink r:id="rId62">
+              <w:r>
+                <w:rPr>
+                  <w:rStyle w:val="Hyperlink"/>
+                </w:rPr>
+                <w:t xml:space="preserve">2015 India 1 km R2025A STAC item</w:t>
+              </w:r>
+            </w:hyperlink>
+          </w:p>
+        </w:tc>
+        <w:tc>
+          <w:tcPr/>
+          <w:p>
+            <w:pPr>
+              <w:pStyle w:val="Compact"/>
+              <w:jc w:val="left"/>
+            </w:pPr>
+            <w:r>
+              <w:t xml:space="preserve">Public STAC asset/GeoTIFF download</w:t>
+            </w:r>
+          </w:p>
+        </w:tc>
+        <w:tc>
+          <w:tcPr/>
+          <w:p>
+            <w:pPr>
+              <w:pStyle w:val="Compact"/>
+              <w:jc w:val="left"/>
+            </w:pPr>
+            <w:r>
+              <w:rPr>
+                <w:bCs/>
+                <w:b/>
+              </w:rPr>
+              <w:t xml:space="preserve">No key or account</w:t>
+            </w:r>
+          </w:p>
+        </w:tc>
+        <w:tc>
+          <w:tcPr/>
+          <w:p>
+            <w:pPr>
+              <w:pStyle w:val="Compact"/>
+              <w:jc w:val="left"/>
+            </w:pPr>
+            <w:r>
+              <w:t xml:space="preserve">Use the 1 km 2015 asset to match the 2015 flood scenario</w:t>
+            </w:r>
+          </w:p>
+        </w:tc>
+        <w:tc>
+          <w:tcPr/>
+          <w:p>
+            <w:pPr>
+              <w:pStyle w:val="Compact"/>
+              <w:jc w:val="left"/>
+            </w:pPr>
+            <w:r>
+              <w:t xml:space="preserve">Array-level weighted mean, p90, disconnection, and threshold summaries only</w:t>
+            </w:r>
+          </w:p>
+        </w:tc>
+        <w:tc>
+          <w:tcPr/>
+          <w:p>
+            <w:pPr>
+              <w:pStyle w:val="Compact"/>
+              <w:jc w:val="left"/>
+            </w:pPr>
+            <w:r>
+              <w:t xml:space="preserve">Download/clip raster, verify count conservation, map cells to graph origins</w:t>
+            </w:r>
+          </w:p>
+        </w:tc>
+      </w:tr>
+      <w:tr>
+        <w:tc>
+          <w:tcPr/>
+          <w:p>
+            <w:pPr>
+              <w:pStyle w:val="Compact"/>
+              <w:jc w:val="left"/>
+            </w:pPr>
+            <w:r>
+              <w:t xml:space="preserve">Partial compliance</w:t>
+            </w:r>
+          </w:p>
+        </w:tc>
+        <w:tc>
+          <w:tcPr/>
+          <w:p>
+            <w:pPr>
+              <w:pStyle w:val="Compact"/>
+              <w:jc w:val="left"/>
+            </w:pPr>
+            <w:r>
+              <w:t xml:space="preserve">Vehicle IDs and declared compliance level; no observed compliance dataset</w:t>
+            </w:r>
+          </w:p>
+        </w:tc>
+        <w:tc>
+          <w:tcPr/>
+          <w:p>
+            <w:pPr>
+              <w:pStyle w:val="Compact"/>
+              <w:jc w:val="left"/>
+            </w:pPr>
+            <w:hyperlink r:id="rId63">
+              <w:r>
+                <w:rPr>
+                  <w:rStyle w:val="Hyperlink"/>
+                </w:rPr>
+                <w:t xml:space="preserve">SUMO automatic-routing options</w:t>
+              </w:r>
+            </w:hyperlink>
+          </w:p>
+        </w:tc>
+        <w:tc>
+          <w:tcPr/>
+          <w:p>
+            <w:pPr>
+              <w:pStyle w:val="Compact"/>
+              <w:jc w:val="left"/>
+            </w:pPr>
+            <w:r>
+              <w:t xml:space="preserve">Local SUMO configuration and TraCI/libsumo</w:t>
+            </w:r>
+          </w:p>
+        </w:tc>
+        <w:tc>
+          <w:tcPr/>
+          <w:p>
+            <w:pPr>
+              <w:pStyle w:val="Compact"/>
+              <w:jc w:val="left"/>
+            </w:pPr>
+            <w:r>
+              <w:rPr>
+                <w:bCs/>
+                <w:b/>
+              </w:rPr>
+              <w:t xml:space="preserve">No key or account</w:t>
+            </w:r>
+          </w:p>
+        </w:tc>
+        <w:tc>
+          <w:tcPr/>
+          <w:p>
+            <w:pPr>
+              <w:pStyle w:val="Compact"/>
+              <w:jc w:val="left"/>
+            </w:pPr>
+            <w:r>
+              <w:t xml:space="preserve">Seeded cohort; size is</w:t>
+            </w:r>
+            <w:r>
+              <w:t xml:space="preserve"> </w:t>
+            </w:r>
+            <m:oMath>
+              <m:r>
+                <m:rPr>
+                  <m:sty m:val="p"/>
+                </m:rPr>
+                <m:t>⌊</m:t>
+              </m:r>
+              <m:r>
+                <m:t>n</m:t>
+              </m:r>
+              <m:r>
+                <m:t>p</m:t>
+              </m:r>
+              <m:r>
+                <m:rPr>
+                  <m:sty m:val="p"/>
+                </m:rPr>
+                <m:t>+</m:t>
+              </m:r>
+              <m:r>
+                <m:t>0.5</m:t>
+              </m:r>
+              <m:r>
+                <m:rPr>
+                  <m:sty m:val="p"/>
+                </m:rPr>
+                <m:t>⌋</m:t>
+              </m:r>
+            </m:oMath>
+            <w:r>
+              <w:t xml:space="preserve">, so exact percentages require a compatible fleet size</w:t>
+            </w:r>
+          </w:p>
+        </w:tc>
+        <w:tc>
+          <w:tcPr/>
+          <w:p>
+            <w:pPr>
+              <w:pStyle w:val="Compact"/>
+              <w:jc w:val="left"/>
+            </w:pPr>
+            <w:r>
+              <w:t xml:space="preserve">Reproducible nearest-integer cohort selection only</w:t>
+            </w:r>
+          </w:p>
+        </w:tc>
+        <w:tc>
+          <w:tcPr/>
+          <w:p>
+            <w:pPr>
+              <w:pStyle w:val="Compact"/>
+              <w:jc w:val="left"/>
+            </w:pPr>
+            <w:r>
+              <w:t xml:space="preserve">Wire selected IDs to rerouting devices/TraCI, define non-compliant behaviour, calibrate demand, repeat seeds</w:t>
+            </w:r>
+          </w:p>
+        </w:tc>
+      </w:tr>
+      <w:tr>
+        <w:tc>
+          <w:tcPr/>
+          <w:p>
+            <w:pPr>
+              <w:pStyle w:val="Compact"/>
+              <w:jc w:val="left"/>
+            </w:pPr>
+            <w:r>
+              <w:t xml:space="preserve">Facility-oriented criticality</w:t>
+            </w:r>
+          </w:p>
+        </w:tc>
+        <w:tc>
+          <w:tcPr/>
+          <w:p>
+            <w:pPr>
+              <w:pStyle w:val="Compact"/>
+              <w:jc w:val="left"/>
+            </w:pPr>
+            <w:r>
+              <w:t xml:space="preserve">Chennai graph + facilities + population; no separate dataset</w:t>
+            </w:r>
+          </w:p>
+        </w:tc>
+        <w:tc>
+          <w:tcPr/>
+          <w:p>
+            <w:pPr>
+              <w:pStyle w:val="Compact"/>
+              <w:jc w:val="left"/>
+            </w:pPr>
+            <w:r>
+              <w:t xml:space="preserve">Derived from</w:t>
+            </w:r>
+            <w:r>
+              <w:t xml:space="preserve"> </w:t>
+            </w:r>
+            <w:hyperlink r:id="rId64">
+              <w:r>
+                <w:rPr>
+                  <w:rStyle w:val="Hyperlink"/>
+                </w:rPr>
+                <w:t xml:space="preserve">OSM</w:t>
+              </w:r>
+            </w:hyperlink>
+            <w:r>
+              <w:t xml:space="preserve">, OpenCity facilities, and WorldPop</w:t>
+            </w:r>
+          </w:p>
+        </w:tc>
+        <w:tc>
+          <w:tcPr/>
+          <w:p>
+            <w:pPr>
+              <w:pStyle w:val="Compact"/>
+              <w:jc w:val="left"/>
+            </w:pPr>
+            <w:r>
+              <w:t xml:space="preserve">Local reverse multi-source shortest-path analysis</w:t>
+            </w:r>
+          </w:p>
+        </w:tc>
+        <w:tc>
+          <w:tcPr/>
+          <w:p>
+            <w:pPr>
+              <w:pStyle w:val="Compact"/>
+              <w:jc w:val="left"/>
+            </w:pPr>
+            <w:r>
+              <w:rPr>
+                <w:bCs/>
+                <w:b/>
+              </w:rPr>
+              <w:t xml:space="preserve">No additional key or account</w:t>
+            </w:r>
+          </w:p>
+        </w:tc>
+        <w:tc>
+          <w:tcPr/>
+          <w:p>
+            <w:pPr>
+              <w:pStyle w:val="Compact"/>
+              <w:jc w:val="left"/>
+            </w:pPr>
+            <w:r>
+              <w:t xml:space="preserve">Reuse the three public inputs above</w:t>
+            </w:r>
+          </w:p>
+        </w:tc>
+        <w:tc>
+          <w:tcPr/>
+          <w:p>
+            <w:pPr>
+              <w:pStyle w:val="Compact"/>
+              <w:jc w:val="left"/>
+            </w:pPr>
+            <w:r>
+              <w:t xml:space="preserve">Toy-tested single directed keyed-edge ranking; added cost is unnormalised person-time and disconnection is separate</w:t>
+            </w:r>
+          </w:p>
+        </w:tc>
+        <w:tc>
+          <w:tcPr/>
+          <w:p>
+            <w:pPr>
+              <w:pStyle w:val="Compact"/>
+              <w:jc w:val="left"/>
+            </w:pPr>
+            <w:r>
+              <w:t xml:space="preserve">Select candidates, group/close all physical-road arcs by OSM way ID, and run Chennai-scale analysis</w:t>
+            </w:r>
+          </w:p>
+        </w:tc>
+      </w:tr>
+    </w:tbl>
+    <w:p>
+      <w:pPr>
+        <w:pStyle w:val="BodyText"/>
       </w:pPr>
       <w:r>
         <w:rPr>
           <w:bCs/>
           <w:b/>
         </w:rPr>
-        <w:t xml:space="preserve">Purpose:</w:t>
-      </w:r>
-      <w:r>
-        <w:t xml:space="preserve"> </w:t>
-      </w:r>
-      <w:r>
-        <w:t xml:space="preserve">Directed Chennai road topology and road attributes.</w:t>
-      </w:r>
-      <w:r>
-        <w:br/>
-      </w:r>
+        <w:t xml:space="preserve">Feasibility conclusion:</w:t>
+      </w:r>
+      <w:r>
+        <w:t xml:space="preserve"> </w:t>
+      </w:r>
+      <w:r>
+        <w:t xml:space="preserve">a public-source acquisition path exists for all five factors without user-supplied credentials, but the complete Chennai pipeline has not yet been demonstrated. Official NASA IMERG/SRTM data cannot be acquired in a no-credential run; Open-Meteo reanalysis and non-elevation susceptibility inputs are the declared fallbacks.</w:t>
+      </w:r>
+    </w:p>
+    <w:bookmarkEnd w:id="65"/>
+    <w:bookmarkStart w:id="72" w:name="api-and-authentication-checklist"/>
+    <w:p>
+      <w:pPr>
+        <w:pStyle w:val="Heading3"/>
+      </w:pPr>
+      <w:r>
+        <w:t xml:space="preserve">6.2 API and Authentication Checklist</w:t>
+      </w:r>
+    </w:p>
+    <w:tbl>
+      <w:tblPr>
+        <w:tblStyle w:val="Table"/>
+        <w:tblW w:type="pct" w:w="5000"/>
+        <w:tblLook w:firstRow="1" w:lastRow="0" w:firstColumn="0" w:lastColumn="0" w:noHBand="0" w:noVBand="0" w:val="0020"/>
+        <w:jc w:val="start"/>
+      </w:tblPr>
+      <w:tblGrid>
+        <w:gridCol w:w="1188"/>
+        <w:gridCol w:w="1188"/>
+        <w:gridCol w:w="1584"/>
+        <w:gridCol w:w="1584"/>
+        <w:gridCol w:w="1188"/>
+        <w:gridCol w:w="1188"/>
+      </w:tblGrid>
+      <w:tr>
+        <w:trPr>
+          <w:tblHeader w:val="true"/>
+        </w:trPr>
+        <w:tc>
+          <w:tcPr/>
+          <w:p>
+            <w:pPr>
+              <w:pStyle w:val="Compact"/>
+              <w:jc w:val="left"/>
+            </w:pPr>
+            <w:r>
+              <w:t xml:space="preserve">Source/service</w:t>
+            </w:r>
+          </w:p>
+        </w:tc>
+        <w:tc>
+          <w:tcPr/>
+          <w:p>
+            <w:pPr>
+              <w:pStyle w:val="Compact"/>
+              <w:jc w:val="left"/>
+            </w:pPr>
+            <w:r>
+              <w:t xml:space="preserve">Cost for research core</w:t>
+            </w:r>
+          </w:p>
+        </w:tc>
+        <w:tc>
+          <w:tcPr/>
+          <w:p>
+            <w:pPr>
+              <w:pStyle w:val="Compact"/>
+              <w:jc w:val="right"/>
+            </w:pPr>
+            <w:r>
+              <w:t xml:space="preserve">Key required?</w:t>
+            </w:r>
+          </w:p>
+        </w:tc>
+        <w:tc>
+          <w:tcPr/>
+          <w:p>
+            <w:pPr>
+              <w:pStyle w:val="Compact"/>
+              <w:jc w:val="right"/>
+            </w:pPr>
+            <w:r>
+              <w:t xml:space="preserve">Account required?</w:t>
+            </w:r>
+          </w:p>
+        </w:tc>
+        <w:tc>
+          <w:tcPr/>
+          <w:p>
+            <w:pPr>
+              <w:pStyle w:val="Compact"/>
+              <w:jc w:val="left"/>
+            </w:pPr>
+            <w:r>
+              <w:t xml:space="preserve">Access/authentication detail</w:t>
+            </w:r>
+          </w:p>
+        </w:tc>
+        <w:tc>
+          <w:tcPr/>
+          <w:p>
+            <w:pPr>
+              <w:pStyle w:val="Compact"/>
+              <w:jc w:val="left"/>
+            </w:pPr>
+            <w:r>
+              <w:t xml:space="preserve">Important restriction</w:t>
+            </w:r>
+          </w:p>
+        </w:tc>
+      </w:tr>
+      <w:tr>
+        <w:tc>
+          <w:tcPr/>
+          <w:p>
+            <w:pPr>
+              <w:pStyle w:val="Compact"/>
+              <w:jc w:val="left"/>
+            </w:pPr>
+            <w:hyperlink r:id="rId66">
+              <w:r>
+                <w:rPr>
+                  <w:rStyle w:val="Hyperlink"/>
+                </w:rPr>
+                <w:t xml:space="preserve">OpenCity Chennai</w:t>
+              </w:r>
+            </w:hyperlink>
+          </w:p>
+        </w:tc>
+        <w:tc>
+          <w:tcPr/>
+          <w:p>
+            <w:pPr>
+              <w:pStyle w:val="Compact"/>
+              <w:jc w:val="left"/>
+            </w:pPr>
+            <w:r>
+              <w:t xml:space="preserve">Free public data</w:t>
+            </w:r>
+          </w:p>
+        </w:tc>
+        <w:tc>
+          <w:tcPr/>
+          <w:p>
+            <w:pPr>
+              <w:pStyle w:val="Compact"/>
+              <w:jc w:val="right"/>
+            </w:pPr>
+            <w:r>
+              <w:t xml:space="preserve">No</w:t>
+            </w:r>
+          </w:p>
+        </w:tc>
+        <w:tc>
+          <w:tcPr/>
+          <w:p>
+            <w:pPr>
+              <w:pStyle w:val="Compact"/>
+              <w:jc w:val="right"/>
+            </w:pPr>
+            <w:r>
+              <w:t xml:space="preserve">No</w:t>
+            </w:r>
+          </w:p>
+        </w:tc>
+        <w:tc>
+          <w:tcPr/>
+          <w:p>
+            <w:pPr>
+              <w:pStyle w:val="Compact"/>
+              <w:jc w:val="left"/>
+            </w:pPr>
+            <w:r>
+              <w:t xml:space="preserve">Dataset page and CKAN resource download</w:t>
+            </w:r>
+          </w:p>
+        </w:tc>
+        <w:tc>
+          <w:tcPr/>
+          <w:p>
+            <w:pPr>
+              <w:pStyle w:val="Compact"/>
+              <w:jc w:val="left"/>
+            </w:pPr>
+            <w:r>
+              <w:t xml:space="preserve">Resources vary between CSV, KML, and PDF; validate dates/schema</w:t>
+            </w:r>
+          </w:p>
+        </w:tc>
+      </w:tr>
+      <w:tr>
+        <w:tc>
+          <w:tcPr/>
+          <w:p>
+            <w:pPr>
+              <w:pStyle w:val="Compact"/>
+              <w:jc w:val="left"/>
+            </w:pPr>
+            <w:hyperlink r:id="rId67">
+              <w:r>
+                <w:rPr>
+                  <w:rStyle w:val="Hyperlink"/>
+                </w:rPr>
+                <w:t xml:space="preserve">Public OSM Overpass</w:t>
+              </w:r>
+            </w:hyperlink>
+          </w:p>
+        </w:tc>
+        <w:tc>
+          <w:tcPr/>
+          <w:p>
+            <w:pPr>
+              <w:pStyle w:val="Compact"/>
+              <w:jc w:val="left"/>
+            </w:pPr>
+            <w:r>
+              <w:t xml:space="preserve">Free community service</w:t>
+            </w:r>
+          </w:p>
+        </w:tc>
+        <w:tc>
+          <w:tcPr/>
+          <w:p>
+            <w:pPr>
+              <w:pStyle w:val="Compact"/>
+              <w:jc w:val="right"/>
+            </w:pPr>
+            <w:r>
+              <w:t xml:space="preserve">No</w:t>
+            </w:r>
+          </w:p>
+        </w:tc>
+        <w:tc>
+          <w:tcPr/>
+          <w:p>
+            <w:pPr>
+              <w:pStyle w:val="Compact"/>
+              <w:jc w:val="right"/>
+            </w:pPr>
+            <w:r>
+              <w:t xml:space="preserve">No</w:t>
+            </w:r>
+          </w:p>
+        </w:tc>
+        <w:tc>
+          <w:tcPr/>
+          <w:p>
+            <w:pPr>
+              <w:pStyle w:val="Compact"/>
+              <w:jc w:val="left"/>
+            </w:pPr>
+            <w:r>
+              <w:rPr>
+                <w:rStyle w:val="VerbatimChar"/>
+              </w:rPr>
+              <w:t xml:space="preserve">https://overpass-api.de/api/interpreter</w:t>
+            </w:r>
+            <w:r>
+              <w:t xml:space="preserve">; use caching and a descriptive user agent</w:t>
+            </w:r>
+          </w:p>
+        </w:tc>
+        <w:tc>
+          <w:tcPr/>
+          <w:p>
+            <w:pPr>
+              <w:pStyle w:val="Compact"/>
+              <w:jc w:val="left"/>
+            </w:pPr>
+            <w:r>
+              <w:t xml:space="preserve">Rate/size limits; dated extracts are preferable for reproducibility</w:t>
+            </w:r>
+          </w:p>
+        </w:tc>
+      </w:tr>
+      <w:tr>
+        <w:tc>
+          <w:tcPr/>
+          <w:p>
+            <w:pPr>
+              <w:pStyle w:val="Compact"/>
+              <w:jc w:val="left"/>
+            </w:pPr>
+            <w:hyperlink r:id="rId68">
+              <w:r>
+                <w:rPr>
+                  <w:rStyle w:val="Hyperlink"/>
+                </w:rPr>
+                <w:t xml:space="preserve">Geofabrik India OSM extract</w:t>
+              </w:r>
+            </w:hyperlink>
+          </w:p>
+        </w:tc>
+        <w:tc>
+          <w:tcPr/>
+          <w:p>
+            <w:pPr>
+              <w:pStyle w:val="Compact"/>
+              <w:jc w:val="left"/>
+            </w:pPr>
+            <w:r>
+              <w:t xml:space="preserve">Free public download</w:t>
+            </w:r>
+          </w:p>
+        </w:tc>
+        <w:tc>
+          <w:tcPr/>
+          <w:p>
+            <w:pPr>
+              <w:pStyle w:val="Compact"/>
+              <w:jc w:val="right"/>
+            </w:pPr>
+            <w:r>
+              <w:t xml:space="preserve">No</w:t>
+            </w:r>
+          </w:p>
+        </w:tc>
+        <w:tc>
+          <w:tcPr/>
+          <w:p>
+            <w:pPr>
+              <w:pStyle w:val="Compact"/>
+              <w:jc w:val="right"/>
+            </w:pPr>
+            <w:r>
+              <w:t xml:space="preserve">No</w:t>
+            </w:r>
+          </w:p>
+        </w:tc>
+        <w:tc>
+          <w:tcPr/>
+          <w:p>
+            <w:pPr>
+              <w:pStyle w:val="Compact"/>
+              <w:jc w:val="left"/>
+            </w:pPr>
+            <w:r>
+              <w:t xml:space="preserve">Download dated</w:t>
+            </w:r>
+            <w:r>
+              <w:t xml:space="preserve"> </w:t>
+            </w:r>
+            <w:r>
+              <w:rPr>
+                <w:rStyle w:val="VerbatimChar"/>
+              </w:rPr>
+              <w:t xml:space="preserve">.osm.pbf</w:t>
+            </w:r>
+            <w:r>
+              <w:t xml:space="preserve">; a separate importer is required</w:t>
+            </w:r>
+          </w:p>
+        </w:tc>
+        <w:tc>
+          <w:tcPr/>
+          <w:p>
+            <w:pPr>
+              <w:pStyle w:val="Compact"/>
+              <w:jc w:val="left"/>
+            </w:pPr>
+            <w:r>
+              <w:t xml:space="preserve">India-wide file is large; ODbL attribution applies</w:t>
+            </w:r>
+          </w:p>
+        </w:tc>
+      </w:tr>
+      <w:tr>
+        <w:tc>
+          <w:tcPr/>
+          <w:p>
+            <w:pPr>
+              <w:pStyle w:val="Compact"/>
+              <w:jc w:val="left"/>
+            </w:pPr>
+            <w:hyperlink r:id="rId56">
+              <w:r>
+                <w:rPr>
+                  <w:rStyle w:val="Hyperlink"/>
+                </w:rPr>
+                <w:t xml:space="preserve">Open-Meteo Historical Weather API</w:t>
+              </w:r>
+            </w:hyperlink>
+          </w:p>
+        </w:tc>
+        <w:tc>
+          <w:tcPr/>
+          <w:p>
+            <w:pPr>
+              <w:pStyle w:val="Compact"/>
+              <w:jc w:val="left"/>
+            </w:pPr>
+            <w:r>
+              <w:t xml:space="preserve">Free for rate-limited non-commercial use</w:t>
+            </w:r>
+          </w:p>
+        </w:tc>
+        <w:tc>
+          <w:tcPr/>
+          <w:p>
+            <w:pPr>
+              <w:pStyle w:val="Compact"/>
+              <w:jc w:val="right"/>
+            </w:pPr>
+            <w:r>
+              <w:t xml:space="preserve">No</w:t>
+            </w:r>
+          </w:p>
+        </w:tc>
+        <w:tc>
+          <w:tcPr/>
+          <w:p>
+            <w:pPr>
+              <w:pStyle w:val="Compact"/>
+              <w:jc w:val="right"/>
+            </w:pPr>
+            <w:r>
+              <w:t xml:space="preserve">No</w:t>
+            </w:r>
+          </w:p>
+        </w:tc>
+        <w:tc>
+          <w:tcPr/>
+          <w:p>
+            <w:pPr>
+              <w:pStyle w:val="Compact"/>
+              <w:jc w:val="left"/>
+            </w:pPr>
+            <w:r>
+              <w:rPr>
+                <w:rStyle w:val="VerbatimChar"/>
+              </w:rPr>
+              <w:t xml:space="preserve">https://archive-api.open-meteo.com/v1/archive</w:t>
+            </w:r>
+            <w:r>
+              <w:t xml:space="preserve"> </w:t>
+            </w:r>
+            <w:r>
+              <w:t xml:space="preserve">returns JSON</w:t>
+            </w:r>
+          </w:p>
+        </w:tc>
+        <w:tc>
+          <w:tcPr/>
+          <w:p>
+            <w:pPr>
+              <w:pStyle w:val="Compact"/>
+              <w:jc w:val="left"/>
+            </w:pPr>
+            <w:r>
+              <w:t xml:space="preserve">CC BY 4.0 attribution; 600 calls/min, 5,000/hour, 10,000/day, 300,000/month; no uptime guarantee</w:t>
+            </w:r>
+          </w:p>
+        </w:tc>
+      </w:tr>
+      <w:tr>
+        <w:tc>
+          <w:tcPr/>
+          <w:p>
+            <w:pPr>
+              <w:pStyle w:val="Compact"/>
+              <w:jc w:val="left"/>
+            </w:pPr>
+            <w:hyperlink r:id="rId69">
+              <w:r>
+                <w:rPr>
+                  <w:rStyle w:val="Hyperlink"/>
+                </w:rPr>
+                <w:t xml:space="preserve">NASA GPM IMERG/GES DISC</w:t>
+              </w:r>
+            </w:hyperlink>
+          </w:p>
+        </w:tc>
+        <w:tc>
+          <w:tcPr/>
+          <w:p>
+            <w:pPr>
+              <w:pStyle w:val="Compact"/>
+              <w:jc w:val="left"/>
+            </w:pPr>
+            <w:r>
+              <w:t xml:space="preserve">Free</w:t>
+            </w:r>
+          </w:p>
+        </w:tc>
+        <w:tc>
+          <w:tcPr/>
+          <w:p>
+            <w:pPr>
+              <w:pStyle w:val="Compact"/>
+              <w:jc w:val="right"/>
+            </w:pPr>
+            <w:r>
+              <w:t xml:space="preserve">No conventional key</w:t>
+            </w:r>
+          </w:p>
+        </w:tc>
+        <w:tc>
+          <w:tcPr/>
+          <w:p>
+            <w:pPr>
+              <w:pStyle w:val="Compact"/>
+              <w:jc w:val="right"/>
+            </w:pPr>
+            <w:r>
+              <w:rPr>
+                <w:bCs/>
+                <w:b/>
+              </w:rPr>
+              <w:t xml:space="preserve">Yes</w:t>
+            </w:r>
+          </w:p>
+        </w:tc>
+        <w:tc>
+          <w:tcPr/>
+          <w:p>
+            <w:pPr>
+              <w:pStyle w:val="Compact"/>
+              <w:jc w:val="left"/>
+            </w:pPr>
+            <w:r>
+              <w:t xml:space="preserve">Authorize NASA GES DISC and use Earthdata credentials or</w:t>
+            </w:r>
+            <w:r>
+              <w:t xml:space="preserve"> </w:t>
+            </w:r>
+            <w:r>
+              <w:rPr>
+                <w:rStyle w:val="VerbatimChar"/>
+              </w:rPr>
+              <w:t xml:space="preserve">Authorization: Bearer &lt;token&gt;</w:t>
+            </w:r>
+          </w:p>
+        </w:tc>
+        <w:tc>
+          <w:tcPr/>
+          <w:p>
+            <w:pPr>
+              <w:pStyle w:val="Compact"/>
+              <w:jc w:val="left"/>
+            </w:pPr>
+            <w:r>
+              <w:t xml:space="preserve">Optional because the user must create/maintain the account/token</w:t>
+            </w:r>
+          </w:p>
+        </w:tc>
+      </w:tr>
+      <w:tr>
+        <w:tc>
+          <w:tcPr/>
+          <w:p>
+            <w:pPr>
+              <w:pStyle w:val="Compact"/>
+              <w:jc w:val="left"/>
+            </w:pPr>
+            <w:hyperlink r:id="rId62">
+              <w:r>
+                <w:rPr>
+                  <w:rStyle w:val="Hyperlink"/>
+                </w:rPr>
+                <w:t xml:space="preserve">WorldPop India 2015 1 km STAC item</w:t>
+              </w:r>
+            </w:hyperlink>
+          </w:p>
+        </w:tc>
+        <w:tc>
+          <w:tcPr/>
+          <w:p>
+            <w:pPr>
+              <w:pStyle w:val="Compact"/>
+              <w:jc w:val="left"/>
+            </w:pPr>
+            <w:r>
+              <w:t xml:space="preserve">Free public download</w:t>
+            </w:r>
+          </w:p>
+        </w:tc>
+        <w:tc>
+          <w:tcPr/>
+          <w:p>
+            <w:pPr>
+              <w:pStyle w:val="Compact"/>
+              <w:jc w:val="right"/>
+            </w:pPr>
+            <w:r>
+              <w:t xml:space="preserve">No</w:t>
+            </w:r>
+          </w:p>
+        </w:tc>
+        <w:tc>
+          <w:tcPr/>
+          <w:p>
+            <w:pPr>
+              <w:pStyle w:val="Compact"/>
+              <w:jc w:val="right"/>
+            </w:pPr>
+            <w:r>
+              <w:t xml:space="preserve">No</w:t>
+            </w:r>
+          </w:p>
+        </w:tc>
+        <w:tc>
+          <w:tcPr/>
+          <w:p>
+            <w:pPr>
+              <w:pStyle w:val="Compact"/>
+              <w:jc w:val="left"/>
+            </w:pPr>
+            <w:r>
+              <w:t xml:space="preserve">Select the GeoTIFF asset from the fixed item ID; do not discover by</w:t>
+            </w:r>
+            <w:r>
+              <w:t xml:space="preserve"> </w:t>
+            </w:r>
+            <w:r>
+              <w:rPr>
+                <w:rStyle w:val="VerbatimChar"/>
+              </w:rPr>
+              <w:t xml:space="preserve">datetime</w:t>
+            </w:r>
+            <w:r>
+              <w:t xml:space="preserve"> </w:t>
+            </w:r>
+            <w:r>
+              <w:t xml:space="preserve">alone</w:t>
+            </w:r>
+          </w:p>
+        </w:tc>
+        <w:tc>
+          <w:tcPr/>
+          <w:p>
+            <w:pPr>
+              <w:pStyle w:val="Compact"/>
+              <w:jc w:val="left"/>
+            </w:pPr>
+            <w:r>
+              <w:t xml:space="preserve">R2025A is model-derived/alpha; verify version and pixel-count conservation</w:t>
+            </w:r>
+          </w:p>
+        </w:tc>
+      </w:tr>
+      <w:tr>
+        <w:tc>
+          <w:tcPr/>
+          <w:p>
+            <w:pPr>
+              <w:pStyle w:val="Compact"/>
+              <w:jc w:val="left"/>
+            </w:pPr>
+            <w:hyperlink r:id="rId70">
+              <w:r>
+                <w:rPr>
+                  <w:rStyle w:val="Hyperlink"/>
+                </w:rPr>
+                <w:t xml:space="preserve">Eclipse SUMO/TraCI</w:t>
+              </w:r>
+            </w:hyperlink>
+          </w:p>
+        </w:tc>
+        <w:tc>
+          <w:tcPr/>
+          <w:p>
+            <w:pPr>
+              <w:pStyle w:val="Compact"/>
+              <w:jc w:val="left"/>
+            </w:pPr>
+            <w:r>
+              <w:t xml:space="preserve">Free open-source software</w:t>
+            </w:r>
+          </w:p>
+        </w:tc>
+        <w:tc>
+          <w:tcPr/>
+          <w:p>
+            <w:pPr>
+              <w:pStyle w:val="Compact"/>
+              <w:jc w:val="right"/>
+            </w:pPr>
+            <w:r>
+              <w:t xml:space="preserve">No</w:t>
+            </w:r>
+          </w:p>
+        </w:tc>
+        <w:tc>
+          <w:tcPr/>
+          <w:p>
+            <w:pPr>
+              <w:pStyle w:val="Compact"/>
+              <w:jc w:val="right"/>
+            </w:pPr>
+            <w:r>
+              <w:t xml:space="preserve">No</w:t>
+            </w:r>
+          </w:p>
+        </w:tc>
+        <w:tc>
+          <w:tcPr/>
+          <w:p>
+            <w:pPr>
+              <w:pStyle w:val="Compact"/>
+              <w:jc w:val="left"/>
+            </w:pPr>
+            <w:r>
+              <w:t xml:space="preserve">Local installation and Python/TraCI interface</w:t>
+            </w:r>
+          </w:p>
+        </w:tc>
+        <w:tc>
+          <w:tcPr/>
+          <w:p>
+            <w:pPr>
+              <w:pStyle w:val="Compact"/>
+              <w:jc w:val="left"/>
+            </w:pPr>
+            <w:r>
+              <w:t xml:space="preserve">Output is simulation, not observed traffic</w:t>
+            </w:r>
+          </w:p>
+        </w:tc>
+      </w:tr>
+      <w:tr>
+        <w:tc>
+          <w:tcPr/>
+          <w:p>
+            <w:pPr>
+              <w:pStyle w:val="Compact"/>
+              <w:jc w:val="left"/>
+            </w:pPr>
+            <w:hyperlink r:id="rId71">
+              <w:r>
+                <w:rPr>
+                  <w:rStyle w:val="Hyperlink"/>
+                </w:rPr>
+                <w:t xml:space="preserve">RoutingKit CCH</w:t>
+              </w:r>
+            </w:hyperlink>
+          </w:p>
+        </w:tc>
+        <w:tc>
+          <w:tcPr/>
+          <w:p>
+            <w:pPr>
+              <w:pStyle w:val="Compact"/>
+              <w:jc w:val="left"/>
+            </w:pPr>
+            <w:r>
+              <w:t xml:space="preserve">Free open-source package</w:t>
+            </w:r>
+          </w:p>
+        </w:tc>
+        <w:tc>
+          <w:tcPr/>
+          <w:p>
+            <w:pPr>
+              <w:pStyle w:val="Compact"/>
+              <w:jc w:val="right"/>
+            </w:pPr>
+            <w:r>
+              <w:t xml:space="preserve">No</w:t>
+            </w:r>
+          </w:p>
+        </w:tc>
+        <w:tc>
+          <w:tcPr/>
+          <w:p>
+            <w:pPr>
+              <w:pStyle w:val="Compact"/>
+              <w:jc w:val="right"/>
+            </w:pPr>
+            <w:r>
+              <w:t xml:space="preserve">No</w:t>
+            </w:r>
+          </w:p>
+        </w:tc>
+        <w:tc>
+          <w:tcPr/>
+          <w:p>
+            <w:pPr>
+              <w:pStyle w:val="Compact"/>
+              <w:jc w:val="left"/>
+            </w:pPr>
+            <w:r>
+              <w:t xml:space="preserve">Install</w:t>
+            </w:r>
+            <w:r>
+              <w:t xml:space="preserve"> </w:t>
+            </w:r>
+            <w:r>
+              <w:rPr>
+                <w:rStyle w:val="VerbatimChar"/>
+              </w:rPr>
+              <w:t xml:space="preserve">routingkit-cch</w:t>
+            </w:r>
+            <w:r>
+              <w:t xml:space="preserve"> </w:t>
+            </w:r>
+            <w:r>
+              <w:t xml:space="preserve">Python package</w:t>
+            </w:r>
+          </w:p>
+        </w:tc>
+        <w:tc>
+          <w:tcPr/>
+          <w:p>
+            <w:pPr>
+              <w:pStyle w:val="Compact"/>
+              <w:jc w:val="left"/>
+            </w:pPr>
+            <w:r>
+              <w:t xml:space="preserve">Native finite-integer/turn/closure assumptions require validation</w:t>
+            </w:r>
+          </w:p>
+        </w:tc>
+      </w:tr>
+    </w:tbl>
+    <w:p>
+      <w:pPr>
+        <w:pStyle w:val="BodyText"/>
+      </w:pPr>
+      <w:r>
+        <w:t xml:space="preserve">No secret, password, or bearer token is committed to the repository.</w:t>
+      </w:r>
+    </w:p>
+    <w:bookmarkEnd w:id="72"/>
+    <w:bookmarkStart w:id="77" w:name="openstreetmap"/>
+    <w:p>
+      <w:pPr>
+        <w:pStyle w:val="Heading3"/>
+      </w:pPr>
+      <w:r>
+        <w:t xml:space="preserve">6.3 OpenStreetMap</w:t>
+      </w:r>
+    </w:p>
+    <w:p>
+      <w:pPr>
+        <w:pStyle w:val="FirstParagraph"/>
+      </w:pPr>
       <w:r>
         <w:rPr>
           <w:bCs/>
           <w:b/>
         </w:rPr>
-        <w:t xml:space="preserve">Contains:</w:t>
-      </w:r>
-      <w:r>
-        <w:t xml:space="preserve"> </w:t>
-      </w:r>
-      <w:r>
-        <w:t xml:space="preserve">Nodes, ways, geometry, road class, direction, and incomplete lanes/speeds/turn data.</w:t>
+        <w:t xml:space="preserve">Purpose:</w:t>
+      </w:r>
+      <w:r>
+        <w:t xml:space="preserve"> </w:t>
+      </w:r>
+      <w:r>
+        <w:t xml:space="preserve">Directed Chennai road topology and road attributes.</w:t>
       </w:r>
       <w:r>
         <w:br/>
@@ -4315,13 +6072,13 @@
           <w:bCs/>
           <w:b/>
         </w:rPr>
-        <w:t xml:space="preserve">Chennai coverage:</w:t>
-      </w:r>
-      <w:r>
-        <w:t xml:space="preserve"> </w:t>
-      </w:r>
-      <w:r>
-        <w:t xml:space="preserve">Yes; completeness must be audited.</w:t>
+        <w:t xml:space="preserve">Contains:</w:t>
+      </w:r>
+      <w:r>
+        <w:t xml:space="preserve"> </w:t>
+      </w:r>
+      <w:r>
+        <w:t xml:space="preserve">Nodes, ways, geometry, road class, direction, and incomplete lanes/speeds/turn data.</w:t>
       </w:r>
       <w:r>
         <w:br/>
@@ -4331,13 +6088,13 @@
           <w:bCs/>
           <w:b/>
         </w:rPr>
-        <w:t xml:space="preserve">Global coverage:</w:t>
-      </w:r>
-      <w:r>
-        <w:t xml:space="preserve"> </w:t>
-      </w:r>
-      <w:r>
-        <w:t xml:space="preserve">Yes.</w:t>
+        <w:t xml:space="preserve">Chennai coverage:</w:t>
+      </w:r>
+      <w:r>
+        <w:t xml:space="preserve"> </w:t>
+      </w:r>
+      <w:r>
+        <w:t xml:space="preserve">Yes; completeness must be audited.</w:t>
       </w:r>
       <w:r>
         <w:br/>
@@ -4347,46 +6104,62 @@
           <w:bCs/>
           <w:b/>
         </w:rPr>
-        <w:t xml:space="preserve">Access:</w:t>
-      </w:r>
-      <w:r>
-        <w:t xml:space="preserve"> </w:t>
-      </w:r>
-      <w:r>
-        <w:t xml:space="preserve">OSMnx/Overpass or dated Geofabrik extract.</w:t>
-      </w:r>
-    </w:p>
-    <w:p>
-      <w:pPr>
-        <w:pStyle w:val="BodyText"/>
-      </w:pPr>
+        <w:t xml:space="preserve">Global coverage:</w:t>
+      </w:r>
+      <w:r>
+        <w:t xml:space="preserve"> </w:t>
+      </w:r>
+      <w:r>
+        <w:t xml:space="preserve">Yes.</w:t>
+      </w:r>
+      <w:r>
+        <w:br/>
+      </w:r>
       <w:r>
         <w:rPr>
           <w:bCs/>
           <w:b/>
         </w:rPr>
-        <w:t xml:space="preserve">Limitations:</w:t>
-      </w:r>
-      <w:r>
-        <w:t xml:space="preserve"> </w:t>
-      </w:r>
-      <w:r>
-        <w:t xml:space="preserve">Mutable community data; missing attributes and turn restrictions.</w:t>
-      </w:r>
-      <w:r>
-        <w:br/>
-      </w:r>
+        <w:t xml:space="preserve">Access:</w:t>
+      </w:r>
+      <w:r>
+        <w:t xml:space="preserve"> </w:t>
+      </w:r>
+      <w:r>
+        <w:t xml:space="preserve">OSMnx/Overpass or dated Geofabrik extract.</w:t>
+      </w:r>
+    </w:p>
+    <w:p>
+      <w:pPr>
+        <w:pStyle w:val="BodyText"/>
+      </w:pPr>
       <w:r>
         <w:rPr>
           <w:bCs/>
           <w:b/>
         </w:rPr>
+        <w:t xml:space="preserve">Limitations:</w:t>
+      </w:r>
+      <w:r>
+        <w:t xml:space="preserve"> </w:t>
+      </w:r>
+      <w:r>
+        <w:t xml:space="preserve">Mutable community data; missing attributes and turn restrictions.</w:t>
+      </w:r>
+      <w:r>
+        <w:br/>
+      </w:r>
+      <w:r>
+        <w:rPr>
+          <w:bCs/>
+          <w:b/>
+        </w:rPr>
         <w:t xml:space="preserve">Direct access:</w:t>
       </w:r>
       <w:r>
         <w:t xml:space="preserve"> </w:t>
       </w:r>
-      <w:hyperlink r:id="rId54">
+      <w:hyperlink r:id="rId68">
         <w:r>
           <w:rPr>
             <w:rStyle w:val="Hyperlink"/>
@@ -4407,7 +6180,7 @@
       <w:r>
         <w:t xml:space="preserve"> </w:t>
       </w:r>
-      <w:hyperlink r:id="rId55">
+      <w:hyperlink r:id="rId73">
         <w:r>
           <w:rPr>
             <w:rStyle w:val="Hyperlink"/>
@@ -4416,6 +6189,20 @@
         </w:r>
       </w:hyperlink>
       <w:r>
+        <w:t xml:space="preserve">,</w:t>
+      </w:r>
+      <w:r>
+        <w:t xml:space="preserve"> </w:t>
+      </w:r>
+      <w:hyperlink r:id="rId67">
+        <w:r>
+          <w:rPr>
+            <w:rStyle w:val="Hyperlink"/>
+          </w:rPr>
+          <w:t xml:space="preserve">Overpass API policy</w:t>
+        </w:r>
+      </w:hyperlink>
+      <w:r>
         <w:br/>
       </w:r>
       <w:r>
@@ -4428,7 +6215,7 @@
       <w:r>
         <w:t xml:space="preserve"> </w:t>
       </w:r>
-      <w:hyperlink r:id="rId56">
+      <w:hyperlink r:id="rId74">
         <w:r>
           <w:rPr>
             <w:rStyle w:val="Hyperlink"/>
@@ -4449,7 +6236,7 @@
       <w:r>
         <w:t xml:space="preserve"> </w:t>
       </w:r>
-      <w:hyperlink r:id="rId57">
+      <w:hyperlink r:id="rId75">
         <w:r>
           <w:rPr>
             <w:rStyle w:val="Hyperlink"/>
@@ -4458,14 +6245,135 @@
         </w:r>
       </w:hyperlink>
     </w:p>
-    <w:bookmarkEnd w:id="58"/>
-    <w:bookmarkStart w:id="63" w:name="opencity-chennai-flood-data"/>
+    <w:p>
+      <w:pPr>
+        <w:pStyle w:val="BodyText"/>
+      </w:pPr>
+      <w:r>
+        <w:t xml:space="preserve">The facility query will be sent to</w:t>
+      </w:r>
+      <w:r>
+        <w:t xml:space="preserve"> </w:t>
+      </w:r>
+      <w:r>
+        <w:rPr>
+          <w:rStyle w:val="VerbatimChar"/>
+        </w:rPr>
+        <w:t xml:space="preserve">https://overpass-api.de/api/interpreter</w:t>
+      </w:r>
+      <w:r>
+        <w:t xml:space="preserve">, cached with retrieval time/checksum, and limited to the declared Chennai study boundary. A descriptive User-Agent is mandatory. The research job will use one non-parallel request, avoid large repeated queries, and treat the public instance as best-effort with no SLA.</w:t>
+      </w:r>
+    </w:p>
+    <w:p>
+      <w:pPr>
+        <w:pStyle w:val="SourceCode"/>
+      </w:pPr>
+      <w:r>
+        <w:rPr>
+          <w:rStyle w:val="VerbatimChar"/>
+        </w:rPr>
+        <w:t xml:space="preserve">[out:json][timeout:120];</w:t>
+      </w:r>
+      <w:r>
+        <w:br/>
+      </w:r>
+      <w:r>
+        <w:rPr>
+          <w:rStyle w:val="VerbatimChar"/>
+        </w:rPr>
+        <w:t xml:space="preserve">(</w:t>
+      </w:r>
+      <w:r>
+        <w:br/>
+      </w:r>
+      <w:r>
+        <w:rPr>
+          <w:rStyle w:val="VerbatimChar"/>
+        </w:rPr>
+        <w:t xml:space="preserve">  nwr["amenity"~"^(hospital|clinic|fire_station)$"](12.85,80.05,13.25,80.40);</w:t>
+      </w:r>
+      <w:r>
+        <w:br/>
+      </w:r>
+      <w:r>
+        <w:rPr>
+          <w:rStyle w:val="VerbatimChar"/>
+        </w:rPr>
+        <w:t xml:space="preserve">  nwr["social_facility"="shelter"](12.85,80.05,13.25,80.40);</w:t>
+      </w:r>
+      <w:r>
+        <w:br/>
+      </w:r>
+      <w:r>
+        <w:rPr>
+          <w:rStyle w:val="VerbatimChar"/>
+        </w:rPr>
+        <w:t xml:space="preserve">);</w:t>
+      </w:r>
+      <w:r>
+        <w:br/>
+      </w:r>
+      <w:r>
+        <w:rPr>
+          <w:rStyle w:val="VerbatimChar"/>
+        </w:rPr>
+        <w:t xml:space="preserve">out center tags;</w:t>
+      </w:r>
+    </w:p>
+    <w:p>
+      <w:pPr>
+        <w:pStyle w:val="FirstParagraph"/>
+      </w:pPr>
+      <w:r>
+        <w:t xml:space="preserve">The bounding box is a provisional acquisition envelope and must be replaced by the final Stage 3 study boundary.</w:t>
+      </w:r>
+      <w:r>
+        <w:t xml:space="preserve"> </w:t>
+      </w:r>
+      <w:r>
+        <w:rPr>
+          <w:rStyle w:val="VerbatimChar"/>
+        </w:rPr>
+        <w:t xml:space="preserve">social_facility=shelter</w:t>
+      </w:r>
+      <w:r>
+        <w:t xml:space="preserve"> </w:t>
+      </w:r>
+      <w:r>
+        <w:t xml:space="preserve">is exploratory OSM tagging and must not be equated with an activated GCC relief centre. The official GCC PDF remains authoritative for the declared 2024 list.</w:t>
+      </w:r>
+    </w:p>
+    <w:p>
+      <w:pPr>
+        <w:pStyle w:val="BodyText"/>
+      </w:pPr>
+      <w:r>
+        <w:t xml:space="preserve">Relief-address geocoding will follow the</w:t>
+      </w:r>
+      <w:r>
+        <w:t xml:space="preserve"> </w:t>
+      </w:r>
+      <w:hyperlink r:id="rId76">
+        <w:r>
+          <w:rPr>
+            <w:rStyle w:val="Hyperlink"/>
+          </w:rPr>
+          <w:t xml:space="preserve">Nominatim usage policy</w:t>
+        </w:r>
+      </w:hyperlink>
+      <w:r>
+        <w:t xml:space="preserve">: maximum one request/second, one thread on one machine, valid identifying User-Agent, local caching, attribution, and no recurring bulk job. Coordinates/names will be manually verified; unverified entries will be excluded.</w:t>
+      </w:r>
+    </w:p>
+    <w:bookmarkEnd w:id="77"/>
+    <w:bookmarkStart w:id="81" w:name="opencity-chennai-flood-data"/>
     <w:p>
       <w:pPr>
         <w:pStyle w:val="Heading3"/>
       </w:pPr>
       <w:r>
-        <w:t xml:space="preserve">6.2 OpenCity Chennai Flood Data</w:t>
+        <w:t xml:space="preserve">6.4 OpenCity Chennai Flood Data</w:t>
       </w:r>
     </w:p>
     <w:p>
@@ -4580,7 +6488,7 @@
       <w:r>
         <w:t xml:space="preserve"> </w:t>
       </w:r>
-      <w:hyperlink r:id="rId59">
+      <w:hyperlink r:id="rId55">
         <w:r>
           <w:rPr>
             <w:rStyle w:val="Hyperlink"/>
@@ -4594,7 +6502,7 @@
       <w:r>
         <w:t xml:space="preserve"> </w:t>
       </w:r>
-      <w:hyperlink r:id="rId60">
+      <w:hyperlink r:id="rId78">
         <w:r>
           <w:rPr>
             <w:rStyle w:val="Hyperlink"/>
@@ -4615,7 +6523,7 @@
       <w:r>
         <w:t xml:space="preserve"> </w:t>
       </w:r>
-      <w:hyperlink r:id="rId61">
+      <w:hyperlink r:id="rId79">
         <w:r>
           <w:rPr>
             <w:rStyle w:val="Hyperlink"/>
@@ -4636,7 +6544,7 @@
       <w:r>
         <w:t xml:space="preserve"> </w:t>
       </w:r>
-      <w:hyperlink r:id="rId62">
+      <w:hyperlink r:id="rId80">
         <w:r>
           <w:rPr>
             <w:rStyle w:val="VerbatimChar"/>
@@ -4661,14 +6569,14 @@
         <w:t xml:space="preserve">Resource previews on the OpenCity page.</w:t>
       </w:r>
     </w:p>
-    <w:bookmarkEnd w:id="63"/>
-    <w:bookmarkStart w:id="68" w:name="nasa-gpm-imerg"/>
+    <w:bookmarkEnd w:id="81"/>
+    <w:bookmarkStart w:id="86" w:name="nasa-gpm-imerg"/>
     <w:p>
       <w:pPr>
         <w:pStyle w:val="Heading3"/>
       </w:pPr>
       <w:r>
-        <w:t xml:space="preserve">6.3 NASA GPM IMERG</w:t>
+        <w:t xml:space="preserve">6.5 NASA GPM IMERG</w:t>
       </w:r>
     </w:p>
     <w:p>
@@ -4702,7 +6610,19 @@
         <w:t xml:space="preserve"> </w:t>
       </w:r>
       <w:r>
-        <w:t xml:space="preserve">Half-hourly satellite precipitation in Early, Late, and Final runs.</w:t>
+        <w:t xml:space="preserve">Half-hourly satellite precipitation; historical evaluation selects Final V07 collection</w:t>
+      </w:r>
+      <w:r>
+        <w:t xml:space="preserve"> </w:t>
+      </w:r>
+      <w:r>
+        <w:rPr>
+          <w:rStyle w:val="VerbatimChar"/>
+        </w:rPr>
+        <w:t xml:space="preserve">GPM_3IMERGHH_07</w:t>
+      </w:r>
+      <w:r>
+        <w:t xml:space="preserve">.</w:t>
       </w:r>
       <w:r>
         <w:br/>
@@ -4750,7 +6670,22 @@
         <w:t xml:space="preserve"> </w:t>
       </w:r>
       <w:r>
-        <w:t xml:space="preserve">Free Earthdata/GES DISC account and product download/subset services.</w:t>
+        <w:t xml:space="preserve">Free Earthdata account, NASA GES DISC application authorization, and</w:t>
+      </w:r>
+      <w:r>
+        <w:t xml:space="preserve"> </w:t>
+      </w:r>
+      <w:r>
+        <w:rPr>
+          <w:rStyle w:val="VerbatimChar"/>
+        </w:rPr>
+        <w:t xml:space="preserve">.netrc</w:t>
+      </w:r>
+      <w:r>
+        <w:t xml:space="preserve"> </w:t>
+      </w:r>
+      <w:r>
+        <w:t xml:space="preserve">credentials or bearer-token authentication.</w:t>
       </w:r>
     </w:p>
     <w:p>
@@ -4783,12 +6718,12 @@
       <w:r>
         <w:t xml:space="preserve"> </w:t>
       </w:r>
-      <w:hyperlink r:id="rId64">
+      <w:hyperlink r:id="rId57">
         <w:r>
           <w:rPr>
             <w:rStyle w:val="Hyperlink"/>
           </w:rPr>
-          <w:t xml:space="preserve">IMERG directory</w:t>
+          <w:t xml:space="preserve">GPM_3IMERGHH_07 summary</w:t>
         </w:r>
       </w:hyperlink>
       <w:r>
@@ -4804,7 +6739,7 @@
       <w:r>
         <w:t xml:space="preserve"> </w:t>
       </w:r>
-      <w:hyperlink r:id="rId65">
+      <w:hyperlink r:id="rId82">
         <w:r>
           <w:rPr>
             <w:rStyle w:val="Hyperlink"/>
@@ -4813,6 +6748,20 @@
         </w:r>
       </w:hyperlink>
       <w:r>
+        <w:t xml:space="preserve">,</w:t>
+      </w:r>
+      <w:r>
+        <w:t xml:space="preserve"> </w:t>
+      </w:r>
+      <w:hyperlink r:id="rId83">
+        <w:r>
+          <w:rPr>
+            <w:rStyle w:val="Hyperlink"/>
+          </w:rPr>
+          <w:t xml:space="preserve">DOI 10.5067/GPM/IMERG/3B-HH/07</w:t>
+        </w:r>
+      </w:hyperlink>
+      <w:r>
         <w:br/>
       </w:r>
       <w:r>
@@ -4826,16 +6775,16 @@
         <w:t xml:space="preserve"> </w:t>
       </w:r>
       <w:r>
-        <w:t xml:space="preserve">Planned rainfall module in</w:t>
-      </w:r>
-      <w:r>
-        <w:t xml:space="preserve"> </w:t>
-      </w:r>
-      <w:r>
         <w:rPr>
           <w:rStyle w:val="VerbatimChar"/>
         </w:rPr>
         <w:t xml:space="preserve">src/chennai_routing/data/rainfall.py</w:t>
+      </w:r>
+      <w:r>
+        <w:t xml:space="preserve"> </w:t>
+      </w:r>
+      <w:r>
+        <w:t xml:space="preserve">is currently a placeholder; acquisition is unimplemented.</w:t>
       </w:r>
       <w:r>
         <w:br/>
@@ -4850,7 +6799,7 @@
       <w:r>
         <w:t xml:space="preserve"> </w:t>
       </w:r>
-      <w:hyperlink r:id="rId66">
+      <w:hyperlink r:id="rId84">
         <w:r>
           <w:rPr>
             <w:rStyle w:val="Hyperlink"/>
@@ -4869,7 +6818,7 @@
       <w:r>
         <w:t xml:space="preserve"> </w:t>
       </w:r>
-      <w:hyperlink r:id="rId67">
+      <w:hyperlink r:id="rId56">
         <w:r>
           <w:rPr>
             <w:rStyle w:val="Hyperlink"/>
@@ -4881,17 +6830,94 @@
         <w:t xml:space="preserve"> </w:t>
       </w:r>
       <w:r>
-        <w:t xml:space="preserve">provides an ERA5/ERA5-Land-derived rainfall fallback. It must be labelled reanalysis and must not be presented as road-level observation.</w:t>
-      </w:r>
-    </w:p>
-    <w:bookmarkEnd w:id="68"/>
-    <w:bookmarkStart w:id="72" w:name="nasa-srtmnasadem-and-chennai-hydrology"/>
+        <w:t xml:space="preserve">provides an ERA5-derived fallback. A</w:t>
+      </w:r>
+      <w:r>
+        <w:t xml:space="preserve"> </w:t>
+      </w:r>
+      <w:hyperlink r:id="rId85">
+        <w:r>
+          <w:rPr>
+            <w:rStyle w:val="Hyperlink"/>
+          </w:rPr>
+          <w:t xml:space="preserve">tested Chennai request</w:t>
+        </w:r>
+      </w:hyperlink>
+      <w:r>
+        <w:t xml:space="preserve"> </w:t>
+      </w:r>
+      <w:r>
+        <w:t xml:space="preserve">uses</w:t>
+      </w:r>
+      <w:r>
+        <w:t xml:space="preserve"> </w:t>
+      </w:r>
+      <w:r>
+        <w:rPr>
+          <w:rStyle w:val="VerbatimChar"/>
+        </w:rPr>
+        <w:t xml:space="preserve">latitude=13.0827</w:t>
+      </w:r>
+      <w:r>
+        <w:t xml:space="preserve">,</w:t>
+      </w:r>
+      <w:r>
+        <w:t xml:space="preserve"> </w:t>
+      </w:r>
+      <w:r>
+        <w:rPr>
+          <w:rStyle w:val="VerbatimChar"/>
+        </w:rPr>
+        <w:t xml:space="preserve">longitude=80.2707</w:t>
+      </w:r>
+      <w:r>
+        <w:t xml:space="preserve">, declared dates,</w:t>
+      </w:r>
+      <w:r>
+        <w:t xml:space="preserve"> </w:t>
+      </w:r>
+      <w:r>
+        <w:rPr>
+          <w:rStyle w:val="VerbatimChar"/>
+        </w:rPr>
+        <w:t xml:space="preserve">hourly=precipitation</w:t>
+      </w:r>
+      <w:r>
+        <w:t xml:space="preserve">,</w:t>
+      </w:r>
+      <w:r>
+        <w:t xml:space="preserve"> </w:t>
+      </w:r>
+      <w:r>
+        <w:rPr>
+          <w:rStyle w:val="VerbatimChar"/>
+        </w:rPr>
+        <w:t xml:space="preserve">models=era5</w:t>
+      </w:r>
+      <w:r>
+        <w:t xml:space="preserve">, and</w:t>
+      </w:r>
+      <w:r>
+        <w:t xml:space="preserve"> </w:t>
+      </w:r>
+      <w:r>
+        <w:rPr>
+          <w:rStyle w:val="VerbatimChar"/>
+        </w:rPr>
+        <w:t xml:space="preserve">timezone=Asia/Kolkata</w:t>
+      </w:r>
+      <w:r>
+        <w:t xml:space="preserve">. It must be labelled retrospective reanalysis—not contemporaneous sensing or road-level observation.</w:t>
+      </w:r>
+    </w:p>
+    <w:bookmarkEnd w:id="86"/>
+    <w:bookmarkStart w:id="90" w:name="nasa-srtmnasadem-and-chennai-hydrology"/>
     <w:p>
       <w:pPr>
         <w:pStyle w:val="Heading3"/>
       </w:pPr>
       <w:r>
-        <w:t xml:space="preserve">6.4 NASA SRTM/NASADEM and Chennai Hydrology</w:t>
+        <w:t xml:space="preserve">6.6 NASA SRTM/NASADEM and Chennai Hydrology</w:t>
       </w:r>
     </w:p>
     <w:p>
@@ -5006,7 +7032,7 @@
       <w:r>
         <w:t xml:space="preserve"> </w:t>
       </w:r>
-      <w:hyperlink r:id="rId69">
+      <w:hyperlink r:id="rId87">
         <w:r>
           <w:rPr>
             <w:rStyle w:val="Hyperlink"/>
@@ -5027,7 +7053,7 @@
       <w:r>
         <w:t xml:space="preserve"> </w:t>
       </w:r>
-      <w:hyperlink r:id="rId70">
+      <w:hyperlink r:id="rId88">
         <w:r>
           <w:rPr>
             <w:rStyle w:val="Hyperlink"/>
@@ -5055,7 +7081,10 @@
         <w:t xml:space="preserve">src/chennai_routing/data/elevation.py</w:t>
       </w:r>
       <w:r>
-        <w:t xml:space="preserve">,</w:t>
+        <w:t xml:space="preserve"> </w:t>
+      </w:r>
+      <w:r>
+        <w:t xml:space="preserve">and</w:t>
       </w:r>
       <w:r>
         <w:t xml:space="preserve"> </w:t>
@@ -5065,6 +7094,12 @@
           <w:rStyle w:val="VerbatimChar"/>
         </w:rPr>
         <w:t xml:space="preserve">hydrology.py</w:t>
+      </w:r>
+      <w:r>
+        <w:t xml:space="preserve"> </w:t>
+      </w:r>
+      <w:r>
+        <w:t xml:space="preserve">are currently placeholders.</w:t>
       </w:r>
       <w:r>
         <w:br/>
@@ -5079,7 +7114,7 @@
       <w:r>
         <w:t xml:space="preserve"> </w:t>
       </w:r>
-      <w:hyperlink r:id="rId71">
+      <w:hyperlink r:id="rId89">
         <w:r>
           <w:rPr>
             <w:rStyle w:val="Hyperlink"/>
@@ -5088,14 +7123,14 @@
         </w:r>
       </w:hyperlink>
     </w:p>
-    <w:bookmarkEnd w:id="72"/>
-    <w:bookmarkStart w:id="76" w:name="eclipse-sumo"/>
+    <w:bookmarkEnd w:id="90"/>
+    <w:bookmarkStart w:id="93" w:name="eclipse-sumo"/>
     <w:p>
       <w:pPr>
         <w:pStyle w:val="Heading3"/>
       </w:pPr>
       <w:r>
-        <w:t xml:space="preserve">6.5 Eclipse SUMO</w:t>
+        <w:t xml:space="preserve">6.7 Eclipse SUMO</w:t>
       </w:r>
     </w:p>
     <w:p>
@@ -5210,7 +7245,7 @@
       <w:r>
         <w:t xml:space="preserve"> </w:t>
       </w:r>
-      <w:hyperlink r:id="rId73">
+      <w:hyperlink r:id="rId70">
         <w:r>
           <w:rPr>
             <w:rStyle w:val="Hyperlink"/>
@@ -5231,7 +7266,7 @@
       <w:r>
         <w:t xml:space="preserve"> </w:t>
       </w:r>
-      <w:hyperlink r:id="rId74">
+      <w:hyperlink r:id="rId91">
         <w:r>
           <w:rPr>
             <w:rStyle w:val="Hyperlink"/>
@@ -5240,6 +7275,20 @@
         </w:r>
       </w:hyperlink>
       <w:r>
+        <w:t xml:space="preserve">,</w:t>
+      </w:r>
+      <w:r>
+        <w:t xml:space="preserve"> </w:t>
+      </w:r>
+      <w:hyperlink r:id="rId63">
+        <w:r>
+          <w:rPr>
+            <w:rStyle w:val="Hyperlink"/>
+          </w:rPr>
+          <w:t xml:space="preserve">automatic-routing/compliance options</w:t>
+        </w:r>
+      </w:hyperlink>
+      <w:r>
         <w:br/>
       </w:r>
       <w:r>
@@ -5252,7 +7301,7 @@
       <w:r>
         <w:t xml:space="preserve"> </w:t>
       </w:r>
-      <w:hyperlink r:id="rId75">
+      <w:hyperlink r:id="rId92">
         <w:r>
           <w:rPr>
             <w:rStyle w:val="Hyperlink"/>
@@ -5277,14 +7326,14 @@
         <w:t xml:space="preserve">SUMO-GUI, not a web data viewer.</w:t>
       </w:r>
     </w:p>
-    <w:bookmarkEnd w:id="76"/>
-    <w:bookmarkStart w:id="81" w:name="critical-facilities-and-population"/>
+    <w:bookmarkEnd w:id="93"/>
+    <w:bookmarkStart w:id="105" w:name="critical-facilities-and-population"/>
     <w:p>
       <w:pPr>
         <w:pStyle w:val="Heading3"/>
       </w:pPr>
       <w:r>
-        <w:t xml:space="preserve">6.6 Critical Facilities and Population</w:t>
+        <w:t xml:space="preserve">6.8 Critical Facilities and Population</w:t>
       </w:r>
     </w:p>
     <w:p>
@@ -5318,7 +7367,7 @@
         <w:t xml:space="preserve"> </w:t>
       </w:r>
       <w:r>
-        <w:t xml:space="preserve">Health-centre/fire-station/relief-centre locations and modelled population counts.</w:t>
+        <w:t xml:space="preserve">Health-centre CSV/selected KML, fire-station CSV/KML, a 2024 relief-centre PDF, and modelled population counts.</w:t>
       </w:r>
       <w:r>
         <w:br/>
@@ -5366,7 +7415,7 @@
         <w:t xml:space="preserve"> </w:t>
       </w:r>
       <w:r>
-        <w:t xml:space="preserve">Public OpenCity downloads and HDX/WorldPop raster download.</w:t>
+        <w:t xml:space="preserve">Public OpenCity downloads and the fixed WorldPop STAC item/GeoTIFF asset.</w:t>
       </w:r>
     </w:p>
     <w:p>
@@ -5384,7 +7433,7 @@
         <w:t xml:space="preserve"> </w:t>
       </w:r>
       <w:r>
-        <w:t xml:space="preserve">Health centres are not necessarily trauma hospitals; population exposure is not socioeconomic equity.</w:t>
+        <w:t xml:space="preserve">UPHC/UCHC data is not a comprehensive emergency-hospital inventory; the relief PDF does not provide validated graph-ready coordinates or current activation; population exposure is not socioeconomic equity.</w:t>
       </w:r>
       <w:r>
         <w:br/>
@@ -5399,12 +7448,12 @@
       <w:r>
         <w:t xml:space="preserve"> </w:t>
       </w:r>
-      <w:hyperlink r:id="rId77">
+      <w:hyperlink r:id="rId94">
         <w:r>
           <w:rPr>
             <w:rStyle w:val="Hyperlink"/>
           </w:rPr>
-          <w:t xml:space="preserve">Health centres</w:t>
+          <w:t xml:space="preserve">Health metadata/API</w:t>
         </w:r>
       </w:hyperlink>
       <w:r>
@@ -5413,12 +7462,12 @@
       <w:r>
         <w:t xml:space="preserve"> </w:t>
       </w:r>
-      <w:hyperlink r:id="rId78">
+      <w:hyperlink r:id="rId95">
         <w:r>
           <w:rPr>
             <w:rStyle w:val="Hyperlink"/>
           </w:rPr>
-          <w:t xml:space="preserve">fire stations</w:t>
+          <w:t xml:space="preserve">fire metadata/API</w:t>
         </w:r>
       </w:hyperlink>
       <w:r>
@@ -5427,36 +7476,43 @@
       <w:r>
         <w:t xml:space="preserve"> </w:t>
       </w:r>
-      <w:hyperlink r:id="rId79">
+      <w:hyperlink r:id="rId96">
         <w:r>
           <w:rPr>
             <w:rStyle w:val="Hyperlink"/>
           </w:rPr>
-          <w:t xml:space="preserve">relief centres</w:t>
+          <w:t xml:space="preserve">relief metadata/API</w:t>
         </w:r>
       </w:hyperlink>
       <w:r>
-        <w:br/>
-      </w:r>
-      <w:r>
-        <w:rPr>
-          <w:bCs/>
-          <w:b/>
-        </w:rPr>
-        <w:t xml:space="preserve">Documentation:</w:t>
-      </w:r>
-      <w:r>
-        <w:t xml:space="preserve"> </w:t>
-      </w:r>
-      <w:hyperlink r:id="rId80">
+        <w:t xml:space="preserve">,</w:t>
+      </w:r>
+      <w:r>
+        <w:t xml:space="preserve"> </w:t>
+      </w:r>
+      <w:hyperlink r:id="rId62">
         <w:r>
           <w:rPr>
             <w:rStyle w:val="Hyperlink"/>
           </w:rPr>
-          <w:t xml:space="preserve">WorldPop India 2015–2030</w:t>
+          <w:t xml:space="preserve">WorldPop 2015 India 1 km item</w:t>
         </w:r>
       </w:hyperlink>
       <w:r>
+        <w:t xml:space="preserve">,</w:t>
+      </w:r>
+      <w:r>
+        <w:t xml:space="preserve"> </w:t>
+      </w:r>
+      <w:hyperlink r:id="rId97">
+        <w:r>
+          <w:rPr>
+            <w:rStyle w:val="Hyperlink"/>
+          </w:rPr>
+          <w:t xml:space="preserve">15.48 MB GeoTIFF asset</w:t>
+        </w:r>
+      </w:hyperlink>
+      <w:r>
         <w:br/>
       </w:r>
       <w:r>
@@ -5464,17 +7520,33 @@
           <w:bCs/>
           <w:b/>
         </w:rPr>
-        <w:t xml:space="preserve">Repository:</w:t>
-      </w:r>
-      <w:r>
-        <w:t xml:space="preserve"> </w:t>
-      </w:r>
-      <w:r>
-        <w:rPr>
-          <w:rStyle w:val="VerbatimChar"/>
-        </w:rPr>
-        <w:t xml:space="preserve">src/chennai_routing/evaluation/metrics.py</w:t>
-      </w:r>
+        <w:t xml:space="preserve">Documentation:</w:t>
+      </w:r>
+      <w:r>
+        <w:t xml:space="preserve"> </w:t>
+      </w:r>
+      <w:hyperlink r:id="rId98">
+        <w:r>
+          <w:rPr>
+            <w:rStyle w:val="Hyperlink"/>
+          </w:rPr>
+          <w:t xml:space="preserve">WorldPop 1 km dataset DOI</w:t>
+        </w:r>
+      </w:hyperlink>
+      <w:r>
+        <w:t xml:space="preserve">,</w:t>
+      </w:r>
+      <w:r>
+        <w:t xml:space="preserve"> </w:t>
+      </w:r>
+      <w:hyperlink r:id="rId99">
+        <w:r>
+          <w:rPr>
+            <w:rStyle w:val="Hyperlink"/>
+          </w:rPr>
+          <w:t xml:space="preserve">WorldPop STAC</w:t>
+        </w:r>
+      </w:hyperlink>
       <w:r>
         <w:br/>
       </w:r>
@@ -5483,18 +7555,384 @@
           <w:bCs/>
           <w:b/>
         </w:rPr>
+        <w:t xml:space="preserve">Repository:</w:t>
+      </w:r>
+      <w:r>
+        <w:t xml:space="preserve"> </w:t>
+      </w:r>
+      <w:r>
+        <w:rPr>
+          <w:rStyle w:val="VerbatimChar"/>
+        </w:rPr>
+        <w:t xml:space="preserve">src/chennai_routing/evaluation/metrics.py</w:t>
+      </w:r>
+      <w:r>
+        <w:t xml:space="preserve"> </w:t>
+      </w:r>
+      <w:r>
+        <w:t xml:space="preserve">provides array/graph utilities; ingestion and graph snapping are unimplemented.</w:t>
+      </w:r>
+      <w:r>
+        <w:br/>
+      </w:r>
+      <w:r>
+        <w:rPr>
+          <w:bCs/>
+          <w:b/>
+        </w:rPr>
         <w:t xml:space="preserve">Viewer:</w:t>
       </w:r>
       <w:r>
         <w:t xml:space="preserve"> </w:t>
       </w:r>
       <w:r>
-        <w:t xml:space="preserve">OpenCity resource previews where provided.</w:t>
-      </w:r>
-    </w:p>
-    <w:bookmarkEnd w:id="81"/>
-    <w:bookmarkEnd w:id="82"/>
-    <w:bookmarkStart w:id="83" w:name="data-classification-and-temporal-meaning"/>
+        <w:t xml:space="preserve">OpenCity resource previews and</w:t>
+      </w:r>
+      <w:r>
+        <w:t xml:space="preserve"> </w:t>
+      </w:r>
+      <w:hyperlink r:id="rId100">
+        <w:r>
+          <w:rPr>
+            <w:rStyle w:val="Hyperlink"/>
+          </w:rPr>
+          <w:t xml:space="preserve">WorldPop STAC Browser</w:t>
+        </w:r>
+      </w:hyperlink>
+      <w:r>
+        <w:t xml:space="preserve">.</w:t>
+      </w:r>
+    </w:p>
+    <w:p>
+      <w:pPr>
+        <w:pStyle w:val="BodyText"/>
+      </w:pPr>
+      <w:r>
+        <w:t xml:space="preserve">Selected OpenCity resources were downloaded and verified on 6 September 2026:</w:t>
+      </w:r>
+    </w:p>
+    <w:tbl>
+      <w:tblPr>
+        <w:tblStyle w:val="Table"/>
+        <w:tblW w:type="pct" w:w="5000"/>
+        <w:tblLook w:firstRow="1" w:lastRow="0" w:firstColumn="0" w:lastColumn="0" w:noHBand="0" w:noVBand="0" w:val="0020"/>
+        <w:jc w:val="start"/>
+      </w:tblPr>
+      <w:tblGrid>
+        <w:gridCol w:w="1827"/>
+        <w:gridCol w:w="1827"/>
+        <w:gridCol w:w="2436"/>
+        <w:gridCol w:w="1827"/>
+      </w:tblGrid>
+      <w:tr>
+        <w:trPr>
+          <w:tblHeader w:val="true"/>
+        </w:trPr>
+        <w:tc>
+          <w:tcPr/>
+          <w:p>
+            <w:pPr>
+              <w:pStyle w:val="Compact"/>
+              <w:jc w:val="left"/>
+            </w:pPr>
+            <w:r>
+              <w:t xml:space="preserve">Selected resource</w:t>
+            </w:r>
+          </w:p>
+        </w:tc>
+        <w:tc>
+          <w:tcPr/>
+          <w:p>
+            <w:pPr>
+              <w:pStyle w:val="Compact"/>
+              <w:jc w:val="left"/>
+            </w:pPr>
+            <w:r>
+              <w:t xml:space="preserve">CKAN resource ID</w:t>
+            </w:r>
+          </w:p>
+        </w:tc>
+        <w:tc>
+          <w:tcPr/>
+          <w:p>
+            <w:pPr>
+              <w:pStyle w:val="Compact"/>
+              <w:jc w:val="right"/>
+            </w:pPr>
+            <w:r>
+              <w:t xml:space="preserve">Format/size</w:t>
+            </w:r>
+          </w:p>
+        </w:tc>
+        <w:tc>
+          <w:tcPr/>
+          <w:p>
+            <w:pPr>
+              <w:pStyle w:val="Compact"/>
+              <w:jc w:val="left"/>
+            </w:pPr>
+            <w:r>
+              <w:t xml:space="preserve">SHA-256</w:t>
+            </w:r>
+          </w:p>
+        </w:tc>
+      </w:tr>
+      <w:tr>
+        <w:tc>
+          <w:tcPr/>
+          <w:p>
+            <w:pPr>
+              <w:pStyle w:val="Compact"/>
+              <w:jc w:val="left"/>
+            </w:pPr>
+            <w:hyperlink r:id="rId101">
+              <w:r>
+                <w:rPr>
+                  <w:rStyle w:val="Hyperlink"/>
+                </w:rPr>
+                <w:t xml:space="preserve">UPHC map</w:t>
+              </w:r>
+            </w:hyperlink>
+          </w:p>
+        </w:tc>
+        <w:tc>
+          <w:tcPr/>
+          <w:p>
+            <w:pPr>
+              <w:pStyle w:val="Compact"/>
+              <w:jc w:val="left"/>
+            </w:pPr>
+            <w:r>
+              <w:rPr>
+                <w:rStyle w:val="VerbatimChar"/>
+              </w:rPr>
+              <w:t xml:space="preserve">5a81427f-0aa1-4270-8df4-5d4cef250912</w:t>
+            </w:r>
+          </w:p>
+        </w:tc>
+        <w:tc>
+          <w:tcPr/>
+          <w:p>
+            <w:pPr>
+              <w:pStyle w:val="Compact"/>
+              <w:jc w:val="right"/>
+            </w:pPr>
+            <w:r>
+              <w:t xml:space="preserve">KML, 100,497 B</w:t>
+            </w:r>
+          </w:p>
+        </w:tc>
+        <w:tc>
+          <w:tcPr/>
+          <w:p>
+            <w:pPr>
+              <w:pStyle w:val="Compact"/>
+              <w:jc w:val="left"/>
+            </w:pPr>
+            <w:r>
+              <w:rPr>
+                <w:rStyle w:val="VerbatimChar"/>
+              </w:rPr>
+              <w:t xml:space="preserve">a700d7e837a5466d38e99a6ed1b67a2ff27be9638605f77b5051fef3b85055eb</w:t>
+            </w:r>
+          </w:p>
+        </w:tc>
+      </w:tr>
+      <w:tr>
+        <w:tc>
+          <w:tcPr/>
+          <w:p>
+            <w:pPr>
+              <w:pStyle w:val="Compact"/>
+              <w:jc w:val="left"/>
+            </w:pPr>
+            <w:hyperlink r:id="rId102">
+              <w:r>
+                <w:rPr>
+                  <w:rStyle w:val="Hyperlink"/>
+                </w:rPr>
+                <w:t xml:space="preserve">UCHC map</w:t>
+              </w:r>
+            </w:hyperlink>
+          </w:p>
+        </w:tc>
+        <w:tc>
+          <w:tcPr/>
+          <w:p>
+            <w:pPr>
+              <w:pStyle w:val="Compact"/>
+              <w:jc w:val="left"/>
+            </w:pPr>
+            <w:r>
+              <w:rPr>
+                <w:rStyle w:val="VerbatimChar"/>
+              </w:rPr>
+              <w:t xml:space="preserve">cd4effee-997f-4fe0-b376-8801080c6962</w:t>
+            </w:r>
+          </w:p>
+        </w:tc>
+        <w:tc>
+          <w:tcPr/>
+          <w:p>
+            <w:pPr>
+              <w:pStyle w:val="Compact"/>
+              <w:jc w:val="right"/>
+            </w:pPr>
+            <w:r>
+              <w:t xml:space="preserve">KML, 14,155 B</w:t>
+            </w:r>
+          </w:p>
+        </w:tc>
+        <w:tc>
+          <w:tcPr/>
+          <w:p>
+            <w:pPr>
+              <w:pStyle w:val="Compact"/>
+              <w:jc w:val="left"/>
+            </w:pPr>
+            <w:r>
+              <w:rPr>
+                <w:rStyle w:val="VerbatimChar"/>
+              </w:rPr>
+              <w:t xml:space="preserve">45e31b7dc026f54dd4e03191c2b91278a9722af5ace5425ebeb44de5c1c637ed</w:t>
+            </w:r>
+          </w:p>
+        </w:tc>
+      </w:tr>
+      <w:tr>
+        <w:tc>
+          <w:tcPr/>
+          <w:p>
+            <w:pPr>
+              <w:pStyle w:val="Compact"/>
+              <w:jc w:val="left"/>
+            </w:pPr>
+            <w:hyperlink r:id="rId103">
+              <w:r>
+                <w:rPr>
+                  <w:rStyle w:val="Hyperlink"/>
+                </w:rPr>
+                <w:t xml:space="preserve">Fire-station locations</w:t>
+              </w:r>
+            </w:hyperlink>
+          </w:p>
+        </w:tc>
+        <w:tc>
+          <w:tcPr/>
+          <w:p>
+            <w:pPr>
+              <w:pStyle w:val="Compact"/>
+              <w:jc w:val="left"/>
+            </w:pPr>
+            <w:r>
+              <w:rPr>
+                <w:rStyle w:val="VerbatimChar"/>
+              </w:rPr>
+              <w:t xml:space="preserve">39d3601b-cd42-4c11-a6c3-8fc4b057b38a</w:t>
+            </w:r>
+          </w:p>
+        </w:tc>
+        <w:tc>
+          <w:tcPr/>
+          <w:p>
+            <w:pPr>
+              <w:pStyle w:val="Compact"/>
+              <w:jc w:val="right"/>
+            </w:pPr>
+            <w:r>
+              <w:t xml:space="preserve">KML, 13,664 B</w:t>
+            </w:r>
+          </w:p>
+        </w:tc>
+        <w:tc>
+          <w:tcPr/>
+          <w:p>
+            <w:pPr>
+              <w:pStyle w:val="Compact"/>
+              <w:jc w:val="left"/>
+            </w:pPr>
+            <w:r>
+              <w:rPr>
+                <w:rStyle w:val="VerbatimChar"/>
+              </w:rPr>
+              <w:t xml:space="preserve">f41a5afb44e316aea26403f8403b08e14fcac9f13c2d5947d3e5ba859736dad9</w:t>
+            </w:r>
+          </w:p>
+        </w:tc>
+      </w:tr>
+      <w:tr>
+        <w:tc>
+          <w:tcPr/>
+          <w:p>
+            <w:pPr>
+              <w:pStyle w:val="Compact"/>
+              <w:jc w:val="left"/>
+            </w:pPr>
+            <w:hyperlink r:id="rId104">
+              <w:r>
+                <w:rPr>
+                  <w:rStyle w:val="Hyperlink"/>
+                </w:rPr>
+                <w:t xml:space="preserve">GCC 2024 relief-centre list</w:t>
+              </w:r>
+            </w:hyperlink>
+          </w:p>
+        </w:tc>
+        <w:tc>
+          <w:tcPr/>
+          <w:p>
+            <w:pPr>
+              <w:pStyle w:val="Compact"/>
+              <w:jc w:val="left"/>
+            </w:pPr>
+            <w:r>
+              <w:rPr>
+                <w:rStyle w:val="VerbatimChar"/>
+              </w:rPr>
+              <w:t xml:space="preserve">ee9f087a-dc6c-41fa-8810-954a9f5887ac</w:t>
+            </w:r>
+          </w:p>
+        </w:tc>
+        <w:tc>
+          <w:tcPr/>
+          <w:p>
+            <w:pPr>
+              <w:pStyle w:val="Compact"/>
+              <w:jc w:val="right"/>
+            </w:pPr>
+            <w:r>
+              <w:t xml:space="preserve">PDF, 247,507 B</w:t>
+            </w:r>
+          </w:p>
+        </w:tc>
+        <w:tc>
+          <w:tcPr/>
+          <w:p>
+            <w:pPr>
+              <w:pStyle w:val="Compact"/>
+              <w:jc w:val="left"/>
+            </w:pPr>
+            <w:r>
+              <w:rPr>
+                <w:rStyle w:val="VerbatimChar"/>
+              </w:rPr>
+              <w:t xml:space="preserve">9d68bb27098d81b161badb721a12d7cd36ba5e856a6a033590876b61cf16ac57</w:t>
+            </w:r>
+          </w:p>
+        </w:tc>
+      </w:tr>
+    </w:tbl>
+    <w:p>
+      <w:pPr>
+        <w:pStyle w:val="BodyText"/>
+      </w:pPr>
+      <w:r>
+        <w:t xml:space="preserve">These resources identify primary/community health centres, fire stations, and a relief-centre list; they do not establish trauma capability, facility capacity, opening status, or emergency readiness.</w:t>
+      </w:r>
+    </w:p>
+    <w:bookmarkEnd w:id="105"/>
+    <w:bookmarkEnd w:id="106"/>
+    <w:bookmarkStart w:id="107" w:name="data-classification-and-temporal-meaning"/>
     <w:p>
       <w:pPr>
         <w:pStyle w:val="Heading2"/>
@@ -5679,31 +8117,31 @@
               <w:jc w:val="left"/>
             </w:pPr>
             <w:r>
-              <w:t xml:space="preserve">IMERG Early</w:t>
-            </w:r>
-          </w:p>
-        </w:tc>
-        <w:tc>
-          <w:tcPr/>
-          <w:p>
-            <w:pPr>
-              <w:pStyle w:val="Compact"/>
-              <w:jc w:val="left"/>
-            </w:pPr>
-            <w:r>
-              <w:t xml:space="preserve">Primary dynamic input</w:t>
-            </w:r>
-          </w:p>
-        </w:tc>
-        <w:tc>
-          <w:tcPr/>
-          <w:p>
-            <w:pPr>
-              <w:pStyle w:val="Compact"/>
-              <w:jc w:val="left"/>
-            </w:pPr>
-            <w:r>
-              <w:t xml:space="preserve">Delayed satellite rainfall estimate</w:t>
+              <w:t xml:space="preserve">Open-Meteo ERA5</w:t>
+            </w:r>
+          </w:p>
+        </w:tc>
+        <w:tc>
+          <w:tcPr/>
+          <w:p>
+            <w:pPr>
+              <w:pStyle w:val="Compact"/>
+              <w:jc w:val="left"/>
+            </w:pPr>
+            <w:r>
+              <w:t xml:space="preserve">No-key core rainfall input</w:t>
+            </w:r>
+          </w:p>
+        </w:tc>
+        <w:tc>
+          <w:tcPr/>
+          <w:p>
+            <w:pPr>
+              <w:pStyle w:val="Compact"/>
+              <w:jc w:val="left"/>
+            </w:pPr>
+            <w:r>
+              <w:t xml:space="preserve">Retrospective reanalysis, not contemporaneous sensing</w:t>
             </w:r>
           </w:p>
         </w:tc>
@@ -5729,19 +8167,19 @@
               <w:jc w:val="left"/>
             </w:pPr>
             <w:r>
-              <w:t xml:space="preserve">Calibration input</w:t>
-            </w:r>
-          </w:p>
-        </w:tc>
-        <w:tc>
-          <w:tcPr/>
-          <w:p>
-            <w:pPr>
-              <w:pStyle w:val="Compact"/>
-              <w:jc w:val="left"/>
-            </w:pPr>
-            <w:r>
-              <w:t xml:space="preserve">Historical gauge-adjusted rainfall</w:t>
+              <w:t xml:space="preserve">Optional credentialed calibration input</w:t>
+            </w:r>
+          </w:p>
+        </w:tc>
+        <w:tc>
+          <w:tcPr/>
+          <w:p>
+            <w:pPr>
+              <w:pStyle w:val="Compact"/>
+              <w:jc w:val="left"/>
+            </w:pPr>
+            <w:r>
+              <w:t xml:space="preserve">Historical gauge-adjusted satellite rainfall</w:t>
             </w:r>
           </w:p>
         </w:tc>
@@ -5755,31 +8193,31 @@
               <w:jc w:val="left"/>
             </w:pPr>
             <w:r>
-              <w:t xml:space="preserve">SUMO</w:t>
-            </w:r>
-          </w:p>
-        </w:tc>
-        <w:tc>
-          <w:tcPr/>
-          <w:p>
-            <w:pPr>
-              <w:pStyle w:val="Compact"/>
-              <w:jc w:val="left"/>
-            </w:pPr>
-            <w:r>
-              <w:t xml:space="preserve">Experimental generator</w:t>
-            </w:r>
-          </w:p>
-        </w:tc>
-        <w:tc>
-          <w:tcPr/>
-          <w:p>
-            <w:pPr>
-              <w:pStyle w:val="Compact"/>
-              <w:jc w:val="left"/>
-            </w:pPr>
-            <w:r>
-              <w:t xml:space="preserve">Simulated traffic</w:t>
+              <w:t xml:space="preserve">IMERG Early</w:t>
+            </w:r>
+          </w:p>
+        </w:tc>
+        <w:tc>
+          <w:tcPr/>
+          <w:p>
+            <w:pPr>
+              <w:pStyle w:val="Compact"/>
+              <w:jc w:val="left"/>
+            </w:pPr>
+            <w:r>
+              <w:t xml:space="preserve">Optional credentialed near-current input</w:t>
+            </w:r>
+          </w:p>
+        </w:tc>
+        <w:tc>
+          <w:tcPr/>
+          <w:p>
+            <w:pPr>
+              <w:pStyle w:val="Compact"/>
+              <w:jc w:val="left"/>
+            </w:pPr>
+            <w:r>
+              <w:t xml:space="preserve">Delayed satellite rainfall estimate</w:t>
             </w:r>
           </w:p>
         </w:tc>
@@ -5793,31 +8231,31 @@
               <w:jc w:val="left"/>
             </w:pPr>
             <w:r>
-              <w:t xml:space="preserve">Facility data</w:t>
-            </w:r>
-          </w:p>
-        </w:tc>
-        <w:tc>
-          <w:tcPr/>
-          <w:p>
-            <w:pPr>
-              <w:pStyle w:val="Compact"/>
-              <w:jc w:val="left"/>
-            </w:pPr>
-            <w:r>
-              <w:t xml:space="preserve">Evaluation input</w:t>
-            </w:r>
-          </w:p>
-        </w:tc>
-        <w:tc>
-          <w:tcPr/>
-          <w:p>
-            <w:pPr>
-              <w:pStyle w:val="Compact"/>
-              <w:jc w:val="left"/>
-            </w:pPr>
-            <w:r>
-              <w:t xml:space="preserve">Catalogue snapshot</w:t>
+              <w:t xml:space="preserve">SUMO</w:t>
+            </w:r>
+          </w:p>
+        </w:tc>
+        <w:tc>
+          <w:tcPr/>
+          <w:p>
+            <w:pPr>
+              <w:pStyle w:val="Compact"/>
+              <w:jc w:val="left"/>
+            </w:pPr>
+            <w:r>
+              <w:t xml:space="preserve">Experimental generator</w:t>
+            </w:r>
+          </w:p>
+        </w:tc>
+        <w:tc>
+          <w:tcPr/>
+          <w:p>
+            <w:pPr>
+              <w:pStyle w:val="Compact"/>
+              <w:jc w:val="left"/>
+            </w:pPr>
+            <w:r>
+              <w:t xml:space="preserve">Simulated traffic</w:t>
             </w:r>
           </w:p>
         </w:tc>
@@ -5831,7 +8269,7 @@
               <w:jc w:val="left"/>
             </w:pPr>
             <w:r>
-              <w:t xml:space="preserve">WorldPop</w:t>
+              <w:t xml:space="preserve">Facility data</w:t>
             </w:r>
           </w:p>
         </w:tc>
@@ -5855,7 +8293,7 @@
               <w:jc w:val="left"/>
             </w:pPr>
             <w:r>
-              <w:t xml:space="preserve">Modelled population</w:t>
+              <w:t xml:space="preserve">Catalogue snapshot</w:t>
             </w:r>
           </w:p>
         </w:tc>
@@ -5869,6 +8307,44 @@
               <w:jc w:val="left"/>
             </w:pPr>
             <w:r>
+              <w:t xml:space="preserve">WorldPop</w:t>
+            </w:r>
+          </w:p>
+        </w:tc>
+        <w:tc>
+          <w:tcPr/>
+          <w:p>
+            <w:pPr>
+              <w:pStyle w:val="Compact"/>
+              <w:jc w:val="left"/>
+            </w:pPr>
+            <w:r>
+              <w:t xml:space="preserve">Evaluation input</w:t>
+            </w:r>
+          </w:p>
+        </w:tc>
+        <w:tc>
+          <w:tcPr/>
+          <w:p>
+            <w:pPr>
+              <w:pStyle w:val="Compact"/>
+              <w:jc w:val="left"/>
+            </w:pPr>
+            <w:r>
+              <w:t xml:space="preserve">Modelled population</w:t>
+            </w:r>
+          </w:p>
+        </w:tc>
+      </w:tr>
+      <w:tr>
+        <w:tc>
+          <w:tcPr/>
+          <w:p>
+            <w:pPr>
+              <w:pStyle w:val="Compact"/>
+              <w:jc w:val="left"/>
+            </w:pPr>
+            <w:r>
               <w:t xml:space="preserve">Processed edge metric</w:t>
             </w:r>
           </w:p>
@@ -5904,11 +8380,11 @@
         <w:pStyle w:val="BodyText"/>
       </w:pPr>
       <w:r>
-        <w:t xml:space="preserve">Optional OpenWeather/Open-Meteo forecasts may support demonstrations, but the core does not depend on paid APIs. No verified public live Chennai road-speed, accident, signal, or closure API is assumed.</w:t>
-      </w:r>
-    </w:p>
-    <w:bookmarkEnd w:id="83"/>
-    <w:bookmarkStart w:id="84" w:name="data-to-routing-mapping"/>
+        <w:t xml:space="preserve">Optional forecasts may support demonstrations, but the historical core uses no-key Open-Meteo ERA5 reanalysis and does not depend on paid APIs. No verified public live Chennai road-speed, accident, signal, or closure API is assumed.</w:t>
+      </w:r>
+    </w:p>
+    <w:bookmarkEnd w:id="107"/>
+    <w:bookmarkStart w:id="108" w:name="data-to-routing-mapping"/>
     <w:p>
       <w:pPr>
         <w:pStyle w:val="Heading2"/>
@@ -6092,7 +8568,7 @@
               <w:jc w:val="left"/>
             </w:pPr>
             <w:r>
-              <w:t xml:space="preserve">IMERG</w:t>
+              <w:t xml:space="preserve">Open-Meteo ERA5 or optional IMERG</w:t>
             </w:r>
           </w:p>
         </w:tc>
@@ -6116,19 +8592,19 @@
               <w:jc w:val="left"/>
             </w:pPr>
             <w:r>
-              <w:t xml:space="preserve">Road-state evidence</w:t>
-            </w:r>
-          </w:p>
-        </w:tc>
-        <w:tc>
-          <w:tcPr/>
-          <w:p>
-            <w:pPr>
-              <w:pStyle w:val="Compact"/>
-              <w:jc w:val="left"/>
-            </w:pPr>
-            <w:r>
-              <w:t xml:space="preserve">Capacity/availability update</w:t>
+              <w:t xml:space="preserve">Scenario-conditioning evidence</w:t>
+            </w:r>
+          </w:p>
+        </w:tc>
+        <w:tc>
+          <w:tcPr/>
+          <w:p>
+            <w:pPr>
+              <w:pStyle w:val="Compact"/>
+              <w:jc w:val="left"/>
+            </w:pPr>
+            <w:r>
+              <w:t xml:space="preserve">Capacity/availability assumption</w:t>
             </w:r>
           </w:p>
         </w:tc>
@@ -6351,8 +8827,8 @@
         </w:tc>
       </w:tr>
     </w:tbl>
-    <w:bookmarkEnd w:id="84"/>
-    <w:bookmarkStart w:id="88" w:name="architecture"/>
+    <w:bookmarkEnd w:id="108"/>
+    <w:bookmarkStart w:id="112" w:name="architecture"/>
     <w:p>
       <w:pPr>
         <w:pStyle w:val="Heading2"/>
@@ -6368,20 +8844,20 @@
       <w:r>
         <w:drawing>
           <wp:inline>
-            <wp:extent cx="5334000" cy="6956293"/>
+            <wp:extent cx="5334000" cy="9701320"/>
             <wp:effectExtent b="0" l="0" r="0" t="0"/>
-            <wp:docPr descr="Certificate-gated routing architecture" title="System Architecture" id="86" name="Picture"/>
+            <wp:docPr descr="Certificate-gated routing architecture" title="System Architecture" id="110" name="Picture"/>
             <a:graphic>
               <a:graphicData uri="http://schemas.openxmlformats.org/drawingml/2006/picture">
                 <pic:pic>
                   <pic:nvPicPr>
-                    <pic:cNvPr descr="docs/.docx-architecture.png" id="87" name="Picture"/>
+                    <pic:cNvPr descr="docs/.docx-architecture.png" id="111" name="Picture"/>
                     <pic:cNvPicPr>
                       <a:picLocks noChangeArrowheads="1" noChangeAspect="1"/>
                     </pic:cNvPicPr>
                   </pic:nvPicPr>
                   <pic:blipFill>
-                    <a:blip r:embed="rId85"/>
+                    <a:blip r:embed="rId109"/>
                     <a:stretch>
                       <a:fillRect/>
                     </a:stretch>
@@ -6389,7 +8865,7 @@
                   <pic:spPr bwMode="auto">
                     <a:xfrm>
                       <a:off x="0" y="0"/>
-                      <a:ext cx="5334000" cy="6956293"/>
+                      <a:ext cx="5334000" cy="9701320"/>
                     </a:xfrm>
                     <a:prstGeom prst="rect">
                       <a:avLst/>
@@ -6408,8 +8884,8 @@
         </w:drawing>
       </w:r>
     </w:p>
-    <w:bookmarkEnd w:id="88"/>
-    <w:bookmarkStart w:id="99" w:name="implementation-status-and-revised-stages"/>
+    <w:bookmarkEnd w:id="112"/>
+    <w:bookmarkStart w:id="123" w:name="implementation-status-and-revised-stages"/>
     <w:p>
       <w:pPr>
         <w:pStyle w:val="Heading2"/>
@@ -6418,13 +8894,13 @@
         <w:t xml:space="preserve">10. Implementation Status and Revised Stages</w:t>
       </w:r>
     </w:p>
-    <w:bookmarkStart w:id="89" w:name="X91a5b516961134ace8296606c3e58ad87e2ed6a"/>
+    <w:bookmarkStart w:id="113" w:name="X8c91d7d608f6e72d66bc3a0113bbb21f6990878"/>
     <w:p>
       <w:pPr>
         <w:pStyle w:val="Heading3"/>
       </w:pPr>
       <w:r>
-        <w:t xml:space="preserve">Stage 1 — Historical Flood Closure Proof of Concept</w:t>
+        <w:t xml:space="preserve">Stage 1 — Previously Executed Historical-Hotspot-Seeded Controlled Demo</w:t>
       </w:r>
     </w:p>
     <w:p>
@@ -6442,17 +8918,17 @@
         <w:t xml:space="preserve"> </w:t>
       </w:r>
       <w:r>
-        <w:t xml:space="preserve">Implemented.</w:t>
+        <w:t xml:space="preserve">Previously executed; implementation remains, but publication-grade evidence is not versioned.</w:t>
       </w:r>
       <w:r>
         <w:br/>
       </w:r>
       <w:r>
-        <w:t xml:space="preserve">OSM and OpenCity historical hotspots are joined to roads; one real mapped edge is controlled as blocked; BPR weights and two Dijkstra snapshots demonstrate closure avoidance. Finite congestion response is not validated.</w:t>
-      </w:r>
-    </w:p>
-    <w:bookmarkEnd w:id="89"/>
-    <w:bookmarkStart w:id="90" w:name="Xccb8caa86ccf46b10144f4fa77c6463d872ef9a"/>
+        <w:t xml:space="preserve">OSM and OpenCity historical hotspots were joined to roads; one real mapped edge was controlled as blocked; BPR weights and two Dijkstra snapshots demonstrated closure avoidance. Inputs/outputs are ignored and current tests use fixtures. This becomes publication evidence only after dated inputs, checksums, configuration, and a compact result manifest are preserved. Finite congestion response is not validated.</w:t>
+      </w:r>
+    </w:p>
+    <w:bookmarkEnd w:id="113"/>
+    <w:bookmarkStart w:id="114" w:name="Xccb8caa86ccf46b10144f4fa77c6463d872ef9a"/>
     <w:p>
       <w:pPr>
         <w:pStyle w:val="Heading3"/>
@@ -6626,8 +9102,8 @@
         <w:t xml:space="preserve">45 passing tests.</w:t>
       </w:r>
     </w:p>
-    <w:bookmarkEnd w:id="90"/>
-    <w:bookmarkStart w:id="91" w:name="stage-3-reproducible-chennai-graph"/>
+    <w:bookmarkEnd w:id="114"/>
+    <w:bookmarkStart w:id="115" w:name="stage-3-reproducible-chennai-graph"/>
     <w:p>
       <w:pPr>
         <w:pStyle w:val="Heading3"/>
@@ -6660,8 +9136,8 @@
         <w:t xml:space="preserve">Dated OSM extract, stable arc IDs, validated directions/turns/parallel arcs, free-flow times, and documented capacity assumptions.</w:t>
       </w:r>
     </w:p>
-    <w:bookmarkEnd w:id="91"/>
-    <w:bookmarkStart w:id="92" w:name="stage-4-flood-and-road-state-evidence"/>
+    <w:bookmarkEnd w:id="115"/>
+    <w:bookmarkStart w:id="116" w:name="stage-4-flood-and-road-state-evidence"/>
     <w:p>
       <w:pPr>
         <w:pStyle w:val="Heading3"/>
@@ -6685,7 +9161,7 @@
         <w:t xml:space="preserve"> </w:t>
       </w:r>
       <w:r>
-        <w:t xml:space="preserve">Generic lag/error perturbation implemented; Chennai evidence integration planned.</w:t>
+        <w:t xml:space="preserve">Synthetic binary lag/error utility implemented; dated Chennai road-state truth and temporal integration are unimplemented.</w:t>
       </w:r>
       <w:r>
         <w:br/>
@@ -6709,8 +9185,8 @@
         <w:t xml:space="preserve">states.</w:t>
       </w:r>
     </w:p>
-    <w:bookmarkEnd w:id="92"/>
-    <w:bookmarkStart w:id="93" w:name="Xb77ec8f9bac440bfe6e8fbaadfd160ccd3243f6"/>
+    <w:bookmarkEnd w:id="116"/>
+    <w:bookmarkStart w:id="117" w:name="Xb77ec8f9bac440bfe6e8fbaadfd160ccd3243f6"/>
     <w:p>
       <w:pPr>
         <w:pStyle w:val="Heading3"/>
@@ -6743,8 +9219,8 @@
         <w:t xml:space="preserve">Heterogeneous demand, entering PCE flow, incidents, queues, BPR calibration/sensitivity, and no double counting of SUMO delay.</w:t>
       </w:r>
     </w:p>
-    <w:bookmarkEnd w:id="93"/>
-    <w:bookmarkStart w:id="94" w:name="stage-6-chennai-cch-integration"/>
+    <w:bookmarkEnd w:id="117"/>
+    <w:bookmarkStart w:id="118" w:name="stage-6-chennai-cch-integration"/>
     <w:p>
       <w:pPr>
         <w:pStyle w:val="Heading3"/>
@@ -6777,8 +9253,8 @@
         <w:t xml:space="preserve">Geometry-aware ordering, turn-expanded topology, finite closure sentinel, integer quantization, full/partial customization, and Dijkstra differential validation.</w:t>
       </w:r>
     </w:p>
-    <w:bookmarkEnd w:id="94"/>
-    <w:bookmarkStart w:id="95" w:name="stage-7-stable-projected-load-rerouting"/>
+    <w:bookmarkEnd w:id="118"/>
+    <w:bookmarkStart w:id="119" w:name="stage-7-stable-projected-load-rerouting"/>
     <w:p>
       <w:pPr>
         <w:pStyle w:val="Heading3"/>
@@ -6811,8 +9287,8 @@
         <w:t xml:space="preserve">Threshold, minimum gain, cooldown, time-indexed route reservations, and compliance sensitivity.</w:t>
       </w:r>
     </w:p>
-    <w:bookmarkEnd w:id="95"/>
-    <w:bookmarkStart w:id="96" w:name="Xccf3cb31944b30e91fefa8a2921cf08ca5a74ca"/>
+    <w:bookmarkEnd w:id="119"/>
+    <w:bookmarkStart w:id="120" w:name="Xccf3cb31944b30e91fefa8a2921cf08ca5a74ca"/>
     <w:p>
       <w:pPr>
         <w:pStyle w:val="Heading3"/>
@@ -6836,7 +9312,7 @@
         <w:t xml:space="preserve"> </w:t>
       </w:r>
       <w:r>
-        <w:t xml:space="preserve">Generic metrics implemented; Chennai data integration planned.</w:t>
+        <w:t xml:space="preserve">Generic utility portions implemented; no Chennai factor-level experiment has run.</w:t>
       </w:r>
       <w:r>
         <w:br/>
@@ -6845,8 +9321,8 @@
         <w:t xml:space="preserve">Hospitals, fire stations, relief centres, disconnection, p90 access, population-weighted loss, partial compliance, and facility-oriented road criticality.</w:t>
       </w:r>
     </w:p>
-    <w:bookmarkEnd w:id="96"/>
-    <w:bookmarkStart w:id="97" w:name="stage-9-emergency-scenario"/>
+    <w:bookmarkEnd w:id="120"/>
+    <w:bookmarkStart w:id="121" w:name="stage-9-emergency-scenario"/>
     <w:p>
       <w:pPr>
         <w:pStyle w:val="Heading3"/>
@@ -6879,8 +9355,8 @@
         <w:t xml:space="preserve">Response time, deadline success, safety exposure, and ordinary-user external delay.</w:t>
       </w:r>
     </w:p>
-    <w:bookmarkEnd w:id="97"/>
-    <w:bookmarkStart w:id="98" w:name="stage-10-full-evaluation-and-paper"/>
+    <w:bookmarkEnd w:id="121"/>
+    <w:bookmarkStart w:id="122" w:name="stage-10-full-evaluation-and-paper"/>
     <w:p>
       <w:pPr>
         <w:pStyle w:val="Heading3"/>
@@ -6913,9 +9389,9 @@
         <w:t xml:space="preserve">Paired scenarios, baselines, ablations, uncertainty, statistical reporting, reproducibility package, and final manuscript.</w:t>
       </w:r>
     </w:p>
-    <w:bookmarkEnd w:id="98"/>
-    <w:bookmarkEnd w:id="99"/>
-    <w:bookmarkStart w:id="104" w:name="preliminary-certificate-experiment"/>
+    <w:bookmarkEnd w:id="122"/>
+    <w:bookmarkEnd w:id="123"/>
+    <w:bookmarkStart w:id="128" w:name="preliminary-certificate-experiment"/>
     <w:p>
       <w:pPr>
         <w:pStyle w:val="Heading2"/>
@@ -6924,7 +9400,7 @@
         <w:t xml:space="preserve">11. Preliminary Certificate Experiment</w:t>
       </w:r>
     </w:p>
-    <w:bookmarkStart w:id="100" w:name="setup"/>
+    <w:bookmarkStart w:id="124" w:name="setup"/>
     <w:p>
       <w:pPr>
         <w:pStyle w:val="Heading3"/>
@@ -7044,8 +9520,8 @@
         <w:t xml:space="preserve">0.1.4.</w:t>
       </w:r>
     </w:p>
-    <w:bookmarkEnd w:id="100"/>
-    <w:bookmarkStart w:id="101" w:name="main-results"/>
+    <w:bookmarkEnd w:id="124"/>
+    <w:bookmarkStart w:id="125" w:name="main-results"/>
     <w:p>
       <w:pPr>
         <w:pStyle w:val="Heading3"/>
@@ -7084,7 +9560,7 @@
               <w:jc w:val="left"/>
             </w:pPr>
             <w:r>
-              <w:t xml:space="preserve">Engine/workload</w:t>
+              <w:t xml:space="preserve">Prototype adapter/workload</w:t>
             </w:r>
           </w:p>
         </w:tc>
@@ -7639,7 +10115,7 @@
         <w:pStyle w:val="BodyText"/>
       </w:pPr>
       <w:r>
-        <w:t xml:space="preserve">These are one-machine, single-run synthetic measurements with degree ordering.</w:t>
+        <w:t xml:space="preserve">These are one-machine, single-run synthetic prototype-adapter measurements with degree ordering.</w:t>
       </w:r>
       <w:r>
         <w:t xml:space="preserve"> </w:t>
@@ -7671,15 +10147,47 @@
       <w:r>
         <w:t xml:space="preserve">”</w:t>
       </w:r>
-      <w:r>
-        <w:t xml:space="preserve"> </w:t>
-      </w:r>
-      <w:r>
-        <w:t xml:space="preserve">The values validate implementation behavior, not Chennai travel outcomes or general performance.</w:t>
-      </w:r>
-    </w:p>
-    <w:bookmarkEnd w:id="101"/>
-    <w:bookmarkStart w:id="103" w:name="epsilon-sensitivity"/>
+    </w:p>
+    <w:p>
+      <w:pPr>
+        <w:pStyle w:val="BodyText"/>
+      </w:pPr>
+      <w:r>
+        <w:t xml:space="preserve">The CCH adapter constructs a fresh</w:t>
+      </w:r>
+      <w:r>
+        <w:t xml:space="preserve"> </w:t>
+      </w:r>
+      <w:r>
+        <w:rPr>
+          <w:rStyle w:val="VerbatimChar"/>
+        </w:rPr>
+        <w:t xml:space="preserve">CCHMetric</w:t>
+      </w:r>
+      <w:r>
+        <w:t xml:space="preserve"> </w:t>
+      </w:r>
+      <w:r>
+        <w:t xml:space="preserve">on synchronization and a fresh</w:t>
+      </w:r>
+      <w:r>
+        <w:t xml:space="preserve"> </w:t>
+      </w:r>
+      <w:r>
+        <w:rPr>
+          <w:rStyle w:val="VerbatimChar"/>
+        </w:rPr>
+        <w:t xml:space="preserve">CCHQuery</w:t>
+      </w:r>
+      <w:r>
+        <w:t xml:space="preserve"> </w:t>
+      </w:r>
+      <w:r>
+        <w:t xml:space="preserve">for each request; metric reset, partial/parallel customization, and query reuse are not benchmarked. The eager Dijkstra adapter similarly rebuilds its represented weighted graph. Therefore, these values validate prototype behavior only and do not establish an optimized CCH-versus-Dijkstra break-even point or Chennai performance.</w:t>
+      </w:r>
+    </w:p>
+    <w:bookmarkEnd w:id="125"/>
+    <w:bookmarkStart w:id="127" w:name="epsilon-sensitivity"/>
     <w:p>
       <w:pPr>
         <w:pStyle w:val="Heading3"/>
@@ -7706,7 +10214,7 @@
       <w:r>
         <w:t xml:space="preserve"> </w:t>
       </w:r>
-      <w:hyperlink r:id="rId102">
+      <w:hyperlink r:id="rId126">
         <w:r>
           <w:rPr>
             <w:rStyle w:val="VerbatimChar"/>
@@ -7718,9 +10226,9 @@
         <w:t xml:space="preserve">.</w:t>
       </w:r>
     </w:p>
-    <w:bookmarkEnd w:id="103"/>
-    <w:bookmarkEnd w:id="104"/>
-    <w:bookmarkStart w:id="108" w:name="evaluation-plan"/>
+    <w:bookmarkEnd w:id="127"/>
+    <w:bookmarkEnd w:id="128"/>
+    <w:bookmarkStart w:id="132" w:name="evaluation-plan"/>
     <w:p>
       <w:pPr>
         <w:pStyle w:val="Heading2"/>
@@ -7729,7 +10237,7 @@
         <w:t xml:space="preserve">12. Evaluation Plan</w:t>
       </w:r>
     </w:p>
-    <w:bookmarkStart w:id="105" w:name="baselines"/>
+    <w:bookmarkStart w:id="129" w:name="baselines"/>
     <w:p>
       <w:pPr>
         <w:pStyle w:val="Heading3"/>
@@ -7822,8 +10330,8 @@
         <w:t xml:space="preserve">independent versus projected-load-aware assignments.</w:t>
       </w:r>
     </w:p>
-    <w:bookmarkEnd w:id="105"/>
-    <w:bookmarkStart w:id="106" w:name="ablations"/>
+    <w:bookmarkEnd w:id="129"/>
+    <w:bookmarkStart w:id="130" w:name="ablations"/>
     <w:p>
       <w:pPr>
         <w:pStyle w:val="Heading3"/>
@@ -7916,8 +10424,8 @@
         <w:t xml:space="preserve">compliance levels 0–100%.</w:t>
       </w:r>
     </w:p>
-    <w:bookmarkEnd w:id="106"/>
-    <w:bookmarkStart w:id="107" w:name="metrics"/>
+    <w:bookmarkEnd w:id="130"/>
+    <w:bookmarkStart w:id="131" w:name="metrics"/>
     <w:p>
       <w:pPr>
         <w:pStyle w:val="Heading3"/>
@@ -8250,9 +10758,9 @@
         </w:tc>
       </w:tr>
     </w:tbl>
-    <w:bookmarkEnd w:id="107"/>
-    <w:bookmarkEnd w:id="108"/>
-    <w:bookmarkStart w:id="109" w:name="reproducibility"/>
+    <w:bookmarkEnd w:id="131"/>
+    <w:bookmarkEnd w:id="132"/>
+    <w:bookmarkStart w:id="133" w:name="reproducibility"/>
     <w:p>
       <w:pPr>
         <w:pStyle w:val="Heading2"/>
@@ -8593,8 +11101,8 @@
         <w:t xml:space="preserve">Remote OSM/OpenCity inputs remain mutable until dated snapshots and checksums are committed. Synthetic experiment results are deterministic apart from timing.</w:t>
       </w:r>
     </w:p>
-    <w:bookmarkEnd w:id="109"/>
-    <w:bookmarkStart w:id="110" w:name="feasibility-and-remaining-uncertainty"/>
+    <w:bookmarkEnd w:id="133"/>
+    <w:bookmarkStart w:id="134" w:name="feasibility-and-remaining-uncertainty"/>
     <w:p>
       <w:pPr>
         <w:pStyle w:val="Heading2"/>
@@ -8612,24 +11120,40 @@
           <w:bCs/>
           <w:b/>
         </w:rPr>
-        <w:t xml:space="preserve">Available:</w:t>
-      </w:r>
-      <w:r>
-        <w:t xml:space="preserve"> </w:t>
-      </w:r>
-      <w:r>
-        <w:t xml:space="preserve">OSM, OpenCity, IMERG, SRTM/NASADEM, facility catalogues, WorldPop, SUMO, NetworkX, native CCH binding, and tested Python controller.</w:t>
-      </w:r>
-    </w:p>
-    <w:p>
-      <w:pPr>
-        <w:pStyle w:val="BodyText"/>
-      </w:pPr>
+        <w:t xml:space="preserve">Public/no-key inputs and tools:</w:t>
+      </w:r>
+      <w:r>
+        <w:t xml:space="preserve"> </w:t>
+      </w:r>
+      <w:r>
+        <w:t xml:space="preserve">OSM, OpenCity, Open-Meteo reanalysis, facility catalogues, WorldPop, SUMO, NetworkX, native CCH binding, and the tested Python utilities.</w:t>
+      </w:r>
+      <w:r>
+        <w:t xml:space="preserve"> </w:t>
+      </w:r>
       <w:r>
         <w:rPr>
           <w:bCs/>
           <w:b/>
         </w:rPr>
+        <w:t xml:space="preserve">Credentialed optional inputs:</w:t>
+      </w:r>
+      <w:r>
+        <w:t xml:space="preserve"> </w:t>
+      </w:r>
+      <w:r>
+        <w:t xml:space="preserve">official IMERG and SRTM/NASADEM through Earthdata.</w:t>
+      </w:r>
+    </w:p>
+    <w:p>
+      <w:pPr>
+        <w:pStyle w:val="BodyText"/>
+      </w:pPr>
+      <w:r>
+        <w:rPr>
+          <w:bCs/>
+          <w:b/>
+        </w:rPr>
         <w:t xml:space="preserve">Uncertain/optional:</w:t>
       </w:r>
       <w:r>
@@ -8644,11 +11168,11 @@
         <w:pStyle w:val="BodyText"/>
       </w:pPr>
       <w:r>
-        <w:t xml:space="preserve">The core remains feasible using historical replay and labelled simulation without paid APIs.</w:t>
-      </w:r>
-    </w:p>
-    <w:bookmarkEnd w:id="110"/>
-    <w:bookmarkStart w:id="111" w:name="limitations"/>
+        <w:t xml:space="preserve">The proposed core remains feasible as historical-evidence-conditioned scenario reconstruction and labelled simulation without paid APIs; end-to-end acquisition and Chennai execution are not yet demonstrated.</w:t>
+      </w:r>
+    </w:p>
+    <w:bookmarkEnd w:id="134"/>
+    <w:bookmarkStart w:id="135" w:name="limitations"/>
     <w:p>
       <w:pPr>
         <w:pStyle w:val="Heading2"/>
@@ -8849,8 +11373,32 @@
         <w:t xml:space="preserve">A literature audit cannot prove universal novelty.</w:t>
       </w:r>
     </w:p>
-    <w:bookmarkEnd w:id="111"/>
-    <w:bookmarkStart w:id="112" w:name="final-project-summary"/>
+    <w:p>
+      <w:pPr>
+        <w:numPr>
+          <w:ilvl w:val="0"/>
+          <w:numId w:val="1021"/>
+        </w:numPr>
+        <w:pStyle w:val="Compact"/>
+      </w:pPr>
+      <w:r>
+        <w:t xml:space="preserve">All five strengthening factors currently have only generic utility portions, not completed Chennai experiments.</w:t>
+      </w:r>
+    </w:p>
+    <w:p>
+      <w:pPr>
+        <w:numPr>
+          <w:ilvl w:val="0"/>
+          <w:numId w:val="1021"/>
+        </w:numPr>
+        <w:pStyle w:val="Compact"/>
+      </w:pPr>
+      <w:r>
+        <w:t xml:space="preserve">OpenCity historical layers do not provide authoritative timestamped road-state truth.</w:t>
+      </w:r>
+    </w:p>
+    <w:bookmarkEnd w:id="135"/>
+    <w:bookmarkStart w:id="136" w:name="final-project-summary"/>
     <w:p>
       <w:pPr>
         <w:pStyle w:val="Heading2"/>
@@ -8946,7 +11494,7 @@
               <w:jc w:val="left"/>
             </w:pPr>
             <w:r>
-              <w:t xml:space="preserve">Native CCH; Dijkstra correctness baseline; ALT backup</w:t>
+              <w:t xml:space="preserve">Dijkstra implemented; prototype CCH implemented; Chennai CCH planned after Stage 6; ALT unimplemented comparator</w:t>
             </w:r>
           </w:p>
         </w:tc>
@@ -9154,7 +11702,7 @@
               <w:jc w:val="left"/>
             </w:pPr>
             <w:r>
-              <w:t xml:space="preserve">Stage 1 plus tested synthetic CCH/Dijkstra method experiment</w:t>
+              <w:t xml:space="preserve">Tested synthetic CCH/Dijkstra method experiment; Stage 1 demo was previously run but lacks versioned publication evidence</w:t>
             </w:r>
           </w:p>
         </w:tc>
@@ -9186,8 +11734,8 @@
         </w:tc>
       </w:tr>
     </w:tbl>
-    <w:bookmarkEnd w:id="112"/>
-    <w:bookmarkStart w:id="113" w:name="research-claim-boundary"/>
+    <w:bookmarkEnd w:id="136"/>
+    <w:bookmarkStart w:id="137" w:name="research-claim-boundary"/>
     <w:p>
       <w:pPr>
         <w:pStyle w:val="Heading2"/>
@@ -9316,8 +11864,8 @@
         <w:t xml:space="preserve">Those claims require completion of Stages 3–10.</w:t>
       </w:r>
     </w:p>
-    <w:bookmarkEnd w:id="113"/>
-    <w:bookmarkEnd w:id="114"/>
+    <w:bookmarkEnd w:id="137"/>
+    <w:bookmarkEnd w:id="138"/>
     <w:sectPr/>
   </w:body>
 </w:document>

</xml_diff>

<commit_message>
Add cleaned professor PDF document
Co-authored-by: rohit michael <rohitmichael-alt@users.noreply.github.com>
</commit_message>
<xml_diff>
--- a/docs/PROJECT_RESEARCH_AND_EVIDENCE.docx
+++ b/docs/PROJECT_RESEARCH_AND_EVIDENCE.docx
@@ -35,50 +35,6 @@
       </w:pPr>
       <w:r>
         <w:t xml:space="preserve">Certificate-Gated Dynamic Routing under Compound Urban Disruptions</w:t>
-      </w:r>
-    </w:p>
-    <w:p>
-      <w:pPr>
-        <w:pStyle w:val="FirstParagraph"/>
-      </w:pPr>
-      <w:r>
-        <w:rPr>
-          <w:bCs/>
-          <w:b/>
-        </w:rPr>
-        <w:t xml:space="preserve">A reproducible Chennai-oriented research framework</w:t>
-      </w:r>
-      <w:r>
-        <w:br/>
-      </w:r>
-      <w:r>
-        <w:rPr>
-          <w:bCs/>
-          <w:b/>
-        </w:rPr>
-        <w:t xml:space="preserve">Research and implementation status:</w:t>
-      </w:r>
-      <w:r>
-        <w:t xml:space="preserve"> </w:t>
-      </w:r>
-      <w:r>
-        <w:t xml:space="preserve">Stage 1 and the preliminary routing-method experiment are implemented; Chennai-wide flood, traffic, and SUMO evaluation remains planned.</w:t>
-      </w:r>
-      <w:r>
-        <w:br/>
-      </w:r>
-      <w:r>
-        <w:rPr>
-          <w:bCs/>
-          <w:b/>
-        </w:rPr>
-        <w:t xml:space="preserve">Evidence reviewed through:</w:t>
-      </w:r>
-      <w:r>
-        <w:t xml:space="preserve"> </w:t>
-      </w:r>
-      <w:r>
-        <w:t xml:space="preserve">6 September 2026</w:t>
       </w:r>
     </w:p>
     <w:bookmarkStart w:id="20" w:name="problem-statement"/>

</xml_diff>

<commit_message>
Harden the evidence-to-certificate pathway after a claims audit
Wire explained road state through capacity, BPR, and millisecond snapshots
so Stage 1 and the certificate controller share one metric chain. Reject
silent UNKNOWN closures, empty updates, and identity version bumps; keep
Stage 1's before-graph intact; apply cooldown only to opportunistic
switches. Update the professor packet to match 55 tests and the remaining
unimplemented SUMO/reservation stages.

Co-authored-by: rohit michael <rohitmichael-alt@users.noreply.github.com>
</commit_message>
<xml_diff>
--- a/docs/PROJECT_RESEARCH_AND_EVIDENCE.docx
+++ b/docs/PROJECT_RESEARCH_AND_EVIDENCE.docx
@@ -2,33 +2,7 @@
 <file path=word/document.xml><?xml version="1.0" encoding="utf-8"?>
 <w:document xmlns:w="http://schemas.openxmlformats.org/wordprocessingml/2006/main" xmlns:m="http://schemas.openxmlformats.org/officeDocument/2006/math" xmlns:r="http://schemas.openxmlformats.org/officeDocument/2006/relationships" xmlns:o="urn:schemas-microsoft-com:office:office" xmlns:v="urn:schemas-microsoft-com:vml" xmlns:w10="urn:schemas-microsoft-com:office:word" xmlns:a="http://schemas.openxmlformats.org/drawingml/2006/main" xmlns:pic="http://schemas.openxmlformats.org/drawingml/2006/picture" xmlns:wp="http://schemas.openxmlformats.org/drawingml/2006/wordprocessingDrawing">
   <w:body>
-    <w:sdt>
-      <w:sdtPr>
-        <w:docPartObj>
-          <w:docPartGallery w:val="Table of Contents"/>
-          <w:docPartUnique/>
-        </w:docPartObj>
-      </w:sdtPr>
-      <w:sdtContent>
-        <w:p>
-          <w:pPr>
-            <w:pStyle w:val="TOCHeading"/>
-          </w:pPr>
-          <w:r>
-            <w:t xml:space="preserve">Table of Contents</w:t>
-          </w:r>
-        </w:p>
-        <w:p>
-          <w:r>
-            <w:fldChar w:fldCharType="begin" w:dirty="true"/>
-            <w:instrText xml:space="preserve">TOC \o "1-3" \h \z \u</w:instrText>
-            <w:fldChar w:fldCharType="separate"/>
-            <w:fldChar w:fldCharType="end"/>
-          </w:r>
-        </w:p>
-      </w:sdtContent>
-    </w:sdt>
-    <w:bookmarkStart w:id="138" w:name="Xd3382af488ce2996da400d0130c7cadeb69cdc7"/>
+    <w:bookmarkStart w:id="135" w:name="Xd3382af488ce2996da400d0130c7cadeb69cdc7"/>
     <w:p>
       <w:pPr>
         <w:pStyle w:val="Heading1"/>
@@ -1554,49 +1528,7 @@
         <w:pStyle w:val="FirstParagraph"/>
       </w:pPr>
       <w:r>
-        <w:t xml:space="preserve">Let</w:t>
-      </w:r>
-      <w:r>
-        <w:t xml:space="preserve"> </w:t>
-      </w:r>
-      <m:oMath>
-        <m:r>
-          <m:t>G</m:t>
-        </m:r>
-        <m:r>
-          <m:rPr>
-            <m:sty m:val="p"/>
-          </m:rPr>
-          <m:t>=</m:t>
-        </m:r>
-        <m:d>
-          <m:dPr>
-            <m:begChr m:val="("/>
-            <m:endChr m:val=")"/>
-            <m:sepChr m:val=""/>
-            <m:grow/>
-          </m:dPr>
-          <m:e>
-            <m:r>
-              <m:t>V</m:t>
-            </m:r>
-            <m:r>
-              <m:rPr>
-                <m:sty m:val="p"/>
-              </m:rPr>
-              <m:t>,</m:t>
-            </m:r>
-            <m:r>
-              <m:t>E</m:t>
-            </m:r>
-          </m:e>
-        </m:d>
-      </m:oMath>
-      <w:r>
-        <w:t xml:space="preserve"> </w:t>
-      </w:r>
-      <w:r>
-        <w:t xml:space="preserve">be a fixed directed multigraph. Every edge has:</w:t>
+        <w:t xml:space="preserve">Let (G=(V,E)) be a fixed directed multigraph. Every edge has:</w:t>
       </w:r>
     </w:p>
     <w:p>
@@ -1608,32 +1540,7 @@
         <w:pStyle w:val="Compact"/>
       </w:pPr>
       <w:r>
-        <w:t xml:space="preserve">free-flow time</w:t>
-      </w:r>
-      <w:r>
-        <w:t xml:space="preserve"> </w:t>
-      </w:r>
-      <m:oMath>
-        <m:sSubSup>
-          <m:e>
-            <m:r>
-              <m:t>t</m:t>
-            </m:r>
-          </m:e>
-          <m:sub>
-            <m:r>
-              <m:t>e</m:t>
-            </m:r>
-          </m:sub>
-          <m:sup>
-            <m:r>
-              <m:t>0</m:t>
-            </m:r>
-          </m:sup>
-        </m:sSubSup>
-      </m:oMath>
-      <w:r>
-        <w:t xml:space="preserve">;</w:t>
+        <w:t xml:space="preserve">free-flow time (t^0_e);</w:t>
       </w:r>
     </w:p>
     <w:p>
@@ -1645,32 +1552,7 @@
         <w:pStyle w:val="Compact"/>
       </w:pPr>
       <w:r>
-        <w:t xml:space="preserve">baseline capacity</w:t>
-      </w:r>
-      <w:r>
-        <w:t xml:space="preserve"> </w:t>
-      </w:r>
-      <m:oMath>
-        <m:sSubSup>
-          <m:e>
-            <m:r>
-              <m:t>c</m:t>
-            </m:r>
-          </m:e>
-          <m:sub>
-            <m:r>
-              <m:t>e</m:t>
-            </m:r>
-          </m:sub>
-          <m:sup>
-            <m:r>
-              <m:t>0</m:t>
-            </m:r>
-          </m:sup>
-        </m:sSubSup>
-      </m:oMath>
-      <w:r>
-        <w:t xml:space="preserve">;</w:t>
+        <w:t xml:space="preserve">baseline capacity (c^0_e);</w:t>
       </w:r>
     </w:p>
     <w:p>
@@ -1682,36 +1564,7 @@
         <w:pStyle w:val="Compact"/>
       </w:pPr>
       <w:r>
-        <w:t xml:space="preserve">assigned entering demand</w:t>
-      </w:r>
-      <w:r>
-        <w:t xml:space="preserve"> </w:t>
-      </w:r>
-      <m:oMath>
-        <m:sSub>
-          <m:e>
-            <m:r>
-              <m:t>x</m:t>
-            </m:r>
-          </m:e>
-          <m:sub>
-            <m:r>
-              <m:t>e</m:t>
-            </m:r>
-            <m:r>
-              <m:rPr>
-                <m:sty m:val="p"/>
-              </m:rPr>
-              <m:t>,</m:t>
-            </m:r>
-            <m:r>
-              <m:t>t</m:t>
-            </m:r>
-          </m:sub>
-        </m:sSub>
-      </m:oMath>
-      <w:r>
-        <w:t xml:space="preserve">;</w:t>
+        <w:t xml:space="preserve">assigned entering demand (x_{e,t});</w:t>
       </w:r>
     </w:p>
     <w:p>
@@ -1723,53 +1576,7 @@
         <w:pStyle w:val="Compact"/>
       </w:pPr>
       <w:r>
-        <w:t xml:space="preserve">flood multiplier</w:t>
-      </w:r>
-      <w:r>
-        <w:t xml:space="preserve"> </w:t>
-      </w:r>
-      <m:oMath>
-        <m:sSubSup>
-          <m:e>
-            <m:r>
-              <m:t>m</m:t>
-            </m:r>
-          </m:e>
-          <m:sub>
-            <m:r>
-              <m:t>e</m:t>
-            </m:r>
-            <m:r>
-              <m:rPr>
-                <m:sty m:val="p"/>
-              </m:rPr>
-              <m:t>,</m:t>
-            </m:r>
-            <m:r>
-              <m:t>t</m:t>
-            </m:r>
-          </m:sub>
-          <m:sup>
-            <m:r>
-              <m:t>f</m:t>
-            </m:r>
-            <m:r>
-              <m:t>l</m:t>
-            </m:r>
-            <m:r>
-              <m:t>o</m:t>
-            </m:r>
-            <m:r>
-              <m:t>o</m:t>
-            </m:r>
-            <m:r>
-              <m:t>d</m:t>
-            </m:r>
-          </m:sup>
-        </m:sSubSup>
-      </m:oMath>
-      <w:r>
-        <w:t xml:space="preserve">;</w:t>
+        <w:t xml:space="preserve">flood multiplier (m^{flood}_{e,t});</w:t>
       </w:r>
     </w:p>
     <w:p>
@@ -1781,62 +1588,7 @@
         <w:pStyle w:val="Compact"/>
       </w:pPr>
       <w:r>
-        <w:t xml:space="preserve">incident multiplier</w:t>
-      </w:r>
-      <w:r>
-        <w:t xml:space="preserve"> </w:t>
-      </w:r>
-      <m:oMath>
-        <m:sSubSup>
-          <m:e>
-            <m:r>
-              <m:t>m</m:t>
-            </m:r>
-          </m:e>
-          <m:sub>
-            <m:r>
-              <m:t>e</m:t>
-            </m:r>
-            <m:r>
-              <m:rPr>
-                <m:sty m:val="p"/>
-              </m:rPr>
-              <m:t>,</m:t>
-            </m:r>
-            <m:r>
-              <m:t>t</m:t>
-            </m:r>
-          </m:sub>
-          <m:sup>
-            <m:r>
-              <m:t>i</m:t>
-            </m:r>
-            <m:r>
-              <m:t>n</m:t>
-            </m:r>
-            <m:r>
-              <m:t>c</m:t>
-            </m:r>
-            <m:r>
-              <m:t>i</m:t>
-            </m:r>
-            <m:r>
-              <m:t>d</m:t>
-            </m:r>
-            <m:r>
-              <m:t>e</m:t>
-            </m:r>
-            <m:r>
-              <m:t>n</m:t>
-            </m:r>
-            <m:r>
-              <m:t>t</m:t>
-            </m:r>
-          </m:sup>
-        </m:sSubSup>
-      </m:oMath>
-      <w:r>
-        <w:t xml:space="preserve">; and</w:t>
+        <w:t xml:space="preserve">incident multiplier (m^{incident}_{e,t}); and</w:t>
       </w:r>
     </w:p>
     <w:p>
@@ -1863,285 +1615,27 @@
       <w:pPr>
         <w:pStyle w:val="BodyText"/>
       </w:pPr>
-      <m:oMathPara>
-        <m:oMathParaPr>
-          <m:jc m:val="center"/>
-        </m:oMathParaPr>
-        <m:oMath>
-          <m:sSubSup>
-            <m:e>
-              <m:r>
-                <m:t>c</m:t>
-              </m:r>
-            </m:e>
-            <m:sub>
-              <m:r>
-                <m:t>e</m:t>
-              </m:r>
-              <m:r>
-                <m:rPr>
-                  <m:sty m:val="p"/>
-                </m:rPr>
-                <m:t>,</m:t>
-              </m:r>
-              <m:r>
-                <m:t>t</m:t>
-              </m:r>
-            </m:sub>
-            <m:sup>
-              <m:r>
-                <m:t>e</m:t>
-              </m:r>
-              <m:r>
-                <m:t>f</m:t>
-              </m:r>
-              <m:r>
-                <m:t>f</m:t>
-              </m:r>
-            </m:sup>
-          </m:sSubSup>
-          <m:r>
-            <m:rPr>
-              <m:sty m:val="p"/>
-            </m:rPr>
-            <m:t>=</m:t>
-          </m:r>
-          <m:d>
-            <m:dPr>
-              <m:begChr m:val="{"/>
-              <m:endChr m:val=""/>
-              <m:sepChr m:val=""/>
-              <m:grow/>
-            </m:dPr>
-            <m:e>
-              <m:m>
-                <m:mPr>
-                  <m:baseJc m:val="center"/>
-                  <m:plcHide m:val="on"/>
-                  <m:mcs>
-                    <m:mc>
-                      <m:mcPr>
-                        <m:mcJc m:val="left"/>
-                        <m:count m:val="1"/>
-                      </m:mcPr>
-                    </m:mc>
-                    <m:mc>
-                      <m:mcPr>
-                        <m:mcJc m:val="left"/>
-                        <m:count m:val="1"/>
-                      </m:mcPr>
-                    </m:mc>
-                  </m:mcs>
-                </m:mPr>
-                <m:mr>
-                  <m:e>
-                    <m:r>
-                      <m:t>0</m:t>
-                    </m:r>
-                    <m:r>
-                      <m:rPr>
-                        <m:sty m:val="p"/>
-                      </m:rPr>
-                      <m:t>,</m:t>
-                    </m:r>
-                  </m:e>
-                  <m:e>
-                    <m:r>
-                      <m:rPr>
-                        <m:nor/>
-                        <m:sty m:val="p"/>
-                      </m:rPr>
-                      <m:t>verified closure</m:t>
-                    </m:r>
-                    <m:r>
-                      <m:rPr>
-                        <m:sty m:val="p"/>
-                      </m:rPr>
-                      <m:t>,</m:t>
-                    </m:r>
-                  </m:e>
-                </m:mr>
-                <m:mr>
-                  <m:e>
-                    <m:r>
-                      <m:rPr>
-                        <m:sty m:val="p"/>
-                      </m:rPr>
-                      <m:t>max</m:t>
-                    </m:r>
-                    <m:d>
-                      <m:dPr>
-                        <m:begChr m:val="("/>
-                        <m:endChr m:val=")"/>
-                        <m:sepChr m:val=""/>
-                        <m:grow/>
-                      </m:dPr>
-                      <m:e>
-                        <m:sSubSup>
-                          <m:e>
-                            <m:r>
-                              <m:t>c</m:t>
-                            </m:r>
-                          </m:e>
-                          <m:sub>
-                            <m:r>
-                              <m:t>e</m:t>
-                            </m:r>
-                          </m:sub>
-                          <m:sup>
-                            <m:r>
-                              <m:t>m</m:t>
-                            </m:r>
-                            <m:r>
-                              <m:t>i</m:t>
-                            </m:r>
-                            <m:r>
-                              <m:t>n</m:t>
-                            </m:r>
-                          </m:sup>
-                        </m:sSubSup>
-                        <m:r>
-                          <m:rPr>
-                            <m:sty m:val="p"/>
-                          </m:rPr>
-                          <m:t>,</m:t>
-                        </m:r>
-                        <m:sSubSup>
-                          <m:e>
-                            <m:r>
-                              <m:t>c</m:t>
-                            </m:r>
-                          </m:e>
-                          <m:sub>
-                            <m:r>
-                              <m:t>e</m:t>
-                            </m:r>
-                          </m:sub>
-                          <m:sup>
-                            <m:r>
-                              <m:t>0</m:t>
-                            </m:r>
-                          </m:sup>
-                        </m:sSubSup>
-                        <m:sSubSup>
-                          <m:e>
-                            <m:r>
-                              <m:t>m</m:t>
-                            </m:r>
-                          </m:e>
-                          <m:sub>
-                            <m:r>
-                              <m:t>e</m:t>
-                            </m:r>
-                            <m:r>
-                              <m:rPr>
-                                <m:sty m:val="p"/>
-                              </m:rPr>
-                              <m:t>,</m:t>
-                            </m:r>
-                            <m:r>
-                              <m:t>t</m:t>
-                            </m:r>
-                          </m:sub>
-                          <m:sup>
-                            <m:r>
-                              <m:t>f</m:t>
-                            </m:r>
-                            <m:r>
-                              <m:t>l</m:t>
-                            </m:r>
-                            <m:r>
-                              <m:t>o</m:t>
-                            </m:r>
-                            <m:r>
-                              <m:t>o</m:t>
-                            </m:r>
-                            <m:r>
-                              <m:t>d</m:t>
-                            </m:r>
-                          </m:sup>
-                        </m:sSubSup>
-                        <m:sSubSup>
-                          <m:e>
-                            <m:r>
-                              <m:t>m</m:t>
-                            </m:r>
-                          </m:e>
-                          <m:sub>
-                            <m:r>
-                              <m:t>e</m:t>
-                            </m:r>
-                            <m:r>
-                              <m:rPr>
-                                <m:sty m:val="p"/>
-                              </m:rPr>
-                              <m:t>,</m:t>
-                            </m:r>
-                            <m:r>
-                              <m:t>t</m:t>
-                            </m:r>
-                          </m:sub>
-                          <m:sup>
-                            <m:r>
-                              <m:t>i</m:t>
-                            </m:r>
-                            <m:r>
-                              <m:t>n</m:t>
-                            </m:r>
-                            <m:r>
-                              <m:t>c</m:t>
-                            </m:r>
-                            <m:r>
-                              <m:t>i</m:t>
-                            </m:r>
-                            <m:r>
-                              <m:t>d</m:t>
-                            </m:r>
-                            <m:r>
-                              <m:t>e</m:t>
-                            </m:r>
-                            <m:r>
-                              <m:t>n</m:t>
-                            </m:r>
-                            <m:r>
-                              <m:t>t</m:t>
-                            </m:r>
-                          </m:sup>
-                        </m:sSubSup>
-                      </m:e>
-                    </m:d>
-                    <m:r>
-                      <m:rPr>
-                        <m:sty m:val="p"/>
-                      </m:rPr>
-                      <m:t>,</m:t>
-                    </m:r>
-                  </m:e>
-                  <m:e>
-                    <m:r>
-                      <m:rPr>
-                        <m:nor/>
-                        <m:sty m:val="p"/>
-                      </m:rPr>
-                      <m:t>otherwise</m:t>
-                    </m:r>
-                    <m:r>
-                      <m:rPr>
-                        <m:sty m:val="p"/>
-                      </m:rPr>
-                      <m:t>.</m:t>
-                    </m:r>
-                  </m:e>
-                </m:mr>
-              </m:m>
-            </m:e>
-          </m:d>
-        </m:oMath>
-      </m:oMathPara>
-    </w:p>
-    <w:p>
-      <w:pPr>
-        <w:pStyle w:val="FirstParagraph"/>
+      <w:r>
+        <w:t xml:space="preserve">[</w:t>
+      </w:r>
+      <w:r>
+        <w:t xml:space="preserve"> </w:t>
+      </w:r>
+      <w:r>
+        <w:t xml:space="preserve">c^{eff}_{e,t}=</w:t>
+      </w:r>
+    </w:p>
+    <w:p>
+      <w:pPr>
+        <w:pStyle w:val="BodyText"/>
+      </w:pPr>
+      <w:r>
+        <w:t xml:space="preserve">]</w:t>
+      </w:r>
+    </w:p>
+    <w:p>
+      <w:pPr>
+        <w:pStyle w:val="BodyText"/>
       </w:pPr>
       <w:r>
         <w:t xml:space="preserve">The BPR route cost is:</w:t>
@@ -2151,188 +1645,28 @@
       <w:pPr>
         <w:pStyle w:val="BodyText"/>
       </w:pPr>
-      <m:oMathPara>
-        <m:oMathParaPr>
-          <m:jc m:val="center"/>
-        </m:oMathParaPr>
-        <m:oMath>
-          <m:sSub>
-            <m:e>
-              <m:r>
-                <m:t>t</m:t>
-              </m:r>
-            </m:e>
-            <m:sub>
-              <m:r>
-                <m:t>e</m:t>
-              </m:r>
-              <m:r>
-                <m:rPr>
-                  <m:sty m:val="p"/>
-                </m:rPr>
-                <m:t>,</m:t>
-              </m:r>
-              <m:r>
-                <m:t>t</m:t>
-              </m:r>
-            </m:sub>
-          </m:sSub>
-          <m:r>
-            <m:rPr>
-              <m:sty m:val="p"/>
-            </m:rPr>
-            <m:t>=</m:t>
-          </m:r>
-          <m:sSubSup>
-            <m:e>
-              <m:r>
-                <m:t>t</m:t>
-              </m:r>
-            </m:e>
-            <m:sub>
-              <m:r>
-                <m:t>e</m:t>
-              </m:r>
-            </m:sub>
-            <m:sup>
-              <m:r>
-                <m:t>0</m:t>
-              </m:r>
-            </m:sup>
-          </m:sSubSup>
-          <m:d>
-            <m:dPr>
-              <m:begChr m:val="["/>
-              <m:endChr m:val="]"/>
-              <m:sepChr m:val=""/>
-              <m:grow/>
-            </m:dPr>
-            <m:e>
-              <m:r>
-                <m:t>1</m:t>
-              </m:r>
-              <m:r>
-                <m:rPr>
-                  <m:sty m:val="p"/>
-                </m:rPr>
-                <m:t>+</m:t>
-              </m:r>
-              <m:sSub>
-                <m:e>
-                  <m:r>
-                    <m:t>α</m:t>
-                  </m:r>
-                </m:e>
-                <m:sub>
-                  <m:r>
-                    <m:t>e</m:t>
-                  </m:r>
-                </m:sub>
-              </m:sSub>
-              <m:sSup>
-                <m:e>
-                  <m:d>
-                    <m:dPr>
-                      <m:begChr m:val="("/>
-                      <m:endChr m:val=")"/>
-                      <m:sepChr m:val=""/>
-                      <m:grow/>
-                    </m:dPr>
-                    <m:e>
-                      <m:f>
-                        <m:fPr>
-                          <m:type m:val="bar"/>
-                        </m:fPr>
-                        <m:num>
-                          <m:sSub>
-                            <m:e>
-                              <m:r>
-                                <m:t>x</m:t>
-                              </m:r>
-                            </m:e>
-                            <m:sub>
-                              <m:r>
-                                <m:t>e</m:t>
-                              </m:r>
-                              <m:r>
-                                <m:rPr>
-                                  <m:sty m:val="p"/>
-                                </m:rPr>
-                                <m:t>,</m:t>
-                              </m:r>
-                              <m:r>
-                                <m:t>t</m:t>
-                              </m:r>
-                            </m:sub>
-                          </m:sSub>
-                        </m:num>
-                        <m:den>
-                          <m:sSubSup>
-                            <m:e>
-                              <m:r>
-                                <m:t>c</m:t>
-                              </m:r>
-                            </m:e>
-                            <m:sub>
-                              <m:r>
-                                <m:t>e</m:t>
-                              </m:r>
-                              <m:r>
-                                <m:rPr>
-                                  <m:sty m:val="p"/>
-                                </m:rPr>
-                                <m:t>,</m:t>
-                              </m:r>
-                              <m:r>
-                                <m:t>t</m:t>
-                              </m:r>
-                            </m:sub>
-                            <m:sup>
-                              <m:r>
-                                <m:t>e</m:t>
-                              </m:r>
-                              <m:r>
-                                <m:t>f</m:t>
-                              </m:r>
-                              <m:r>
-                                <m:t>f</m:t>
-                              </m:r>
-                            </m:sup>
-                          </m:sSubSup>
-                        </m:den>
-                      </m:f>
-                    </m:e>
-                  </m:d>
-                </m:e>
-                <m:sup>
-                  <m:sSub>
-                    <m:e>
-                      <m:r>
-                        <m:t>β</m:t>
-                      </m:r>
-                    </m:e>
-                    <m:sub>
-                      <m:r>
-                        <m:t>e</m:t>
-                      </m:r>
-                    </m:sub>
-                  </m:sSub>
-                </m:sup>
-              </m:sSup>
-            </m:e>
-          </m:d>
-          <m:r>
-            <m:rPr>
-              <m:sty m:val="p"/>
-            </m:rPr>
-            <m:t>,</m:t>
-          </m:r>
-        </m:oMath>
-      </m:oMathPara>
-    </w:p>
-    <w:p>
-      <w:pPr>
-        <w:pStyle w:val="FirstParagraph"/>
+      <w:r>
+        <w:t xml:space="preserve">[</w:t>
+      </w:r>
+      <w:r>
+        <w:t xml:space="preserve"> </w:t>
+      </w:r>
+      <w:r>
+        <w:t xml:space="preserve">t_{e,t}=t^0_e</w:t>
+      </w:r>
+      <w:r>
+        <w:t xml:space="preserve">,</w:t>
+      </w:r>
+      <w:r>
+        <w:t xml:space="preserve"> </w:t>
+      </w:r>
+      <w:r>
+        <w:t xml:space="preserve">]</w:t>
+      </w:r>
+    </w:p>
+    <w:p>
+      <w:pPr>
+        <w:pStyle w:val="BodyText"/>
       </w:pPr>
       <w:r>
         <w:t xml:space="preserve">where adjacency denotes multiplication. For software and CCH, seconds are quantized to non-negative integer milliseconds. Flow and capacity use the same interval and units. Discharged throughput is retained as an outcome, not substituted for assigned entering demand.</w:t>
@@ -2343,76 +1677,13 @@
         <w:pStyle w:val="BodyText"/>
       </w:pPr>
       <w:r>
-        <w:t xml:space="preserve">When</w:t>
-      </w:r>
-      <w:r>
-        <w:t xml:space="preserve"> </w:t>
-      </w:r>
-      <m:oMath>
-        <m:sSubSup>
-          <m:e>
-            <m:r>
-              <m:t>c</m:t>
-            </m:r>
-          </m:e>
-          <m:sub>
-            <m:r>
-              <m:t>e</m:t>
-            </m:r>
-            <m:r>
-              <m:rPr>
-                <m:sty m:val="p"/>
-              </m:rPr>
-              <m:t>,</m:t>
-            </m:r>
-            <m:r>
-              <m:t>t</m:t>
-            </m:r>
-          </m:sub>
-          <m:sup>
-            <m:r>
-              <m:t>e</m:t>
-            </m:r>
-            <m:r>
-              <m:t>f</m:t>
-            </m:r>
-            <m:r>
-              <m:t>f</m:t>
-            </m:r>
-          </m:sup>
-        </m:sSubSup>
-        <m:r>
-          <m:rPr>
-            <m:sty m:val="p"/>
-          </m:rPr>
-          <m:t>=</m:t>
-        </m:r>
-        <m:r>
-          <m:t>0</m:t>
-        </m:r>
-      </m:oMath>
-      <w:r>
-        <w:t xml:space="preserve">, the edge is excluded and its routing cost is</w:t>
-      </w:r>
-      <w:r>
-        <w:t xml:space="preserve"> </w:t>
-      </w:r>
-      <m:oMath>
-        <m:r>
-          <m:rPr>
-            <m:sty m:val="p"/>
-          </m:rPr>
-          <m:t>+</m:t>
-        </m:r>
-        <m:r>
-          <m:rPr>
-            <m:sty m:val="p"/>
-          </m:rPr>
-          <m:t>∞</m:t>
-        </m:r>
-      </m:oMath>
-      <w:r>
-        <w:t xml:space="preserve">; the finite BPR expression is not evaluated. The native CCH experiment currently rejects closures until a finite sentinel and overflow bound are validated.</w:t>
+        <w:t xml:space="preserve">When (c^{eff}_{e,t}=0), the edge is excluded and its routing cost is (+</w:t>
+      </w:r>
+      <w:r>
+        <w:t xml:space="preserve">); the finite BPR expression is not evaluated. Native CCH currently rejects (+</w:t>
+      </w:r>
+      <w:r>
+        <w:t xml:space="preserve">) closures; Dijkstra omits those edges. An integer-millisecond conversion is implemented for the Stage 2 snapshot glue.</w:t>
       </w:r>
     </w:p>
     <w:bookmarkEnd w:id="46"/>
@@ -2627,20 +1898,11 @@
         </w:numPr>
         <w:pStyle w:val="Compact"/>
       </w:pPr>
-      <m:oMath>
-        <m:acc>
-          <m:accPr>
-            <m:chr m:val="‾"/>
-          </m:accPr>
-          <m:e>
-            <m:r>
-              <m:t>w</m:t>
-            </m:r>
-          </m:e>
-        </m:acc>
-      </m:oMath>
-      <w:r>
-        <w:t xml:space="preserve">: the edge metric currently synchronized into CCH;</w:t>
+      <w:r>
+        <w:t xml:space="preserve">(</w:t>
+      </w:r>
+      <w:r>
+        <w:t xml:space="preserve">w): the edge metric currently synchronized into CCH;</w:t>
       </w:r>
     </w:p>
     <w:p>
@@ -2651,13 +1913,8 @@
         </w:numPr>
         <w:pStyle w:val="Compact"/>
       </w:pPr>
-      <m:oMath>
-        <m:r>
-          <m:t>w</m:t>
-        </m:r>
-      </m:oMath>
-      <w:r>
-        <w:t xml:space="preserve">: the latest authoritative/projected metric;</w:t>
+      <w:r>
+        <w:t xml:space="preserve">(w): the latest authoritative/projected metric;</w:t>
       </w:r>
     </w:p>
     <w:p>
@@ -2668,40 +1925,11 @@
         </w:numPr>
         <w:pStyle w:val="Compact"/>
       </w:pPr>
-      <m:oMath>
-        <m:sSub>
-          <m:e>
-            <m:r>
-              <m:t>P</m:t>
-            </m:r>
-          </m:e>
-          <m:sub>
-            <m:r>
-              <m:t>0</m:t>
-            </m:r>
-          </m:sub>
-        </m:sSub>
-      </m:oMath>
-      <w:r>
-        <w:t xml:space="preserve">: an exact path returned under</w:t>
-      </w:r>
-      <w:r>
-        <w:t xml:space="preserve"> </w:t>
-      </w:r>
-      <m:oMath>
-        <m:acc>
-          <m:accPr>
-            <m:chr m:val="‾"/>
-          </m:accPr>
-          <m:e>
-            <m:r>
-              <m:t>w</m:t>
-            </m:r>
-          </m:e>
-        </m:acc>
-      </m:oMath>
-      <w:r>
-        <w:t xml:space="preserve">;</w:t>
+      <w:r>
+        <w:t xml:space="preserve">(P_0): an exact path returned under (</w:t>
+      </w:r>
+      <w:r>
+        <w:t xml:space="preserve">w);</w:t>
       </w:r>
     </w:p>
     <w:p>
@@ -2712,60 +1940,11 @@
         </w:numPr>
         <w:pStyle w:val="Compact"/>
       </w:pPr>
-      <m:oMath>
-        <m:r>
-          <m:t>L</m:t>
-        </m:r>
-        <m:r>
-          <m:rPr>
-            <m:sty m:val="p"/>
-          </m:rPr>
-          <m:t>=</m:t>
-        </m:r>
-        <m:sSub>
-          <m:e>
-            <m:r>
-              <m:t>d</m:t>
-            </m:r>
-          </m:e>
-          <m:sub>
-            <m:acc>
-              <m:accPr>
-                <m:chr m:val="‾"/>
-              </m:accPr>
-              <m:e>
-                <m:r>
-                  <m:t>w</m:t>
-                </m:r>
-              </m:e>
-            </m:acc>
-          </m:sub>
-        </m:sSub>
-        <m:d>
-          <m:dPr>
-            <m:begChr m:val="("/>
-            <m:endChr m:val=")"/>
-            <m:sepChr m:val=""/>
-            <m:grow/>
-          </m:dPr>
-          <m:e>
-            <m:r>
-              <m:t>s</m:t>
-            </m:r>
-            <m:r>
-              <m:rPr>
-                <m:sty m:val="p"/>
-              </m:rPr>
-              <m:t>,</m:t>
-            </m:r>
-            <m:r>
-              <m:t>t</m:t>
-            </m:r>
-          </m:e>
-        </m:d>
-      </m:oMath>
-      <w:r>
-        <w:t xml:space="preserve">: its old optimal distance;</w:t>
+      <w:r>
+        <w:t xml:space="preserve">(L=d_{</w:t>
+      </w:r>
+      <w:r>
+        <w:t xml:space="preserve">w}(s,t)): its old optimal distance;</w:t>
       </w:r>
     </w:p>
     <w:p>
@@ -2776,53 +1955,8 @@
         </w:numPr>
         <w:pStyle w:val="Compact"/>
       </w:pPr>
-      <m:oMath>
-        <m:r>
-          <m:t>U</m:t>
-        </m:r>
-        <m:r>
-          <m:rPr>
-            <m:sty m:val="p"/>
-          </m:rPr>
-          <m:t>=</m:t>
-        </m:r>
-        <m:sSub>
-          <m:e>
-            <m:r>
-              <m:t>C</m:t>
-            </m:r>
-          </m:e>
-          <m:sub>
-            <m:r>
-              <m:t>w</m:t>
-            </m:r>
-          </m:sub>
-        </m:sSub>
-        <m:d>
-          <m:dPr>
-            <m:begChr m:val="("/>
-            <m:endChr m:val=")"/>
-            <m:sepChr m:val=""/>
-            <m:grow/>
-          </m:dPr>
-          <m:e>
-            <m:sSub>
-              <m:e>
-                <m:r>
-                  <m:t>P</m:t>
-                </m:r>
-              </m:e>
-              <m:sub>
-                <m:r>
-                  <m:t>0</m:t>
-                </m:r>
-              </m:sub>
-            </m:sSub>
-          </m:e>
-        </m:d>
-      </m:oMath>
-      <w:r>
-        <w:t xml:space="preserve">: the same keyed-edge path evaluated under current weights; and</w:t>
+      <w:r>
+        <w:t xml:space="preserve">(U=C_w(P_0)): the same keyed-edge path evaluated under current weights; and</w:t>
       </w:r>
     </w:p>
     <w:p>
@@ -2833,13 +1967,11 @@
         </w:numPr>
         <w:pStyle w:val="Compact"/>
       </w:pPr>
-      <m:oMath>
-        <m:r>
-          <m:t>ϵ</m:t>
-        </m:r>
-      </m:oMath>
-      <w:r>
-        <w:t xml:space="preserve">: permitted represented-cost stretch.</w:t>
+      <w:r>
+        <w:t xml:space="preserve">(</w:t>
+      </w:r>
+      <w:r>
+        <w:t xml:space="preserve">): permitted represented-cost stretch.</w:t>
       </w:r>
     </w:p>
     <w:p>
@@ -2854,72 +1986,34 @@
       <w:pPr>
         <w:pStyle w:val="BodyText"/>
       </w:pPr>
-      <m:oMathPara>
-        <m:oMathParaPr>
-          <m:jc m:val="center"/>
-        </m:oMathParaPr>
-        <m:oMath>
-          <m:sSub>
-            <m:e>
-              <m:r>
-                <m:t>w</m:t>
-              </m:r>
-            </m:e>
-            <m:sub>
-              <m:r>
-                <m:t>e</m:t>
-              </m:r>
-            </m:sub>
-          </m:sSub>
-          <m:r>
-            <m:rPr>
-              <m:sty m:val="p"/>
-            </m:rPr>
-            <m:t>≥</m:t>
-          </m:r>
-          <m:sSub>
-            <m:e>
-              <m:acc>
-                <m:accPr>
-                  <m:chr m:val="‾"/>
-                </m:accPr>
-                <m:e>
-                  <m:r>
-                    <m:t>w</m:t>
-                  </m:r>
-                </m:e>
-              </m:acc>
-            </m:e>
-            <m:sub>
-              <m:r>
-                <m:t>e</m:t>
-              </m:r>
-            </m:sub>
-          </m:sSub>
-          <m:r>
-            <m:t> </m:t>
-          </m:r>
-          <m:r>
-            <m:rPr>
-              <m:sty m:val="p"/>
-            </m:rPr>
-            <m:t>∀</m:t>
-          </m:r>
-          <m:r>
-            <m:t>e</m:t>
-          </m:r>
-          <m:r>
-            <m:rPr>
-              <m:sty m:val="p"/>
-            </m:rPr>
-            <m:t>,</m:t>
-          </m:r>
-        </m:oMath>
-      </m:oMathPara>
-    </w:p>
-    <w:p>
-      <w:pPr>
-        <w:pStyle w:val="FirstParagraph"/>
+      <w:r>
+        <w:t xml:space="preserve">[</w:t>
+      </w:r>
+      <w:r>
+        <w:t xml:space="preserve"> </w:t>
+      </w:r>
+      <w:r>
+        <w:t xml:space="preserve">w_e</w:t>
+      </w:r>
+      <w:r>
+        <w:t xml:space="preserve">w_e</w:t>
+      </w:r>
+      <w:r>
+        <w:t xml:space="preserve"> </w:t>
+      </w:r>
+      <w:r>
+        <w:t xml:space="preserve">e,</w:t>
+      </w:r>
+      <w:r>
+        <w:t xml:space="preserve"> </w:t>
+      </w:r>
+      <w:r>
+        <w:t xml:space="preserve">]</w:t>
+      </w:r>
+    </w:p>
+    <w:p>
+      <w:pPr>
+        <w:pStyle w:val="BodyText"/>
       </w:pPr>
       <w:r>
         <w:t xml:space="preserve">the old optimum is a current lower bound. The route can be returned without CCH customization when:</w:t>
@@ -2929,57 +2023,31 @@
       <w:pPr>
         <w:pStyle w:val="BodyText"/>
       </w:pPr>
-      <m:oMathPara>
-        <m:oMathParaPr>
-          <m:jc m:val="center"/>
-        </m:oMathParaPr>
-        <m:oMath>
-          <m:r>
-            <m:t>U</m:t>
-          </m:r>
-          <m:r>
-            <m:rPr>
-              <m:sty m:val="p"/>
-            </m:rPr>
-            <m:t>≤</m:t>
-          </m:r>
-          <m:d>
-            <m:dPr>
-              <m:begChr m:val="("/>
-              <m:endChr m:val=")"/>
-              <m:sepChr m:val=""/>
-              <m:grow/>
-            </m:dPr>
-            <m:e>
-              <m:r>
-                <m:t>1</m:t>
-              </m:r>
-              <m:r>
-                <m:rPr>
-                  <m:sty m:val="p"/>
-                </m:rPr>
-                <m:t>+</m:t>
-              </m:r>
-              <m:r>
-                <m:t>ϵ</m:t>
-              </m:r>
-            </m:e>
-          </m:d>
-          <m:r>
-            <m:t>L</m:t>
-          </m:r>
-          <m:r>
-            <m:rPr>
-              <m:sty m:val="p"/>
-            </m:rPr>
-            <m:t>.</m:t>
-          </m:r>
-        </m:oMath>
-      </m:oMathPara>
-    </w:p>
-    <w:p>
-      <w:pPr>
-        <w:pStyle w:val="FirstParagraph"/>
+      <w:r>
+        <w:t xml:space="preserve">[</w:t>
+      </w:r>
+      <w:r>
+        <w:t xml:space="preserve"> </w:t>
+      </w:r>
+      <w:r>
+        <w:t xml:space="preserve">U</w:t>
+      </w:r>
+      <w:r>
+        <w:t xml:space="preserve">(1+</w:t>
+      </w:r>
+      <w:r>
+        <w:t xml:space="preserve">)L.</w:t>
+      </w:r>
+      <w:r>
+        <w:t xml:space="preserve"> </w:t>
+      </w:r>
+      <w:r>
+        <w:t xml:space="preserve">]</w:t>
+      </w:r>
+    </w:p>
+    <w:p>
+      <w:pPr>
+        <w:pStyle w:val="BodyText"/>
       </w:pPr>
       <w:r>
         <w:t xml:space="preserve">Otherwise, the controller customizes CCH with the complete current metric and queries again.</w:t>
@@ -3126,27 +2194,7 @@
         <w:pStyle w:val="BodyText"/>
       </w:pPr>
       <w:r>
-        <w:t xml:space="preserve">CCH selects Road A and records</w:t>
-      </w:r>
-      <w:r>
-        <w:t xml:space="preserve"> </w:t>
-      </w:r>
-      <m:oMath>
-        <m:r>
-          <m:t>L</m:t>
-        </m:r>
-        <m:r>
-          <m:rPr>
-            <m:sty m:val="p"/>
-          </m:rPr>
-          <m:t>=</m:t>
-        </m:r>
-        <m:r>
-          <m:t>5.0</m:t>
-        </m:r>
-      </m:oMath>
-      <w:r>
-        <w:t xml:space="preserve">.</w:t>
+        <w:t xml:space="preserve">CCH selects Road A and records (L=5.0).</w:t>
       </w:r>
     </w:p>
     <w:p>
@@ -3154,33 +2202,10 @@
         <w:pStyle w:val="BodyText"/>
       </w:pPr>
       <w:r>
-        <w:t xml:space="preserve">With</w:t>
-      </w:r>
-      <w:r>
-        <w:t xml:space="preserve"> </w:t>
-      </w:r>
-      <m:oMath>
-        <m:r>
-          <m:t>ϵ</m:t>
-        </m:r>
-        <m:r>
-          <m:rPr>
-            <m:sty m:val="p"/>
-          </m:rPr>
-          <m:t>=</m:t>
-        </m:r>
-        <m:r>
-          <m:t>5</m:t>
-        </m:r>
-        <m:r>
-          <m:rPr>
-            <m:sty m:val="p"/>
-          </m:rPr>
-          <m:t>%</m:t>
-        </m:r>
-      </m:oMath>
-      <w:r>
-        <w:t xml:space="preserve">:</w:t>
+        <w:t xml:space="preserve">With (</w:t>
+      </w:r>
+      <w:r>
+        <w:t xml:space="preserve">%):</w:t>
       </w:r>
     </w:p>
     <w:p>
@@ -3204,36 +2229,10 @@
         <w:pStyle w:val="Compact"/>
       </w:pPr>
       <w:r>
-        <w:t xml:space="preserve">allowed cost is</w:t>
-      </w:r>
-      <w:r>
-        <w:t xml:space="preserve"> </w:t>
-      </w:r>
-      <m:oMath>
-        <m:r>
-          <m:t>1.05</m:t>
-        </m:r>
-        <m:r>
-          <m:rPr>
-            <m:sty m:val="p"/>
-          </m:rPr>
-          <m:t>×</m:t>
-        </m:r>
-        <m:r>
-          <m:t>5.0</m:t>
-        </m:r>
-        <m:r>
-          <m:rPr>
-            <m:sty m:val="p"/>
-          </m:rPr>
-          <m:t>=</m:t>
-        </m:r>
-        <m:r>
-          <m:t>5.25</m:t>
-        </m:r>
-      </m:oMath>
-      <w:r>
-        <w:t xml:space="preserve">;</w:t>
+        <w:t xml:space="preserve">allowed cost is (1.05</w:t>
+      </w:r>
+      <w:r>
+        <w:t xml:space="preserve">=5.25);</w:t>
       </w:r>
     </w:p>
     <w:p>
@@ -3244,22 +2243,11 @@
         </w:numPr>
         <w:pStyle w:val="Compact"/>
       </w:pPr>
-      <m:oMath>
-        <m:r>
-          <m:t>5.2</m:t>
-        </m:r>
-        <m:r>
-          <m:rPr>
-            <m:sty m:val="p"/>
-          </m:rPr>
-          <m:t>≤</m:t>
-        </m:r>
-        <m:r>
-          <m:t>5.25</m:t>
-        </m:r>
-      </m:oMath>
-      <w:r>
-        <w:t xml:space="preserve">, so A is certified and CCH is not refreshed.</w:t>
+      <w:r>
+        <w:t xml:space="preserve">(5.2</w:t>
+      </w:r>
+      <w:r>
+        <w:t xml:space="preserve">), so A is certified and CCH is not refreshed.</w:t>
       </w:r>
     </w:p>
     <w:p>
@@ -3278,22 +2266,8 @@
         </w:numPr>
         <w:pStyle w:val="Compact"/>
       </w:pPr>
-      <m:oMath>
-        <m:r>
-          <m:t>5.8</m:t>
-        </m:r>
-        <m:r>
-          <m:rPr>
-            <m:sty m:val="p"/>
-          </m:rPr>
-          <m:t>&gt;</m:t>
-        </m:r>
-        <m:r>
-          <m:t>5.25</m:t>
-        </m:r>
-      </m:oMath>
-      <w:r>
-        <w:t xml:space="preserve">;</w:t>
+      <w:r>
+        <w:t xml:space="preserve">(5.8&gt;5.25);</w:t>
       </w:r>
     </w:p>
     <w:p>
@@ -3362,524 +2336,127 @@
         <w:pStyle w:val="BodyText"/>
       </w:pPr>
       <w:r>
-        <w:t xml:space="preserve">For every path</w:t>
-      </w:r>
-      <w:r>
-        <w:t xml:space="preserve"> </w:t>
-      </w:r>
-      <m:oMath>
-        <m:r>
-          <m:t>P</m:t>
-        </m:r>
-      </m:oMath>
-      <w:r>
-        <w:t xml:space="preserve">,</w:t>
-      </w:r>
-      <w:r>
-        <w:t xml:space="preserve"> </w:t>
-      </w:r>
-      <m:oMath>
-        <m:sSub>
-          <m:e>
-            <m:r>
-              <m:t>C</m:t>
-            </m:r>
-          </m:e>
-          <m:sub>
-            <m:acc>
-              <m:accPr>
-                <m:chr m:val="‾"/>
-              </m:accPr>
-              <m:e>
-                <m:r>
-                  <m:t>w</m:t>
-                </m:r>
-              </m:e>
-            </m:acc>
-          </m:sub>
-        </m:sSub>
-        <m:d>
-          <m:dPr>
-            <m:begChr m:val="("/>
-            <m:endChr m:val=")"/>
-            <m:sepChr m:val=""/>
-            <m:grow/>
-          </m:dPr>
-          <m:e>
-            <m:r>
-              <m:t>P</m:t>
-            </m:r>
-          </m:e>
-        </m:d>
-        <m:r>
-          <m:rPr>
-            <m:sty m:val="p"/>
-          </m:rPr>
-          <m:t>≤</m:t>
-        </m:r>
-        <m:sSub>
-          <m:e>
-            <m:r>
-              <m:t>C</m:t>
-            </m:r>
-          </m:e>
-          <m:sub>
-            <m:r>
-              <m:t>w</m:t>
-            </m:r>
-          </m:sub>
-        </m:sSub>
-        <m:d>
-          <m:dPr>
-            <m:begChr m:val="("/>
-            <m:endChr m:val=")"/>
-            <m:sepChr m:val=""/>
-            <m:grow/>
-          </m:dPr>
-          <m:e>
-            <m:r>
-              <m:t>P</m:t>
-            </m:r>
-          </m:e>
-        </m:d>
-      </m:oMath>
-      <w:r>
-        <w:t xml:space="preserve">. Therefore:</w:t>
+        <w:t xml:space="preserve">For every path (P), (C_{</w:t>
+      </w:r>
+      <w:r>
+        <w:t xml:space="preserve">w}(P)</w:t>
+      </w:r>
+      <w:r>
+        <w:t xml:space="preserve">C_w(P)). Therefore:</w:t>
       </w:r>
     </w:p>
     <w:p>
       <w:pPr>
         <w:pStyle w:val="BodyText"/>
       </w:pPr>
-      <m:oMathPara>
-        <m:oMathParaPr>
-          <m:jc m:val="center"/>
-        </m:oMathParaPr>
-        <m:oMath>
-          <m:r>
-            <m:t>L</m:t>
-          </m:r>
-          <m:r>
-            <m:rPr>
-              <m:sty m:val="p"/>
-            </m:rPr>
-            <m:t>=</m:t>
-          </m:r>
-          <m:sSub>
-            <m:e>
-              <m:r>
-                <m:t>d</m:t>
-              </m:r>
-            </m:e>
-            <m:sub>
-              <m:acc>
-                <m:accPr>
-                  <m:chr m:val="‾"/>
-                </m:accPr>
-                <m:e>
-                  <m:r>
-                    <m:t>w</m:t>
-                  </m:r>
-                </m:e>
-              </m:acc>
-            </m:sub>
-          </m:sSub>
-          <m:d>
-            <m:dPr>
-              <m:begChr m:val="("/>
-              <m:endChr m:val=")"/>
-              <m:sepChr m:val=""/>
-              <m:grow/>
-            </m:dPr>
-            <m:e>
-              <m:r>
-                <m:t>s</m:t>
-              </m:r>
-              <m:r>
-                <m:rPr>
-                  <m:sty m:val="p"/>
-                </m:rPr>
-                <m:t>,</m:t>
-              </m:r>
-              <m:r>
-                <m:t>t</m:t>
-              </m:r>
-            </m:e>
-          </m:d>
-          <m:r>
-            <m:rPr>
-              <m:sty m:val="p"/>
-            </m:rPr>
-            <m:t>≤</m:t>
-          </m:r>
-          <m:sSub>
-            <m:e>
-              <m:r>
-                <m:t>d</m:t>
-              </m:r>
-            </m:e>
-            <m:sub>
-              <m:r>
-                <m:t>w</m:t>
-              </m:r>
-            </m:sub>
-          </m:sSub>
-          <m:d>
-            <m:dPr>
-              <m:begChr m:val="("/>
-              <m:endChr m:val=")"/>
-              <m:sepChr m:val=""/>
-              <m:grow/>
-            </m:dPr>
-            <m:e>
-              <m:r>
-                <m:t>s</m:t>
-              </m:r>
-              <m:r>
-                <m:rPr>
-                  <m:sty m:val="p"/>
-                </m:rPr>
-                <m:t>,</m:t>
-              </m:r>
-              <m:r>
-                <m:t>t</m:t>
-              </m:r>
-            </m:e>
-          </m:d>
-          <m:r>
-            <m:rPr>
-              <m:sty m:val="p"/>
-            </m:rPr>
-            <m:t>.</m:t>
-          </m:r>
-        </m:oMath>
-      </m:oMathPara>
-    </w:p>
-    <w:p>
-      <w:pPr>
-        <w:pStyle w:val="FirstParagraph"/>
-      </w:pPr>
-      <w:r>
-        <w:t xml:space="preserve">Because</w:t>
-      </w:r>
-      <w:r>
-        <w:t xml:space="preserve"> </w:t>
-      </w:r>
-      <m:oMath>
-        <m:sSub>
-          <m:e>
-            <m:r>
-              <m:t>P</m:t>
-            </m:r>
-          </m:e>
-          <m:sub>
-            <m:r>
-              <m:t>0</m:t>
-            </m:r>
-          </m:sub>
-        </m:sSub>
-      </m:oMath>
-      <w:r>
-        <w:t xml:space="preserve"> </w:t>
-      </w:r>
-      <w:r>
-        <w:t xml:space="preserve">remains feasible:</w:t>
+      <w:r>
+        <w:t xml:space="preserve">[</w:t>
+      </w:r>
+      <w:r>
+        <w:t xml:space="preserve"> </w:t>
+      </w:r>
+      <w:r>
+        <w:t xml:space="preserve">L=d_{</w:t>
+      </w:r>
+      <w:r>
+        <w:t xml:space="preserve">w}(s,t)</w:t>
+      </w:r>
+      <w:r>
+        <w:t xml:space="preserve">d_w(s,t).</w:t>
+      </w:r>
+      <w:r>
+        <w:t xml:space="preserve"> </w:t>
+      </w:r>
+      <w:r>
+        <w:t xml:space="preserve">]</w:t>
       </w:r>
     </w:p>
     <w:p>
       <w:pPr>
         <w:pStyle w:val="BodyText"/>
       </w:pPr>
-      <m:oMathPara>
-        <m:oMathParaPr>
-          <m:jc m:val="center"/>
-        </m:oMathParaPr>
-        <m:oMath>
-          <m:sSub>
-            <m:e>
-              <m:r>
-                <m:t>d</m:t>
-              </m:r>
-            </m:e>
-            <m:sub>
-              <m:r>
-                <m:t>w</m:t>
-              </m:r>
-            </m:sub>
-          </m:sSub>
-          <m:d>
-            <m:dPr>
-              <m:begChr m:val="("/>
-              <m:endChr m:val=")"/>
-              <m:sepChr m:val=""/>
-              <m:grow/>
-            </m:dPr>
-            <m:e>
-              <m:r>
-                <m:t>s</m:t>
-              </m:r>
-              <m:r>
-                <m:rPr>
-                  <m:sty m:val="p"/>
-                </m:rPr>
-                <m:t>,</m:t>
-              </m:r>
-              <m:r>
-                <m:t>t</m:t>
-              </m:r>
-            </m:e>
-          </m:d>
-          <m:r>
-            <m:rPr>
-              <m:sty m:val="p"/>
-            </m:rPr>
-            <m:t>≤</m:t>
-          </m:r>
-          <m:r>
-            <m:t>U</m:t>
-          </m:r>
-          <m:r>
-            <m:rPr>
-              <m:sty m:val="p"/>
-            </m:rPr>
-            <m:t>=</m:t>
-          </m:r>
-          <m:sSub>
-            <m:e>
-              <m:r>
-                <m:t>C</m:t>
-              </m:r>
-            </m:e>
-            <m:sub>
-              <m:r>
-                <m:t>w</m:t>
-              </m:r>
-            </m:sub>
-          </m:sSub>
-          <m:d>
-            <m:dPr>
-              <m:begChr m:val="("/>
-              <m:endChr m:val=")"/>
-              <m:sepChr m:val=""/>
-              <m:grow/>
-            </m:dPr>
-            <m:e>
-              <m:sSub>
-                <m:e>
-                  <m:r>
-                    <m:t>P</m:t>
-                  </m:r>
-                </m:e>
-                <m:sub>
-                  <m:r>
-                    <m:t>0</m:t>
-                  </m:r>
-                </m:sub>
-              </m:sSub>
-            </m:e>
-          </m:d>
-          <m:r>
-            <m:rPr>
-              <m:sty m:val="p"/>
-            </m:rPr>
-            <m:t>.</m:t>
-          </m:r>
-        </m:oMath>
-      </m:oMathPara>
-    </w:p>
-    <w:p>
-      <w:pPr>
-        <w:pStyle w:val="FirstParagraph"/>
-      </w:pPr>
-      <w:r>
-        <w:t xml:space="preserve">If</w:t>
-      </w:r>
-      <w:r>
-        <w:t xml:space="preserve"> </w:t>
-      </w:r>
-      <m:oMath>
-        <m:r>
-          <m:t>U</m:t>
-        </m:r>
-        <m:r>
-          <m:rPr>
-            <m:sty m:val="p"/>
-          </m:rPr>
-          <m:t>≤</m:t>
-        </m:r>
-        <m:d>
-          <m:dPr>
-            <m:begChr m:val="("/>
-            <m:endChr m:val=")"/>
-            <m:sepChr m:val=""/>
-            <m:grow/>
-          </m:dPr>
-          <m:e>
-            <m:r>
-              <m:t>1</m:t>
-            </m:r>
-            <m:r>
-              <m:rPr>
-                <m:sty m:val="p"/>
-              </m:rPr>
-              <m:t>+</m:t>
-            </m:r>
-            <m:r>
-              <m:t>ϵ</m:t>
-            </m:r>
-          </m:e>
-        </m:d>
-        <m:r>
-          <m:t>L</m:t>
-        </m:r>
-      </m:oMath>
-      <w:r>
-        <w:t xml:space="preserve">, then:</w:t>
+      <w:r>
+        <w:t xml:space="preserve">Because (P_0) remains feasible:</w:t>
       </w:r>
     </w:p>
     <w:p>
       <w:pPr>
         <w:pStyle w:val="BodyText"/>
       </w:pPr>
-      <m:oMathPara>
-        <m:oMathParaPr>
-          <m:jc m:val="center"/>
-        </m:oMathParaPr>
-        <m:oMath>
-          <m:r>
-            <m:t>U</m:t>
-          </m:r>
-          <m:r>
-            <m:rPr>
-              <m:sty m:val="p"/>
-            </m:rPr>
-            <m:t>≤</m:t>
-          </m:r>
-          <m:d>
-            <m:dPr>
-              <m:begChr m:val="("/>
-              <m:endChr m:val=")"/>
-              <m:sepChr m:val=""/>
-              <m:grow/>
-            </m:dPr>
-            <m:e>
-              <m:r>
-                <m:t>1</m:t>
-              </m:r>
-              <m:r>
-                <m:rPr>
-                  <m:sty m:val="p"/>
-                </m:rPr>
-                <m:t>+</m:t>
-              </m:r>
-              <m:r>
-                <m:t>ϵ</m:t>
-              </m:r>
-            </m:e>
-          </m:d>
-          <m:r>
-            <m:t>L</m:t>
-          </m:r>
-          <m:r>
-            <m:rPr>
-              <m:sty m:val="p"/>
-            </m:rPr>
-            <m:t>≤</m:t>
-          </m:r>
-          <m:d>
-            <m:dPr>
-              <m:begChr m:val="("/>
-              <m:endChr m:val=")"/>
-              <m:sepChr m:val=""/>
-              <m:grow/>
-            </m:dPr>
-            <m:e>
-              <m:r>
-                <m:t>1</m:t>
-              </m:r>
-              <m:r>
-                <m:rPr>
-                  <m:sty m:val="p"/>
-                </m:rPr>
-                <m:t>+</m:t>
-              </m:r>
-              <m:r>
-                <m:t>ϵ</m:t>
-              </m:r>
-            </m:e>
-          </m:d>
-          <m:sSub>
-            <m:e>
-              <m:r>
-                <m:t>d</m:t>
-              </m:r>
-            </m:e>
-            <m:sub>
-              <m:r>
-                <m:t>w</m:t>
-              </m:r>
-            </m:sub>
-          </m:sSub>
-          <m:d>
-            <m:dPr>
-              <m:begChr m:val="("/>
-              <m:endChr m:val=")"/>
-              <m:sepChr m:val=""/>
-              <m:grow/>
-            </m:dPr>
-            <m:e>
-              <m:r>
-                <m:t>s</m:t>
-              </m:r>
-              <m:r>
-                <m:rPr>
-                  <m:sty m:val="p"/>
-                </m:rPr>
-                <m:t>,</m:t>
-              </m:r>
-              <m:r>
-                <m:t>t</m:t>
-              </m:r>
-            </m:e>
-          </m:d>
-          <m:r>
-            <m:rPr>
-              <m:sty m:val="p"/>
-            </m:rPr>
-            <m:t>.</m:t>
-          </m:r>
-        </m:oMath>
-      </m:oMathPara>
-    </w:p>
-    <w:p>
-      <w:pPr>
-        <w:pStyle w:val="FirstParagraph"/>
-      </w:pPr>
-      <w:r>
-        <w:t xml:space="preserve">Thus the returned path is within</w:t>
-      </w:r>
-      <w:r>
-        <w:t xml:space="preserve"> </w:t>
-      </w:r>
-      <m:oMath>
-        <m:r>
-          <m:t>1</m:t>
-        </m:r>
-        <m:r>
-          <m:rPr>
-            <m:sty m:val="p"/>
-          </m:rPr>
-          <m:t>+</m:t>
-        </m:r>
-        <m:r>
-          <m:t>ϵ</m:t>
-        </m:r>
-      </m:oMath>
-      <w:r>
-        <w:t xml:space="preserve"> </w:t>
-      </w:r>
-      <w:r>
-        <w:t xml:space="preserve">of the current represented optimum.</w:t>
+      <w:r>
+        <w:t xml:space="preserve">[</w:t>
+      </w:r>
+      <w:r>
+        <w:t xml:space="preserve"> </w:t>
+      </w:r>
+      <w:r>
+        <w:t xml:space="preserve">d_w(s,t)</w:t>
+      </w:r>
+      <w:r>
+        <w:t xml:space="preserve">U=C_w(P_0).</w:t>
+      </w:r>
+      <w:r>
+        <w:t xml:space="preserve"> </w:t>
+      </w:r>
+      <w:r>
+        <w:t xml:space="preserve">]</w:t>
+      </w:r>
+    </w:p>
+    <w:p>
+      <w:pPr>
+        <w:pStyle w:val="BodyText"/>
+      </w:pPr>
+      <w:r>
+        <w:t xml:space="preserve">If (U</w:t>
+      </w:r>
+      <w:r>
+        <w:t xml:space="preserve">(1+</w:t>
+      </w:r>
+      <w:r>
+        <w:t xml:space="preserve">)L), then:</w:t>
+      </w:r>
+    </w:p>
+    <w:p>
+      <w:pPr>
+        <w:pStyle w:val="BodyText"/>
+      </w:pPr>
+      <w:r>
+        <w:t xml:space="preserve">[</w:t>
+      </w:r>
+      <w:r>
+        <w:t xml:space="preserve"> </w:t>
+      </w:r>
+      <w:r>
+        <w:t xml:space="preserve">U</w:t>
+      </w:r>
+      <w:r>
+        <w:t xml:space="preserve">(1+</w:t>
+      </w:r>
+      <w:r>
+        <w:t xml:space="preserve">)L</w:t>
+      </w:r>
+      <w:r>
+        <w:t xml:space="preserve">(1+</w:t>
+      </w:r>
+      <w:r>
+        <w:t xml:space="preserve">)d_w(s,t).</w:t>
+      </w:r>
+      <w:r>
+        <w:t xml:space="preserve"> </w:t>
+      </w:r>
+      <w:r>
+        <w:t xml:space="preserve">]</w:t>
+      </w:r>
+    </w:p>
+    <w:p>
+      <w:pPr>
+        <w:pStyle w:val="BodyText"/>
+      </w:pPr>
+      <w:r>
+        <w:t xml:space="preserve">Thus the returned path is within (1+</w:t>
+      </w:r>
+      <w:r>
+        <w:t xml:space="preserve">) of the current represented optimum.</w:t>
       </w:r>
     </w:p>
     <w:p>
@@ -3992,7 +2569,7 @@
         <w:t xml:space="preserve">metric synchronization</w:t>
       </w:r>
       <w:r>
-        <w:t xml:space="preserve">. A separate policy controls</w:t>
+        <w:t xml:space="preserve">. A separate SCENARIO filter can then decide</w:t>
       </w:r>
       <w:r>
         <w:t xml:space="preserve"> </w:t>
@@ -4017,33 +2594,10 @@
         <w:pStyle w:val="Compact"/>
       </w:pPr>
       <w:r>
-        <w:t xml:space="preserve">current route becomes infeasible, or degradation exceeds</w:t>
-      </w:r>
-      <w:r>
-        <w:t xml:space="preserve"> </w:t>
-      </w:r>
-      <m:oMath>
-        <m:sSub>
-          <m:e>
-            <m:r>
-              <m:t>θ</m:t>
-            </m:r>
-          </m:e>
-          <m:sub>
-            <m:r>
-              <m:t>d</m:t>
-            </m:r>
-            <m:r>
-              <m:t>e</m:t>
-            </m:r>
-            <m:r>
-              <m:t>g</m:t>
-            </m:r>
-          </m:sub>
-        </m:sSub>
-      </m:oMath>
-      <w:r>
-        <w:t xml:space="preserve">;</w:t>
+        <w:t xml:space="preserve">current route becomes infeasible, or degradation exceeds (</w:t>
+      </w:r>
+      <w:r>
+        <w:t xml:space="preserve">_{deg});</w:t>
       </w:r>
     </w:p>
     <w:p>
@@ -4055,36 +2609,10 @@
         <w:pStyle w:val="Compact"/>
       </w:pPr>
       <w:r>
-        <w:t xml:space="preserve">candidate improvement exceeds</w:t>
-      </w:r>
-      <w:r>
-        <w:t xml:space="preserve"> </w:t>
-      </w:r>
-      <m:oMath>
-        <m:sSub>
-          <m:e>
-            <m:r>
-              <m:t>θ</m:t>
-            </m:r>
-          </m:e>
-          <m:sub>
-            <m:r>
-              <m:t>g</m:t>
-            </m:r>
-            <m:r>
-              <m:t>a</m:t>
-            </m:r>
-            <m:r>
-              <m:t>i</m:t>
-            </m:r>
-            <m:r>
-              <m:t>n</m:t>
-            </m:r>
-          </m:sub>
-        </m:sSub>
-      </m:oMath>
-      <w:r>
-        <w:t xml:space="preserve">;</w:t>
+        <w:t xml:space="preserve">candidate improvement exceeds (</w:t>
+      </w:r>
+      <w:r>
+        <w:t xml:space="preserve">_{gain});</w:t>
       </w:r>
     </w:p>
     <w:p>
@@ -4096,31 +2624,7 @@
         <w:pStyle w:val="Compact"/>
       </w:pPr>
       <w:r>
-        <w:t xml:space="preserve">cooldown has expired unless safety requires immediate action;</w:t>
-      </w:r>
-    </w:p>
-    <w:p>
-      <w:pPr>
-        <w:numPr>
-          <w:ilvl w:val="0"/>
-          <w:numId w:val="1014"/>
-        </w:numPr>
-        <w:pStyle w:val="Compact"/>
-      </w:pPr>
-      <w:r>
-        <w:t xml:space="preserve">accepted compliant demand is reserved on projected edge-entry intervals;</w:t>
-      </w:r>
-    </w:p>
-    <w:p>
-      <w:pPr>
-        <w:numPr>
-          <w:ilvl w:val="0"/>
-          <w:numId w:val="1014"/>
-        </w:numPr>
-        <w:pStyle w:val="Compact"/>
-      </w:pPr>
-      <w:r>
-        <w:t xml:space="preserve">later requests use the updated projected metric.</w:t>
+        <w:t xml:space="preserve">cooldown has expired unless safety requires immediate action.</w:t>
       </w:r>
     </w:p>
     <w:p>
@@ -4128,7 +2632,19 @@
         <w:pStyle w:val="FirstParagraph"/>
       </w:pPr>
       <w:r>
-        <w:t xml:space="preserve">This greedy policy is not claimed to achieve traffic equilibrium.</w:t>
+        <w:t xml:space="preserve">Items 1–3 are implemented as</w:t>
+      </w:r>
+      <w:r>
+        <w:t xml:space="preserve"> </w:t>
+      </w:r>
+      <w:r>
+        <w:rPr>
+          <w:rStyle w:val="VerbatimChar"/>
+        </w:rPr>
+        <w:t xml:space="preserve">decide_route_adoption</w:t>
+      </w:r>
+      <w:r>
+        <w:t xml:space="preserve">. Time-indexed reservations (items previously 4–5) remain unimplemented. The filter is not claimed to achieve traffic equilibrium.</w:t>
       </w:r>
     </w:p>
     <w:bookmarkEnd w:id="52"/>
@@ -4981,42 +3497,13 @@
               <w:jc w:val="left"/>
             </w:pPr>
             <w:r>
-              <w:t xml:space="preserve">Seeded cohort; size is</w:t>
-            </w:r>
-            <w:r>
-              <w:t xml:space="preserve"> </w:t>
-            </w:r>
-            <m:oMath>
-              <m:r>
-                <m:rPr>
-                  <m:sty m:val="p"/>
-                </m:rPr>
-                <m:t>⌊</m:t>
-              </m:r>
-              <m:r>
-                <m:t>n</m:t>
-              </m:r>
-              <m:r>
-                <m:t>p</m:t>
-              </m:r>
-              <m:r>
-                <m:rPr>
-                  <m:sty m:val="p"/>
-                </m:rPr>
-                <m:t>+</m:t>
-              </m:r>
-              <m:r>
-                <m:t>0.5</m:t>
-              </m:r>
-              <m:r>
-                <m:rPr>
-                  <m:sty m:val="p"/>
-                </m:rPr>
-                <m:t>⌋</m:t>
-              </m:r>
-            </m:oMath>
-            <w:r>
-              <w:t xml:space="preserve">, so exact percentages require a compatible fleet size</w:t>
+              <w:t xml:space="preserve">Seeded cohort; size is (</w:t>
+            </w:r>
+            <w:r>
+              <w:t xml:space="preserve">np+0.5</w:t>
+            </w:r>
+            <w:r>
+              <w:t xml:space="preserve">), so exact percentages require a compatible fleet size</w:t>
             </w:r>
           </w:p>
         </w:tc>
@@ -8648,25 +7135,8 @@
               <w:jc w:val="left"/>
             </w:pPr>
             <w:r>
-              <w:t xml:space="preserve">BPR</w:t>
-            </w:r>
-            <w:r>
-              <w:t xml:space="preserve"> </w:t>
-            </w:r>
-            <m:oMath>
-              <m:r>
-                <m:t>x</m:t>
-              </m:r>
-              <m:r>
-                <m:rPr>
-                  <m:sty m:val="p"/>
-                </m:rPr>
-                <m:t>/</m:t>
-              </m:r>
-              <m:r>
-                <m:t>c</m:t>
-              </m:r>
-            </m:oMath>
+              <w:t xml:space="preserve">BPR (x/c)</w:t>
+            </w:r>
           </w:p>
         </w:tc>
         <w:tc>
@@ -8784,7 +7254,7 @@
       </w:tr>
     </w:tbl>
     <w:bookmarkEnd w:id="108"/>
-    <w:bookmarkStart w:id="112" w:name="architecture"/>
+    <w:bookmarkStart w:id="109" w:name="architecture"/>
     <w:p>
       <w:pPr>
         <w:pStyle w:val="Heading2"/>
@@ -8795,53 +7265,223 @@
     </w:p>
     <w:p>
       <w:pPr>
+        <w:pStyle w:val="SourceCode"/>
+      </w:pPr>
+      <w:r>
+        <w:rPr>
+          <w:rStyle w:val="VerbatimChar"/>
+        </w:rPr>
+        <w:t xml:space="preserve">flowchart TD</w:t>
+      </w:r>
+      <w:r>
+        <w:br/>
+      </w:r>
+      <w:r>
+        <w:rPr>
+          <w:rStyle w:val="VerbatimChar"/>
+        </w:rPr>
+        <w:t xml:space="preserve">    Data[Road_Flood_Rain_Incident_Data] --&gt; State[Explained_Road_State]</w:t>
+      </w:r>
+      <w:r>
+        <w:br/>
+      </w:r>
+      <w:r>
+        <w:rPr>
+          <w:rStyle w:val="VerbatimChar"/>
+        </w:rPr>
+        <w:t xml:space="preserve">    State --&gt; Capacity[Effective_Capacity]</w:t>
+      </w:r>
+      <w:r>
+        <w:br/>
+      </w:r>
+      <w:r>
+        <w:rPr>
+          <w:rStyle w:val="VerbatimChar"/>
+        </w:rPr>
+        <w:t xml:space="preserve">    Demand[SUMO_and_Projected_Demand] --&gt; BPR[BPR_Integer_Metric]</w:t>
+      </w:r>
+      <w:r>
+        <w:br/>
+      </w:r>
+      <w:r>
+        <w:rPr>
+          <w:rStyle w:val="VerbatimChar"/>
+        </w:rPr>
+        <w:t xml:space="preserve">    Capacity --&gt; BPR</w:t>
+      </w:r>
+      <w:r>
+        <w:br/>
+      </w:r>
+      <w:r>
+        <w:rPr>
+          <w:rStyle w:val="VerbatimChar"/>
+        </w:rPr>
+        <w:t xml:space="preserve">    BPR --&gt; Monotonicity[Check_Current_Weights_ge_Synchronized]</w:t>
+      </w:r>
+      <w:r>
+        <w:br/>
+      </w:r>
+      <w:r>
+        <w:rPr>
+          <w:rStyle w:val="VerbatimChar"/>
+        </w:rPr>
+        <w:t xml:space="preserve">    OD[Origin_Destination_Query] --&gt; Monotonicity</w:t>
+      </w:r>
+      <w:r>
+        <w:br/>
+      </w:r>
+      <w:r>
+        <w:rPr>
+          <w:rStyle w:val="VerbatimChar"/>
+        </w:rPr>
+        <w:t xml:space="preserve">    Monotonicity --&gt;|Nondecrease| StaleQuery[Query_Synchronized_CCH]</w:t>
+      </w:r>
+      <w:r>
+        <w:br/>
+      </w:r>
+      <w:r>
+        <w:rPr>
+          <w:rStyle w:val="VerbatimChar"/>
+        </w:rPr>
+        <w:t xml:space="preserve">    Monotonicity --&gt;|Any_Decrease| Customize[Customize_CCH_with_Current_Metric]</w:t>
+      </w:r>
+      <w:r>
+        <w:br/>
+      </w:r>
+      <w:r>
+        <w:rPr>
+          <w:rStyle w:val="VerbatimChar"/>
+        </w:rPr>
+        <w:t xml:space="preserve">    StaleQuery --&gt; PathEval[Evaluate_Old_Path_on_Current_Metric]</w:t>
+      </w:r>
+      <w:r>
+        <w:br/>
+      </w:r>
+      <w:r>
+        <w:rPr>
+          <w:rStyle w:val="VerbatimChar"/>
+        </w:rPr>
+        <w:t xml:space="preserve">    BPR --&gt; PathEval</w:t>
+      </w:r>
+      <w:r>
+        <w:br/>
+      </w:r>
+      <w:r>
+        <w:rPr>
+          <w:rStyle w:val="VerbatimChar"/>
+        </w:rPr>
+        <w:t xml:space="preserve">    PathEval --&gt; Gate[LB_UB_Certificate_Gate]</w:t>
+      </w:r>
+      <w:r>
+        <w:br/>
+      </w:r>
+      <w:r>
+        <w:rPr>
+          <w:rStyle w:val="VerbatimChar"/>
+        </w:rPr>
+        <w:t xml:space="preserve">    Gate --&gt;|Pass| Candidate[Certified_Candidate_Route]</w:t>
+      </w:r>
+      <w:r>
+        <w:br/>
+      </w:r>
+      <w:r>
+        <w:rPr>
+          <w:rStyle w:val="VerbatimChar"/>
+        </w:rPr>
+        <w:t xml:space="preserve">    Gate --&gt;|Certificate_Fail| Customize</w:t>
+      </w:r>
+      <w:r>
+        <w:br/>
+      </w:r>
+      <w:r>
+        <w:rPr>
+          <w:rStyle w:val="VerbatimChar"/>
+        </w:rPr>
+        <w:t xml:space="preserve">    BPR --&gt; Customize</w:t>
+      </w:r>
+      <w:r>
+        <w:br/>
+      </w:r>
+      <w:r>
+        <w:rPr>
+          <w:rStyle w:val="VerbatimChar"/>
+        </w:rPr>
+        <w:t xml:space="preserve">    Customize --&gt; FreshQuery[Query_Refreshed_CCH]</w:t>
+      </w:r>
+      <w:r>
+        <w:br/>
+      </w:r>
+      <w:r>
+        <w:rPr>
+          <w:rStyle w:val="VerbatimChar"/>
+        </w:rPr>
+        <w:t xml:space="preserve">    FreshQuery --&gt; Candidate</w:t>
+      </w:r>
+      <w:r>
+        <w:br/>
+      </w:r>
+      <w:r>
+        <w:rPr>
+          <w:rStyle w:val="VerbatimChar"/>
+        </w:rPr>
+        <w:t xml:space="preserve">    Candidate --&gt; Policy[Stability_Priority_Compliance]</w:t>
+      </w:r>
+      <w:r>
+        <w:br/>
+      </w:r>
+      <w:r>
+        <w:rPr>
+          <w:rStyle w:val="VerbatimChar"/>
+        </w:rPr>
+        <w:t xml:space="preserve">    Policy --&gt; Reservation[Projected_Load_Reservation]</w:t>
+      </w:r>
+      <w:r>
+        <w:br/>
+      </w:r>
+      <w:r>
+        <w:rPr>
+          <w:rStyle w:val="VerbatimChar"/>
+        </w:rPr>
+        <w:t xml:space="preserve">    Reservation --&gt; Demand</w:t>
+      </w:r>
+      <w:r>
+        <w:br/>
+      </w:r>
+      <w:r>
+        <w:rPr>
+          <w:rStyle w:val="VerbatimChar"/>
+        </w:rPr>
+        <w:t xml:space="preserve">    Policy --&gt; SUMO[SUMO_Realized_Traffic]</w:t>
+      </w:r>
+      <w:r>
+        <w:br/>
+      </w:r>
+      <w:r>
+        <w:rPr>
+          <w:rStyle w:val="VerbatimChar"/>
+        </w:rPr>
+        <w:t xml:space="preserve">    SUMO --&gt; Evaluation[Travel_Stability_Access_Evaluation]</w:t>
+      </w:r>
+      <w:r>
+        <w:br/>
+      </w:r>
+      <w:r>
+        <w:rPr>
+          <w:rStyle w:val="VerbatimChar"/>
+        </w:rPr>
+        <w:t xml:space="preserve">    Dijkstra[Dijkstra_Oracle] --&gt; Evaluation</w:t>
+      </w:r>
+    </w:p>
+    <w:p>
+      <w:pPr>
         <w:pStyle w:val="FirstParagraph"/>
       </w:pPr>
       <w:r>
-        <w:drawing>
-          <wp:inline>
-            <wp:extent cx="5334000" cy="9701320"/>
-            <wp:effectExtent b="0" l="0" r="0" t="0"/>
-            <wp:docPr descr="Certificate-gated routing architecture" title="System Architecture" id="110" name="Picture"/>
-            <a:graphic>
-              <a:graphicData uri="http://schemas.openxmlformats.org/drawingml/2006/picture">
-                <pic:pic>
-                  <pic:nvPicPr>
-                    <pic:cNvPr descr="docs/.docx-architecture.png" id="111" name="Picture"/>
-                    <pic:cNvPicPr>
-                      <a:picLocks noChangeArrowheads="1" noChangeAspect="1"/>
-                    </pic:cNvPicPr>
-                  </pic:nvPicPr>
-                  <pic:blipFill>
-                    <a:blip r:embed="rId109"/>
-                    <a:stretch>
-                      <a:fillRect/>
-                    </a:stretch>
-                  </pic:blipFill>
-                  <pic:spPr bwMode="auto">
-                    <a:xfrm>
-                      <a:off x="0" y="0"/>
-                      <a:ext cx="5334000" cy="9701320"/>
-                    </a:xfrm>
-                    <a:prstGeom prst="rect">
-                      <a:avLst/>
-                    </a:prstGeom>
-                    <a:noFill/>
-                    <a:ln w="9525">
-                      <a:noFill/>
-                      <a:headEnd/>
-                      <a:tailEnd/>
-                    </a:ln>
-                  </pic:spPr>
-                </pic:pic>
-              </a:graphicData>
-            </a:graphic>
-          </wp:inline>
-        </w:drawing>
-      </w:r>
-    </w:p>
-    <w:bookmarkEnd w:id="112"/>
-    <w:bookmarkStart w:id="123" w:name="implementation-status-and-revised-stages"/>
+        <w:t xml:space="preserve">Implemented now: integer BPR snapshot glue, certificate gate, Dijkstra/CCH engines, and a SCENARIO adoption-threshold filter. SUMO, projected reservations, and Chennai road-state ingestion remain unimplemented on this branch.</w:t>
+      </w:r>
+    </w:p>
+    <w:bookmarkEnd w:id="109"/>
+    <w:bookmarkStart w:id="120" w:name="implementation-status-and-revised-stages"/>
     <w:p>
       <w:pPr>
         <w:pStyle w:val="Heading2"/>
@@ -8850,7 +7490,7 @@
         <w:t xml:space="preserve">10. Implementation Status and Revised Stages</w:t>
       </w:r>
     </w:p>
-    <w:bookmarkStart w:id="113" w:name="X8c91d7d608f6e72d66bc3a0113bbb21f6990878"/>
+    <w:bookmarkStart w:id="110" w:name="X8c91d7d608f6e72d66bc3a0113bbb21f6990878"/>
     <w:p>
       <w:pPr>
         <w:pStyle w:val="Heading3"/>
@@ -8883,8 +7523,8 @@
         <w:t xml:space="preserve">OSM and OpenCity historical hotspots were joined to roads; one real mapped edge was controlled as blocked; BPR weights and two Dijkstra snapshots demonstrated closure avoidance. Inputs/outputs are ignored and current tests use fixtures. This becomes publication evidence only after dated inputs, checksums, configuration, and a compact result manifest are preserved. Finite congestion response is not validated.</w:t>
       </w:r>
     </w:p>
-    <w:bookmarkEnd w:id="113"/>
-    <w:bookmarkStart w:id="114" w:name="Xccb8caa86ccf46b10144f4fa77c6463d872ef9a"/>
+    <w:bookmarkEnd w:id="110"/>
+    <w:bookmarkStart w:id="111" w:name="Xccb8caa86ccf46b10144f4fa77c6463d872ef9a"/>
     <w:p>
       <w:pPr>
         <w:pStyle w:val="Heading3"/>
@@ -9055,11 +7695,26 @@
         <w:pStyle w:val="Compact"/>
       </w:pPr>
       <w:r>
-        <w:t xml:space="preserve">45 passing tests.</w:t>
-      </w:r>
-    </w:p>
-    <w:bookmarkEnd w:id="114"/>
-    <w:bookmarkStart w:id="115" w:name="stage-3-reproducible-chennai-graph"/>
+        <w:t xml:space="preserve">55 collected tests when</w:t>
+      </w:r>
+      <w:r>
+        <w:t xml:space="preserve"> </w:t>
+      </w:r>
+      <w:r>
+        <w:rPr>
+          <w:rStyle w:val="VerbatimChar"/>
+        </w:rPr>
+        <w:t xml:space="preserve">routingkit-cch</w:t>
+      </w:r>
+      <w:r>
+        <w:t xml:space="preserve"> </w:t>
+      </w:r>
+      <w:r>
+        <w:t xml:space="preserve">is installed (4 skip without it).</w:t>
+      </w:r>
+    </w:p>
+    <w:bookmarkEnd w:id="111"/>
+    <w:bookmarkStart w:id="112" w:name="stage-3-reproducible-chennai-graph"/>
     <w:p>
       <w:pPr>
         <w:pStyle w:val="Heading3"/>
@@ -9092,8 +7747,8 @@
         <w:t xml:space="preserve">Dated OSM extract, stable arc IDs, validated directions/turns/parallel arcs, free-flow times, and documented capacity assumptions.</w:t>
       </w:r>
     </w:p>
-    <w:bookmarkEnd w:id="115"/>
-    <w:bookmarkStart w:id="116" w:name="stage-4-flood-and-road-state-evidence"/>
+    <w:bookmarkEnd w:id="112"/>
+    <w:bookmarkStart w:id="113" w:name="stage-4-flood-and-road-state-evidence"/>
     <w:p>
       <w:pPr>
         <w:pStyle w:val="Heading3"/>
@@ -9141,8 +7796,8 @@
         <w:t xml:space="preserve">states.</w:t>
       </w:r>
     </w:p>
-    <w:bookmarkEnd w:id="116"/>
-    <w:bookmarkStart w:id="117" w:name="Xb77ec8f9bac440bfe6e8fbaadfd160ccd3243f6"/>
+    <w:bookmarkEnd w:id="113"/>
+    <w:bookmarkStart w:id="114" w:name="Xb77ec8f9bac440bfe6e8fbaadfd160ccd3243f6"/>
     <w:p>
       <w:pPr>
         <w:pStyle w:val="Heading3"/>
@@ -9175,8 +7830,8 @@
         <w:t xml:space="preserve">Heterogeneous demand, entering PCE flow, incidents, queues, BPR calibration/sensitivity, and no double counting of SUMO delay.</w:t>
       </w:r>
     </w:p>
-    <w:bookmarkEnd w:id="117"/>
-    <w:bookmarkStart w:id="118" w:name="stage-6-chennai-cch-integration"/>
+    <w:bookmarkEnd w:id="114"/>
+    <w:bookmarkStart w:id="115" w:name="stage-6-chennai-cch-integration"/>
     <w:p>
       <w:pPr>
         <w:pStyle w:val="Heading3"/>
@@ -9209,8 +7864,8 @@
         <w:t xml:space="preserve">Geometry-aware ordering, turn-expanded topology, finite closure sentinel, integer quantization, full/partial customization, and Dijkstra differential validation.</w:t>
       </w:r>
     </w:p>
-    <w:bookmarkEnd w:id="118"/>
-    <w:bookmarkStart w:id="119" w:name="stage-7-stable-projected-load-rerouting"/>
+    <w:bookmarkEnd w:id="115"/>
+    <w:bookmarkStart w:id="116" w:name="stage-7-stable-projected-load-rerouting"/>
     <w:p>
       <w:pPr>
         <w:pStyle w:val="Heading3"/>
@@ -9234,17 +7889,11 @@
         <w:t xml:space="preserve"> </w:t>
       </w:r>
       <w:r>
-        <w:t xml:space="preserve">Planned.</w:t>
-      </w:r>
-      <w:r>
-        <w:br/>
-      </w:r>
-      <w:r>
-        <w:t xml:space="preserve">Threshold, minimum gain, cooldown, time-indexed route reservations, and compliance sensitivity.</w:t>
-      </w:r>
-    </w:p>
-    <w:bookmarkEnd w:id="119"/>
-    <w:bookmarkStart w:id="120" w:name="Xccf3cb31944b30e91fefa8a2921cf08ca5a74ca"/>
+        <w:t xml:space="preserve">SCENARIO threshold/cooldown adoption filter implemented; cooldown does not delay degradation or infeasible incumbents. Time-indexed reservations and SUMO comparison are unimplemented.</w:t>
+      </w:r>
+    </w:p>
+    <w:bookmarkEnd w:id="116"/>
+    <w:bookmarkStart w:id="117" w:name="Xccf3cb31944b30e91fefa8a2921cf08ca5a74ca"/>
     <w:p>
       <w:pPr>
         <w:pStyle w:val="Heading3"/>
@@ -9277,8 +7926,8 @@
         <w:t xml:space="preserve">Hospitals, fire stations, relief centres, disconnection, p90 access, population-weighted loss, partial compliance, and facility-oriented road criticality.</w:t>
       </w:r>
     </w:p>
-    <w:bookmarkEnd w:id="120"/>
-    <w:bookmarkStart w:id="121" w:name="stage-9-emergency-scenario"/>
+    <w:bookmarkEnd w:id="117"/>
+    <w:bookmarkStart w:id="118" w:name="stage-9-emergency-scenario"/>
     <w:p>
       <w:pPr>
         <w:pStyle w:val="Heading3"/>
@@ -9311,8 +7960,8 @@
         <w:t xml:space="preserve">Response time, deadline success, safety exposure, and ordinary-user external delay.</w:t>
       </w:r>
     </w:p>
-    <w:bookmarkEnd w:id="121"/>
-    <w:bookmarkStart w:id="122" w:name="stage-10-full-evaluation-and-paper"/>
+    <w:bookmarkEnd w:id="118"/>
+    <w:bookmarkStart w:id="119" w:name="stage-10-full-evaluation-and-paper"/>
     <w:p>
       <w:pPr>
         <w:pStyle w:val="Heading3"/>
@@ -9345,9 +7994,9 @@
         <w:t xml:space="preserve">Paired scenarios, baselines, ablations, uncertainty, statistical reporting, reproducibility package, and final manuscript.</w:t>
       </w:r>
     </w:p>
-    <w:bookmarkEnd w:id="122"/>
-    <w:bookmarkEnd w:id="123"/>
-    <w:bookmarkStart w:id="128" w:name="preliminary-certificate-experiment"/>
+    <w:bookmarkEnd w:id="119"/>
+    <w:bookmarkEnd w:id="120"/>
+    <w:bookmarkStart w:id="125" w:name="preliminary-certificate-experiment"/>
     <w:p>
       <w:pPr>
         <w:pStyle w:val="Heading2"/>
@@ -9356,7 +8005,7 @@
         <w:t xml:space="preserve">11. Preliminary Certificate Experiment</w:t>
       </w:r>
     </w:p>
-    <w:bookmarkStart w:id="124" w:name="setup"/>
+    <w:bookmarkStart w:id="121" w:name="setup"/>
     <w:p>
       <w:pPr>
         <w:pStyle w:val="Heading3"/>
@@ -9446,7 +8095,7 @@
         <w:pStyle w:val="Compact"/>
       </w:pPr>
       <w:r>
-        <w:t xml:space="preserve">monotone-increase and mixed increase/decrease workloads;</w:t>
+        <w:t xml:space="preserve">monotone-increase and mixed increase/decrease workloads (a changed edge decreases with probability 0.3);</w:t>
       </w:r>
     </w:p>
     <w:p>
@@ -9476,8 +8125,8 @@
         <w:t xml:space="preserve">0.1.4.</w:t>
       </w:r>
     </w:p>
-    <w:bookmarkEnd w:id="124"/>
-    <w:bookmarkStart w:id="125" w:name="main-results"/>
+    <w:bookmarkEnd w:id="121"/>
+    <w:bookmarkStart w:id="122" w:name="main-results"/>
     <w:p>
       <w:pPr>
         <w:pStyle w:val="Heading3"/>
@@ -10142,8 +8791,8 @@
         <w:t xml:space="preserve">for each request; metric reset, partial/parallel customization, and query reuse are not benchmarked. The eager Dijkstra adapter similarly rebuilds its represented weighted graph. Therefore, these values validate prototype behavior only and do not establish an optimized CCH-versus-Dijkstra break-even point or Chennai performance.</w:t>
       </w:r>
     </w:p>
-    <w:bookmarkEnd w:id="125"/>
-    <w:bookmarkStart w:id="127" w:name="epsilon-sensitivity"/>
+    <w:bookmarkEnd w:id="122"/>
+    <w:bookmarkStart w:id="124" w:name="epsilon-sensitivity"/>
     <w:p>
       <w:pPr>
         <w:pStyle w:val="Heading3"/>
@@ -10170,7 +8819,7 @@
       <w:r>
         <w:t xml:space="preserve"> </w:t>
       </w:r>
-      <w:hyperlink r:id="rId126">
+      <w:hyperlink r:id="rId123">
         <w:r>
           <w:rPr>
             <w:rStyle w:val="VerbatimChar"/>
@@ -10182,206 +8831,206 @@
         <w:t xml:space="preserve">.</w:t>
       </w:r>
     </w:p>
+    <w:bookmarkEnd w:id="124"/>
+    <w:bookmarkEnd w:id="125"/>
+    <w:bookmarkStart w:id="129" w:name="evaluation-plan"/>
+    <w:p>
+      <w:pPr>
+        <w:pStyle w:val="Heading2"/>
+      </w:pPr>
+      <w:r>
+        <w:t xml:space="preserve">12. Evaluation Plan</w:t>
+      </w:r>
+    </w:p>
+    <w:bookmarkStart w:id="126" w:name="baselines"/>
+    <w:p>
+      <w:pPr>
+        <w:pStyle w:val="Heading3"/>
+      </w:pPr>
+      <w:r>
+        <w:t xml:space="preserve">Baselines</w:t>
+      </w:r>
+    </w:p>
+    <w:p>
+      <w:pPr>
+        <w:numPr>
+          <w:ilvl w:val="0"/>
+          <w:numId w:val="1019"/>
+        </w:numPr>
+        <w:pStyle w:val="Compact"/>
+      </w:pPr>
+      <w:r>
+        <w:t xml:space="preserve">route-once Dijkstra;</w:t>
+      </w:r>
+    </w:p>
+    <w:p>
+      <w:pPr>
+        <w:numPr>
+          <w:ilvl w:val="0"/>
+          <w:numId w:val="1019"/>
+        </w:numPr>
+        <w:pStyle w:val="Compact"/>
+      </w:pPr>
+      <w:r>
+        <w:t xml:space="preserve">eager repeated Dijkstra;</w:t>
+      </w:r>
+    </w:p>
+    <w:p>
+      <w:pPr>
+        <w:numPr>
+          <w:ilvl w:val="0"/>
+          <w:numId w:val="1019"/>
+        </w:numPr>
+        <w:pStyle w:val="Compact"/>
+      </w:pPr>
+      <w:r>
+        <w:t xml:space="preserve">eager CCH;</w:t>
+      </w:r>
+    </w:p>
+    <w:p>
+      <w:pPr>
+        <w:numPr>
+          <w:ilvl w:val="0"/>
+          <w:numId w:val="1019"/>
+        </w:numPr>
+        <w:pStyle w:val="Compact"/>
+      </w:pPr>
+      <w:r>
+        <w:t xml:space="preserve">certificate-gated CCH;</w:t>
+      </w:r>
+    </w:p>
+    <w:p>
+      <w:pPr>
+        <w:numPr>
+          <w:ilvl w:val="0"/>
+          <w:numId w:val="1019"/>
+        </w:numPr>
+        <w:pStyle w:val="Compact"/>
+      </w:pPr>
+      <w:r>
+        <w:t xml:space="preserve">ALT-guided bidirectional A*;</w:t>
+      </w:r>
+    </w:p>
+    <w:p>
+      <w:pPr>
+        <w:numPr>
+          <w:ilvl w:val="0"/>
+          <w:numId w:val="1019"/>
+        </w:numPr>
+        <w:pStyle w:val="Compact"/>
+      </w:pPr>
+      <w:r>
+        <w:t xml:space="preserve">SUMO periodic rerouting;</w:t>
+      </w:r>
+    </w:p>
+    <w:p>
+      <w:pPr>
+        <w:numPr>
+          <w:ilvl w:val="0"/>
+          <w:numId w:val="1019"/>
+        </w:numPr>
+        <w:pStyle w:val="Compact"/>
+      </w:pPr>
+      <w:r>
+        <w:t xml:space="preserve">independent versus projected-load-aware assignments.</w:t>
+      </w:r>
+    </w:p>
+    <w:bookmarkEnd w:id="126"/>
+    <w:bookmarkStart w:id="127" w:name="ablations"/>
+    <w:p>
+      <w:pPr>
+        <w:pStyle w:val="Heading3"/>
+      </w:pPr>
+      <w:r>
+        <w:t xml:space="preserve">Ablations</w:t>
+      </w:r>
+    </w:p>
+    <w:p>
+      <w:pPr>
+        <w:numPr>
+          <w:ilvl w:val="0"/>
+          <w:numId w:val="1020"/>
+        </w:numPr>
+        <w:pStyle w:val="Compact"/>
+      </w:pPr>
+      <w:r>
+        <w:t xml:space="preserve">no flood evidence;</w:t>
+      </w:r>
+    </w:p>
+    <w:p>
+      <w:pPr>
+        <w:numPr>
+          <w:ilvl w:val="0"/>
+          <w:numId w:val="1020"/>
+        </w:numPr>
+        <w:pStyle w:val="Compact"/>
+      </w:pPr>
+      <w:r>
+        <w:t xml:space="preserve">no certificate;</w:t>
+      </w:r>
+    </w:p>
+    <w:p>
+      <w:pPr>
+        <w:numPr>
+          <w:ilvl w:val="0"/>
+          <w:numId w:val="1020"/>
+        </w:numPr>
+        <w:pStyle w:val="Compact"/>
+      </w:pPr>
+      <w:r>
+        <w:t xml:space="preserve">no threshold/cooldown;</w:t>
+      </w:r>
+    </w:p>
+    <w:p>
+      <w:pPr>
+        <w:numPr>
+          <w:ilvl w:val="0"/>
+          <w:numId w:val="1020"/>
+        </w:numPr>
+        <w:pStyle w:val="Compact"/>
+      </w:pPr>
+      <w:r>
+        <w:t xml:space="preserve">no projected reservations;</w:t>
+      </w:r>
+    </w:p>
+    <w:p>
+      <w:pPr>
+        <w:numPr>
+          <w:ilvl w:val="0"/>
+          <w:numId w:val="1020"/>
+        </w:numPr>
+        <w:pStyle w:val="Compact"/>
+      </w:pPr>
+      <w:r>
+        <w:t xml:space="preserve">no emergency priority;</w:t>
+      </w:r>
+    </w:p>
+    <w:p>
+      <w:pPr>
+        <w:numPr>
+          <w:ilvl w:val="0"/>
+          <w:numId w:val="1020"/>
+        </w:numPr>
+        <w:pStyle w:val="Compact"/>
+      </w:pPr>
+      <w:r>
+        <w:t xml:space="preserve">no population weighting;</w:t>
+      </w:r>
+    </w:p>
+    <w:p>
+      <w:pPr>
+        <w:numPr>
+          <w:ilvl w:val="0"/>
+          <w:numId w:val="1020"/>
+        </w:numPr>
+        <w:pStyle w:val="Compact"/>
+      </w:pPr>
+      <w:r>
+        <w:t xml:space="preserve">compliance levels 0–100%.</w:t>
+      </w:r>
+    </w:p>
     <w:bookmarkEnd w:id="127"/>
-    <w:bookmarkEnd w:id="128"/>
-    <w:bookmarkStart w:id="132" w:name="evaluation-plan"/>
-    <w:p>
-      <w:pPr>
-        <w:pStyle w:val="Heading2"/>
-      </w:pPr>
-      <w:r>
-        <w:t xml:space="preserve">12. Evaluation Plan</w:t>
-      </w:r>
-    </w:p>
-    <w:bookmarkStart w:id="129" w:name="baselines"/>
-    <w:p>
-      <w:pPr>
-        <w:pStyle w:val="Heading3"/>
-      </w:pPr>
-      <w:r>
-        <w:t xml:space="preserve">Baselines</w:t>
-      </w:r>
-    </w:p>
-    <w:p>
-      <w:pPr>
-        <w:numPr>
-          <w:ilvl w:val="0"/>
-          <w:numId w:val="1019"/>
-        </w:numPr>
-        <w:pStyle w:val="Compact"/>
-      </w:pPr>
-      <w:r>
-        <w:t xml:space="preserve">route-once Dijkstra;</w:t>
-      </w:r>
-    </w:p>
-    <w:p>
-      <w:pPr>
-        <w:numPr>
-          <w:ilvl w:val="0"/>
-          <w:numId w:val="1019"/>
-        </w:numPr>
-        <w:pStyle w:val="Compact"/>
-      </w:pPr>
-      <w:r>
-        <w:t xml:space="preserve">eager repeated Dijkstra;</w:t>
-      </w:r>
-    </w:p>
-    <w:p>
-      <w:pPr>
-        <w:numPr>
-          <w:ilvl w:val="0"/>
-          <w:numId w:val="1019"/>
-        </w:numPr>
-        <w:pStyle w:val="Compact"/>
-      </w:pPr>
-      <w:r>
-        <w:t xml:space="preserve">eager CCH;</w:t>
-      </w:r>
-    </w:p>
-    <w:p>
-      <w:pPr>
-        <w:numPr>
-          <w:ilvl w:val="0"/>
-          <w:numId w:val="1019"/>
-        </w:numPr>
-        <w:pStyle w:val="Compact"/>
-      </w:pPr>
-      <w:r>
-        <w:t xml:space="preserve">certificate-gated CCH;</w:t>
-      </w:r>
-    </w:p>
-    <w:p>
-      <w:pPr>
-        <w:numPr>
-          <w:ilvl w:val="0"/>
-          <w:numId w:val="1019"/>
-        </w:numPr>
-        <w:pStyle w:val="Compact"/>
-      </w:pPr>
-      <w:r>
-        <w:t xml:space="preserve">ALT-guided bidirectional A*;</w:t>
-      </w:r>
-    </w:p>
-    <w:p>
-      <w:pPr>
-        <w:numPr>
-          <w:ilvl w:val="0"/>
-          <w:numId w:val="1019"/>
-        </w:numPr>
-        <w:pStyle w:val="Compact"/>
-      </w:pPr>
-      <w:r>
-        <w:t xml:space="preserve">SUMO periodic rerouting;</w:t>
-      </w:r>
-    </w:p>
-    <w:p>
-      <w:pPr>
-        <w:numPr>
-          <w:ilvl w:val="0"/>
-          <w:numId w:val="1019"/>
-        </w:numPr>
-        <w:pStyle w:val="Compact"/>
-      </w:pPr>
-      <w:r>
-        <w:t xml:space="preserve">independent versus projected-load-aware assignments.</w:t>
-      </w:r>
-    </w:p>
-    <w:bookmarkEnd w:id="129"/>
-    <w:bookmarkStart w:id="130" w:name="ablations"/>
-    <w:p>
-      <w:pPr>
-        <w:pStyle w:val="Heading3"/>
-      </w:pPr>
-      <w:r>
-        <w:t xml:space="preserve">Ablations</w:t>
-      </w:r>
-    </w:p>
-    <w:p>
-      <w:pPr>
-        <w:numPr>
-          <w:ilvl w:val="0"/>
-          <w:numId w:val="1020"/>
-        </w:numPr>
-        <w:pStyle w:val="Compact"/>
-      </w:pPr>
-      <w:r>
-        <w:t xml:space="preserve">no flood evidence;</w:t>
-      </w:r>
-    </w:p>
-    <w:p>
-      <w:pPr>
-        <w:numPr>
-          <w:ilvl w:val="0"/>
-          <w:numId w:val="1020"/>
-        </w:numPr>
-        <w:pStyle w:val="Compact"/>
-      </w:pPr>
-      <w:r>
-        <w:t xml:space="preserve">no certificate;</w:t>
-      </w:r>
-    </w:p>
-    <w:p>
-      <w:pPr>
-        <w:numPr>
-          <w:ilvl w:val="0"/>
-          <w:numId w:val="1020"/>
-        </w:numPr>
-        <w:pStyle w:val="Compact"/>
-      </w:pPr>
-      <w:r>
-        <w:t xml:space="preserve">no threshold/cooldown;</w:t>
-      </w:r>
-    </w:p>
-    <w:p>
-      <w:pPr>
-        <w:numPr>
-          <w:ilvl w:val="0"/>
-          <w:numId w:val="1020"/>
-        </w:numPr>
-        <w:pStyle w:val="Compact"/>
-      </w:pPr>
-      <w:r>
-        <w:t xml:space="preserve">no projected reservations;</w:t>
-      </w:r>
-    </w:p>
-    <w:p>
-      <w:pPr>
-        <w:numPr>
-          <w:ilvl w:val="0"/>
-          <w:numId w:val="1020"/>
-        </w:numPr>
-        <w:pStyle w:val="Compact"/>
-      </w:pPr>
-      <w:r>
-        <w:t xml:space="preserve">no emergency priority;</w:t>
-      </w:r>
-    </w:p>
-    <w:p>
-      <w:pPr>
-        <w:numPr>
-          <w:ilvl w:val="0"/>
-          <w:numId w:val="1020"/>
-        </w:numPr>
-        <w:pStyle w:val="Compact"/>
-      </w:pPr>
-      <w:r>
-        <w:t xml:space="preserve">no population weighting;</w:t>
-      </w:r>
-    </w:p>
-    <w:p>
-      <w:pPr>
-        <w:numPr>
-          <w:ilvl w:val="0"/>
-          <w:numId w:val="1020"/>
-        </w:numPr>
-        <w:pStyle w:val="Compact"/>
-      </w:pPr>
-      <w:r>
-        <w:t xml:space="preserve">compliance levels 0–100%.</w:t>
-      </w:r>
-    </w:p>
-    <w:bookmarkEnd w:id="130"/>
-    <w:bookmarkStart w:id="131" w:name="metrics"/>
+    <w:bookmarkStart w:id="128" w:name="metrics"/>
     <w:p>
       <w:pPr>
         <w:pStyle w:val="Heading3"/>
@@ -10543,30 +9192,7 @@
               <w:jc w:val="left"/>
             </w:pPr>
             <w:r>
-              <w:t xml:space="preserve">Maximum</w:t>
-            </w:r>
-            <w:r>
-              <w:t xml:space="preserve"> </w:t>
-            </w:r>
-            <m:oMath>
-              <m:r>
-                <m:t>x</m:t>
-              </m:r>
-              <m:r>
-                <m:rPr>
-                  <m:sty m:val="p"/>
-                </m:rPr>
-                <m:t>/</m:t>
-              </m:r>
-              <m:r>
-                <m:t>c</m:t>
-              </m:r>
-            </m:oMath>
-            <w:r>
-              <w:t xml:space="preserve"> </w:t>
-            </w:r>
-            <w:r>
-              <w:t xml:space="preserve">and load concentration</w:t>
+              <w:t xml:space="preserve">Maximum (x/c) and load concentration</w:t>
             </w:r>
           </w:p>
         </w:tc>
@@ -10714,9 +9340,9 @@
         </w:tc>
       </w:tr>
     </w:tbl>
-    <w:bookmarkEnd w:id="131"/>
-    <w:bookmarkEnd w:id="132"/>
-    <w:bookmarkStart w:id="133" w:name="reproducibility"/>
+    <w:bookmarkEnd w:id="128"/>
+    <w:bookmarkEnd w:id="129"/>
+    <w:bookmarkStart w:id="130" w:name="reproducibility"/>
     <w:p>
       <w:pPr>
         <w:pStyle w:val="Heading2"/>
@@ -11057,8 +9683,8 @@
         <w:t xml:space="preserve">Remote OSM/OpenCity inputs remain mutable until dated snapshots and checksums are committed. Synthetic experiment results are deterministic apart from timing.</w:t>
       </w:r>
     </w:p>
-    <w:bookmarkEnd w:id="133"/>
-    <w:bookmarkStart w:id="134" w:name="feasibility-and-remaining-uncertainty"/>
+    <w:bookmarkEnd w:id="130"/>
+    <w:bookmarkStart w:id="131" w:name="feasibility-and-remaining-uncertainty"/>
     <w:p>
       <w:pPr>
         <w:pStyle w:val="Heading2"/>
@@ -11127,8 +9753,8 @@
         <w:t xml:space="preserve">The proposed core remains feasible as historical-evidence-conditioned scenario reconstruction and labelled simulation without paid APIs; end-to-end acquisition and Chennai execution are not yet demonstrated.</w:t>
       </w:r>
     </w:p>
-    <w:bookmarkEnd w:id="134"/>
-    <w:bookmarkStart w:id="135" w:name="limitations"/>
+    <w:bookmarkEnd w:id="131"/>
+    <w:bookmarkStart w:id="132" w:name="limitations"/>
     <w:p>
       <w:pPr>
         <w:pStyle w:val="Heading2"/>
@@ -11353,8 +9979,32 @@
         <w:t xml:space="preserve">OpenCity historical layers do not provide authoritative timestamped road-state truth.</w:t>
       </w:r>
     </w:p>
-    <w:bookmarkEnd w:id="135"/>
-    <w:bookmarkStart w:id="136" w:name="final-project-summary"/>
+    <w:p>
+      <w:pPr>
+        <w:numPr>
+          <w:ilvl w:val="0"/>
+          <w:numId w:val="1021"/>
+        </w:numPr>
+        <w:pStyle w:val="Compact"/>
+      </w:pPr>
+      <w:r>
+        <w:t xml:space="preserve">Stage 1 uniform flow/capacity makes BPR almost a scale factor; congestion response is not validated.</w:t>
+      </w:r>
+    </w:p>
+    <w:p>
+      <w:pPr>
+        <w:numPr>
+          <w:ilvl w:val="0"/>
+          <w:numId w:val="1021"/>
+        </w:numPr>
+        <w:pStyle w:val="Compact"/>
+      </w:pPr>
+      <w:r>
+        <w:t xml:space="preserve">The adoption filter is a labelled policy, not observed driver behaviour or an equilibrium model.</w:t>
+      </w:r>
+    </w:p>
+    <w:bookmarkEnd w:id="132"/>
+    <w:bookmarkStart w:id="133" w:name="final-project-summary"/>
     <w:p>
       <w:pPr>
         <w:pStyle w:val="Heading2"/>
@@ -11690,8 +10340,8 @@
         </w:tc>
       </w:tr>
     </w:tbl>
-    <w:bookmarkEnd w:id="136"/>
-    <w:bookmarkStart w:id="137" w:name="research-claim-boundary"/>
+    <w:bookmarkEnd w:id="133"/>
+    <w:bookmarkStart w:id="134" w:name="research-claim-boundary"/>
     <w:p>
       <w:pPr>
         <w:pStyle w:val="Heading2"/>
@@ -11820,8 +10470,8 @@
         <w:t xml:space="preserve">Those claims require completion of Stages 3–10.</w:t>
       </w:r>
     </w:p>
-    <w:bookmarkEnd w:id="137"/>
-    <w:bookmarkEnd w:id="138"/>
+    <w:bookmarkEnd w:id="134"/>
+    <w:bookmarkEnd w:id="135"/>
     <w:sectPr/>
   </w:body>
 </w:document>
@@ -12809,7 +11459,7 @@
       <w:color w:themeColor="accent1" w:themeShade="BF" w:val="365F91"/>
     </w:rPr>
   </w:style>
-  <w:style w:type="paragraph" w:customStyle="1" w:styleId="SourceCode">
+  <w:style w:customStyle="1" w:styleId="SourceCode" w:type="paragraph">
     <w:name w:val="Source Code"/>
     <w:basedOn w:val="Normal"/>
     <w:link w:val="VerbatimChar"/>
@@ -12817,7 +11467,7 @@
       <w:wordWrap w:val="off"/>
     </w:pPr>
   </w:style>
-  <w:style w:type="character" w:customStyle="1" w:styleId="KeywordTok">
+  <w:style w:customStyle="1" w:styleId="KeywordTok" w:type="character">
     <w:name w:val="KeywordTok"/>
     <w:basedOn w:val="VerbatimChar"/>
     <w:rPr>
@@ -12825,77 +11475,77 @@
       <w:b/>
     </w:rPr>
   </w:style>
-  <w:style w:type="character" w:customStyle="1" w:styleId="DataTypeTok">
+  <w:style w:customStyle="1" w:styleId="DataTypeTok" w:type="character">
     <w:name w:val="DataTypeTok"/>
     <w:basedOn w:val="VerbatimChar"/>
     <w:rPr>
       <w:color w:val="902000"/>
     </w:rPr>
   </w:style>
-  <w:style w:type="character" w:customStyle="1" w:styleId="DecValTok">
+  <w:style w:customStyle="1" w:styleId="DecValTok" w:type="character">
     <w:name w:val="DecValTok"/>
     <w:basedOn w:val="VerbatimChar"/>
     <w:rPr>
       <w:color w:val="40a070"/>
     </w:rPr>
   </w:style>
-  <w:style w:type="character" w:customStyle="1" w:styleId="BaseNTok">
+  <w:style w:customStyle="1" w:styleId="BaseNTok" w:type="character">
     <w:name w:val="BaseNTok"/>
     <w:basedOn w:val="VerbatimChar"/>
     <w:rPr>
       <w:color w:val="40a070"/>
     </w:rPr>
   </w:style>
-  <w:style w:type="character" w:customStyle="1" w:styleId="FloatTok">
+  <w:style w:customStyle="1" w:styleId="FloatTok" w:type="character">
     <w:name w:val="FloatTok"/>
     <w:basedOn w:val="VerbatimChar"/>
     <w:rPr>
       <w:color w:val="40a070"/>
     </w:rPr>
   </w:style>
-  <w:style w:type="character" w:customStyle="1" w:styleId="ConstantTok">
+  <w:style w:customStyle="1" w:styleId="ConstantTok" w:type="character">
     <w:name w:val="ConstantTok"/>
     <w:basedOn w:val="VerbatimChar"/>
     <w:rPr>
       <w:color w:val="880000"/>
     </w:rPr>
   </w:style>
-  <w:style w:type="character" w:customStyle="1" w:styleId="CharTok">
+  <w:style w:customStyle="1" w:styleId="CharTok" w:type="character">
     <w:name w:val="CharTok"/>
     <w:basedOn w:val="VerbatimChar"/>
     <w:rPr>
       <w:color w:val="4070a0"/>
     </w:rPr>
   </w:style>
-  <w:style w:type="character" w:customStyle="1" w:styleId="SpecialCharTok">
+  <w:style w:customStyle="1" w:styleId="SpecialCharTok" w:type="character">
     <w:name w:val="SpecialCharTok"/>
     <w:basedOn w:val="VerbatimChar"/>
     <w:rPr>
       <w:color w:val="4070a0"/>
     </w:rPr>
   </w:style>
-  <w:style w:type="character" w:customStyle="1" w:styleId="StringTok">
+  <w:style w:customStyle="1" w:styleId="StringTok" w:type="character">
     <w:name w:val="StringTok"/>
     <w:basedOn w:val="VerbatimChar"/>
     <w:rPr>
       <w:color w:val="4070a0"/>
     </w:rPr>
   </w:style>
-  <w:style w:type="character" w:customStyle="1" w:styleId="VerbatimStringTok">
+  <w:style w:customStyle="1" w:styleId="VerbatimStringTok" w:type="character">
     <w:name w:val="VerbatimStringTok"/>
     <w:basedOn w:val="VerbatimChar"/>
     <w:rPr>
       <w:color w:val="4070a0"/>
     </w:rPr>
   </w:style>
-  <w:style w:type="character" w:customStyle="1" w:styleId="SpecialStringTok">
+  <w:style w:customStyle="1" w:styleId="SpecialStringTok" w:type="character">
     <w:name w:val="SpecialStringTok"/>
     <w:basedOn w:val="VerbatimChar"/>
     <w:rPr>
       <w:color w:val="bb6688"/>
     </w:rPr>
   </w:style>
-  <w:style w:type="character" w:customStyle="1" w:styleId="ImportTok">
+  <w:style w:customStyle="1" w:styleId="ImportTok" w:type="character">
     <w:name w:val="ImportTok"/>
     <w:basedOn w:val="VerbatimChar"/>
     <w:rPr>
@@ -12903,7 +11553,7 @@
       <w:b/>
     </w:rPr>
   </w:style>
-  <w:style w:type="character" w:customStyle="1" w:styleId="CommentTok">
+  <w:style w:customStyle="1" w:styleId="CommentTok" w:type="character">
     <w:name w:val="CommentTok"/>
     <w:basedOn w:val="VerbatimChar"/>
     <w:rPr>
@@ -12911,7 +11561,7 @@
       <w:i/>
     </w:rPr>
   </w:style>
-  <w:style w:type="character" w:customStyle="1" w:styleId="DocumentationTok">
+  <w:style w:customStyle="1" w:styleId="DocumentationTok" w:type="character">
     <w:name w:val="DocumentationTok"/>
     <w:basedOn w:val="VerbatimChar"/>
     <w:rPr>
@@ -12919,7 +11569,7 @@
       <w:i/>
     </w:rPr>
   </w:style>
-  <w:style w:type="character" w:customStyle="1" w:styleId="AnnotationTok">
+  <w:style w:customStyle="1" w:styleId="AnnotationTok" w:type="character">
     <w:name w:val="AnnotationTok"/>
     <w:basedOn w:val="VerbatimChar"/>
     <w:rPr>
@@ -12928,7 +11578,7 @@
       <w:i/>
     </w:rPr>
   </w:style>
-  <w:style w:type="character" w:customStyle="1" w:styleId="CommentVarTok">
+  <w:style w:customStyle="1" w:styleId="CommentVarTok" w:type="character">
     <w:name w:val="CommentVarTok"/>
     <w:basedOn w:val="VerbatimChar"/>
     <w:rPr>
@@ -12937,28 +11587,28 @@
       <w:i/>
     </w:rPr>
   </w:style>
-  <w:style w:type="character" w:customStyle="1" w:styleId="OtherTok">
+  <w:style w:customStyle="1" w:styleId="OtherTok" w:type="character">
     <w:name w:val="OtherTok"/>
     <w:basedOn w:val="VerbatimChar"/>
     <w:rPr>
       <w:color w:val="007020"/>
     </w:rPr>
   </w:style>
-  <w:style w:type="character" w:customStyle="1" w:styleId="FunctionTok">
+  <w:style w:customStyle="1" w:styleId="FunctionTok" w:type="character">
     <w:name w:val="FunctionTok"/>
     <w:basedOn w:val="VerbatimChar"/>
     <w:rPr>
       <w:color w:val="06287e"/>
     </w:rPr>
   </w:style>
-  <w:style w:type="character" w:customStyle="1" w:styleId="VariableTok">
+  <w:style w:customStyle="1" w:styleId="VariableTok" w:type="character">
     <w:name w:val="VariableTok"/>
     <w:basedOn w:val="VerbatimChar"/>
     <w:rPr>
       <w:color w:val="19177c"/>
     </w:rPr>
   </w:style>
-  <w:style w:type="character" w:customStyle="1" w:styleId="ControlFlowTok">
+  <w:style w:customStyle="1" w:styleId="ControlFlowTok" w:type="character">
     <w:name w:val="ControlFlowTok"/>
     <w:basedOn w:val="VerbatimChar"/>
     <w:rPr>
@@ -12966,45 +11616,45 @@
       <w:b/>
     </w:rPr>
   </w:style>
-  <w:style w:type="character" w:customStyle="1" w:styleId="OperatorTok">
+  <w:style w:customStyle="1" w:styleId="OperatorTok" w:type="character">
     <w:name w:val="OperatorTok"/>
     <w:basedOn w:val="VerbatimChar"/>
     <w:rPr>
       <w:color w:val="666666"/>
     </w:rPr>
   </w:style>
-  <w:style w:type="character" w:customStyle="1" w:styleId="BuiltInTok">
+  <w:style w:customStyle="1" w:styleId="BuiltInTok" w:type="character">
     <w:name w:val="BuiltInTok"/>
     <w:basedOn w:val="VerbatimChar"/>
     <w:rPr>
       <w:color w:val="008000"/>
     </w:rPr>
   </w:style>
-  <w:style w:type="character" w:customStyle="1" w:styleId="ExtensionTok">
+  <w:style w:customStyle="1" w:styleId="ExtensionTok" w:type="character">
     <w:name w:val="ExtensionTok"/>
     <w:basedOn w:val="VerbatimChar"/>
     <w:rPr/>
   </w:style>
-  <w:style w:type="character" w:customStyle="1" w:styleId="PreprocessorTok">
+  <w:style w:customStyle="1" w:styleId="PreprocessorTok" w:type="character">
     <w:name w:val="PreprocessorTok"/>
     <w:basedOn w:val="VerbatimChar"/>
     <w:rPr>
       <w:color w:val="bc7a00"/>
     </w:rPr>
   </w:style>
-  <w:style w:type="character" w:customStyle="1" w:styleId="AttributeTok">
+  <w:style w:customStyle="1" w:styleId="AttributeTok" w:type="character">
     <w:name w:val="AttributeTok"/>
     <w:basedOn w:val="VerbatimChar"/>
     <w:rPr>
       <w:color w:val="7d9029"/>
     </w:rPr>
   </w:style>
-  <w:style w:type="character" w:customStyle="1" w:styleId="RegionMarkerTok">
+  <w:style w:customStyle="1" w:styleId="RegionMarkerTok" w:type="character">
     <w:name w:val="RegionMarkerTok"/>
     <w:basedOn w:val="VerbatimChar"/>
     <w:rPr/>
   </w:style>
-  <w:style w:type="character" w:customStyle="1" w:styleId="InformationTok">
+  <w:style w:customStyle="1" w:styleId="InformationTok" w:type="character">
     <w:name w:val="InformationTok"/>
     <w:basedOn w:val="VerbatimChar"/>
     <w:rPr>
@@ -13013,7 +11663,7 @@
       <w:i/>
     </w:rPr>
   </w:style>
-  <w:style w:type="character" w:customStyle="1" w:styleId="WarningTok">
+  <w:style w:customStyle="1" w:styleId="WarningTok" w:type="character">
     <w:name w:val="WarningTok"/>
     <w:basedOn w:val="VerbatimChar"/>
     <w:rPr>
@@ -13022,7 +11672,7 @@
       <w:i/>
     </w:rPr>
   </w:style>
-  <w:style w:type="character" w:customStyle="1" w:styleId="AlertTok">
+  <w:style w:customStyle="1" w:styleId="AlertTok" w:type="character">
     <w:name w:val="AlertTok"/>
     <w:basedOn w:val="VerbatimChar"/>
     <w:rPr>
@@ -13030,7 +11680,7 @@
       <w:b/>
     </w:rPr>
   </w:style>
-  <w:style w:type="character" w:customStyle="1" w:styleId="ErrorTok">
+  <w:style w:customStyle="1" w:styleId="ErrorTok" w:type="character">
     <w:name w:val="ErrorTok"/>
     <w:basedOn w:val="VerbatimChar"/>
     <w:rPr>
@@ -13038,7 +11688,7 @@
       <w:b/>
     </w:rPr>
   </w:style>
-  <w:style w:type="character" w:customStyle="1" w:styleId="NormalTok">
+  <w:style w:customStyle="1" w:styleId="NormalTok" w:type="character">
     <w:name w:val="NormalTok"/>
     <w:basedOn w:val="VerbatimChar"/>
     <w:rPr/>

</xml_diff>

<commit_message>
Add literature-grounded senior research review
</commit_message>
<xml_diff>
--- a/docs/PROJECT_RESEARCH_AND_EVIDENCE.docx
+++ b/docs/PROJECT_RESEARCH_AND_EVIDENCE.docx
@@ -776,7 +776,7 @@
                 <w:b w:val="0"/>
                 <w:sz w:val="17"/>
               </w:rPr>
-              <w:t>CCH customization/query costs, recheck periods, improvement thresholds, compliance/penetration, and congestion redistribution</w:t>
+              <w:t>Metropolitan-scale Mobiliti simulation of dynamic rerouting penetration, recheck periods, improvement thresholds, congestion redistribution, and parallel scalability</w:t>
             </w:r>
           </w:p>
         </w:tc>
@@ -795,7 +795,7 @@
                 <w:b w:val="0"/>
                 <w:sz w:val="17"/>
               </w:rPr>
-              <w:t>No flood evidence or deterministic monotone per-query stale-metric certificate</w:t>
+              <w:t>No flood evidence or deterministic monotone per-query stale-metric certificate; not a CCH study</w:t>
             </w:r>
           </w:p>
         </w:tc>
@@ -1052,7 +1052,7 @@
         <w:pStyle w:val="ListBullet"/>
       </w:pPr>
       <w:r>
-        <w:t>city-level Dijkstra/A*/ALT routing (Kumar et al., 2020 (https://doi.org/10.18520/cs/v119/i4/680-690));</w:t>
+        <w:t>city-level Dijkstra/A*/ALT routing (Bachu et al., 2020 (https://doi.org/10.18520/cs/v119/i4/680-690));</w:t>
       </w:r>
     </w:p>
     <w:p>
@@ -2014,7 +2014,7 @@
         <w:jc w:val="both"/>
       </w:pPr>
       <w:r>
-        <w:t>A closure represented as an increase is safe for the lower-bound direction, but a candidate containing the closed edge fails the upper-bound test. Native CCH currently accepts finite integer weights only; closure-sentinel behavior still requires a dedicated validation stage.</w:t>
+        <w:t>A closure represented as an increase is safe for the lower-bound direction, but a candidate containing the closed edge fails the upper-bound test. Native CCH accepts finite integer weights only, so Stage 6 validates a finite closure sentinel against the configured maximum finite path-weight bound; it does not support literal +\infty inside CCH.</w:t>
       </w:r>
     </w:p>
     <w:p>
@@ -2062,7 +2062,7 @@
         <w:jc w:val="both"/>
       </w:pPr>
       <w:r>
-        <w:t>Items 1–3 are implemented as decide_route_adoption. Time-indexed reservations (items previously 4–5) remain unimplemented. The filter is not claimed to achieve traffic equilibrium.</w:t>
+        <w:t>Items 1–3 are implemented as decide_route_adoption. Stage 7 also implements time-binned, compliant-only projected-load reservations with metric updates applied before certificate evaluation. The reservation experiment is limited to a four-node labelled SCENARIO network and is not claimed to achieve traffic equilibrium or a fleet optimum.</w:t>
       </w:r>
     </w:p>
     <w:p>
@@ -2166,7 +2166,7 @@
         <w:jc w:val="both"/>
       </w:pPr>
       <w:r>
-        <w:t>Generic utility functions exist for portions of all five factors in evaluation/metrics.py and evaluation/robustness.py. None of the five has yet been integrated with Chennai inputs or executed as a factor-level experiment.</w:t>
+        <w:t>The dated Chennai graph, WorldPop raster, UPHC/UCHC catalogues, and fire-station catalogue were integrated in Stage 8. Population-weighted accessibility, seeded compliance cohorts, directed-arc dependency exposure, and OSM-way grouping were executed. Relief centres were excluded for lack of verified coordinates, and controlled lag/classification-error traces remain utility-level rather than a matched city experiment.</w:t>
       </w:r>
     </w:p>
     <w:p>
@@ -2403,7 +2403,7 @@
                 <w:b w:val="0"/>
                 <w:sz w:val="17"/>
               </w:rPr>
-              <w:t>A derived/simulated binary road-state truth trace plus rainfall/flood evidence</w:t>
+              <w:t>A derived/simulated road-state trace plus rainfall/flood evidence</w:t>
             </w:r>
           </w:p>
         </w:tc>
@@ -2422,7 +2422,7 @@
                 <w:b w:val="0"/>
                 <w:sz w:val="17"/>
               </w:rPr>
-              <w:t>OpenCity flood records (https://data.opencity.in/dataset/chennai-floods-2015-data); Open-Meteo reanalysis (https://open-meteo.com/en/docs/historical-weather-api); optional IMERG Final V07 (https://disc.gsfc.nasa.gov/datasets/GPM_3IMERGHH_07/summary)</w:t>
+              <w:t>OpenCity flood records (https://data.opencity.in/dataset/chennai-floods-2015-data); ERA5 reanalysis; optional IMERG Final V07 (https://disc.gsfc.nasa.gov/datasets/GPM_3IMERGHH_07/summary)</w:t>
             </w:r>
           </w:p>
         </w:tc>
@@ -2441,7 +2441,7 @@
                 <w:b w:val="0"/>
                 <w:sz w:val="17"/>
               </w:rPr>
-              <w:t>CKAN download, HTTPS JSON, or credentialed GES DISC download</w:t>
+              <w:t>CKAN download, HTTPS reanalysis download, or credentialed GES DISC download</w:t>
             </w:r>
           </w:p>
         </w:tc>
@@ -2460,7 +2460,7 @@
                 <w:b w:val="0"/>
                 <w:sz w:val="17"/>
               </w:rPr>
-              <w:t>No key for OpenCity/Open-Meteo; Earthdata account authorization plus credentials/token for optional IMERG</w:t>
+              <w:t>No key for executed OpenCity/ERA5 path; Earthdata account for optional IMERG</w:t>
             </w:r>
           </w:p>
         </w:tc>
@@ -2479,7 +2479,7 @@
                 <w:b w:val="0"/>
                 <w:sz w:val="17"/>
               </w:rPr>
-              <w:t>OpenCity + Open-Meteo</w:t>
+              <w:t>OpenCity + ERA5</w:t>
             </w:r>
           </w:p>
         </w:tc>
@@ -2498,7 +2498,7 @@
                 <w:b w:val="0"/>
                 <w:sz w:val="17"/>
               </w:rPr>
-              <w:t>Synthetic binary step-lag and false-positive/false-negative utility only</w:t>
+              <w:t>Historical-evidence-conditioned Stage 4 state table; generic lag/error utilities</w:t>
             </w:r>
           </w:p>
         </w:tc>
@@ -2517,7 +2517,7 @@
                 <w:b w:val="0"/>
                 <w:sz w:val="17"/>
               </w:rPr>
-              <w:t>Create and justify road-state truth, timestamp alignment, multiclass/confidence mapping, then run scenarios</w:t>
+              <w:t>Obtain timestamped road observations and execute matched lag/error scenarios</w:t>
             </w:r>
           </w:p>
         </w:tc>
@@ -2576,7 +2576,7 @@
                 <w:b w:val="0"/>
                 <w:sz w:val="17"/>
               </w:rPr>
-              <w:t>OpenCity health (https://data.opencity.in/dataset/chennai-healthcare-uphcs-and-uchcs), fire (https://data.opencity.in/dataset/chennai-fire-stations-), and relief (https://data.opencity.in/dataset/gcc-relief-centres); OSM POIs (https://overpass-api.de/api/interpreter)</w:t>
+              <w:t>OpenCity health (https://data.opencity.in/dataset/chennai-healthcare-uphcs-and-uchcs), fire (https://data.opencity.in/dataset/chennai-fire-stations-), and relief (https://data.opencity.in/dataset/gcc-relief-centres)</w:t>
             </w:r>
           </w:p>
         </w:tc>
@@ -2595,7 +2595,7 @@
                 <w:b w:val="0"/>
                 <w:sz w:val="17"/>
               </w:rPr>
-              <w:t>Health CSV/selected KML, fire CSV/KML, relief-centre PDF, and cached Overpass response</w:t>
+              <w:t>Coordinate-bearing KML and relief-centre PDF</w:t>
             </w:r>
           </w:p>
         </w:tc>
@@ -2614,7 +2614,7 @@
                 <w:b w:val="0"/>
                 <w:sz w:val="17"/>
               </w:rPr>
-              <w:t>No key or account for the listed sources</w:t>
+              <w:t>No key or account</w:t>
             </w:r>
           </w:p>
         </w:tc>
@@ -2633,7 +2633,7 @@
                 <w:b w:val="0"/>
                 <w:sz w:val="17"/>
               </w:rPr>
-              <w:t>Use coordinate-bearing KML/OSM; geocode relief addresses sequentially through no-key Nominatim, then cache and manually verify</w:t>
+              <w:t>Use verified coordinate-bearing KML</w:t>
             </w:r>
           </w:p>
         </w:tc>
@@ -2652,7 +2652,7 @@
                 <w:b w:val="0"/>
                 <w:sz w:val="17"/>
               </w:rPr>
-              <w:t>Summaries from precomputed travel-time arrays only</w:t>
+              <w:t>140 UPHC, 14 UCHC, and 47 fire stations verified, snapped, and evaluated</w:t>
             </w:r>
           </w:p>
         </w:tc>
@@ -2671,7 +2671,7 @@
                 <w:b w:val="0"/>
                 <w:sz w:val="17"/>
               </w:rPr>
-              <w:t>Acquire/cache, verify type and emergency capability, geocode relief addresses, snap facilities, compute routes</w:t>
+              <w:t>Add verified hospital capability/capacity; geocode and manually verify relief centres</w:t>
             </w:r>
           </w:p>
         </w:tc>
@@ -2787,7 +2787,7 @@
                 <w:b w:val="0"/>
                 <w:sz w:val="17"/>
               </w:rPr>
-              <w:t>Use the 1 km 2015 asset to match the 2015 flood scenario</w:t>
+              <w:t>Use the 1 km 2015 asset to match the historical scenario</w:t>
             </w:r>
           </w:p>
         </w:tc>
@@ -2806,7 +2806,7 @@
                 <w:b w:val="0"/>
                 <w:sz w:val="17"/>
               </w:rPr>
-              <w:t>Array-level weighted mean, p90, disconnection, and threshold summaries only</w:t>
+              <w:t>525 graph origins representing 3,591,253 residents evaluated</w:t>
             </w:r>
           </w:p>
         </w:tc>
@@ -2825,7 +2825,7 @@
                 <w:b w:val="0"/>
                 <w:sz w:val="17"/>
               </w:rPr>
-              <w:t>Download/clip raster, verify count conservation, map cells to graph origins</w:t>
+              <w:t>Validate sub-cell allocation and compare weighted versus unweighted outcomes</w:t>
             </w:r>
           </w:p>
         </w:tc>
@@ -2903,7 +2903,7 @@
                 <w:b w:val="0"/>
                 <w:sz w:val="17"/>
               </w:rPr>
-              <w:t>Local SUMO configuration and TraCI/libsumo</w:t>
+              <w:t>Local policy/SUMO configuration</w:t>
             </w:r>
           </w:p>
         </w:tc>
@@ -2941,7 +2941,7 @@
                 <w:b w:val="0"/>
                 <w:sz w:val="17"/>
               </w:rPr>
-              <w:t>Seeded cohort; size is \lfloor np+0.5\rfloor, so exact percentages require a compatible fleet size</w:t>
+              <w:t>Seeded cohort; size is \lfloor np+0.5\rfloor</w:t>
             </w:r>
           </w:p>
         </w:tc>
@@ -2960,7 +2960,7 @@
                 <w:b w:val="0"/>
                 <w:sz w:val="17"/>
               </w:rPr>
-              <w:t>Reproducible nearest-integer cohort selection only</w:t>
+              <w:t>0/25/50/75/100% seeded Stage 7 scenario cohorts executed</w:t>
             </w:r>
           </w:p>
         </w:tc>
@@ -2979,7 +2979,7 @@
                 <w:b w:val="0"/>
                 <w:sz w:val="17"/>
               </w:rPr>
-              <w:t>Wire selected IDs to rerouting devices/TraCI, define non-compliant behaviour, calibrate demand, repeat seeds</w:t>
+              <w:t>Execute matched citywide SUMO comparator with calibrated demand and repeated stochastic seeds</w:t>
             </w:r>
           </w:p>
         </w:tc>
@@ -3114,7 +3114,7 @@
                 <w:b w:val="0"/>
                 <w:sz w:val="17"/>
               </w:rPr>
-              <w:t>Toy-tested single directed keyed-edge ranking; added cost is unnormalised person-time and disconnection is separate</w:t>
+              <w:t>Chennai-scale directed-arc dependency ranking and OSM-way grouping executed</w:t>
             </w:r>
           </w:p>
         </w:tc>
@@ -3133,7 +3133,7 @@
                 <w:b w:val="0"/>
                 <w:sz w:val="17"/>
               </w:rPr>
-              <w:t>Select candidates, group/close all physical-road arcs by OSM way ID, and run Chennai-scale analysis</w:t>
+              <w:t>Recompute causal closure criticality for physical roads and validate candidate interpretation</w:t>
             </w:r>
           </w:p>
         </w:tc>
@@ -3149,7 +3149,7 @@
         <w:jc w:val="both"/>
       </w:pPr>
       <w:r>
-        <w:t>Feasibility conclusion: a public-source acquisition path exists for all five factors without user-supplied credentials, but the complete Chennai pipeline has not yet been demonstrated. Official NASA IMERG/SRTM data cannot be acquired in a no-credential run; Open-Meteo reanalysis and non-elevation susceptibility inputs are the declared fallbacks.</w:t>
+        <w:t>Feasibility conclusion: the no-credential Chennai pipeline was demonstrated for dated topology, historical/modelled flood evidence, ERA5 reanalysis, coarse public elevation, coordinate-bearing facilities, and WorldPop. Optional official NASA IMERG/SRTM inputs still require credentials; relief-centre coordinates and operational facility capability remain unverified.</w:t>
       </w:r>
     </w:p>
     <w:p>
@@ -4598,7 +4598,7 @@
         <w:jc w:val="both"/>
       </w:pPr>
       <w:r>
-        <w:t xml:space="preserve">Repository: src/chennai_routing/data/rainfall.py is currently a placeholder; acquisition is unimplemented.  </w:t>
+        <w:t>Repository: src/chennai_routing/data/rainfall.py implements the executed reanalysis acquisition/provenance path; credentialed IMERG acquisition remains optional and unexecuted.</w:t>
       </w:r>
     </w:p>
     <w:p>
@@ -4694,7 +4694,7 @@
         <w:jc w:val="both"/>
       </w:pPr>
       <w:r>
-        <w:t xml:space="preserve">Repository: src/chennai_routing/data/elevation.py and hydrology.py are currently placeholders.  </w:t>
+        <w:t>Repository: src/chennai_routing/data/elevation.py and hydrology.py implement the executed coarse-elevation and public hydrology evidence path.</w:t>
       </w:r>
     </w:p>
     <w:p>
@@ -4870,7 +4870,7 @@
         <w:jc w:val="both"/>
       </w:pPr>
       <w:r>
-        <w:t xml:space="preserve">Repository: src/chennai_routing/evaluation/metrics.py provides array/graph utilities; ingestion and graph snapping are unimplemented.  </w:t>
+        <w:t>Repository: src/chennai_routing/stage8_accessibility.py implements streamed graph loading, facility/population snapping, sparse accessibility, and dependency reporting; reusable summaries remain in evaluation/metrics.py.</w:t>
       </w:r>
     </w:p>
     <w:p>
@@ -9663,7 +9663,7 @@
         <w:jc w:val="both"/>
       </w:pPr>
       <w:r>
-        <w:t>The Stage 10 synthesis is therefore a transparent partial publication package. Its defensible novelty is Chennai-oriented integration, reproducibility, and evaluation design; remaining experiment gaps are enumerated in docs/evidence/STAGE10_EVALUATION_RESULTS.json rather than silently converted into results.</w:t>
+        <w:t>The Stage 10 synthesis is a transparent partial publication package. Its defensible novelty is Chennai-oriented integration and reproducibility; remaining gaps are explicit in docs/evidence/STAGE10_EVALUATION_RESULTS.json.</w:t>
       </w:r>
     </w:p>
     <w:sectPr>

</xml_diff>